<commit_message>
Added Open Source vs. Closed Source Data comparison
</commit_message>
<xml_diff>
--- a/week 2/Data collection proccess.docx
+++ b/week 2/Data collection proccess.docx
@@ -300,8 +300,6 @@
         </w:rPr>
         <w:t xml:space="preserve">; </w:t>
       </w:r>
-      <w:bookmarkStart w:id="0" w:name="_GoBack"/>
-      <w:bookmarkEnd w:id="0"/>
     </w:p>
     <w:p>
       <w:pPr>
@@ -674,6 +672,2589 @@
           <w:lang w:val="en-US" w:eastAsia="ru-RU"/>
         </w:rPr>
         <w:t>The collected information will be used to identify relationships between different infrastructure elements and create a dataset for further analysis.</w:t>
+      </w:r>
+    </w:p>
+    <w:p>
+      <w:pPr>
+        <w:spacing w:before="100" w:beforeAutospacing="1" w:after="100" w:afterAutospacing="1" w:line="240" w:lineRule="auto"/>
+        <w:jc w:val="center"/>
+        <w:outlineLvl w:val="0"/>
+        <w:rPr>
+          <w:rFonts w:asciiTheme="majorHAnsi" w:eastAsia="Times New Roman" w:hAnsiTheme="majorHAnsi" w:cs="Times New Roman"/>
+          <w:b/>
+          <w:bCs/>
+          <w:kern w:val="36"/>
+          <w:sz w:val="48"/>
+          <w:szCs w:val="48"/>
+          <w:lang w:val="en-US" w:eastAsia="ru-RU"/>
+        </w:rPr>
+      </w:pPr>
+      <w:r>
+        <w:rPr>
+          <w:rFonts w:asciiTheme="majorHAnsi" w:eastAsia="Times New Roman" w:hAnsiTheme="majorHAnsi" w:cs="Times New Roman"/>
+          <w:b/>
+          <w:bCs/>
+          <w:kern w:val="36"/>
+          <w:sz w:val="48"/>
+          <w:szCs w:val="48"/>
+          <w:lang w:val="en-US" w:eastAsia="ru-RU"/>
+        </w:rPr>
+        <w:t>2.2. Open Source vs. Closed Source Data</w:t>
+      </w:r>
+    </w:p>
+    <w:p>
+      <w:pPr>
+        <w:spacing w:before="100" w:beforeAutospacing="1" w:after="100" w:afterAutospacing="1" w:line="240" w:lineRule="auto"/>
+        <w:outlineLvl w:val="2"/>
+        <w:rPr>
+          <w:rFonts w:asciiTheme="majorHAnsi" w:eastAsia="Times New Roman" w:hAnsiTheme="majorHAnsi" w:cs="Times New Roman"/>
+          <w:b/>
+          <w:bCs/>
+          <w:sz w:val="27"/>
+          <w:szCs w:val="27"/>
+          <w:lang w:val="en-US" w:eastAsia="ru-RU"/>
+        </w:rPr>
+      </w:pPr>
+      <w:r>
+        <w:rPr>
+          <w:rFonts w:asciiTheme="majorHAnsi" w:eastAsia="Times New Roman" w:hAnsiTheme="majorHAnsi" w:cs="Times New Roman"/>
+          <w:b/>
+          <w:bCs/>
+          <w:sz w:val="27"/>
+          <w:szCs w:val="27"/>
+          <w:lang w:val="en-US" w:eastAsia="ru-RU"/>
+        </w:rPr>
+        <w:t>Open-source data</w:t>
+      </w:r>
+    </w:p>
+    <w:p>
+      <w:pPr>
+        <w:spacing w:before="100" w:beforeAutospacing="1" w:after="100" w:afterAutospacing="1" w:line="240" w:lineRule="auto"/>
+        <w:rPr>
+          <w:rFonts w:asciiTheme="majorHAnsi" w:eastAsia="Times New Roman" w:hAnsiTheme="majorHAnsi" w:cs="Times New Roman"/>
+          <w:sz w:val="24"/>
+          <w:szCs w:val="24"/>
+          <w:lang w:val="en-US" w:eastAsia="ru-RU"/>
+        </w:rPr>
+      </w:pPr>
+      <w:r>
+        <w:rPr>
+          <w:rFonts w:asciiTheme="majorHAnsi" w:eastAsia="Times New Roman" w:hAnsiTheme="majorHAnsi" w:cs="Times New Roman"/>
+          <w:b/>
+          <w:bCs/>
+          <w:sz w:val="24"/>
+          <w:szCs w:val="24"/>
+          <w:lang w:val="en-US" w:eastAsia="ru-RU"/>
+        </w:rPr>
+        <w:t>Open-source intelligence (OSINT)</w:t>
+      </w:r>
+      <w:r>
+        <w:rPr>
+          <w:rFonts w:asciiTheme="majorHAnsi" w:eastAsia="Times New Roman" w:hAnsiTheme="majorHAnsi" w:cs="Times New Roman"/>
+          <w:sz w:val="24"/>
+          <w:szCs w:val="24"/>
+          <w:lang w:val="en-US" w:eastAsia="ru-RU"/>
+        </w:rPr>
+        <w:t xml:space="preserve"> is information that can be legally obtained from publicly accessible sources.</w:t>
+      </w:r>
+    </w:p>
+    <w:p>
+      <w:pPr>
+        <w:spacing w:before="100" w:beforeAutospacing="1" w:after="100" w:afterAutospacing="1" w:line="240" w:lineRule="auto"/>
+        <w:rPr>
+          <w:rFonts w:asciiTheme="majorHAnsi" w:eastAsia="Times New Roman" w:hAnsiTheme="majorHAnsi" w:cs="Times New Roman"/>
+          <w:sz w:val="24"/>
+          <w:szCs w:val="24"/>
+          <w:lang w:val="en-US" w:eastAsia="ru-RU"/>
+        </w:rPr>
+      </w:pPr>
+      <w:r>
+        <w:rPr>
+          <w:rFonts w:asciiTheme="majorHAnsi" w:eastAsia="Times New Roman" w:hAnsiTheme="majorHAnsi" w:cs="Times New Roman"/>
+          <w:sz w:val="24"/>
+          <w:szCs w:val="24"/>
+          <w:lang w:val="en-US" w:eastAsia="ru-RU"/>
+        </w:rPr>
+        <w:t>For this project, examples include:</w:t>
+      </w:r>
+    </w:p>
+    <w:p>
+      <w:pPr>
+        <w:numPr>
+          <w:ilvl w:val="0"/>
+          <w:numId w:val="2"/>
+        </w:numPr>
+        <w:spacing w:before="100" w:beforeAutospacing="1" w:after="100" w:afterAutospacing="1" w:line="240" w:lineRule="auto"/>
+        <w:rPr>
+          <w:rFonts w:asciiTheme="majorHAnsi" w:eastAsia="Times New Roman" w:hAnsiTheme="majorHAnsi" w:cs="Times New Roman"/>
+          <w:sz w:val="24"/>
+          <w:szCs w:val="24"/>
+          <w:lang w:eastAsia="ru-RU"/>
+        </w:rPr>
+      </w:pPr>
+      <w:r>
+        <w:rPr>
+          <w:rFonts w:asciiTheme="majorHAnsi" w:eastAsia="Times New Roman" w:hAnsiTheme="majorHAnsi" w:cs="Times New Roman"/>
+          <w:sz w:val="24"/>
+          <w:szCs w:val="24"/>
+          <w:lang w:val="en-US" w:eastAsia="ru-RU"/>
+        </w:rPr>
+        <w:t>P</w:t>
+      </w:r>
+      <w:proofErr w:type="spellStart"/>
+      <w:r>
+        <w:rPr>
+          <w:rFonts w:asciiTheme="majorHAnsi" w:eastAsia="Times New Roman" w:hAnsiTheme="majorHAnsi" w:cs="Times New Roman"/>
+          <w:sz w:val="24"/>
+          <w:szCs w:val="24"/>
+          <w:lang w:eastAsia="ru-RU"/>
+        </w:rPr>
+        <w:t>ublic</w:t>
+      </w:r>
+      <w:proofErr w:type="spellEnd"/>
+      <w:r>
+        <w:rPr>
+          <w:rFonts w:asciiTheme="majorHAnsi" w:eastAsia="Times New Roman" w:hAnsiTheme="majorHAnsi" w:cs="Times New Roman"/>
+          <w:sz w:val="24"/>
+          <w:szCs w:val="24"/>
+          <w:lang w:eastAsia="ru-RU"/>
+        </w:rPr>
+        <w:t xml:space="preserve"> </w:t>
+      </w:r>
+      <w:proofErr w:type="spellStart"/>
+      <w:r>
+        <w:rPr>
+          <w:rFonts w:asciiTheme="majorHAnsi" w:eastAsia="Times New Roman" w:hAnsiTheme="majorHAnsi" w:cs="Times New Roman"/>
+          <w:sz w:val="24"/>
+          <w:szCs w:val="24"/>
+          <w:lang w:eastAsia="ru-RU"/>
+        </w:rPr>
+        <w:t>threat</w:t>
+      </w:r>
+      <w:proofErr w:type="spellEnd"/>
+      <w:r>
+        <w:rPr>
+          <w:rFonts w:asciiTheme="majorHAnsi" w:eastAsia="Times New Roman" w:hAnsiTheme="majorHAnsi" w:cs="Times New Roman"/>
+          <w:sz w:val="24"/>
+          <w:szCs w:val="24"/>
+          <w:lang w:eastAsia="ru-RU"/>
+        </w:rPr>
+        <w:t xml:space="preserve"> </w:t>
+      </w:r>
+      <w:proofErr w:type="spellStart"/>
+      <w:r>
+        <w:rPr>
+          <w:rFonts w:asciiTheme="majorHAnsi" w:eastAsia="Times New Roman" w:hAnsiTheme="majorHAnsi" w:cs="Times New Roman"/>
+          <w:sz w:val="24"/>
+          <w:szCs w:val="24"/>
+          <w:lang w:eastAsia="ru-RU"/>
+        </w:rPr>
+        <w:t>intelligence</w:t>
+      </w:r>
+      <w:proofErr w:type="spellEnd"/>
+      <w:r>
+        <w:rPr>
+          <w:rFonts w:asciiTheme="majorHAnsi" w:eastAsia="Times New Roman" w:hAnsiTheme="majorHAnsi" w:cs="Times New Roman"/>
+          <w:sz w:val="24"/>
+          <w:szCs w:val="24"/>
+          <w:lang w:eastAsia="ru-RU"/>
+        </w:rPr>
+        <w:t xml:space="preserve"> </w:t>
+      </w:r>
+      <w:proofErr w:type="spellStart"/>
+      <w:r>
+        <w:rPr>
+          <w:rFonts w:asciiTheme="majorHAnsi" w:eastAsia="Times New Roman" w:hAnsiTheme="majorHAnsi" w:cs="Times New Roman"/>
+          <w:sz w:val="24"/>
+          <w:szCs w:val="24"/>
+          <w:lang w:eastAsia="ru-RU"/>
+        </w:rPr>
+        <w:t>databases</w:t>
+      </w:r>
+      <w:proofErr w:type="spellEnd"/>
+      <w:r>
+        <w:rPr>
+          <w:rFonts w:asciiTheme="majorHAnsi" w:eastAsia="Times New Roman" w:hAnsiTheme="majorHAnsi" w:cs="Times New Roman"/>
+          <w:sz w:val="24"/>
+          <w:szCs w:val="24"/>
+          <w:lang w:eastAsia="ru-RU"/>
+        </w:rPr>
+        <w:t xml:space="preserve">; </w:t>
+      </w:r>
+      <w:bookmarkStart w:id="0" w:name="_GoBack"/>
+      <w:bookmarkEnd w:id="0"/>
+    </w:p>
+    <w:p>
+      <w:pPr>
+        <w:numPr>
+          <w:ilvl w:val="0"/>
+          <w:numId w:val="2"/>
+        </w:numPr>
+        <w:spacing w:before="100" w:beforeAutospacing="1" w:after="100" w:afterAutospacing="1" w:line="240" w:lineRule="auto"/>
+        <w:rPr>
+          <w:rFonts w:asciiTheme="majorHAnsi" w:eastAsia="Times New Roman" w:hAnsiTheme="majorHAnsi" w:cs="Times New Roman"/>
+          <w:sz w:val="24"/>
+          <w:szCs w:val="24"/>
+          <w:lang w:eastAsia="ru-RU"/>
+        </w:rPr>
+      </w:pPr>
+      <w:proofErr w:type="spellStart"/>
+      <w:r>
+        <w:rPr>
+          <w:rFonts w:asciiTheme="majorHAnsi" w:eastAsia="Times New Roman" w:hAnsiTheme="majorHAnsi" w:cs="Times New Roman"/>
+          <w:sz w:val="24"/>
+          <w:szCs w:val="24"/>
+          <w:lang w:eastAsia="ru-RU"/>
+        </w:rPr>
+        <w:t>VirusTotal</w:t>
+      </w:r>
+      <w:proofErr w:type="spellEnd"/>
+      <w:r>
+        <w:rPr>
+          <w:rFonts w:asciiTheme="majorHAnsi" w:eastAsia="Times New Roman" w:hAnsiTheme="majorHAnsi" w:cs="Times New Roman"/>
+          <w:sz w:val="24"/>
+          <w:szCs w:val="24"/>
+          <w:lang w:eastAsia="ru-RU"/>
+        </w:rPr>
+        <w:t xml:space="preserve"> </w:t>
+      </w:r>
+      <w:proofErr w:type="spellStart"/>
+      <w:r>
+        <w:rPr>
+          <w:rFonts w:asciiTheme="majorHAnsi" w:eastAsia="Times New Roman" w:hAnsiTheme="majorHAnsi" w:cs="Times New Roman"/>
+          <w:sz w:val="24"/>
+          <w:szCs w:val="24"/>
+          <w:lang w:eastAsia="ru-RU"/>
+        </w:rPr>
+        <w:t>public</w:t>
+      </w:r>
+      <w:proofErr w:type="spellEnd"/>
+      <w:r>
+        <w:rPr>
+          <w:rFonts w:asciiTheme="majorHAnsi" w:eastAsia="Times New Roman" w:hAnsiTheme="majorHAnsi" w:cs="Times New Roman"/>
+          <w:sz w:val="24"/>
+          <w:szCs w:val="24"/>
+          <w:lang w:eastAsia="ru-RU"/>
+        </w:rPr>
+        <w:t xml:space="preserve"> </w:t>
+      </w:r>
+      <w:proofErr w:type="spellStart"/>
+      <w:r>
+        <w:rPr>
+          <w:rFonts w:asciiTheme="majorHAnsi" w:eastAsia="Times New Roman" w:hAnsiTheme="majorHAnsi" w:cs="Times New Roman"/>
+          <w:sz w:val="24"/>
+          <w:szCs w:val="24"/>
+          <w:lang w:eastAsia="ru-RU"/>
+        </w:rPr>
+        <w:t>reports</w:t>
+      </w:r>
+      <w:proofErr w:type="spellEnd"/>
+      <w:r>
+        <w:rPr>
+          <w:rFonts w:asciiTheme="majorHAnsi" w:eastAsia="Times New Roman" w:hAnsiTheme="majorHAnsi" w:cs="Times New Roman"/>
+          <w:sz w:val="24"/>
+          <w:szCs w:val="24"/>
+          <w:lang w:eastAsia="ru-RU"/>
+        </w:rPr>
+        <w:t xml:space="preserve">; </w:t>
+      </w:r>
+    </w:p>
+    <w:p>
+      <w:pPr>
+        <w:numPr>
+          <w:ilvl w:val="0"/>
+          <w:numId w:val="2"/>
+        </w:numPr>
+        <w:spacing w:before="100" w:beforeAutospacing="1" w:after="100" w:afterAutospacing="1" w:line="240" w:lineRule="auto"/>
+        <w:rPr>
+          <w:rFonts w:asciiTheme="majorHAnsi" w:eastAsia="Times New Roman" w:hAnsiTheme="majorHAnsi" w:cs="Times New Roman"/>
+          <w:sz w:val="24"/>
+          <w:szCs w:val="24"/>
+          <w:lang w:val="en-US" w:eastAsia="ru-RU"/>
+        </w:rPr>
+      </w:pPr>
+      <w:proofErr w:type="spellStart"/>
+      <w:r>
+        <w:rPr>
+          <w:rFonts w:asciiTheme="majorHAnsi" w:eastAsia="Times New Roman" w:hAnsiTheme="majorHAnsi" w:cs="Times New Roman"/>
+          <w:sz w:val="24"/>
+          <w:szCs w:val="24"/>
+          <w:lang w:val="en-US" w:eastAsia="ru-RU"/>
+        </w:rPr>
+        <w:t>Shodan</w:t>
+      </w:r>
+      <w:proofErr w:type="spellEnd"/>
+      <w:r>
+        <w:rPr>
+          <w:rFonts w:asciiTheme="majorHAnsi" w:eastAsia="Times New Roman" w:hAnsiTheme="majorHAnsi" w:cs="Times New Roman"/>
+          <w:sz w:val="24"/>
+          <w:szCs w:val="24"/>
+          <w:lang w:val="en-US" w:eastAsia="ru-RU"/>
+        </w:rPr>
+        <w:t xml:space="preserve"> information about publicly indexed hosts; </w:t>
+      </w:r>
+    </w:p>
+    <w:p>
+      <w:pPr>
+        <w:numPr>
+          <w:ilvl w:val="0"/>
+          <w:numId w:val="2"/>
+        </w:numPr>
+        <w:spacing w:before="100" w:beforeAutospacing="1" w:after="100" w:afterAutospacing="1" w:line="240" w:lineRule="auto"/>
+        <w:rPr>
+          <w:rFonts w:asciiTheme="majorHAnsi" w:eastAsia="Times New Roman" w:hAnsiTheme="majorHAnsi" w:cs="Times New Roman"/>
+          <w:sz w:val="24"/>
+          <w:szCs w:val="24"/>
+          <w:lang w:eastAsia="ru-RU"/>
+        </w:rPr>
+      </w:pPr>
+      <w:r>
+        <w:rPr>
+          <w:rFonts w:asciiTheme="majorHAnsi" w:eastAsia="Times New Roman" w:hAnsiTheme="majorHAnsi" w:cs="Times New Roman"/>
+          <w:sz w:val="24"/>
+          <w:szCs w:val="24"/>
+          <w:lang w:eastAsia="ru-RU"/>
+        </w:rPr>
+        <w:t xml:space="preserve">DNS </w:t>
+      </w:r>
+      <w:proofErr w:type="spellStart"/>
+      <w:r>
+        <w:rPr>
+          <w:rFonts w:asciiTheme="majorHAnsi" w:eastAsia="Times New Roman" w:hAnsiTheme="majorHAnsi" w:cs="Times New Roman"/>
+          <w:sz w:val="24"/>
+          <w:szCs w:val="24"/>
+          <w:lang w:eastAsia="ru-RU"/>
+        </w:rPr>
+        <w:t>records</w:t>
+      </w:r>
+      <w:proofErr w:type="spellEnd"/>
+      <w:r>
+        <w:rPr>
+          <w:rFonts w:asciiTheme="majorHAnsi" w:eastAsia="Times New Roman" w:hAnsiTheme="majorHAnsi" w:cs="Times New Roman"/>
+          <w:sz w:val="24"/>
+          <w:szCs w:val="24"/>
+          <w:lang w:eastAsia="ru-RU"/>
+        </w:rPr>
+        <w:t xml:space="preserve">; </w:t>
+      </w:r>
+    </w:p>
+    <w:p>
+      <w:pPr>
+        <w:numPr>
+          <w:ilvl w:val="0"/>
+          <w:numId w:val="2"/>
+        </w:numPr>
+        <w:spacing w:before="100" w:beforeAutospacing="1" w:after="100" w:afterAutospacing="1" w:line="240" w:lineRule="auto"/>
+        <w:rPr>
+          <w:rFonts w:asciiTheme="majorHAnsi" w:eastAsia="Times New Roman" w:hAnsiTheme="majorHAnsi" w:cs="Times New Roman"/>
+          <w:sz w:val="24"/>
+          <w:szCs w:val="24"/>
+          <w:lang w:eastAsia="ru-RU"/>
+        </w:rPr>
+      </w:pPr>
+      <w:r>
+        <w:rPr>
+          <w:rFonts w:asciiTheme="majorHAnsi" w:eastAsia="Times New Roman" w:hAnsiTheme="majorHAnsi" w:cs="Times New Roman"/>
+          <w:sz w:val="24"/>
+          <w:szCs w:val="24"/>
+          <w:lang w:eastAsia="ru-RU"/>
+        </w:rPr>
+        <w:t xml:space="preserve">WHOIS </w:t>
+      </w:r>
+      <w:proofErr w:type="spellStart"/>
+      <w:r>
+        <w:rPr>
+          <w:rFonts w:asciiTheme="majorHAnsi" w:eastAsia="Times New Roman" w:hAnsiTheme="majorHAnsi" w:cs="Times New Roman"/>
+          <w:sz w:val="24"/>
+          <w:szCs w:val="24"/>
+          <w:lang w:eastAsia="ru-RU"/>
+        </w:rPr>
+        <w:t>information</w:t>
+      </w:r>
+      <w:proofErr w:type="spellEnd"/>
+      <w:r>
+        <w:rPr>
+          <w:rFonts w:asciiTheme="majorHAnsi" w:eastAsia="Times New Roman" w:hAnsiTheme="majorHAnsi" w:cs="Times New Roman"/>
+          <w:sz w:val="24"/>
+          <w:szCs w:val="24"/>
+          <w:lang w:eastAsia="ru-RU"/>
+        </w:rPr>
+        <w:t xml:space="preserve">; </w:t>
+      </w:r>
+    </w:p>
+    <w:p>
+      <w:pPr>
+        <w:numPr>
+          <w:ilvl w:val="0"/>
+          <w:numId w:val="2"/>
+        </w:numPr>
+        <w:spacing w:before="100" w:beforeAutospacing="1" w:after="100" w:afterAutospacing="1" w:line="240" w:lineRule="auto"/>
+        <w:rPr>
+          <w:rFonts w:asciiTheme="majorHAnsi" w:eastAsia="Times New Roman" w:hAnsiTheme="majorHAnsi" w:cs="Times New Roman"/>
+          <w:sz w:val="24"/>
+          <w:szCs w:val="24"/>
+          <w:lang w:eastAsia="ru-RU"/>
+        </w:rPr>
+      </w:pPr>
+      <w:r>
+        <w:rPr>
+          <w:rFonts w:asciiTheme="majorHAnsi" w:eastAsia="Times New Roman" w:hAnsiTheme="majorHAnsi" w:cs="Times New Roman"/>
+          <w:sz w:val="24"/>
+          <w:szCs w:val="24"/>
+          <w:lang w:val="en-US" w:eastAsia="ru-RU"/>
+        </w:rPr>
+        <w:t>P</w:t>
+      </w:r>
+      <w:proofErr w:type="spellStart"/>
+      <w:r>
+        <w:rPr>
+          <w:rFonts w:asciiTheme="majorHAnsi" w:eastAsia="Times New Roman" w:hAnsiTheme="majorHAnsi" w:cs="Times New Roman"/>
+          <w:sz w:val="24"/>
+          <w:szCs w:val="24"/>
+          <w:lang w:eastAsia="ru-RU"/>
+        </w:rPr>
+        <w:t>ublic</w:t>
+      </w:r>
+      <w:proofErr w:type="spellEnd"/>
+      <w:r>
+        <w:rPr>
+          <w:rFonts w:asciiTheme="majorHAnsi" w:eastAsia="Times New Roman" w:hAnsiTheme="majorHAnsi" w:cs="Times New Roman"/>
+          <w:sz w:val="24"/>
+          <w:szCs w:val="24"/>
+          <w:lang w:eastAsia="ru-RU"/>
+        </w:rPr>
+        <w:t xml:space="preserve"> </w:t>
+      </w:r>
+      <w:proofErr w:type="spellStart"/>
+      <w:r>
+        <w:rPr>
+          <w:rFonts w:asciiTheme="majorHAnsi" w:eastAsia="Times New Roman" w:hAnsiTheme="majorHAnsi" w:cs="Times New Roman"/>
+          <w:sz w:val="24"/>
+          <w:szCs w:val="24"/>
+          <w:lang w:eastAsia="ru-RU"/>
+        </w:rPr>
+        <w:t>security</w:t>
+      </w:r>
+      <w:proofErr w:type="spellEnd"/>
+      <w:r>
+        <w:rPr>
+          <w:rFonts w:asciiTheme="majorHAnsi" w:eastAsia="Times New Roman" w:hAnsiTheme="majorHAnsi" w:cs="Times New Roman"/>
+          <w:sz w:val="24"/>
+          <w:szCs w:val="24"/>
+          <w:lang w:eastAsia="ru-RU"/>
+        </w:rPr>
+        <w:t xml:space="preserve"> </w:t>
+      </w:r>
+      <w:proofErr w:type="spellStart"/>
+      <w:r>
+        <w:rPr>
+          <w:rFonts w:asciiTheme="majorHAnsi" w:eastAsia="Times New Roman" w:hAnsiTheme="majorHAnsi" w:cs="Times New Roman"/>
+          <w:sz w:val="24"/>
+          <w:szCs w:val="24"/>
+          <w:lang w:eastAsia="ru-RU"/>
+        </w:rPr>
+        <w:t>reports</w:t>
+      </w:r>
+      <w:proofErr w:type="spellEnd"/>
+      <w:r>
+        <w:rPr>
+          <w:rFonts w:asciiTheme="majorHAnsi" w:eastAsia="Times New Roman" w:hAnsiTheme="majorHAnsi" w:cs="Times New Roman"/>
+          <w:sz w:val="24"/>
+          <w:szCs w:val="24"/>
+          <w:lang w:eastAsia="ru-RU"/>
+        </w:rPr>
+        <w:t xml:space="preserve">; </w:t>
+      </w:r>
+    </w:p>
+    <w:p>
+      <w:pPr>
+        <w:numPr>
+          <w:ilvl w:val="0"/>
+          <w:numId w:val="2"/>
+        </w:numPr>
+        <w:spacing w:before="100" w:beforeAutospacing="1" w:after="100" w:afterAutospacing="1" w:line="240" w:lineRule="auto"/>
+        <w:rPr>
+          <w:rFonts w:asciiTheme="majorHAnsi" w:eastAsia="Times New Roman" w:hAnsiTheme="majorHAnsi" w:cs="Times New Roman"/>
+          <w:sz w:val="24"/>
+          <w:szCs w:val="24"/>
+          <w:lang w:val="en-US" w:eastAsia="ru-RU"/>
+        </w:rPr>
+      </w:pPr>
+      <w:r>
+        <w:rPr>
+          <w:rFonts w:asciiTheme="majorHAnsi" w:eastAsia="Times New Roman" w:hAnsiTheme="majorHAnsi" w:cs="Times New Roman"/>
+          <w:sz w:val="24"/>
+          <w:szCs w:val="24"/>
+          <w:lang w:val="en-US" w:eastAsia="ru-RU"/>
+        </w:rPr>
+        <w:t>P</w:t>
+      </w:r>
+      <w:r>
+        <w:rPr>
+          <w:rFonts w:asciiTheme="majorHAnsi" w:eastAsia="Times New Roman" w:hAnsiTheme="majorHAnsi" w:cs="Times New Roman"/>
+          <w:sz w:val="24"/>
+          <w:szCs w:val="24"/>
+          <w:lang w:val="en-US" w:eastAsia="ru-RU"/>
+        </w:rPr>
+        <w:t xml:space="preserve">ublic malware and threat reports; </w:t>
+      </w:r>
+    </w:p>
+    <w:p>
+      <w:pPr>
+        <w:numPr>
+          <w:ilvl w:val="0"/>
+          <w:numId w:val="2"/>
+        </w:numPr>
+        <w:spacing w:before="100" w:beforeAutospacing="1" w:after="100" w:afterAutospacing="1" w:line="240" w:lineRule="auto"/>
+        <w:rPr>
+          <w:rFonts w:asciiTheme="majorHAnsi" w:eastAsia="Times New Roman" w:hAnsiTheme="majorHAnsi" w:cs="Times New Roman"/>
+          <w:sz w:val="24"/>
+          <w:szCs w:val="24"/>
+          <w:lang w:eastAsia="ru-RU"/>
+        </w:rPr>
+      </w:pPr>
+      <w:r>
+        <w:rPr>
+          <w:rFonts w:asciiTheme="majorHAnsi" w:eastAsia="Times New Roman" w:hAnsiTheme="majorHAnsi" w:cs="Times New Roman"/>
+          <w:sz w:val="24"/>
+          <w:szCs w:val="24"/>
+          <w:lang w:val="en-US" w:eastAsia="ru-RU"/>
+        </w:rPr>
+        <w:t>S</w:t>
+      </w:r>
+      <w:proofErr w:type="spellStart"/>
+      <w:r>
+        <w:rPr>
+          <w:rFonts w:asciiTheme="majorHAnsi" w:eastAsia="Times New Roman" w:hAnsiTheme="majorHAnsi" w:cs="Times New Roman"/>
+          <w:sz w:val="24"/>
+          <w:szCs w:val="24"/>
+          <w:lang w:eastAsia="ru-RU"/>
+        </w:rPr>
+        <w:t>ecurity</w:t>
+      </w:r>
+      <w:proofErr w:type="spellEnd"/>
+      <w:r>
+        <w:rPr>
+          <w:rFonts w:asciiTheme="majorHAnsi" w:eastAsia="Times New Roman" w:hAnsiTheme="majorHAnsi" w:cs="Times New Roman"/>
+          <w:sz w:val="24"/>
+          <w:szCs w:val="24"/>
+          <w:lang w:eastAsia="ru-RU"/>
+        </w:rPr>
+        <w:t xml:space="preserve"> </w:t>
+      </w:r>
+      <w:proofErr w:type="spellStart"/>
+      <w:r>
+        <w:rPr>
+          <w:rFonts w:asciiTheme="majorHAnsi" w:eastAsia="Times New Roman" w:hAnsiTheme="majorHAnsi" w:cs="Times New Roman"/>
+          <w:sz w:val="24"/>
+          <w:szCs w:val="24"/>
+          <w:lang w:eastAsia="ru-RU"/>
+        </w:rPr>
+        <w:t>researchers</w:t>
+      </w:r>
+      <w:proofErr w:type="spellEnd"/>
+      <w:r>
+        <w:rPr>
+          <w:rFonts w:asciiTheme="majorHAnsi" w:eastAsia="Times New Roman" w:hAnsiTheme="majorHAnsi" w:cs="Times New Roman"/>
+          <w:sz w:val="24"/>
+          <w:szCs w:val="24"/>
+          <w:lang w:eastAsia="ru-RU"/>
+        </w:rPr>
+        <w:t xml:space="preserve">' </w:t>
+      </w:r>
+      <w:proofErr w:type="spellStart"/>
+      <w:r>
+        <w:rPr>
+          <w:rFonts w:asciiTheme="majorHAnsi" w:eastAsia="Times New Roman" w:hAnsiTheme="majorHAnsi" w:cs="Times New Roman"/>
+          <w:sz w:val="24"/>
+          <w:szCs w:val="24"/>
+          <w:lang w:eastAsia="ru-RU"/>
+        </w:rPr>
+        <w:t>publications</w:t>
+      </w:r>
+      <w:proofErr w:type="spellEnd"/>
+      <w:r>
+        <w:rPr>
+          <w:rFonts w:asciiTheme="majorHAnsi" w:eastAsia="Times New Roman" w:hAnsiTheme="majorHAnsi" w:cs="Times New Roman"/>
+          <w:sz w:val="24"/>
+          <w:szCs w:val="24"/>
+          <w:lang w:eastAsia="ru-RU"/>
+        </w:rPr>
+        <w:t xml:space="preserve">. </w:t>
+      </w:r>
+    </w:p>
+    <w:p>
+      <w:pPr>
+        <w:spacing w:before="100" w:beforeAutospacing="1" w:after="100" w:afterAutospacing="1" w:line="240" w:lineRule="auto"/>
+        <w:rPr>
+          <w:rFonts w:asciiTheme="majorHAnsi" w:eastAsia="Times New Roman" w:hAnsiTheme="majorHAnsi" w:cs="Times New Roman"/>
+          <w:sz w:val="24"/>
+          <w:szCs w:val="24"/>
+          <w:lang w:val="en-US" w:eastAsia="ru-RU"/>
+        </w:rPr>
+      </w:pPr>
+      <w:r>
+        <w:rPr>
+          <w:rFonts w:asciiTheme="majorHAnsi" w:eastAsia="Times New Roman" w:hAnsiTheme="majorHAnsi" w:cs="Times New Roman"/>
+          <w:sz w:val="24"/>
+          <w:szCs w:val="24"/>
+          <w:lang w:val="en-US" w:eastAsia="ru-RU"/>
+        </w:rPr>
+        <w:t>OSINT is useful because the information can be collected without direct access to the infrastructure being investigated.</w:t>
+      </w:r>
+    </w:p>
+    <w:p>
+      <w:pPr>
+        <w:spacing w:before="100" w:beforeAutospacing="1" w:after="100" w:afterAutospacing="1" w:line="240" w:lineRule="auto"/>
+        <w:rPr>
+          <w:rFonts w:asciiTheme="majorHAnsi" w:eastAsia="Times New Roman" w:hAnsiTheme="majorHAnsi" w:cs="Times New Roman"/>
+          <w:sz w:val="24"/>
+          <w:szCs w:val="24"/>
+          <w:lang w:val="en-US" w:eastAsia="ru-RU"/>
+        </w:rPr>
+      </w:pPr>
+      <w:r>
+        <w:rPr>
+          <w:rFonts w:asciiTheme="majorHAnsi" w:eastAsia="Times New Roman" w:hAnsiTheme="majorHAnsi" w:cs="Times New Roman"/>
+          <w:sz w:val="24"/>
+          <w:szCs w:val="24"/>
+          <w:lang w:val="en-US" w:eastAsia="ru-RU"/>
+        </w:rPr>
+        <w:t xml:space="preserve">For example, </w:t>
+      </w:r>
+      <w:proofErr w:type="spellStart"/>
+      <w:r>
+        <w:rPr>
+          <w:rFonts w:asciiTheme="majorHAnsi" w:eastAsia="Times New Roman" w:hAnsiTheme="majorHAnsi" w:cs="Times New Roman"/>
+          <w:sz w:val="24"/>
+          <w:szCs w:val="24"/>
+          <w:lang w:val="en-US" w:eastAsia="ru-RU"/>
+        </w:rPr>
+        <w:t>VirusTotal</w:t>
+      </w:r>
+      <w:proofErr w:type="spellEnd"/>
+      <w:r>
+        <w:rPr>
+          <w:rFonts w:asciiTheme="majorHAnsi" w:eastAsia="Times New Roman" w:hAnsiTheme="majorHAnsi" w:cs="Times New Roman"/>
+          <w:sz w:val="24"/>
+          <w:szCs w:val="24"/>
+          <w:lang w:val="en-US" w:eastAsia="ru-RU"/>
+        </w:rPr>
+        <w:t xml:space="preserve"> allows users to search for IP addresses, domains, URLs and file hashes and retrieve information associated with them. </w:t>
+      </w:r>
+    </w:p>
+    <w:p>
+      <w:pPr>
+        <w:spacing w:before="100" w:beforeAutospacing="1" w:after="100" w:afterAutospacing="1" w:line="240" w:lineRule="auto"/>
+        <w:rPr>
+          <w:rFonts w:asciiTheme="majorHAnsi" w:eastAsia="Times New Roman" w:hAnsiTheme="majorHAnsi" w:cs="Times New Roman"/>
+          <w:sz w:val="24"/>
+          <w:szCs w:val="24"/>
+          <w:lang w:val="en-US" w:eastAsia="ru-RU"/>
+        </w:rPr>
+      </w:pPr>
+      <w:proofErr w:type="spellStart"/>
+      <w:r>
+        <w:rPr>
+          <w:rFonts w:asciiTheme="majorHAnsi" w:eastAsia="Times New Roman" w:hAnsiTheme="majorHAnsi" w:cs="Times New Roman"/>
+          <w:sz w:val="24"/>
+          <w:szCs w:val="24"/>
+          <w:lang w:val="en-US" w:eastAsia="ru-RU"/>
+        </w:rPr>
+        <w:t>Maltego</w:t>
+      </w:r>
+      <w:proofErr w:type="spellEnd"/>
+      <w:r>
+        <w:rPr>
+          <w:rFonts w:asciiTheme="majorHAnsi" w:eastAsia="Times New Roman" w:hAnsiTheme="majorHAnsi" w:cs="Times New Roman"/>
+          <w:sz w:val="24"/>
+          <w:szCs w:val="24"/>
+          <w:lang w:val="en-US" w:eastAsia="ru-RU"/>
+        </w:rPr>
+        <w:t xml:space="preserve"> can also combine information from public sources and visualize relationships between domains, IP addresses, DNS names and other entities. </w:t>
+      </w:r>
+    </w:p>
+    <w:p>
+      <w:pPr>
+        <w:spacing w:before="100" w:beforeAutospacing="1" w:after="100" w:afterAutospacing="1" w:line="240" w:lineRule="auto"/>
+        <w:outlineLvl w:val="2"/>
+        <w:rPr>
+          <w:rFonts w:asciiTheme="majorHAnsi" w:eastAsia="Times New Roman" w:hAnsiTheme="majorHAnsi" w:cs="Times New Roman"/>
+          <w:b/>
+          <w:bCs/>
+          <w:sz w:val="27"/>
+          <w:szCs w:val="27"/>
+          <w:lang w:val="en-US" w:eastAsia="ru-RU"/>
+        </w:rPr>
+      </w:pPr>
+      <w:r>
+        <w:rPr>
+          <w:rFonts w:asciiTheme="majorHAnsi" w:eastAsia="Times New Roman" w:hAnsiTheme="majorHAnsi" w:cs="Times New Roman"/>
+          <w:b/>
+          <w:bCs/>
+          <w:sz w:val="27"/>
+          <w:szCs w:val="27"/>
+          <w:lang w:val="en-US" w:eastAsia="ru-RU"/>
+        </w:rPr>
+        <w:t>Closed-source data</w:t>
+      </w:r>
+    </w:p>
+    <w:p>
+      <w:pPr>
+        <w:spacing w:before="100" w:beforeAutospacing="1" w:after="100" w:afterAutospacing="1" w:line="240" w:lineRule="auto"/>
+        <w:rPr>
+          <w:rFonts w:asciiTheme="majorHAnsi" w:eastAsia="Times New Roman" w:hAnsiTheme="majorHAnsi" w:cs="Times New Roman"/>
+          <w:sz w:val="24"/>
+          <w:szCs w:val="24"/>
+          <w:lang w:val="en-US" w:eastAsia="ru-RU"/>
+        </w:rPr>
+      </w:pPr>
+      <w:r>
+        <w:rPr>
+          <w:rFonts w:asciiTheme="majorHAnsi" w:eastAsia="Times New Roman" w:hAnsiTheme="majorHAnsi" w:cs="Times New Roman"/>
+          <w:sz w:val="24"/>
+          <w:szCs w:val="24"/>
+          <w:lang w:val="en-US" w:eastAsia="ru-RU"/>
+        </w:rPr>
+        <w:lastRenderedPageBreak/>
+        <w:t>Closed-source data requires access to private or restricted information.</w:t>
+      </w:r>
+    </w:p>
+    <w:p>
+      <w:pPr>
+        <w:spacing w:before="100" w:beforeAutospacing="1" w:after="100" w:afterAutospacing="1" w:line="240" w:lineRule="auto"/>
+        <w:rPr>
+          <w:rFonts w:asciiTheme="majorHAnsi" w:eastAsia="Times New Roman" w:hAnsiTheme="majorHAnsi" w:cs="Times New Roman"/>
+          <w:sz w:val="24"/>
+          <w:szCs w:val="24"/>
+          <w:lang w:eastAsia="ru-RU"/>
+        </w:rPr>
+      </w:pPr>
+      <w:proofErr w:type="spellStart"/>
+      <w:r>
+        <w:rPr>
+          <w:rFonts w:asciiTheme="majorHAnsi" w:eastAsia="Times New Roman" w:hAnsiTheme="majorHAnsi" w:cs="Times New Roman"/>
+          <w:sz w:val="24"/>
+          <w:szCs w:val="24"/>
+          <w:lang w:eastAsia="ru-RU"/>
+        </w:rPr>
+        <w:t>Examples</w:t>
+      </w:r>
+      <w:proofErr w:type="spellEnd"/>
+      <w:r>
+        <w:rPr>
+          <w:rFonts w:asciiTheme="majorHAnsi" w:eastAsia="Times New Roman" w:hAnsiTheme="majorHAnsi" w:cs="Times New Roman"/>
+          <w:sz w:val="24"/>
+          <w:szCs w:val="24"/>
+          <w:lang w:eastAsia="ru-RU"/>
+        </w:rPr>
+        <w:t xml:space="preserve"> </w:t>
+      </w:r>
+      <w:proofErr w:type="spellStart"/>
+      <w:r>
+        <w:rPr>
+          <w:rFonts w:asciiTheme="majorHAnsi" w:eastAsia="Times New Roman" w:hAnsiTheme="majorHAnsi" w:cs="Times New Roman"/>
+          <w:sz w:val="24"/>
+          <w:szCs w:val="24"/>
+          <w:lang w:eastAsia="ru-RU"/>
+        </w:rPr>
+        <w:t>include</w:t>
+      </w:r>
+      <w:proofErr w:type="spellEnd"/>
+      <w:r>
+        <w:rPr>
+          <w:rFonts w:asciiTheme="majorHAnsi" w:eastAsia="Times New Roman" w:hAnsiTheme="majorHAnsi" w:cs="Times New Roman"/>
+          <w:sz w:val="24"/>
+          <w:szCs w:val="24"/>
+          <w:lang w:eastAsia="ru-RU"/>
+        </w:rPr>
+        <w:t>:</w:t>
+      </w:r>
+    </w:p>
+    <w:p>
+      <w:pPr>
+        <w:numPr>
+          <w:ilvl w:val="0"/>
+          <w:numId w:val="3"/>
+        </w:numPr>
+        <w:spacing w:before="100" w:beforeAutospacing="1" w:after="100" w:afterAutospacing="1" w:line="240" w:lineRule="auto"/>
+        <w:rPr>
+          <w:rFonts w:asciiTheme="majorHAnsi" w:eastAsia="Times New Roman" w:hAnsiTheme="majorHAnsi" w:cs="Times New Roman"/>
+          <w:sz w:val="24"/>
+          <w:szCs w:val="24"/>
+          <w:lang w:eastAsia="ru-RU"/>
+        </w:rPr>
+      </w:pPr>
+      <w:r>
+        <w:rPr>
+          <w:rFonts w:asciiTheme="majorHAnsi" w:eastAsia="Times New Roman" w:hAnsiTheme="majorHAnsi" w:cs="Times New Roman"/>
+          <w:sz w:val="24"/>
+          <w:szCs w:val="24"/>
+          <w:lang w:eastAsia="ru-RU"/>
+        </w:rPr>
+        <w:t xml:space="preserve">ISP </w:t>
+      </w:r>
+      <w:proofErr w:type="spellStart"/>
+      <w:r>
+        <w:rPr>
+          <w:rFonts w:asciiTheme="majorHAnsi" w:eastAsia="Times New Roman" w:hAnsiTheme="majorHAnsi" w:cs="Times New Roman"/>
+          <w:sz w:val="24"/>
+          <w:szCs w:val="24"/>
+          <w:lang w:eastAsia="ru-RU"/>
+        </w:rPr>
+        <w:t>network</w:t>
+      </w:r>
+      <w:proofErr w:type="spellEnd"/>
+      <w:r>
+        <w:rPr>
+          <w:rFonts w:asciiTheme="majorHAnsi" w:eastAsia="Times New Roman" w:hAnsiTheme="majorHAnsi" w:cs="Times New Roman"/>
+          <w:sz w:val="24"/>
+          <w:szCs w:val="24"/>
+          <w:lang w:eastAsia="ru-RU"/>
+        </w:rPr>
+        <w:t xml:space="preserve"> </w:t>
+      </w:r>
+      <w:proofErr w:type="spellStart"/>
+      <w:r>
+        <w:rPr>
+          <w:rFonts w:asciiTheme="majorHAnsi" w:eastAsia="Times New Roman" w:hAnsiTheme="majorHAnsi" w:cs="Times New Roman"/>
+          <w:sz w:val="24"/>
+          <w:szCs w:val="24"/>
+          <w:lang w:eastAsia="ru-RU"/>
+        </w:rPr>
+        <w:t>logs</w:t>
+      </w:r>
+      <w:proofErr w:type="spellEnd"/>
+      <w:r>
+        <w:rPr>
+          <w:rFonts w:asciiTheme="majorHAnsi" w:eastAsia="Times New Roman" w:hAnsiTheme="majorHAnsi" w:cs="Times New Roman"/>
+          <w:sz w:val="24"/>
+          <w:szCs w:val="24"/>
+          <w:lang w:eastAsia="ru-RU"/>
+        </w:rPr>
+        <w:t xml:space="preserve">; </w:t>
+      </w:r>
+    </w:p>
+    <w:p>
+      <w:pPr>
+        <w:numPr>
+          <w:ilvl w:val="0"/>
+          <w:numId w:val="3"/>
+        </w:numPr>
+        <w:spacing w:before="100" w:beforeAutospacing="1" w:after="100" w:afterAutospacing="1" w:line="240" w:lineRule="auto"/>
+        <w:rPr>
+          <w:rFonts w:asciiTheme="majorHAnsi" w:eastAsia="Times New Roman" w:hAnsiTheme="majorHAnsi" w:cs="Times New Roman"/>
+          <w:sz w:val="24"/>
+          <w:szCs w:val="24"/>
+          <w:lang w:eastAsia="ru-RU"/>
+        </w:rPr>
+      </w:pPr>
+      <w:proofErr w:type="spellStart"/>
+      <w:r>
+        <w:rPr>
+          <w:rFonts w:asciiTheme="majorHAnsi" w:eastAsia="Times New Roman" w:hAnsiTheme="majorHAnsi" w:cs="Times New Roman"/>
+          <w:sz w:val="24"/>
+          <w:szCs w:val="24"/>
+          <w:lang w:eastAsia="ru-RU"/>
+        </w:rPr>
+        <w:t>firewall</w:t>
+      </w:r>
+      <w:proofErr w:type="spellEnd"/>
+      <w:r>
+        <w:rPr>
+          <w:rFonts w:asciiTheme="majorHAnsi" w:eastAsia="Times New Roman" w:hAnsiTheme="majorHAnsi" w:cs="Times New Roman"/>
+          <w:sz w:val="24"/>
+          <w:szCs w:val="24"/>
+          <w:lang w:eastAsia="ru-RU"/>
+        </w:rPr>
+        <w:t xml:space="preserve"> </w:t>
+      </w:r>
+      <w:proofErr w:type="spellStart"/>
+      <w:r>
+        <w:rPr>
+          <w:rFonts w:asciiTheme="majorHAnsi" w:eastAsia="Times New Roman" w:hAnsiTheme="majorHAnsi" w:cs="Times New Roman"/>
+          <w:sz w:val="24"/>
+          <w:szCs w:val="24"/>
+          <w:lang w:eastAsia="ru-RU"/>
+        </w:rPr>
+        <w:t>logs</w:t>
+      </w:r>
+      <w:proofErr w:type="spellEnd"/>
+      <w:r>
+        <w:rPr>
+          <w:rFonts w:asciiTheme="majorHAnsi" w:eastAsia="Times New Roman" w:hAnsiTheme="majorHAnsi" w:cs="Times New Roman"/>
+          <w:sz w:val="24"/>
+          <w:szCs w:val="24"/>
+          <w:lang w:eastAsia="ru-RU"/>
+        </w:rPr>
+        <w:t xml:space="preserve">; </w:t>
+      </w:r>
+    </w:p>
+    <w:p>
+      <w:pPr>
+        <w:numPr>
+          <w:ilvl w:val="0"/>
+          <w:numId w:val="3"/>
+        </w:numPr>
+        <w:spacing w:before="100" w:beforeAutospacing="1" w:after="100" w:afterAutospacing="1" w:line="240" w:lineRule="auto"/>
+        <w:rPr>
+          <w:rFonts w:asciiTheme="majorHAnsi" w:eastAsia="Times New Roman" w:hAnsiTheme="majorHAnsi" w:cs="Times New Roman"/>
+          <w:sz w:val="24"/>
+          <w:szCs w:val="24"/>
+          <w:lang w:eastAsia="ru-RU"/>
+        </w:rPr>
+      </w:pPr>
+      <w:r>
+        <w:rPr>
+          <w:rFonts w:asciiTheme="majorHAnsi" w:eastAsia="Times New Roman" w:hAnsiTheme="majorHAnsi" w:cs="Times New Roman"/>
+          <w:sz w:val="24"/>
+          <w:szCs w:val="24"/>
+          <w:lang w:val="en-US" w:eastAsia="ru-RU"/>
+        </w:rPr>
+        <w:t>I</w:t>
+      </w:r>
+      <w:proofErr w:type="spellStart"/>
+      <w:r>
+        <w:rPr>
+          <w:rFonts w:asciiTheme="majorHAnsi" w:eastAsia="Times New Roman" w:hAnsiTheme="majorHAnsi" w:cs="Times New Roman"/>
+          <w:sz w:val="24"/>
+          <w:szCs w:val="24"/>
+          <w:lang w:eastAsia="ru-RU"/>
+        </w:rPr>
+        <w:t>nternal</w:t>
+      </w:r>
+      <w:proofErr w:type="spellEnd"/>
+      <w:r>
+        <w:rPr>
+          <w:rFonts w:asciiTheme="majorHAnsi" w:eastAsia="Times New Roman" w:hAnsiTheme="majorHAnsi" w:cs="Times New Roman"/>
+          <w:sz w:val="24"/>
+          <w:szCs w:val="24"/>
+          <w:lang w:eastAsia="ru-RU"/>
+        </w:rPr>
+        <w:t xml:space="preserve"> SIEM </w:t>
+      </w:r>
+      <w:proofErr w:type="spellStart"/>
+      <w:r>
+        <w:rPr>
+          <w:rFonts w:asciiTheme="majorHAnsi" w:eastAsia="Times New Roman" w:hAnsiTheme="majorHAnsi" w:cs="Times New Roman"/>
+          <w:sz w:val="24"/>
+          <w:szCs w:val="24"/>
+          <w:lang w:eastAsia="ru-RU"/>
+        </w:rPr>
+        <w:t>data</w:t>
+      </w:r>
+      <w:proofErr w:type="spellEnd"/>
+      <w:r>
+        <w:rPr>
+          <w:rFonts w:asciiTheme="majorHAnsi" w:eastAsia="Times New Roman" w:hAnsiTheme="majorHAnsi" w:cs="Times New Roman"/>
+          <w:sz w:val="24"/>
+          <w:szCs w:val="24"/>
+          <w:lang w:eastAsia="ru-RU"/>
+        </w:rPr>
+        <w:t xml:space="preserve">; </w:t>
+      </w:r>
+    </w:p>
+    <w:p>
+      <w:pPr>
+        <w:numPr>
+          <w:ilvl w:val="0"/>
+          <w:numId w:val="3"/>
+        </w:numPr>
+        <w:spacing w:before="100" w:beforeAutospacing="1" w:after="100" w:afterAutospacing="1" w:line="240" w:lineRule="auto"/>
+        <w:rPr>
+          <w:rFonts w:asciiTheme="majorHAnsi" w:eastAsia="Times New Roman" w:hAnsiTheme="majorHAnsi" w:cs="Times New Roman"/>
+          <w:sz w:val="24"/>
+          <w:szCs w:val="24"/>
+          <w:lang w:eastAsia="ru-RU"/>
+        </w:rPr>
+      </w:pPr>
+      <w:proofErr w:type="spellStart"/>
+      <w:r>
+        <w:rPr>
+          <w:rFonts w:asciiTheme="majorHAnsi" w:eastAsia="Times New Roman" w:hAnsiTheme="majorHAnsi" w:cs="Times New Roman"/>
+          <w:sz w:val="24"/>
+          <w:szCs w:val="24"/>
+          <w:lang w:eastAsia="ru-RU"/>
+        </w:rPr>
+        <w:t>NetFlow</w:t>
+      </w:r>
+      <w:proofErr w:type="spellEnd"/>
+      <w:r>
+        <w:rPr>
+          <w:rFonts w:asciiTheme="majorHAnsi" w:eastAsia="Times New Roman" w:hAnsiTheme="majorHAnsi" w:cs="Times New Roman"/>
+          <w:sz w:val="24"/>
+          <w:szCs w:val="24"/>
+          <w:lang w:eastAsia="ru-RU"/>
+        </w:rPr>
+        <w:t xml:space="preserve"> </w:t>
+      </w:r>
+      <w:proofErr w:type="spellStart"/>
+      <w:r>
+        <w:rPr>
+          <w:rFonts w:asciiTheme="majorHAnsi" w:eastAsia="Times New Roman" w:hAnsiTheme="majorHAnsi" w:cs="Times New Roman"/>
+          <w:sz w:val="24"/>
+          <w:szCs w:val="24"/>
+          <w:lang w:eastAsia="ru-RU"/>
+        </w:rPr>
+        <w:t>records</w:t>
+      </w:r>
+      <w:proofErr w:type="spellEnd"/>
+      <w:r>
+        <w:rPr>
+          <w:rFonts w:asciiTheme="majorHAnsi" w:eastAsia="Times New Roman" w:hAnsiTheme="majorHAnsi" w:cs="Times New Roman"/>
+          <w:sz w:val="24"/>
+          <w:szCs w:val="24"/>
+          <w:lang w:eastAsia="ru-RU"/>
+        </w:rPr>
+        <w:t xml:space="preserve">; </w:t>
+      </w:r>
+    </w:p>
+    <w:p>
+      <w:pPr>
+        <w:numPr>
+          <w:ilvl w:val="0"/>
+          <w:numId w:val="3"/>
+        </w:numPr>
+        <w:spacing w:before="100" w:beforeAutospacing="1" w:after="100" w:afterAutospacing="1" w:line="240" w:lineRule="auto"/>
+        <w:rPr>
+          <w:rFonts w:asciiTheme="majorHAnsi" w:eastAsia="Times New Roman" w:hAnsiTheme="majorHAnsi" w:cs="Times New Roman"/>
+          <w:sz w:val="24"/>
+          <w:szCs w:val="24"/>
+          <w:lang w:eastAsia="ru-RU"/>
+        </w:rPr>
+      </w:pPr>
+      <w:r>
+        <w:rPr>
+          <w:rFonts w:asciiTheme="majorHAnsi" w:eastAsia="Times New Roman" w:hAnsiTheme="majorHAnsi" w:cs="Times New Roman"/>
+          <w:sz w:val="24"/>
+          <w:szCs w:val="24"/>
+          <w:lang w:eastAsia="ru-RU"/>
+        </w:rPr>
+        <w:t xml:space="preserve">IDS/IPS </w:t>
+      </w:r>
+      <w:proofErr w:type="spellStart"/>
+      <w:r>
+        <w:rPr>
+          <w:rFonts w:asciiTheme="majorHAnsi" w:eastAsia="Times New Roman" w:hAnsiTheme="majorHAnsi" w:cs="Times New Roman"/>
+          <w:sz w:val="24"/>
+          <w:szCs w:val="24"/>
+          <w:lang w:eastAsia="ru-RU"/>
+        </w:rPr>
+        <w:t>alerts</w:t>
+      </w:r>
+      <w:proofErr w:type="spellEnd"/>
+      <w:r>
+        <w:rPr>
+          <w:rFonts w:asciiTheme="majorHAnsi" w:eastAsia="Times New Roman" w:hAnsiTheme="majorHAnsi" w:cs="Times New Roman"/>
+          <w:sz w:val="24"/>
+          <w:szCs w:val="24"/>
+          <w:lang w:eastAsia="ru-RU"/>
+        </w:rPr>
+        <w:t xml:space="preserve">; </w:t>
+      </w:r>
+    </w:p>
+    <w:p>
+      <w:pPr>
+        <w:numPr>
+          <w:ilvl w:val="0"/>
+          <w:numId w:val="3"/>
+        </w:numPr>
+        <w:spacing w:before="100" w:beforeAutospacing="1" w:after="100" w:afterAutospacing="1" w:line="240" w:lineRule="auto"/>
+        <w:rPr>
+          <w:rFonts w:asciiTheme="majorHAnsi" w:eastAsia="Times New Roman" w:hAnsiTheme="majorHAnsi" w:cs="Times New Roman"/>
+          <w:sz w:val="24"/>
+          <w:szCs w:val="24"/>
+          <w:lang w:eastAsia="ru-RU"/>
+        </w:rPr>
+      </w:pPr>
+      <w:r>
+        <w:rPr>
+          <w:rFonts w:asciiTheme="majorHAnsi" w:eastAsia="Times New Roman" w:hAnsiTheme="majorHAnsi" w:cs="Times New Roman"/>
+          <w:sz w:val="24"/>
+          <w:szCs w:val="24"/>
+          <w:lang w:val="en-US" w:eastAsia="ru-RU"/>
+        </w:rPr>
+        <w:t>P</w:t>
+      </w:r>
+      <w:proofErr w:type="spellStart"/>
+      <w:r>
+        <w:rPr>
+          <w:rFonts w:asciiTheme="majorHAnsi" w:eastAsia="Times New Roman" w:hAnsiTheme="majorHAnsi" w:cs="Times New Roman"/>
+          <w:sz w:val="24"/>
+          <w:szCs w:val="24"/>
+          <w:lang w:eastAsia="ru-RU"/>
+        </w:rPr>
+        <w:t>rivate</w:t>
+      </w:r>
+      <w:proofErr w:type="spellEnd"/>
+      <w:r>
+        <w:rPr>
+          <w:rFonts w:asciiTheme="majorHAnsi" w:eastAsia="Times New Roman" w:hAnsiTheme="majorHAnsi" w:cs="Times New Roman"/>
+          <w:sz w:val="24"/>
+          <w:szCs w:val="24"/>
+          <w:lang w:eastAsia="ru-RU"/>
+        </w:rPr>
+        <w:t xml:space="preserve"> </w:t>
+      </w:r>
+      <w:proofErr w:type="spellStart"/>
+      <w:r>
+        <w:rPr>
+          <w:rFonts w:asciiTheme="majorHAnsi" w:eastAsia="Times New Roman" w:hAnsiTheme="majorHAnsi" w:cs="Times New Roman"/>
+          <w:sz w:val="24"/>
+          <w:szCs w:val="24"/>
+          <w:lang w:eastAsia="ru-RU"/>
+        </w:rPr>
+        <w:t>threat</w:t>
+      </w:r>
+      <w:proofErr w:type="spellEnd"/>
+      <w:r>
+        <w:rPr>
+          <w:rFonts w:asciiTheme="majorHAnsi" w:eastAsia="Times New Roman" w:hAnsiTheme="majorHAnsi" w:cs="Times New Roman"/>
+          <w:sz w:val="24"/>
+          <w:szCs w:val="24"/>
+          <w:lang w:eastAsia="ru-RU"/>
+        </w:rPr>
+        <w:t xml:space="preserve"> </w:t>
+      </w:r>
+      <w:proofErr w:type="spellStart"/>
+      <w:r>
+        <w:rPr>
+          <w:rFonts w:asciiTheme="majorHAnsi" w:eastAsia="Times New Roman" w:hAnsiTheme="majorHAnsi" w:cs="Times New Roman"/>
+          <w:sz w:val="24"/>
+          <w:szCs w:val="24"/>
+          <w:lang w:eastAsia="ru-RU"/>
+        </w:rPr>
+        <w:t>intelligence</w:t>
+      </w:r>
+      <w:proofErr w:type="spellEnd"/>
+      <w:r>
+        <w:rPr>
+          <w:rFonts w:asciiTheme="majorHAnsi" w:eastAsia="Times New Roman" w:hAnsiTheme="majorHAnsi" w:cs="Times New Roman"/>
+          <w:sz w:val="24"/>
+          <w:szCs w:val="24"/>
+          <w:lang w:eastAsia="ru-RU"/>
+        </w:rPr>
+        <w:t xml:space="preserve"> </w:t>
+      </w:r>
+      <w:proofErr w:type="spellStart"/>
+      <w:r>
+        <w:rPr>
+          <w:rFonts w:asciiTheme="majorHAnsi" w:eastAsia="Times New Roman" w:hAnsiTheme="majorHAnsi" w:cs="Times New Roman"/>
+          <w:sz w:val="24"/>
+          <w:szCs w:val="24"/>
+          <w:lang w:eastAsia="ru-RU"/>
+        </w:rPr>
+        <w:t>feeds</w:t>
+      </w:r>
+      <w:proofErr w:type="spellEnd"/>
+      <w:r>
+        <w:rPr>
+          <w:rFonts w:asciiTheme="majorHAnsi" w:eastAsia="Times New Roman" w:hAnsiTheme="majorHAnsi" w:cs="Times New Roman"/>
+          <w:sz w:val="24"/>
+          <w:szCs w:val="24"/>
+          <w:lang w:eastAsia="ru-RU"/>
+        </w:rPr>
+        <w:t xml:space="preserve">; </w:t>
+      </w:r>
+    </w:p>
+    <w:p>
+      <w:pPr>
+        <w:numPr>
+          <w:ilvl w:val="0"/>
+          <w:numId w:val="3"/>
+        </w:numPr>
+        <w:spacing w:before="100" w:beforeAutospacing="1" w:after="100" w:afterAutospacing="1" w:line="240" w:lineRule="auto"/>
+        <w:rPr>
+          <w:rFonts w:asciiTheme="majorHAnsi" w:eastAsia="Times New Roman" w:hAnsiTheme="majorHAnsi" w:cs="Times New Roman"/>
+          <w:sz w:val="24"/>
+          <w:szCs w:val="24"/>
+          <w:lang w:eastAsia="ru-RU"/>
+        </w:rPr>
+      </w:pPr>
+      <w:proofErr w:type="spellStart"/>
+      <w:r>
+        <w:rPr>
+          <w:rFonts w:asciiTheme="majorHAnsi" w:eastAsia="Times New Roman" w:hAnsiTheme="majorHAnsi" w:cs="Times New Roman"/>
+          <w:sz w:val="24"/>
+          <w:szCs w:val="24"/>
+          <w:lang w:eastAsia="ru-RU"/>
+        </w:rPr>
+        <w:t>DDoS</w:t>
+      </w:r>
+      <w:proofErr w:type="spellEnd"/>
+      <w:r>
+        <w:rPr>
+          <w:rFonts w:asciiTheme="majorHAnsi" w:eastAsia="Times New Roman" w:hAnsiTheme="majorHAnsi" w:cs="Times New Roman"/>
+          <w:sz w:val="24"/>
+          <w:szCs w:val="24"/>
+          <w:lang w:eastAsia="ru-RU"/>
+        </w:rPr>
+        <w:t xml:space="preserve"> </w:t>
+      </w:r>
+      <w:proofErr w:type="spellStart"/>
+      <w:r>
+        <w:rPr>
+          <w:rFonts w:asciiTheme="majorHAnsi" w:eastAsia="Times New Roman" w:hAnsiTheme="majorHAnsi" w:cs="Times New Roman"/>
+          <w:sz w:val="24"/>
+          <w:szCs w:val="24"/>
+          <w:lang w:eastAsia="ru-RU"/>
+        </w:rPr>
+        <w:t>mitigation</w:t>
+      </w:r>
+      <w:proofErr w:type="spellEnd"/>
+      <w:r>
+        <w:rPr>
+          <w:rFonts w:asciiTheme="majorHAnsi" w:eastAsia="Times New Roman" w:hAnsiTheme="majorHAnsi" w:cs="Times New Roman"/>
+          <w:sz w:val="24"/>
+          <w:szCs w:val="24"/>
+          <w:lang w:eastAsia="ru-RU"/>
+        </w:rPr>
+        <w:t xml:space="preserve"> </w:t>
+      </w:r>
+      <w:proofErr w:type="spellStart"/>
+      <w:r>
+        <w:rPr>
+          <w:rFonts w:asciiTheme="majorHAnsi" w:eastAsia="Times New Roman" w:hAnsiTheme="majorHAnsi" w:cs="Times New Roman"/>
+          <w:sz w:val="24"/>
+          <w:szCs w:val="24"/>
+          <w:lang w:eastAsia="ru-RU"/>
+        </w:rPr>
+        <w:t>provider</w:t>
+      </w:r>
+      <w:proofErr w:type="spellEnd"/>
+      <w:r>
+        <w:rPr>
+          <w:rFonts w:asciiTheme="majorHAnsi" w:eastAsia="Times New Roman" w:hAnsiTheme="majorHAnsi" w:cs="Times New Roman"/>
+          <w:sz w:val="24"/>
+          <w:szCs w:val="24"/>
+          <w:lang w:eastAsia="ru-RU"/>
+        </w:rPr>
+        <w:t xml:space="preserve"> </w:t>
+      </w:r>
+      <w:proofErr w:type="spellStart"/>
+      <w:r>
+        <w:rPr>
+          <w:rFonts w:asciiTheme="majorHAnsi" w:eastAsia="Times New Roman" w:hAnsiTheme="majorHAnsi" w:cs="Times New Roman"/>
+          <w:sz w:val="24"/>
+          <w:szCs w:val="24"/>
+          <w:lang w:eastAsia="ru-RU"/>
+        </w:rPr>
+        <w:t>telemetry</w:t>
+      </w:r>
+      <w:proofErr w:type="spellEnd"/>
+      <w:r>
+        <w:rPr>
+          <w:rFonts w:asciiTheme="majorHAnsi" w:eastAsia="Times New Roman" w:hAnsiTheme="majorHAnsi" w:cs="Times New Roman"/>
+          <w:sz w:val="24"/>
+          <w:szCs w:val="24"/>
+          <w:lang w:eastAsia="ru-RU"/>
+        </w:rPr>
+        <w:t xml:space="preserve">; </w:t>
+      </w:r>
+    </w:p>
+    <w:p>
+      <w:pPr>
+        <w:numPr>
+          <w:ilvl w:val="0"/>
+          <w:numId w:val="3"/>
+        </w:numPr>
+        <w:spacing w:before="100" w:beforeAutospacing="1" w:after="100" w:afterAutospacing="1" w:line="240" w:lineRule="auto"/>
+        <w:rPr>
+          <w:rFonts w:asciiTheme="majorHAnsi" w:eastAsia="Times New Roman" w:hAnsiTheme="majorHAnsi" w:cs="Times New Roman"/>
+          <w:sz w:val="24"/>
+          <w:szCs w:val="24"/>
+          <w:lang w:eastAsia="ru-RU"/>
+        </w:rPr>
+      </w:pPr>
+      <w:r>
+        <w:rPr>
+          <w:rFonts w:asciiTheme="majorHAnsi" w:eastAsia="Times New Roman" w:hAnsiTheme="majorHAnsi" w:cs="Times New Roman"/>
+          <w:sz w:val="24"/>
+          <w:szCs w:val="24"/>
+          <w:lang w:val="en-US" w:eastAsia="ru-RU"/>
+        </w:rPr>
+        <w:t>I</w:t>
+      </w:r>
+      <w:proofErr w:type="spellStart"/>
+      <w:r>
+        <w:rPr>
+          <w:rFonts w:asciiTheme="majorHAnsi" w:eastAsia="Times New Roman" w:hAnsiTheme="majorHAnsi" w:cs="Times New Roman"/>
+          <w:sz w:val="24"/>
+          <w:szCs w:val="24"/>
+          <w:lang w:eastAsia="ru-RU"/>
+        </w:rPr>
+        <w:t>nternal</w:t>
+      </w:r>
+      <w:proofErr w:type="spellEnd"/>
+      <w:r>
+        <w:rPr>
+          <w:rFonts w:asciiTheme="majorHAnsi" w:eastAsia="Times New Roman" w:hAnsiTheme="majorHAnsi" w:cs="Times New Roman"/>
+          <w:sz w:val="24"/>
+          <w:szCs w:val="24"/>
+          <w:lang w:eastAsia="ru-RU"/>
+        </w:rPr>
+        <w:t xml:space="preserve"> </w:t>
+      </w:r>
+      <w:proofErr w:type="spellStart"/>
+      <w:r>
+        <w:rPr>
+          <w:rFonts w:asciiTheme="majorHAnsi" w:eastAsia="Times New Roman" w:hAnsiTheme="majorHAnsi" w:cs="Times New Roman"/>
+          <w:sz w:val="24"/>
+          <w:szCs w:val="24"/>
+          <w:lang w:eastAsia="ru-RU"/>
+        </w:rPr>
+        <w:t>incident</w:t>
+      </w:r>
+      <w:proofErr w:type="spellEnd"/>
+      <w:r>
+        <w:rPr>
+          <w:rFonts w:asciiTheme="majorHAnsi" w:eastAsia="Times New Roman" w:hAnsiTheme="majorHAnsi" w:cs="Times New Roman"/>
+          <w:sz w:val="24"/>
+          <w:szCs w:val="24"/>
+          <w:lang w:eastAsia="ru-RU"/>
+        </w:rPr>
+        <w:t xml:space="preserve"> </w:t>
+      </w:r>
+      <w:proofErr w:type="spellStart"/>
+      <w:r>
+        <w:rPr>
+          <w:rFonts w:asciiTheme="majorHAnsi" w:eastAsia="Times New Roman" w:hAnsiTheme="majorHAnsi" w:cs="Times New Roman"/>
+          <w:sz w:val="24"/>
+          <w:szCs w:val="24"/>
+          <w:lang w:eastAsia="ru-RU"/>
+        </w:rPr>
+        <w:t>reports</w:t>
+      </w:r>
+      <w:proofErr w:type="spellEnd"/>
+      <w:r>
+        <w:rPr>
+          <w:rFonts w:asciiTheme="majorHAnsi" w:eastAsia="Times New Roman" w:hAnsiTheme="majorHAnsi" w:cs="Times New Roman"/>
+          <w:sz w:val="24"/>
+          <w:szCs w:val="24"/>
+          <w:lang w:eastAsia="ru-RU"/>
+        </w:rPr>
+        <w:t xml:space="preserve">. </w:t>
+      </w:r>
+    </w:p>
+    <w:p>
+      <w:pPr>
+        <w:spacing w:before="100" w:beforeAutospacing="1" w:after="100" w:afterAutospacing="1" w:line="240" w:lineRule="auto"/>
+        <w:rPr>
+          <w:rFonts w:asciiTheme="majorHAnsi" w:eastAsia="Times New Roman" w:hAnsiTheme="majorHAnsi" w:cs="Times New Roman"/>
+          <w:sz w:val="24"/>
+          <w:szCs w:val="24"/>
+          <w:lang w:val="en-US" w:eastAsia="ru-RU"/>
+        </w:rPr>
+      </w:pPr>
+      <w:r>
+        <w:rPr>
+          <w:rFonts w:asciiTheme="majorHAnsi" w:eastAsia="Times New Roman" w:hAnsiTheme="majorHAnsi" w:cs="Times New Roman"/>
+          <w:sz w:val="24"/>
+          <w:szCs w:val="24"/>
+          <w:lang w:val="en-US" w:eastAsia="ru-RU"/>
+        </w:rPr>
+        <w:t>This type of data can provide much more detailed information about an actual attack, but it is normally unavailable to an external researcher.</w:t>
+      </w:r>
+    </w:p>
+    <w:p>
+      <w:pPr>
+        <w:spacing w:before="100" w:beforeAutospacing="1" w:after="100" w:afterAutospacing="1" w:line="240" w:lineRule="auto"/>
+        <w:outlineLvl w:val="2"/>
+        <w:rPr>
+          <w:rFonts w:asciiTheme="majorHAnsi" w:eastAsia="Times New Roman" w:hAnsiTheme="majorHAnsi" w:cs="Times New Roman"/>
+          <w:b/>
+          <w:bCs/>
+          <w:sz w:val="27"/>
+          <w:szCs w:val="27"/>
+          <w:lang w:eastAsia="ru-RU"/>
+        </w:rPr>
+      </w:pPr>
+      <w:proofErr w:type="spellStart"/>
+      <w:r>
+        <w:rPr>
+          <w:rFonts w:asciiTheme="majorHAnsi" w:eastAsia="Times New Roman" w:hAnsiTheme="majorHAnsi" w:cs="Times New Roman"/>
+          <w:b/>
+          <w:bCs/>
+          <w:sz w:val="27"/>
+          <w:szCs w:val="27"/>
+          <w:lang w:eastAsia="ru-RU"/>
+        </w:rPr>
+        <w:t>Comparison</w:t>
+      </w:r>
+      <w:proofErr w:type="spellEnd"/>
+    </w:p>
+    <w:tbl>
+      <w:tblPr>
+        <w:tblStyle w:val="a3"/>
+        <w:tblW w:w="0" w:type="auto"/>
+        <w:tblLook w:val="04A0" w:firstRow="1" w:lastRow="0" w:firstColumn="1" w:lastColumn="0" w:noHBand="0" w:noVBand="1"/>
+      </w:tblPr>
+      <w:tblGrid>
+        <w:gridCol w:w="2039"/>
+        <w:gridCol w:w="3007"/>
+        <w:gridCol w:w="2814"/>
+      </w:tblGrid>
+      <w:tr>
+        <w:tc>
+          <w:tcPr>
+            <w:tcW w:w="2039" w:type="dxa"/>
+            <w:shd w:val="clear" w:color="auto" w:fill="8DB3E2" w:themeFill="text2" w:themeFillTint="66"/>
+            <w:hideMark/>
+          </w:tcPr>
+          <w:p>
+            <w:pPr>
+              <w:jc w:val="center"/>
+              <w:rPr>
+                <w:rFonts w:asciiTheme="majorHAnsi" w:eastAsia="Times New Roman" w:hAnsiTheme="majorHAnsi" w:cs="Times New Roman"/>
+                <w:b/>
+                <w:bCs/>
+                <w:sz w:val="24"/>
+                <w:szCs w:val="24"/>
+                <w:lang w:eastAsia="ru-RU"/>
+              </w:rPr>
+            </w:pPr>
+            <w:proofErr w:type="spellStart"/>
+            <w:r>
+              <w:rPr>
+                <w:rFonts w:asciiTheme="majorHAnsi" w:eastAsia="Times New Roman" w:hAnsiTheme="majorHAnsi" w:cs="Times New Roman"/>
+                <w:b/>
+                <w:bCs/>
+                <w:sz w:val="24"/>
+                <w:szCs w:val="24"/>
+                <w:lang w:eastAsia="ru-RU"/>
+              </w:rPr>
+              <w:t>Feature</w:t>
+            </w:r>
+            <w:proofErr w:type="spellEnd"/>
+          </w:p>
+        </w:tc>
+        <w:tc>
+          <w:tcPr>
+            <w:tcW w:w="3007" w:type="dxa"/>
+            <w:shd w:val="clear" w:color="auto" w:fill="D99594" w:themeFill="accent2" w:themeFillTint="99"/>
+            <w:hideMark/>
+          </w:tcPr>
+          <w:p>
+            <w:pPr>
+              <w:jc w:val="center"/>
+              <w:rPr>
+                <w:rFonts w:asciiTheme="majorHAnsi" w:eastAsia="Times New Roman" w:hAnsiTheme="majorHAnsi" w:cs="Times New Roman"/>
+                <w:b/>
+                <w:bCs/>
+                <w:sz w:val="24"/>
+                <w:szCs w:val="24"/>
+                <w:lang w:eastAsia="ru-RU"/>
+              </w:rPr>
+            </w:pPr>
+            <w:proofErr w:type="spellStart"/>
+            <w:r>
+              <w:rPr>
+                <w:rFonts w:asciiTheme="majorHAnsi" w:eastAsia="Times New Roman" w:hAnsiTheme="majorHAnsi" w:cs="Times New Roman"/>
+                <w:b/>
+                <w:bCs/>
+                <w:sz w:val="24"/>
+                <w:szCs w:val="24"/>
+                <w:lang w:eastAsia="ru-RU"/>
+              </w:rPr>
+              <w:t>Open</w:t>
+            </w:r>
+            <w:proofErr w:type="spellEnd"/>
+            <w:r>
+              <w:rPr>
+                <w:rFonts w:asciiTheme="majorHAnsi" w:eastAsia="Times New Roman" w:hAnsiTheme="majorHAnsi" w:cs="Times New Roman"/>
+                <w:b/>
+                <w:bCs/>
+                <w:sz w:val="24"/>
+                <w:szCs w:val="24"/>
+                <w:lang w:eastAsia="ru-RU"/>
+              </w:rPr>
+              <w:t xml:space="preserve"> </w:t>
+            </w:r>
+            <w:proofErr w:type="spellStart"/>
+            <w:r>
+              <w:rPr>
+                <w:rFonts w:asciiTheme="majorHAnsi" w:eastAsia="Times New Roman" w:hAnsiTheme="majorHAnsi" w:cs="Times New Roman"/>
+                <w:b/>
+                <w:bCs/>
+                <w:sz w:val="24"/>
+                <w:szCs w:val="24"/>
+                <w:lang w:eastAsia="ru-RU"/>
+              </w:rPr>
+              <w:t>Source</w:t>
+            </w:r>
+            <w:proofErr w:type="spellEnd"/>
+          </w:p>
+        </w:tc>
+        <w:tc>
+          <w:tcPr>
+            <w:tcW w:w="0" w:type="auto"/>
+            <w:shd w:val="clear" w:color="auto" w:fill="D99594" w:themeFill="accent2" w:themeFillTint="99"/>
+            <w:hideMark/>
+          </w:tcPr>
+          <w:p>
+            <w:pPr>
+              <w:jc w:val="center"/>
+              <w:rPr>
+                <w:rFonts w:asciiTheme="majorHAnsi" w:eastAsia="Times New Roman" w:hAnsiTheme="majorHAnsi" w:cs="Times New Roman"/>
+                <w:b/>
+                <w:bCs/>
+                <w:sz w:val="24"/>
+                <w:szCs w:val="24"/>
+                <w:lang w:eastAsia="ru-RU"/>
+              </w:rPr>
+            </w:pPr>
+            <w:proofErr w:type="spellStart"/>
+            <w:r>
+              <w:rPr>
+                <w:rFonts w:asciiTheme="majorHAnsi" w:eastAsia="Times New Roman" w:hAnsiTheme="majorHAnsi" w:cs="Times New Roman"/>
+                <w:b/>
+                <w:bCs/>
+                <w:sz w:val="24"/>
+                <w:szCs w:val="24"/>
+                <w:lang w:eastAsia="ru-RU"/>
+              </w:rPr>
+              <w:t>Closed</w:t>
+            </w:r>
+            <w:proofErr w:type="spellEnd"/>
+            <w:r>
+              <w:rPr>
+                <w:rFonts w:asciiTheme="majorHAnsi" w:eastAsia="Times New Roman" w:hAnsiTheme="majorHAnsi" w:cs="Times New Roman"/>
+                <w:b/>
+                <w:bCs/>
+                <w:sz w:val="24"/>
+                <w:szCs w:val="24"/>
+                <w:lang w:eastAsia="ru-RU"/>
+              </w:rPr>
+              <w:t xml:space="preserve"> </w:t>
+            </w:r>
+            <w:proofErr w:type="spellStart"/>
+            <w:r>
+              <w:rPr>
+                <w:rFonts w:asciiTheme="majorHAnsi" w:eastAsia="Times New Roman" w:hAnsiTheme="majorHAnsi" w:cs="Times New Roman"/>
+                <w:b/>
+                <w:bCs/>
+                <w:sz w:val="24"/>
+                <w:szCs w:val="24"/>
+                <w:lang w:eastAsia="ru-RU"/>
+              </w:rPr>
+              <w:t>Source</w:t>
+            </w:r>
+            <w:proofErr w:type="spellEnd"/>
+          </w:p>
+        </w:tc>
+      </w:tr>
+      <w:tr>
+        <w:tc>
+          <w:tcPr>
+            <w:tcW w:w="2039" w:type="dxa"/>
+            <w:shd w:val="clear" w:color="auto" w:fill="C6D9F1" w:themeFill="text2" w:themeFillTint="33"/>
+            <w:hideMark/>
+          </w:tcPr>
+          <w:p>
+            <w:pPr>
+              <w:rPr>
+                <w:rFonts w:asciiTheme="majorHAnsi" w:eastAsia="Times New Roman" w:hAnsiTheme="majorHAnsi" w:cs="Times New Roman"/>
+                <w:sz w:val="24"/>
+                <w:szCs w:val="24"/>
+                <w:lang w:eastAsia="ru-RU"/>
+              </w:rPr>
+            </w:pPr>
+            <w:proofErr w:type="spellStart"/>
+            <w:r>
+              <w:rPr>
+                <w:rFonts w:asciiTheme="majorHAnsi" w:eastAsia="Times New Roman" w:hAnsiTheme="majorHAnsi" w:cs="Times New Roman"/>
+                <w:sz w:val="24"/>
+                <w:szCs w:val="24"/>
+                <w:lang w:eastAsia="ru-RU"/>
+              </w:rPr>
+              <w:t>Accessibility</w:t>
+            </w:r>
+            <w:proofErr w:type="spellEnd"/>
+          </w:p>
+        </w:tc>
+        <w:tc>
+          <w:tcPr>
+            <w:tcW w:w="3007" w:type="dxa"/>
+            <w:shd w:val="clear" w:color="auto" w:fill="E5B8B7" w:themeFill="accent2" w:themeFillTint="66"/>
+            <w:hideMark/>
+          </w:tcPr>
+          <w:p>
+            <w:pPr>
+              <w:rPr>
+                <w:rFonts w:asciiTheme="majorHAnsi" w:eastAsia="Times New Roman" w:hAnsiTheme="majorHAnsi" w:cs="Times New Roman"/>
+                <w:sz w:val="24"/>
+                <w:szCs w:val="24"/>
+                <w:lang w:eastAsia="ru-RU"/>
+              </w:rPr>
+            </w:pPr>
+            <w:proofErr w:type="spellStart"/>
+            <w:r>
+              <w:rPr>
+                <w:rFonts w:asciiTheme="majorHAnsi" w:eastAsia="Times New Roman" w:hAnsiTheme="majorHAnsi" w:cs="Times New Roman"/>
+                <w:sz w:val="24"/>
+                <w:szCs w:val="24"/>
+                <w:lang w:eastAsia="ru-RU"/>
+              </w:rPr>
+              <w:t>Public</w:t>
+            </w:r>
+            <w:proofErr w:type="spellEnd"/>
+          </w:p>
+        </w:tc>
+        <w:tc>
+          <w:tcPr>
+            <w:tcW w:w="0" w:type="auto"/>
+            <w:shd w:val="clear" w:color="auto" w:fill="E5B8B7" w:themeFill="accent2" w:themeFillTint="66"/>
+            <w:hideMark/>
+          </w:tcPr>
+          <w:p>
+            <w:pPr>
+              <w:rPr>
+                <w:rFonts w:asciiTheme="majorHAnsi" w:eastAsia="Times New Roman" w:hAnsiTheme="majorHAnsi" w:cs="Times New Roman"/>
+                <w:sz w:val="24"/>
+                <w:szCs w:val="24"/>
+                <w:lang w:eastAsia="ru-RU"/>
+              </w:rPr>
+            </w:pPr>
+            <w:proofErr w:type="spellStart"/>
+            <w:r>
+              <w:rPr>
+                <w:rFonts w:asciiTheme="majorHAnsi" w:eastAsia="Times New Roman" w:hAnsiTheme="majorHAnsi" w:cs="Times New Roman"/>
+                <w:sz w:val="24"/>
+                <w:szCs w:val="24"/>
+                <w:lang w:eastAsia="ru-RU"/>
+              </w:rPr>
+              <w:t>Restricted</w:t>
+            </w:r>
+            <w:proofErr w:type="spellEnd"/>
+          </w:p>
+        </w:tc>
+      </w:tr>
+      <w:tr>
+        <w:tc>
+          <w:tcPr>
+            <w:tcW w:w="2039" w:type="dxa"/>
+            <w:shd w:val="clear" w:color="auto" w:fill="8DB3E2" w:themeFill="text2" w:themeFillTint="66"/>
+            <w:hideMark/>
+          </w:tcPr>
+          <w:p>
+            <w:pPr>
+              <w:rPr>
+                <w:rFonts w:asciiTheme="majorHAnsi" w:eastAsia="Times New Roman" w:hAnsiTheme="majorHAnsi" w:cs="Times New Roman"/>
+                <w:sz w:val="24"/>
+                <w:szCs w:val="24"/>
+                <w:lang w:eastAsia="ru-RU"/>
+              </w:rPr>
+            </w:pPr>
+            <w:proofErr w:type="spellStart"/>
+            <w:r>
+              <w:rPr>
+                <w:rFonts w:asciiTheme="majorHAnsi" w:eastAsia="Times New Roman" w:hAnsiTheme="majorHAnsi" w:cs="Times New Roman"/>
+                <w:sz w:val="24"/>
+                <w:szCs w:val="24"/>
+                <w:lang w:eastAsia="ru-RU"/>
+              </w:rPr>
+              <w:t>Example</w:t>
+            </w:r>
+            <w:proofErr w:type="spellEnd"/>
+          </w:p>
+        </w:tc>
+        <w:tc>
+          <w:tcPr>
+            <w:tcW w:w="3007" w:type="dxa"/>
+            <w:shd w:val="clear" w:color="auto" w:fill="8DB3E2" w:themeFill="text2" w:themeFillTint="66"/>
+            <w:hideMark/>
+          </w:tcPr>
+          <w:p>
+            <w:pPr>
+              <w:rPr>
+                <w:rFonts w:asciiTheme="majorHAnsi" w:eastAsia="Times New Roman" w:hAnsiTheme="majorHAnsi" w:cs="Times New Roman"/>
+                <w:sz w:val="24"/>
+                <w:szCs w:val="24"/>
+                <w:lang w:eastAsia="ru-RU"/>
+              </w:rPr>
+            </w:pPr>
+            <w:proofErr w:type="spellStart"/>
+            <w:r>
+              <w:rPr>
+                <w:rFonts w:asciiTheme="majorHAnsi" w:eastAsia="Times New Roman" w:hAnsiTheme="majorHAnsi" w:cs="Times New Roman"/>
+                <w:sz w:val="24"/>
+                <w:szCs w:val="24"/>
+                <w:lang w:eastAsia="ru-RU"/>
+              </w:rPr>
+              <w:t>VirusTotal</w:t>
+            </w:r>
+            <w:proofErr w:type="spellEnd"/>
+          </w:p>
+        </w:tc>
+        <w:tc>
+          <w:tcPr>
+            <w:tcW w:w="0" w:type="auto"/>
+            <w:shd w:val="clear" w:color="auto" w:fill="8DB3E2" w:themeFill="text2" w:themeFillTint="66"/>
+            <w:hideMark/>
+          </w:tcPr>
+          <w:p>
+            <w:pPr>
+              <w:rPr>
+                <w:rFonts w:asciiTheme="majorHAnsi" w:eastAsia="Times New Roman" w:hAnsiTheme="majorHAnsi" w:cs="Times New Roman"/>
+                <w:sz w:val="24"/>
+                <w:szCs w:val="24"/>
+                <w:lang w:eastAsia="ru-RU"/>
+              </w:rPr>
+            </w:pPr>
+            <w:r>
+              <w:rPr>
+                <w:rFonts w:asciiTheme="majorHAnsi" w:eastAsia="Times New Roman" w:hAnsiTheme="majorHAnsi" w:cs="Times New Roman"/>
+                <w:sz w:val="24"/>
+                <w:szCs w:val="24"/>
+                <w:lang w:eastAsia="ru-RU"/>
+              </w:rPr>
+              <w:t xml:space="preserve">ISP </w:t>
+            </w:r>
+            <w:proofErr w:type="spellStart"/>
+            <w:r>
+              <w:rPr>
+                <w:rFonts w:asciiTheme="majorHAnsi" w:eastAsia="Times New Roman" w:hAnsiTheme="majorHAnsi" w:cs="Times New Roman"/>
+                <w:sz w:val="24"/>
+                <w:szCs w:val="24"/>
+                <w:lang w:eastAsia="ru-RU"/>
+              </w:rPr>
+              <w:t>logs</w:t>
+            </w:r>
+            <w:proofErr w:type="spellEnd"/>
+          </w:p>
+        </w:tc>
+      </w:tr>
+      <w:tr>
+        <w:tc>
+          <w:tcPr>
+            <w:tcW w:w="2039" w:type="dxa"/>
+            <w:shd w:val="clear" w:color="auto" w:fill="C6D9F1" w:themeFill="text2" w:themeFillTint="33"/>
+            <w:hideMark/>
+          </w:tcPr>
+          <w:p>
+            <w:pPr>
+              <w:rPr>
+                <w:rFonts w:asciiTheme="majorHAnsi" w:eastAsia="Times New Roman" w:hAnsiTheme="majorHAnsi" w:cs="Times New Roman"/>
+                <w:sz w:val="24"/>
+                <w:szCs w:val="24"/>
+                <w:lang w:eastAsia="ru-RU"/>
+              </w:rPr>
+            </w:pPr>
+            <w:proofErr w:type="spellStart"/>
+            <w:r>
+              <w:rPr>
+                <w:rFonts w:asciiTheme="majorHAnsi" w:eastAsia="Times New Roman" w:hAnsiTheme="majorHAnsi" w:cs="Times New Roman"/>
+                <w:sz w:val="24"/>
+                <w:szCs w:val="24"/>
+                <w:lang w:eastAsia="ru-RU"/>
+              </w:rPr>
+              <w:t>Cost</w:t>
+            </w:r>
+            <w:proofErr w:type="spellEnd"/>
+          </w:p>
+        </w:tc>
+        <w:tc>
+          <w:tcPr>
+            <w:tcW w:w="3007" w:type="dxa"/>
+            <w:shd w:val="clear" w:color="auto" w:fill="E5B8B7" w:themeFill="accent2" w:themeFillTint="66"/>
+            <w:hideMark/>
+          </w:tcPr>
+          <w:p>
+            <w:pPr>
+              <w:rPr>
+                <w:rFonts w:asciiTheme="majorHAnsi" w:eastAsia="Times New Roman" w:hAnsiTheme="majorHAnsi" w:cs="Times New Roman"/>
+                <w:sz w:val="24"/>
+                <w:szCs w:val="24"/>
+                <w:lang w:eastAsia="ru-RU"/>
+              </w:rPr>
+            </w:pPr>
+            <w:proofErr w:type="spellStart"/>
+            <w:r>
+              <w:rPr>
+                <w:rFonts w:asciiTheme="majorHAnsi" w:eastAsia="Times New Roman" w:hAnsiTheme="majorHAnsi" w:cs="Times New Roman"/>
+                <w:sz w:val="24"/>
+                <w:szCs w:val="24"/>
+                <w:lang w:eastAsia="ru-RU"/>
+              </w:rPr>
+              <w:t>Often</w:t>
+            </w:r>
+            <w:proofErr w:type="spellEnd"/>
+            <w:r>
+              <w:rPr>
+                <w:rFonts w:asciiTheme="majorHAnsi" w:eastAsia="Times New Roman" w:hAnsiTheme="majorHAnsi" w:cs="Times New Roman"/>
+                <w:sz w:val="24"/>
+                <w:szCs w:val="24"/>
+                <w:lang w:eastAsia="ru-RU"/>
+              </w:rPr>
+              <w:t xml:space="preserve"> </w:t>
+            </w:r>
+            <w:proofErr w:type="spellStart"/>
+            <w:r>
+              <w:rPr>
+                <w:rFonts w:asciiTheme="majorHAnsi" w:eastAsia="Times New Roman" w:hAnsiTheme="majorHAnsi" w:cs="Times New Roman"/>
+                <w:sz w:val="24"/>
+                <w:szCs w:val="24"/>
+                <w:lang w:eastAsia="ru-RU"/>
+              </w:rPr>
+              <w:t>free</w:t>
+            </w:r>
+            <w:proofErr w:type="spellEnd"/>
+            <w:r>
+              <w:rPr>
+                <w:rFonts w:asciiTheme="majorHAnsi" w:eastAsia="Times New Roman" w:hAnsiTheme="majorHAnsi" w:cs="Times New Roman"/>
+                <w:sz w:val="24"/>
+                <w:szCs w:val="24"/>
+                <w:lang w:eastAsia="ru-RU"/>
+              </w:rPr>
+              <w:t>/</w:t>
+            </w:r>
+            <w:proofErr w:type="spellStart"/>
+            <w:r>
+              <w:rPr>
+                <w:rFonts w:asciiTheme="majorHAnsi" w:eastAsia="Times New Roman" w:hAnsiTheme="majorHAnsi" w:cs="Times New Roman"/>
+                <w:sz w:val="24"/>
+                <w:szCs w:val="24"/>
+                <w:lang w:eastAsia="ru-RU"/>
+              </w:rPr>
+              <w:t>limited</w:t>
+            </w:r>
+            <w:proofErr w:type="spellEnd"/>
+          </w:p>
+        </w:tc>
+        <w:tc>
+          <w:tcPr>
+            <w:tcW w:w="0" w:type="auto"/>
+            <w:shd w:val="clear" w:color="auto" w:fill="E5B8B7" w:themeFill="accent2" w:themeFillTint="66"/>
+            <w:hideMark/>
+          </w:tcPr>
+          <w:p>
+            <w:pPr>
+              <w:rPr>
+                <w:rFonts w:asciiTheme="majorHAnsi" w:eastAsia="Times New Roman" w:hAnsiTheme="majorHAnsi" w:cs="Times New Roman"/>
+                <w:sz w:val="24"/>
+                <w:szCs w:val="24"/>
+                <w:lang w:eastAsia="ru-RU"/>
+              </w:rPr>
+            </w:pPr>
+            <w:proofErr w:type="spellStart"/>
+            <w:r>
+              <w:rPr>
+                <w:rFonts w:asciiTheme="majorHAnsi" w:eastAsia="Times New Roman" w:hAnsiTheme="majorHAnsi" w:cs="Times New Roman"/>
+                <w:sz w:val="24"/>
+                <w:szCs w:val="24"/>
+                <w:lang w:eastAsia="ru-RU"/>
+              </w:rPr>
+              <w:t>Usually</w:t>
+            </w:r>
+            <w:proofErr w:type="spellEnd"/>
+            <w:r>
+              <w:rPr>
+                <w:rFonts w:asciiTheme="majorHAnsi" w:eastAsia="Times New Roman" w:hAnsiTheme="majorHAnsi" w:cs="Times New Roman"/>
+                <w:sz w:val="24"/>
+                <w:szCs w:val="24"/>
+                <w:lang w:eastAsia="ru-RU"/>
+              </w:rPr>
+              <w:t xml:space="preserve"> </w:t>
+            </w:r>
+            <w:proofErr w:type="spellStart"/>
+            <w:r>
+              <w:rPr>
+                <w:rFonts w:asciiTheme="majorHAnsi" w:eastAsia="Times New Roman" w:hAnsiTheme="majorHAnsi" w:cs="Times New Roman"/>
+                <w:sz w:val="24"/>
+                <w:szCs w:val="24"/>
+                <w:lang w:eastAsia="ru-RU"/>
+              </w:rPr>
+              <w:t>requires</w:t>
+            </w:r>
+            <w:proofErr w:type="spellEnd"/>
+            <w:r>
+              <w:rPr>
+                <w:rFonts w:asciiTheme="majorHAnsi" w:eastAsia="Times New Roman" w:hAnsiTheme="majorHAnsi" w:cs="Times New Roman"/>
+                <w:sz w:val="24"/>
+                <w:szCs w:val="24"/>
+                <w:lang w:eastAsia="ru-RU"/>
+              </w:rPr>
+              <w:t xml:space="preserve"> </w:t>
+            </w:r>
+            <w:proofErr w:type="spellStart"/>
+            <w:r>
+              <w:rPr>
+                <w:rFonts w:asciiTheme="majorHAnsi" w:eastAsia="Times New Roman" w:hAnsiTheme="majorHAnsi" w:cs="Times New Roman"/>
+                <w:sz w:val="24"/>
+                <w:szCs w:val="24"/>
+                <w:lang w:eastAsia="ru-RU"/>
+              </w:rPr>
+              <w:t>access</w:t>
+            </w:r>
+            <w:proofErr w:type="spellEnd"/>
+          </w:p>
+        </w:tc>
+      </w:tr>
+      <w:tr>
+        <w:tc>
+          <w:tcPr>
+            <w:tcW w:w="2039" w:type="dxa"/>
+            <w:shd w:val="clear" w:color="auto" w:fill="8DB3E2" w:themeFill="text2" w:themeFillTint="66"/>
+            <w:hideMark/>
+          </w:tcPr>
+          <w:p>
+            <w:pPr>
+              <w:rPr>
+                <w:rFonts w:asciiTheme="majorHAnsi" w:eastAsia="Times New Roman" w:hAnsiTheme="majorHAnsi" w:cs="Times New Roman"/>
+                <w:sz w:val="24"/>
+                <w:szCs w:val="24"/>
+                <w:lang w:eastAsia="ru-RU"/>
+              </w:rPr>
+            </w:pPr>
+            <w:proofErr w:type="spellStart"/>
+            <w:r>
+              <w:rPr>
+                <w:rFonts w:asciiTheme="majorHAnsi" w:eastAsia="Times New Roman" w:hAnsiTheme="majorHAnsi" w:cs="Times New Roman"/>
+                <w:sz w:val="24"/>
+                <w:szCs w:val="24"/>
+                <w:lang w:eastAsia="ru-RU"/>
+              </w:rPr>
+              <w:t>Privacy</w:t>
+            </w:r>
+            <w:proofErr w:type="spellEnd"/>
+          </w:p>
+        </w:tc>
+        <w:tc>
+          <w:tcPr>
+            <w:tcW w:w="3007" w:type="dxa"/>
+            <w:shd w:val="clear" w:color="auto" w:fill="8DB3E2" w:themeFill="text2" w:themeFillTint="66"/>
+            <w:hideMark/>
+          </w:tcPr>
+          <w:p>
+            <w:pPr>
+              <w:rPr>
+                <w:rFonts w:asciiTheme="majorHAnsi" w:eastAsia="Times New Roman" w:hAnsiTheme="majorHAnsi" w:cs="Times New Roman"/>
+                <w:sz w:val="24"/>
+                <w:szCs w:val="24"/>
+                <w:lang w:eastAsia="ru-RU"/>
+              </w:rPr>
+            </w:pPr>
+            <w:proofErr w:type="spellStart"/>
+            <w:r>
+              <w:rPr>
+                <w:rFonts w:asciiTheme="majorHAnsi" w:eastAsia="Times New Roman" w:hAnsiTheme="majorHAnsi" w:cs="Times New Roman"/>
+                <w:sz w:val="24"/>
+                <w:szCs w:val="24"/>
+                <w:lang w:eastAsia="ru-RU"/>
+              </w:rPr>
+              <w:t>Public</w:t>
+            </w:r>
+            <w:proofErr w:type="spellEnd"/>
+            <w:r>
+              <w:rPr>
+                <w:rFonts w:asciiTheme="majorHAnsi" w:eastAsia="Times New Roman" w:hAnsiTheme="majorHAnsi" w:cs="Times New Roman"/>
+                <w:sz w:val="24"/>
+                <w:szCs w:val="24"/>
+                <w:lang w:eastAsia="ru-RU"/>
+              </w:rPr>
+              <w:t xml:space="preserve"> </w:t>
+            </w:r>
+            <w:proofErr w:type="spellStart"/>
+            <w:r>
+              <w:rPr>
+                <w:rFonts w:asciiTheme="majorHAnsi" w:eastAsia="Times New Roman" w:hAnsiTheme="majorHAnsi" w:cs="Times New Roman"/>
+                <w:sz w:val="24"/>
+                <w:szCs w:val="24"/>
+                <w:lang w:eastAsia="ru-RU"/>
+              </w:rPr>
+              <w:t>information</w:t>
+            </w:r>
+            <w:proofErr w:type="spellEnd"/>
+          </w:p>
+        </w:tc>
+        <w:tc>
+          <w:tcPr>
+            <w:tcW w:w="0" w:type="auto"/>
+            <w:shd w:val="clear" w:color="auto" w:fill="8DB3E2" w:themeFill="text2" w:themeFillTint="66"/>
+            <w:hideMark/>
+          </w:tcPr>
+          <w:p>
+            <w:pPr>
+              <w:rPr>
+                <w:rFonts w:asciiTheme="majorHAnsi" w:eastAsia="Times New Roman" w:hAnsiTheme="majorHAnsi" w:cs="Times New Roman"/>
+                <w:sz w:val="24"/>
+                <w:szCs w:val="24"/>
+                <w:lang w:eastAsia="ru-RU"/>
+              </w:rPr>
+            </w:pPr>
+            <w:proofErr w:type="spellStart"/>
+            <w:r>
+              <w:rPr>
+                <w:rFonts w:asciiTheme="majorHAnsi" w:eastAsia="Times New Roman" w:hAnsiTheme="majorHAnsi" w:cs="Times New Roman"/>
+                <w:sz w:val="24"/>
+                <w:szCs w:val="24"/>
+                <w:lang w:eastAsia="ru-RU"/>
+              </w:rPr>
+              <w:t>Potentially</w:t>
+            </w:r>
+            <w:proofErr w:type="spellEnd"/>
+            <w:r>
+              <w:rPr>
+                <w:rFonts w:asciiTheme="majorHAnsi" w:eastAsia="Times New Roman" w:hAnsiTheme="majorHAnsi" w:cs="Times New Roman"/>
+                <w:sz w:val="24"/>
+                <w:szCs w:val="24"/>
+                <w:lang w:eastAsia="ru-RU"/>
+              </w:rPr>
+              <w:t xml:space="preserve"> </w:t>
+            </w:r>
+            <w:proofErr w:type="spellStart"/>
+            <w:r>
+              <w:rPr>
+                <w:rFonts w:asciiTheme="majorHAnsi" w:eastAsia="Times New Roman" w:hAnsiTheme="majorHAnsi" w:cs="Times New Roman"/>
+                <w:sz w:val="24"/>
+                <w:szCs w:val="24"/>
+                <w:lang w:eastAsia="ru-RU"/>
+              </w:rPr>
+              <w:t>sensitive</w:t>
+            </w:r>
+            <w:proofErr w:type="spellEnd"/>
+          </w:p>
+        </w:tc>
+      </w:tr>
+      <w:tr>
+        <w:tc>
+          <w:tcPr>
+            <w:tcW w:w="2039" w:type="dxa"/>
+            <w:shd w:val="clear" w:color="auto" w:fill="C6D9F1" w:themeFill="text2" w:themeFillTint="33"/>
+            <w:hideMark/>
+          </w:tcPr>
+          <w:p>
+            <w:pPr>
+              <w:rPr>
+                <w:rFonts w:asciiTheme="majorHAnsi" w:eastAsia="Times New Roman" w:hAnsiTheme="majorHAnsi" w:cs="Times New Roman"/>
+                <w:sz w:val="24"/>
+                <w:szCs w:val="24"/>
+                <w:lang w:eastAsia="ru-RU"/>
+              </w:rPr>
+            </w:pPr>
+            <w:proofErr w:type="spellStart"/>
+            <w:r>
+              <w:rPr>
+                <w:rFonts w:asciiTheme="majorHAnsi" w:eastAsia="Times New Roman" w:hAnsiTheme="majorHAnsi" w:cs="Times New Roman"/>
+                <w:sz w:val="24"/>
+                <w:szCs w:val="24"/>
+                <w:lang w:eastAsia="ru-RU"/>
+              </w:rPr>
+              <w:t>Data</w:t>
+            </w:r>
+            <w:proofErr w:type="spellEnd"/>
+            <w:r>
+              <w:rPr>
+                <w:rFonts w:asciiTheme="majorHAnsi" w:eastAsia="Times New Roman" w:hAnsiTheme="majorHAnsi" w:cs="Times New Roman"/>
+                <w:sz w:val="24"/>
+                <w:szCs w:val="24"/>
+                <w:lang w:eastAsia="ru-RU"/>
+              </w:rPr>
+              <w:t xml:space="preserve"> </w:t>
+            </w:r>
+            <w:proofErr w:type="spellStart"/>
+            <w:r>
+              <w:rPr>
+                <w:rFonts w:asciiTheme="majorHAnsi" w:eastAsia="Times New Roman" w:hAnsiTheme="majorHAnsi" w:cs="Times New Roman"/>
+                <w:sz w:val="24"/>
+                <w:szCs w:val="24"/>
+                <w:lang w:eastAsia="ru-RU"/>
+              </w:rPr>
+              <w:t>volume</w:t>
+            </w:r>
+            <w:proofErr w:type="spellEnd"/>
+          </w:p>
+        </w:tc>
+        <w:tc>
+          <w:tcPr>
+            <w:tcW w:w="3007" w:type="dxa"/>
+            <w:shd w:val="clear" w:color="auto" w:fill="E5B8B7" w:themeFill="accent2" w:themeFillTint="66"/>
+            <w:hideMark/>
+          </w:tcPr>
+          <w:p>
+            <w:pPr>
+              <w:rPr>
+                <w:rFonts w:asciiTheme="majorHAnsi" w:eastAsia="Times New Roman" w:hAnsiTheme="majorHAnsi" w:cs="Times New Roman"/>
+                <w:sz w:val="24"/>
+                <w:szCs w:val="24"/>
+                <w:lang w:eastAsia="ru-RU"/>
+              </w:rPr>
+            </w:pPr>
+            <w:proofErr w:type="spellStart"/>
+            <w:r>
+              <w:rPr>
+                <w:rFonts w:asciiTheme="majorHAnsi" w:eastAsia="Times New Roman" w:hAnsiTheme="majorHAnsi" w:cs="Times New Roman"/>
+                <w:sz w:val="24"/>
+                <w:szCs w:val="24"/>
+                <w:lang w:eastAsia="ru-RU"/>
+              </w:rPr>
+              <w:t>Variable</w:t>
+            </w:r>
+            <w:proofErr w:type="spellEnd"/>
+          </w:p>
+        </w:tc>
+        <w:tc>
+          <w:tcPr>
+            <w:tcW w:w="0" w:type="auto"/>
+            <w:shd w:val="clear" w:color="auto" w:fill="E5B8B7" w:themeFill="accent2" w:themeFillTint="66"/>
+            <w:hideMark/>
+          </w:tcPr>
+          <w:p>
+            <w:pPr>
+              <w:rPr>
+                <w:rFonts w:asciiTheme="majorHAnsi" w:eastAsia="Times New Roman" w:hAnsiTheme="majorHAnsi" w:cs="Times New Roman"/>
+                <w:sz w:val="24"/>
+                <w:szCs w:val="24"/>
+                <w:lang w:eastAsia="ru-RU"/>
+              </w:rPr>
+            </w:pPr>
+            <w:proofErr w:type="spellStart"/>
+            <w:r>
+              <w:rPr>
+                <w:rFonts w:asciiTheme="majorHAnsi" w:eastAsia="Times New Roman" w:hAnsiTheme="majorHAnsi" w:cs="Times New Roman"/>
+                <w:sz w:val="24"/>
+                <w:szCs w:val="24"/>
+                <w:lang w:eastAsia="ru-RU"/>
+              </w:rPr>
+              <w:t>Potentially</w:t>
+            </w:r>
+            <w:proofErr w:type="spellEnd"/>
+            <w:r>
+              <w:rPr>
+                <w:rFonts w:asciiTheme="majorHAnsi" w:eastAsia="Times New Roman" w:hAnsiTheme="majorHAnsi" w:cs="Times New Roman"/>
+                <w:sz w:val="24"/>
+                <w:szCs w:val="24"/>
+                <w:lang w:eastAsia="ru-RU"/>
+              </w:rPr>
+              <w:t xml:space="preserve"> </w:t>
+            </w:r>
+            <w:proofErr w:type="spellStart"/>
+            <w:r>
+              <w:rPr>
+                <w:rFonts w:asciiTheme="majorHAnsi" w:eastAsia="Times New Roman" w:hAnsiTheme="majorHAnsi" w:cs="Times New Roman"/>
+                <w:sz w:val="24"/>
+                <w:szCs w:val="24"/>
+                <w:lang w:eastAsia="ru-RU"/>
+              </w:rPr>
+              <w:t>very</w:t>
+            </w:r>
+            <w:proofErr w:type="spellEnd"/>
+            <w:r>
+              <w:rPr>
+                <w:rFonts w:asciiTheme="majorHAnsi" w:eastAsia="Times New Roman" w:hAnsiTheme="majorHAnsi" w:cs="Times New Roman"/>
+                <w:sz w:val="24"/>
+                <w:szCs w:val="24"/>
+                <w:lang w:eastAsia="ru-RU"/>
+              </w:rPr>
+              <w:t xml:space="preserve"> </w:t>
+            </w:r>
+            <w:proofErr w:type="spellStart"/>
+            <w:r>
+              <w:rPr>
+                <w:rFonts w:asciiTheme="majorHAnsi" w:eastAsia="Times New Roman" w:hAnsiTheme="majorHAnsi" w:cs="Times New Roman"/>
+                <w:sz w:val="24"/>
+                <w:szCs w:val="24"/>
+                <w:lang w:eastAsia="ru-RU"/>
+              </w:rPr>
+              <w:t>high</w:t>
+            </w:r>
+            <w:proofErr w:type="spellEnd"/>
+          </w:p>
+        </w:tc>
+      </w:tr>
+      <w:tr>
+        <w:tc>
+          <w:tcPr>
+            <w:tcW w:w="2039" w:type="dxa"/>
+            <w:shd w:val="clear" w:color="auto" w:fill="8DB3E2" w:themeFill="text2" w:themeFillTint="66"/>
+            <w:hideMark/>
+          </w:tcPr>
+          <w:p>
+            <w:pPr>
+              <w:rPr>
+                <w:rFonts w:asciiTheme="majorHAnsi" w:eastAsia="Times New Roman" w:hAnsiTheme="majorHAnsi" w:cs="Times New Roman"/>
+                <w:sz w:val="24"/>
+                <w:szCs w:val="24"/>
+                <w:lang w:eastAsia="ru-RU"/>
+              </w:rPr>
+            </w:pPr>
+            <w:proofErr w:type="spellStart"/>
+            <w:r>
+              <w:rPr>
+                <w:rFonts w:asciiTheme="majorHAnsi" w:eastAsia="Times New Roman" w:hAnsiTheme="majorHAnsi" w:cs="Times New Roman"/>
+                <w:sz w:val="24"/>
+                <w:szCs w:val="24"/>
+                <w:lang w:eastAsia="ru-RU"/>
+              </w:rPr>
+              <w:t>Use</w:t>
+            </w:r>
+            <w:proofErr w:type="spellEnd"/>
+            <w:r>
+              <w:rPr>
+                <w:rFonts w:asciiTheme="majorHAnsi" w:eastAsia="Times New Roman" w:hAnsiTheme="majorHAnsi" w:cs="Times New Roman"/>
+                <w:sz w:val="24"/>
+                <w:szCs w:val="24"/>
+                <w:lang w:eastAsia="ru-RU"/>
+              </w:rPr>
+              <w:t xml:space="preserve"> </w:t>
+            </w:r>
+            <w:proofErr w:type="spellStart"/>
+            <w:r>
+              <w:rPr>
+                <w:rFonts w:asciiTheme="majorHAnsi" w:eastAsia="Times New Roman" w:hAnsiTheme="majorHAnsi" w:cs="Times New Roman"/>
+                <w:sz w:val="24"/>
+                <w:szCs w:val="24"/>
+                <w:lang w:eastAsia="ru-RU"/>
+              </w:rPr>
+              <w:t>in</w:t>
+            </w:r>
+            <w:proofErr w:type="spellEnd"/>
+            <w:r>
+              <w:rPr>
+                <w:rFonts w:asciiTheme="majorHAnsi" w:eastAsia="Times New Roman" w:hAnsiTheme="majorHAnsi" w:cs="Times New Roman"/>
+                <w:sz w:val="24"/>
+                <w:szCs w:val="24"/>
+                <w:lang w:eastAsia="ru-RU"/>
+              </w:rPr>
+              <w:t xml:space="preserve"> </w:t>
+            </w:r>
+            <w:proofErr w:type="spellStart"/>
+            <w:r>
+              <w:rPr>
+                <w:rFonts w:asciiTheme="majorHAnsi" w:eastAsia="Times New Roman" w:hAnsiTheme="majorHAnsi" w:cs="Times New Roman"/>
+                <w:sz w:val="24"/>
+                <w:szCs w:val="24"/>
+                <w:lang w:eastAsia="ru-RU"/>
+              </w:rPr>
+              <w:t>our</w:t>
+            </w:r>
+            <w:proofErr w:type="spellEnd"/>
+            <w:r>
+              <w:rPr>
+                <w:rFonts w:asciiTheme="majorHAnsi" w:eastAsia="Times New Roman" w:hAnsiTheme="majorHAnsi" w:cs="Times New Roman"/>
+                <w:sz w:val="24"/>
+                <w:szCs w:val="24"/>
+                <w:lang w:eastAsia="ru-RU"/>
+              </w:rPr>
+              <w:t xml:space="preserve"> </w:t>
+            </w:r>
+            <w:proofErr w:type="spellStart"/>
+            <w:r>
+              <w:rPr>
+                <w:rFonts w:asciiTheme="majorHAnsi" w:eastAsia="Times New Roman" w:hAnsiTheme="majorHAnsi" w:cs="Times New Roman"/>
+                <w:sz w:val="24"/>
+                <w:szCs w:val="24"/>
+                <w:lang w:eastAsia="ru-RU"/>
+              </w:rPr>
+              <w:t>project</w:t>
+            </w:r>
+            <w:proofErr w:type="spellEnd"/>
+          </w:p>
+        </w:tc>
+        <w:tc>
+          <w:tcPr>
+            <w:tcW w:w="3007" w:type="dxa"/>
+            <w:shd w:val="clear" w:color="auto" w:fill="8DB3E2" w:themeFill="text2" w:themeFillTint="66"/>
+            <w:hideMark/>
+          </w:tcPr>
+          <w:p>
+            <w:pPr>
+              <w:rPr>
+                <w:rFonts w:asciiTheme="majorHAnsi" w:eastAsia="Times New Roman" w:hAnsiTheme="majorHAnsi" w:cs="Times New Roman"/>
+                <w:sz w:val="24"/>
+                <w:szCs w:val="24"/>
+                <w:lang w:eastAsia="ru-RU"/>
+              </w:rPr>
+            </w:pPr>
+            <w:proofErr w:type="spellStart"/>
+            <w:r>
+              <w:rPr>
+                <w:rFonts w:asciiTheme="majorHAnsi" w:eastAsia="Times New Roman" w:hAnsiTheme="majorHAnsi" w:cs="Times New Roman"/>
+                <w:b/>
+                <w:bCs/>
+                <w:sz w:val="24"/>
+                <w:szCs w:val="24"/>
+                <w:lang w:eastAsia="ru-RU"/>
+              </w:rPr>
+              <w:t>Yes</w:t>
+            </w:r>
+            <w:proofErr w:type="spellEnd"/>
+          </w:p>
+        </w:tc>
+        <w:tc>
+          <w:tcPr>
+            <w:tcW w:w="0" w:type="auto"/>
+            <w:shd w:val="clear" w:color="auto" w:fill="8DB3E2" w:themeFill="text2" w:themeFillTint="66"/>
+            <w:hideMark/>
+          </w:tcPr>
+          <w:p>
+            <w:pPr>
+              <w:rPr>
+                <w:rFonts w:asciiTheme="majorHAnsi" w:eastAsia="Times New Roman" w:hAnsiTheme="majorHAnsi" w:cs="Times New Roman"/>
+                <w:sz w:val="24"/>
+                <w:szCs w:val="24"/>
+                <w:lang w:eastAsia="ru-RU"/>
+              </w:rPr>
+            </w:pPr>
+            <w:proofErr w:type="spellStart"/>
+            <w:r>
+              <w:rPr>
+                <w:rFonts w:asciiTheme="majorHAnsi" w:eastAsia="Times New Roman" w:hAnsiTheme="majorHAnsi" w:cs="Times New Roman"/>
+                <w:sz w:val="24"/>
+                <w:szCs w:val="24"/>
+                <w:lang w:eastAsia="ru-RU"/>
+              </w:rPr>
+              <w:t>No</w:t>
+            </w:r>
+            <w:proofErr w:type="spellEnd"/>
+          </w:p>
+        </w:tc>
+      </w:tr>
+      <w:tr>
+        <w:tc>
+          <w:tcPr>
+            <w:tcW w:w="2039" w:type="dxa"/>
+            <w:shd w:val="clear" w:color="auto" w:fill="C6D9F1" w:themeFill="text2" w:themeFillTint="33"/>
+            <w:hideMark/>
+          </w:tcPr>
+          <w:p>
+            <w:pPr>
+              <w:rPr>
+                <w:rFonts w:asciiTheme="majorHAnsi" w:eastAsia="Times New Roman" w:hAnsiTheme="majorHAnsi" w:cs="Times New Roman"/>
+                <w:sz w:val="24"/>
+                <w:szCs w:val="24"/>
+                <w:lang w:eastAsia="ru-RU"/>
+              </w:rPr>
+            </w:pPr>
+            <w:proofErr w:type="spellStart"/>
+            <w:r>
+              <w:rPr>
+                <w:rFonts w:asciiTheme="majorHAnsi" w:eastAsia="Times New Roman" w:hAnsiTheme="majorHAnsi" w:cs="Times New Roman"/>
+                <w:sz w:val="24"/>
+                <w:szCs w:val="24"/>
+                <w:lang w:eastAsia="ru-RU"/>
+              </w:rPr>
+              <w:t>Main</w:t>
+            </w:r>
+            <w:proofErr w:type="spellEnd"/>
+            <w:r>
+              <w:rPr>
+                <w:rFonts w:asciiTheme="majorHAnsi" w:eastAsia="Times New Roman" w:hAnsiTheme="majorHAnsi" w:cs="Times New Roman"/>
+                <w:sz w:val="24"/>
+                <w:szCs w:val="24"/>
+                <w:lang w:eastAsia="ru-RU"/>
+              </w:rPr>
+              <w:t xml:space="preserve"> </w:t>
+            </w:r>
+            <w:proofErr w:type="spellStart"/>
+            <w:r>
+              <w:rPr>
+                <w:rFonts w:asciiTheme="majorHAnsi" w:eastAsia="Times New Roman" w:hAnsiTheme="majorHAnsi" w:cs="Times New Roman"/>
+                <w:sz w:val="24"/>
+                <w:szCs w:val="24"/>
+                <w:lang w:eastAsia="ru-RU"/>
+              </w:rPr>
+              <w:t>purpose</w:t>
+            </w:r>
+            <w:proofErr w:type="spellEnd"/>
+          </w:p>
+        </w:tc>
+        <w:tc>
+          <w:tcPr>
+            <w:tcW w:w="3007" w:type="dxa"/>
+            <w:shd w:val="clear" w:color="auto" w:fill="E5B8B7" w:themeFill="accent2" w:themeFillTint="66"/>
+            <w:hideMark/>
+          </w:tcPr>
+          <w:p>
+            <w:pPr>
+              <w:rPr>
+                <w:rFonts w:asciiTheme="majorHAnsi" w:eastAsia="Times New Roman" w:hAnsiTheme="majorHAnsi" w:cs="Times New Roman"/>
+                <w:sz w:val="24"/>
+                <w:szCs w:val="24"/>
+                <w:lang w:eastAsia="ru-RU"/>
+              </w:rPr>
+            </w:pPr>
+            <w:proofErr w:type="spellStart"/>
+            <w:r>
+              <w:rPr>
+                <w:rFonts w:asciiTheme="majorHAnsi" w:eastAsia="Times New Roman" w:hAnsiTheme="majorHAnsi" w:cs="Times New Roman"/>
+                <w:sz w:val="24"/>
+                <w:szCs w:val="24"/>
+                <w:lang w:eastAsia="ru-RU"/>
+              </w:rPr>
+              <w:t>External</w:t>
+            </w:r>
+            <w:proofErr w:type="spellEnd"/>
+            <w:r>
+              <w:rPr>
+                <w:rFonts w:asciiTheme="majorHAnsi" w:eastAsia="Times New Roman" w:hAnsiTheme="majorHAnsi" w:cs="Times New Roman"/>
+                <w:sz w:val="24"/>
+                <w:szCs w:val="24"/>
+                <w:lang w:eastAsia="ru-RU"/>
+              </w:rPr>
+              <w:t xml:space="preserve"> </w:t>
+            </w:r>
+            <w:proofErr w:type="spellStart"/>
+            <w:r>
+              <w:rPr>
+                <w:rFonts w:asciiTheme="majorHAnsi" w:eastAsia="Times New Roman" w:hAnsiTheme="majorHAnsi" w:cs="Times New Roman"/>
+                <w:sz w:val="24"/>
+                <w:szCs w:val="24"/>
+                <w:lang w:eastAsia="ru-RU"/>
+              </w:rPr>
+              <w:t>threat</w:t>
+            </w:r>
+            <w:proofErr w:type="spellEnd"/>
+            <w:r>
+              <w:rPr>
+                <w:rFonts w:asciiTheme="majorHAnsi" w:eastAsia="Times New Roman" w:hAnsiTheme="majorHAnsi" w:cs="Times New Roman"/>
+                <w:sz w:val="24"/>
+                <w:szCs w:val="24"/>
+                <w:lang w:eastAsia="ru-RU"/>
+              </w:rPr>
+              <w:t xml:space="preserve"> </w:t>
+            </w:r>
+            <w:proofErr w:type="spellStart"/>
+            <w:r>
+              <w:rPr>
+                <w:rFonts w:asciiTheme="majorHAnsi" w:eastAsia="Times New Roman" w:hAnsiTheme="majorHAnsi" w:cs="Times New Roman"/>
+                <w:sz w:val="24"/>
+                <w:szCs w:val="24"/>
+                <w:lang w:eastAsia="ru-RU"/>
+              </w:rPr>
+              <w:t>intelligence</w:t>
+            </w:r>
+            <w:proofErr w:type="spellEnd"/>
+          </w:p>
+        </w:tc>
+        <w:tc>
+          <w:tcPr>
+            <w:tcW w:w="0" w:type="auto"/>
+            <w:shd w:val="clear" w:color="auto" w:fill="E5B8B7" w:themeFill="accent2" w:themeFillTint="66"/>
+            <w:hideMark/>
+          </w:tcPr>
+          <w:p>
+            <w:pPr>
+              <w:rPr>
+                <w:rFonts w:asciiTheme="majorHAnsi" w:eastAsia="Times New Roman" w:hAnsiTheme="majorHAnsi" w:cs="Times New Roman"/>
+                <w:sz w:val="24"/>
+                <w:szCs w:val="24"/>
+                <w:lang w:eastAsia="ru-RU"/>
+              </w:rPr>
+            </w:pPr>
+            <w:proofErr w:type="spellStart"/>
+            <w:r>
+              <w:rPr>
+                <w:rFonts w:asciiTheme="majorHAnsi" w:eastAsia="Times New Roman" w:hAnsiTheme="majorHAnsi" w:cs="Times New Roman"/>
+                <w:sz w:val="24"/>
+                <w:szCs w:val="24"/>
+                <w:lang w:eastAsia="ru-RU"/>
+              </w:rPr>
+              <w:t>Internal</w:t>
+            </w:r>
+            <w:proofErr w:type="spellEnd"/>
+            <w:r>
+              <w:rPr>
+                <w:rFonts w:asciiTheme="majorHAnsi" w:eastAsia="Times New Roman" w:hAnsiTheme="majorHAnsi" w:cs="Times New Roman"/>
+                <w:sz w:val="24"/>
+                <w:szCs w:val="24"/>
+                <w:lang w:eastAsia="ru-RU"/>
+              </w:rPr>
+              <w:t xml:space="preserve"> </w:t>
+            </w:r>
+            <w:proofErr w:type="spellStart"/>
+            <w:r>
+              <w:rPr>
+                <w:rFonts w:asciiTheme="majorHAnsi" w:eastAsia="Times New Roman" w:hAnsiTheme="majorHAnsi" w:cs="Times New Roman"/>
+                <w:sz w:val="24"/>
+                <w:szCs w:val="24"/>
+                <w:lang w:eastAsia="ru-RU"/>
+              </w:rPr>
+              <w:t>incident</w:t>
+            </w:r>
+            <w:proofErr w:type="spellEnd"/>
+            <w:r>
+              <w:rPr>
+                <w:rFonts w:asciiTheme="majorHAnsi" w:eastAsia="Times New Roman" w:hAnsiTheme="majorHAnsi" w:cs="Times New Roman"/>
+                <w:sz w:val="24"/>
+                <w:szCs w:val="24"/>
+                <w:lang w:eastAsia="ru-RU"/>
+              </w:rPr>
+              <w:t xml:space="preserve"> </w:t>
+            </w:r>
+            <w:proofErr w:type="spellStart"/>
+            <w:r>
+              <w:rPr>
+                <w:rFonts w:asciiTheme="majorHAnsi" w:eastAsia="Times New Roman" w:hAnsiTheme="majorHAnsi" w:cs="Times New Roman"/>
+                <w:sz w:val="24"/>
+                <w:szCs w:val="24"/>
+                <w:lang w:eastAsia="ru-RU"/>
+              </w:rPr>
+              <w:t>analysis</w:t>
+            </w:r>
+            <w:proofErr w:type="spellEnd"/>
+          </w:p>
+        </w:tc>
+      </w:tr>
+    </w:tbl>
+    <w:p>
+      <w:pPr>
+        <w:spacing w:before="100" w:beforeAutospacing="1" w:after="100" w:afterAutospacing="1" w:line="240" w:lineRule="auto"/>
+        <w:rPr>
+          <w:rFonts w:asciiTheme="majorHAnsi" w:eastAsia="Times New Roman" w:hAnsiTheme="majorHAnsi" w:cs="Times New Roman"/>
+          <w:sz w:val="24"/>
+          <w:szCs w:val="24"/>
+          <w:lang w:val="en-US" w:eastAsia="ru-RU"/>
+        </w:rPr>
+      </w:pPr>
+      <w:r>
+        <w:rPr>
+          <w:rFonts w:asciiTheme="majorHAnsi" w:eastAsia="Times New Roman" w:hAnsiTheme="majorHAnsi" w:cs="Times New Roman"/>
+          <w:sz w:val="24"/>
+          <w:szCs w:val="24"/>
+          <w:lang w:val="en-US" w:eastAsia="ru-RU"/>
+        </w:rPr>
+        <w:t xml:space="preserve">Therefore, our project will primarily use </w:t>
+      </w:r>
+      <w:r>
+        <w:rPr>
+          <w:rFonts w:asciiTheme="majorHAnsi" w:eastAsia="Times New Roman" w:hAnsiTheme="majorHAnsi" w:cs="Times New Roman"/>
+          <w:b/>
+          <w:bCs/>
+          <w:sz w:val="24"/>
+          <w:szCs w:val="24"/>
+          <w:lang w:val="en-US" w:eastAsia="ru-RU"/>
+        </w:rPr>
+        <w:t>open-source data</w:t>
+      </w:r>
+      <w:r>
+        <w:rPr>
+          <w:rFonts w:asciiTheme="majorHAnsi" w:eastAsia="Times New Roman" w:hAnsiTheme="majorHAnsi" w:cs="Times New Roman"/>
+          <w:sz w:val="24"/>
+          <w:szCs w:val="24"/>
+          <w:lang w:val="en-US" w:eastAsia="ru-RU"/>
+        </w:rPr>
+        <w:t xml:space="preserve">, because the objective is to demonstrate an OSINT-based </w:t>
+      </w:r>
+      <w:proofErr w:type="spellStart"/>
+      <w:r>
+        <w:rPr>
+          <w:rFonts w:asciiTheme="majorHAnsi" w:eastAsia="Times New Roman" w:hAnsiTheme="majorHAnsi" w:cs="Times New Roman"/>
+          <w:sz w:val="24"/>
+          <w:szCs w:val="24"/>
+          <w:lang w:val="en-US" w:eastAsia="ru-RU"/>
+        </w:rPr>
+        <w:t>DDoS</w:t>
+      </w:r>
+      <w:proofErr w:type="spellEnd"/>
+      <w:r>
+        <w:rPr>
+          <w:rFonts w:asciiTheme="majorHAnsi" w:eastAsia="Times New Roman" w:hAnsiTheme="majorHAnsi" w:cs="Times New Roman"/>
+          <w:sz w:val="24"/>
+          <w:szCs w:val="24"/>
+          <w:lang w:val="en-US" w:eastAsia="ru-RU"/>
+        </w:rPr>
+        <w:t xml:space="preserve"> threat intelligence workflow.</w:t>
       </w:r>
     </w:p>
     <w:p>
@@ -844,8 +3425,312 @@
       </w:rPr>
     </w:lvl>
   </w:abstractNum>
+  <w:abstractNum w:abstractNumId="1">
+    <w:nsid w:val="49697877"/>
+    <w:multiLevelType w:val="multilevel"/>
+    <w:tmpl w:val="A4D0558A"/>
+    <w:lvl w:ilvl="0">
+      <w:start w:val="1"/>
+      <w:numFmt w:val="bullet"/>
+      <w:lvlText w:val=""/>
+      <w:lvlJc w:val="left"/>
+      <w:pPr>
+        <w:tabs>
+          <w:tab w:val="num" w:pos="720"/>
+        </w:tabs>
+        <w:ind w:left="720" w:hanging="360"/>
+      </w:pPr>
+      <w:rPr>
+        <w:rFonts w:ascii="Symbol" w:hAnsi="Symbol" w:hint="default"/>
+        <w:sz w:val="20"/>
+      </w:rPr>
+    </w:lvl>
+    <w:lvl w:ilvl="1" w:tentative="1">
+      <w:start w:val="1"/>
+      <w:numFmt w:val="bullet"/>
+      <w:lvlText w:val="o"/>
+      <w:lvlJc w:val="left"/>
+      <w:pPr>
+        <w:tabs>
+          <w:tab w:val="num" w:pos="1440"/>
+        </w:tabs>
+        <w:ind w:left="1440" w:hanging="360"/>
+      </w:pPr>
+      <w:rPr>
+        <w:rFonts w:ascii="Courier New" w:hAnsi="Courier New" w:hint="default"/>
+        <w:sz w:val="20"/>
+      </w:rPr>
+    </w:lvl>
+    <w:lvl w:ilvl="2" w:tentative="1">
+      <w:start w:val="1"/>
+      <w:numFmt w:val="bullet"/>
+      <w:lvlText w:val=""/>
+      <w:lvlJc w:val="left"/>
+      <w:pPr>
+        <w:tabs>
+          <w:tab w:val="num" w:pos="2160"/>
+        </w:tabs>
+        <w:ind w:left="2160" w:hanging="360"/>
+      </w:pPr>
+      <w:rPr>
+        <w:rFonts w:ascii="Wingdings" w:hAnsi="Wingdings" w:hint="default"/>
+        <w:sz w:val="20"/>
+      </w:rPr>
+    </w:lvl>
+    <w:lvl w:ilvl="3" w:tentative="1">
+      <w:start w:val="1"/>
+      <w:numFmt w:val="bullet"/>
+      <w:lvlText w:val=""/>
+      <w:lvlJc w:val="left"/>
+      <w:pPr>
+        <w:tabs>
+          <w:tab w:val="num" w:pos="2880"/>
+        </w:tabs>
+        <w:ind w:left="2880" w:hanging="360"/>
+      </w:pPr>
+      <w:rPr>
+        <w:rFonts w:ascii="Wingdings" w:hAnsi="Wingdings" w:hint="default"/>
+        <w:sz w:val="20"/>
+      </w:rPr>
+    </w:lvl>
+    <w:lvl w:ilvl="4" w:tentative="1">
+      <w:start w:val="1"/>
+      <w:numFmt w:val="bullet"/>
+      <w:lvlText w:val=""/>
+      <w:lvlJc w:val="left"/>
+      <w:pPr>
+        <w:tabs>
+          <w:tab w:val="num" w:pos="3600"/>
+        </w:tabs>
+        <w:ind w:left="3600" w:hanging="360"/>
+      </w:pPr>
+      <w:rPr>
+        <w:rFonts w:ascii="Wingdings" w:hAnsi="Wingdings" w:hint="default"/>
+        <w:sz w:val="20"/>
+      </w:rPr>
+    </w:lvl>
+    <w:lvl w:ilvl="5" w:tentative="1">
+      <w:start w:val="1"/>
+      <w:numFmt w:val="bullet"/>
+      <w:lvlText w:val=""/>
+      <w:lvlJc w:val="left"/>
+      <w:pPr>
+        <w:tabs>
+          <w:tab w:val="num" w:pos="4320"/>
+        </w:tabs>
+        <w:ind w:left="4320" w:hanging="360"/>
+      </w:pPr>
+      <w:rPr>
+        <w:rFonts w:ascii="Wingdings" w:hAnsi="Wingdings" w:hint="default"/>
+        <w:sz w:val="20"/>
+      </w:rPr>
+    </w:lvl>
+    <w:lvl w:ilvl="6" w:tentative="1">
+      <w:start w:val="1"/>
+      <w:numFmt w:val="bullet"/>
+      <w:lvlText w:val=""/>
+      <w:lvlJc w:val="left"/>
+      <w:pPr>
+        <w:tabs>
+          <w:tab w:val="num" w:pos="5040"/>
+        </w:tabs>
+        <w:ind w:left="5040" w:hanging="360"/>
+      </w:pPr>
+      <w:rPr>
+        <w:rFonts w:ascii="Wingdings" w:hAnsi="Wingdings" w:hint="default"/>
+        <w:sz w:val="20"/>
+      </w:rPr>
+    </w:lvl>
+    <w:lvl w:ilvl="7" w:tentative="1">
+      <w:start w:val="1"/>
+      <w:numFmt w:val="bullet"/>
+      <w:lvlText w:val=""/>
+      <w:lvlJc w:val="left"/>
+      <w:pPr>
+        <w:tabs>
+          <w:tab w:val="num" w:pos="5760"/>
+        </w:tabs>
+        <w:ind w:left="5760" w:hanging="360"/>
+      </w:pPr>
+      <w:rPr>
+        <w:rFonts w:ascii="Wingdings" w:hAnsi="Wingdings" w:hint="default"/>
+        <w:sz w:val="20"/>
+      </w:rPr>
+    </w:lvl>
+    <w:lvl w:ilvl="8" w:tentative="1">
+      <w:start w:val="1"/>
+      <w:numFmt w:val="bullet"/>
+      <w:lvlText w:val=""/>
+      <w:lvlJc w:val="left"/>
+      <w:pPr>
+        <w:tabs>
+          <w:tab w:val="num" w:pos="6480"/>
+        </w:tabs>
+        <w:ind w:left="6480" w:hanging="360"/>
+      </w:pPr>
+      <w:rPr>
+        <w:rFonts w:ascii="Wingdings" w:hAnsi="Wingdings" w:hint="default"/>
+        <w:sz w:val="20"/>
+      </w:rPr>
+    </w:lvl>
+  </w:abstractNum>
+  <w:abstractNum w:abstractNumId="2">
+    <w:nsid w:val="4B23434C"/>
+    <w:multiLevelType w:val="multilevel"/>
+    <w:tmpl w:val="F566DB02"/>
+    <w:lvl w:ilvl="0">
+      <w:start w:val="1"/>
+      <w:numFmt w:val="bullet"/>
+      <w:lvlText w:val=""/>
+      <w:lvlJc w:val="left"/>
+      <w:pPr>
+        <w:tabs>
+          <w:tab w:val="num" w:pos="720"/>
+        </w:tabs>
+        <w:ind w:left="720" w:hanging="360"/>
+      </w:pPr>
+      <w:rPr>
+        <w:rFonts w:ascii="Symbol" w:hAnsi="Symbol" w:hint="default"/>
+        <w:sz w:val="20"/>
+      </w:rPr>
+    </w:lvl>
+    <w:lvl w:ilvl="1" w:tentative="1">
+      <w:start w:val="1"/>
+      <w:numFmt w:val="bullet"/>
+      <w:lvlText w:val="o"/>
+      <w:lvlJc w:val="left"/>
+      <w:pPr>
+        <w:tabs>
+          <w:tab w:val="num" w:pos="1440"/>
+        </w:tabs>
+        <w:ind w:left="1440" w:hanging="360"/>
+      </w:pPr>
+      <w:rPr>
+        <w:rFonts w:ascii="Courier New" w:hAnsi="Courier New" w:hint="default"/>
+        <w:sz w:val="20"/>
+      </w:rPr>
+    </w:lvl>
+    <w:lvl w:ilvl="2" w:tentative="1">
+      <w:start w:val="1"/>
+      <w:numFmt w:val="bullet"/>
+      <w:lvlText w:val=""/>
+      <w:lvlJc w:val="left"/>
+      <w:pPr>
+        <w:tabs>
+          <w:tab w:val="num" w:pos="2160"/>
+        </w:tabs>
+        <w:ind w:left="2160" w:hanging="360"/>
+      </w:pPr>
+      <w:rPr>
+        <w:rFonts w:ascii="Wingdings" w:hAnsi="Wingdings" w:hint="default"/>
+        <w:sz w:val="20"/>
+      </w:rPr>
+    </w:lvl>
+    <w:lvl w:ilvl="3" w:tentative="1">
+      <w:start w:val="1"/>
+      <w:numFmt w:val="bullet"/>
+      <w:lvlText w:val=""/>
+      <w:lvlJc w:val="left"/>
+      <w:pPr>
+        <w:tabs>
+          <w:tab w:val="num" w:pos="2880"/>
+        </w:tabs>
+        <w:ind w:left="2880" w:hanging="360"/>
+      </w:pPr>
+      <w:rPr>
+        <w:rFonts w:ascii="Wingdings" w:hAnsi="Wingdings" w:hint="default"/>
+        <w:sz w:val="20"/>
+      </w:rPr>
+    </w:lvl>
+    <w:lvl w:ilvl="4" w:tentative="1">
+      <w:start w:val="1"/>
+      <w:numFmt w:val="bullet"/>
+      <w:lvlText w:val=""/>
+      <w:lvlJc w:val="left"/>
+      <w:pPr>
+        <w:tabs>
+          <w:tab w:val="num" w:pos="3600"/>
+        </w:tabs>
+        <w:ind w:left="3600" w:hanging="360"/>
+      </w:pPr>
+      <w:rPr>
+        <w:rFonts w:ascii="Wingdings" w:hAnsi="Wingdings" w:hint="default"/>
+        <w:sz w:val="20"/>
+      </w:rPr>
+    </w:lvl>
+    <w:lvl w:ilvl="5" w:tentative="1">
+      <w:start w:val="1"/>
+      <w:numFmt w:val="bullet"/>
+      <w:lvlText w:val=""/>
+      <w:lvlJc w:val="left"/>
+      <w:pPr>
+        <w:tabs>
+          <w:tab w:val="num" w:pos="4320"/>
+        </w:tabs>
+        <w:ind w:left="4320" w:hanging="360"/>
+      </w:pPr>
+      <w:rPr>
+        <w:rFonts w:ascii="Wingdings" w:hAnsi="Wingdings" w:hint="default"/>
+        <w:sz w:val="20"/>
+      </w:rPr>
+    </w:lvl>
+    <w:lvl w:ilvl="6" w:tentative="1">
+      <w:start w:val="1"/>
+      <w:numFmt w:val="bullet"/>
+      <w:lvlText w:val=""/>
+      <w:lvlJc w:val="left"/>
+      <w:pPr>
+        <w:tabs>
+          <w:tab w:val="num" w:pos="5040"/>
+        </w:tabs>
+        <w:ind w:left="5040" w:hanging="360"/>
+      </w:pPr>
+      <w:rPr>
+        <w:rFonts w:ascii="Wingdings" w:hAnsi="Wingdings" w:hint="default"/>
+        <w:sz w:val="20"/>
+      </w:rPr>
+    </w:lvl>
+    <w:lvl w:ilvl="7" w:tentative="1">
+      <w:start w:val="1"/>
+      <w:numFmt w:val="bullet"/>
+      <w:lvlText w:val=""/>
+      <w:lvlJc w:val="left"/>
+      <w:pPr>
+        <w:tabs>
+          <w:tab w:val="num" w:pos="5760"/>
+        </w:tabs>
+        <w:ind w:left="5760" w:hanging="360"/>
+      </w:pPr>
+      <w:rPr>
+        <w:rFonts w:ascii="Wingdings" w:hAnsi="Wingdings" w:hint="default"/>
+        <w:sz w:val="20"/>
+      </w:rPr>
+    </w:lvl>
+    <w:lvl w:ilvl="8" w:tentative="1">
+      <w:start w:val="1"/>
+      <w:numFmt w:val="bullet"/>
+      <w:lvlText w:val=""/>
+      <w:lvlJc w:val="left"/>
+      <w:pPr>
+        <w:tabs>
+          <w:tab w:val="num" w:pos="6480"/>
+        </w:tabs>
+        <w:ind w:left="6480" w:hanging="360"/>
+      </w:pPr>
+      <w:rPr>
+        <w:rFonts w:ascii="Wingdings" w:hAnsi="Wingdings" w:hint="default"/>
+        <w:sz w:val="20"/>
+      </w:rPr>
+    </w:lvl>
+  </w:abstractNum>
   <w:num w:numId="1">
     <w:abstractNumId w:val="0"/>
+  </w:num>
+  <w:num w:numId="2">
+    <w:abstractNumId w:val="2"/>
+  </w:num>
+  <w:num w:numId="3">
+    <w:abstractNumId w:val="1"/>
   </w:num>
 </w:numbering>
 </file>
@@ -1038,6 +3923,32 @@
     <w:semiHidden/>
     <w:unhideWhenUsed/>
   </w:style>
+  <w:style w:type="table" w:styleId="a3">
+    <w:name w:val="Table Grid"/>
+    <w:basedOn w:val="a1"/>
+    <w:uiPriority w:val="59"/>
+    <w:rsid w:val="007B0846"/>
+    <w:pPr>
+      <w:spacing w:after="0" w:line="240" w:lineRule="auto"/>
+    </w:pPr>
+    <w:tblPr>
+      <w:tblInd w:w="0" w:type="dxa"/>
+      <w:tblBorders>
+        <w:top w:val="single" w:sz="4" w:space="0" w:color="auto"/>
+        <w:left w:val="single" w:sz="4" w:space="0" w:color="auto"/>
+        <w:bottom w:val="single" w:sz="4" w:space="0" w:color="auto"/>
+        <w:right w:val="single" w:sz="4" w:space="0" w:color="auto"/>
+        <w:insideH w:val="single" w:sz="4" w:space="0" w:color="auto"/>
+        <w:insideV w:val="single" w:sz="4" w:space="0" w:color="auto"/>
+      </w:tblBorders>
+      <w:tblCellMar>
+        <w:top w:w="0" w:type="dxa"/>
+        <w:left w:w="108" w:type="dxa"/>
+        <w:bottom w:w="0" w:type="dxa"/>
+        <w:right w:w="108" w:type="dxa"/>
+      </w:tblCellMar>
+    </w:tblPr>
+  </w:style>
 </w:styles>
 </file>
 
@@ -1228,6 +4139,32 @@
     <w:uiPriority w:val="99"/>
     <w:semiHidden/>
     <w:unhideWhenUsed/>
+  </w:style>
+  <w:style w:type="table" w:styleId="a3">
+    <w:name w:val="Table Grid"/>
+    <w:basedOn w:val="a1"/>
+    <w:uiPriority w:val="59"/>
+    <w:rsid w:val="007B0846"/>
+    <w:pPr>
+      <w:spacing w:after="0" w:line="240" w:lineRule="auto"/>
+    </w:pPr>
+    <w:tblPr>
+      <w:tblInd w:w="0" w:type="dxa"/>
+      <w:tblBorders>
+        <w:top w:val="single" w:sz="4" w:space="0" w:color="auto"/>
+        <w:left w:val="single" w:sz="4" w:space="0" w:color="auto"/>
+        <w:bottom w:val="single" w:sz="4" w:space="0" w:color="auto"/>
+        <w:right w:val="single" w:sz="4" w:space="0" w:color="auto"/>
+        <w:insideH w:val="single" w:sz="4" w:space="0" w:color="auto"/>
+        <w:insideV w:val="single" w:sz="4" w:space="0" w:color="auto"/>
+      </w:tblBorders>
+      <w:tblCellMar>
+        <w:top w:w="0" w:type="dxa"/>
+        <w:left w:w="108" w:type="dxa"/>
+        <w:bottom w:w="0" w:type="dxa"/>
+        <w:right w:w="108" w:type="dxa"/>
+      </w:tblCellMar>
+    </w:tblPr>
   </w:style>
 </w:styles>
 </file>

</xml_diff>

<commit_message>
Data Sources observation added
</commit_message>
<xml_diff>
--- a/week 2/Data collection proccess.docx
+++ b/week 2/Data collection proccess.docx
@@ -881,8 +881,6 @@
         </w:rPr>
         <w:t xml:space="preserve">; </w:t>
       </w:r>
-      <w:bookmarkStart w:id="0" w:name="_GoBack"/>
-      <w:bookmarkEnd w:id="0"/>
     </w:p>
     <w:p>
       <w:pPr>
@@ -3259,6 +3257,1937 @@
     </w:p>
     <w:p>
       <w:pPr>
+        <w:spacing w:before="100" w:beforeAutospacing="1" w:after="100" w:afterAutospacing="1" w:line="240" w:lineRule="auto"/>
+        <w:jc w:val="center"/>
+        <w:outlineLvl w:val="0"/>
+        <w:rPr>
+          <w:rFonts w:asciiTheme="majorHAnsi" w:eastAsia="Times New Roman" w:hAnsiTheme="majorHAnsi" w:cs="Times New Roman"/>
+          <w:b/>
+          <w:bCs/>
+          <w:kern w:val="36"/>
+          <w:sz w:val="48"/>
+          <w:szCs w:val="48"/>
+          <w:lang w:val="en-US" w:eastAsia="ru-RU"/>
+        </w:rPr>
+      </w:pPr>
+      <w:r>
+        <w:rPr>
+          <w:rFonts w:asciiTheme="majorHAnsi" w:eastAsia="Times New Roman" w:hAnsiTheme="majorHAnsi" w:cs="Times New Roman"/>
+          <w:b/>
+          <w:bCs/>
+          <w:kern w:val="36"/>
+          <w:sz w:val="48"/>
+          <w:szCs w:val="48"/>
+          <w:lang w:val="en-US" w:eastAsia="ru-RU"/>
+        </w:rPr>
+        <w:t>2.3. Data Sources</w:t>
+      </w:r>
+    </w:p>
+    <w:p>
+      <w:pPr>
+        <w:spacing w:before="100" w:beforeAutospacing="1" w:after="100" w:afterAutospacing="1" w:line="240" w:lineRule="auto"/>
+        <w:rPr>
+          <w:rFonts w:asciiTheme="majorHAnsi" w:eastAsia="Times New Roman" w:hAnsiTheme="majorHAnsi" w:cs="Times New Roman"/>
+          <w:sz w:val="24"/>
+          <w:szCs w:val="24"/>
+          <w:lang w:val="en-US" w:eastAsia="ru-RU"/>
+        </w:rPr>
+      </w:pPr>
+      <w:r>
+        <w:rPr>
+          <w:rFonts w:asciiTheme="majorHAnsi" w:eastAsia="Times New Roman" w:hAnsiTheme="majorHAnsi" w:cs="Times New Roman"/>
+          <w:sz w:val="24"/>
+          <w:szCs w:val="24"/>
+          <w:lang w:val="en-US" w:eastAsia="ru-RU"/>
+        </w:rPr>
+        <w:t>The project will use three main tools required by the assignment:</w:t>
+      </w:r>
+    </w:p>
+    <w:p>
+      <w:pPr>
+        <w:spacing w:before="100" w:beforeAutospacing="1" w:after="100" w:afterAutospacing="1" w:line="240" w:lineRule="auto"/>
+        <w:outlineLvl w:val="2"/>
+        <w:rPr>
+          <w:rFonts w:asciiTheme="majorHAnsi" w:eastAsia="Times New Roman" w:hAnsiTheme="majorHAnsi" w:cs="Times New Roman"/>
+          <w:b/>
+          <w:bCs/>
+          <w:sz w:val="27"/>
+          <w:szCs w:val="27"/>
+          <w:lang w:val="en-US" w:eastAsia="ru-RU"/>
+        </w:rPr>
+      </w:pPr>
+      <w:r>
+        <w:rPr>
+          <w:rFonts w:asciiTheme="majorHAnsi" w:eastAsia="Times New Roman" w:hAnsiTheme="majorHAnsi" w:cs="Times New Roman"/>
+          <w:b/>
+          <w:bCs/>
+          <w:sz w:val="27"/>
+          <w:szCs w:val="27"/>
+          <w:lang w:val="en-US" w:eastAsia="ru-RU"/>
+        </w:rPr>
+        <w:t xml:space="preserve">1. </w:t>
+      </w:r>
+      <w:proofErr w:type="spellStart"/>
+      <w:r>
+        <w:rPr>
+          <w:rFonts w:asciiTheme="majorHAnsi" w:eastAsia="Times New Roman" w:hAnsiTheme="majorHAnsi" w:cs="Times New Roman"/>
+          <w:b/>
+          <w:bCs/>
+          <w:sz w:val="27"/>
+          <w:szCs w:val="27"/>
+          <w:lang w:val="en-US" w:eastAsia="ru-RU"/>
+        </w:rPr>
+        <w:t>Shodan</w:t>
+      </w:r>
+      <w:proofErr w:type="spellEnd"/>
+    </w:p>
+    <w:p>
+      <w:pPr>
+        <w:spacing w:after="0" w:line="240" w:lineRule="auto"/>
+        <w:rPr>
+          <w:rFonts w:asciiTheme="majorHAnsi" w:eastAsia="Times New Roman" w:hAnsiTheme="majorHAnsi" w:cs="Times New Roman"/>
+          <w:sz w:val="24"/>
+          <w:szCs w:val="24"/>
+          <w:lang w:val="en-US" w:eastAsia="ru-RU"/>
+        </w:rPr>
+      </w:pPr>
+      <w:proofErr w:type="spellStart"/>
+      <w:r>
+        <w:rPr>
+          <w:rFonts w:asciiTheme="majorHAnsi" w:eastAsia="Times New Roman" w:hAnsiTheme="majorHAnsi" w:cs="Times New Roman"/>
+          <w:sz w:val="24"/>
+          <w:szCs w:val="24"/>
+          <w:lang w:val="en-US" w:eastAsia="ru-RU"/>
+        </w:rPr>
+        <w:t>Shodan</w:t>
+      </w:r>
+      <w:proofErr w:type="spellEnd"/>
+      <w:r>
+        <w:rPr>
+          <w:rFonts w:asciiTheme="majorHAnsi" w:eastAsia="Times New Roman" w:hAnsiTheme="majorHAnsi" w:cs="Times New Roman"/>
+          <w:sz w:val="24"/>
+          <w:szCs w:val="24"/>
+          <w:lang w:val="en-US" w:eastAsia="ru-RU"/>
+        </w:rPr>
+        <w:t xml:space="preserve"> can provide information about Internet-facing infrastructure.</w:t>
+      </w:r>
+    </w:p>
+    <w:p>
+      <w:pPr>
+        <w:spacing w:after="120" w:line="240" w:lineRule="auto"/>
+        <w:rPr>
+          <w:rFonts w:asciiTheme="majorHAnsi" w:eastAsia="Times New Roman" w:hAnsiTheme="majorHAnsi" w:cs="Times New Roman"/>
+          <w:sz w:val="24"/>
+          <w:szCs w:val="24"/>
+          <w:lang w:val="en-US" w:eastAsia="ru-RU"/>
+        </w:rPr>
+      </w:pPr>
+      <w:r>
+        <w:rPr>
+          <w:rFonts w:asciiTheme="majorHAnsi" w:eastAsia="Times New Roman" w:hAnsiTheme="majorHAnsi" w:cs="Times New Roman"/>
+          <w:sz w:val="24"/>
+          <w:szCs w:val="24"/>
+          <w:lang w:val="en-US" w:eastAsia="ru-RU"/>
+        </w:rPr>
+        <w:t>For our project, we can collect:</w:t>
+      </w:r>
+    </w:p>
+    <w:p>
+      <w:pPr>
+        <w:numPr>
+          <w:ilvl w:val="0"/>
+          <w:numId w:val="4"/>
+        </w:numPr>
+        <w:spacing w:after="0" w:line="240" w:lineRule="auto"/>
+        <w:rPr>
+          <w:rFonts w:asciiTheme="majorHAnsi" w:eastAsia="Times New Roman" w:hAnsiTheme="majorHAnsi" w:cs="Times New Roman"/>
+          <w:sz w:val="24"/>
+          <w:szCs w:val="24"/>
+          <w:lang w:eastAsia="ru-RU"/>
+        </w:rPr>
+      </w:pPr>
+      <w:r>
+        <w:rPr>
+          <w:rFonts w:asciiTheme="majorHAnsi" w:eastAsia="Times New Roman" w:hAnsiTheme="majorHAnsi" w:cs="Times New Roman"/>
+          <w:sz w:val="24"/>
+          <w:szCs w:val="24"/>
+          <w:lang w:eastAsia="ru-RU"/>
+        </w:rPr>
+        <w:t xml:space="preserve">IP </w:t>
+      </w:r>
+      <w:proofErr w:type="spellStart"/>
+      <w:r>
+        <w:rPr>
+          <w:rFonts w:asciiTheme="majorHAnsi" w:eastAsia="Times New Roman" w:hAnsiTheme="majorHAnsi" w:cs="Times New Roman"/>
+          <w:sz w:val="24"/>
+          <w:szCs w:val="24"/>
+          <w:lang w:eastAsia="ru-RU"/>
+        </w:rPr>
+        <w:t>address</w:t>
+      </w:r>
+      <w:proofErr w:type="spellEnd"/>
+      <w:r>
+        <w:rPr>
+          <w:rFonts w:asciiTheme="majorHAnsi" w:eastAsia="Times New Roman" w:hAnsiTheme="majorHAnsi" w:cs="Times New Roman"/>
+          <w:sz w:val="24"/>
+          <w:szCs w:val="24"/>
+          <w:lang w:eastAsia="ru-RU"/>
+        </w:rPr>
+        <w:t xml:space="preserve">; </w:t>
+      </w:r>
+    </w:p>
+    <w:p>
+      <w:pPr>
+        <w:numPr>
+          <w:ilvl w:val="0"/>
+          <w:numId w:val="4"/>
+        </w:numPr>
+        <w:spacing w:after="0" w:line="240" w:lineRule="auto"/>
+        <w:rPr>
+          <w:rFonts w:asciiTheme="majorHAnsi" w:eastAsia="Times New Roman" w:hAnsiTheme="majorHAnsi" w:cs="Times New Roman"/>
+          <w:sz w:val="24"/>
+          <w:szCs w:val="24"/>
+          <w:lang w:eastAsia="ru-RU"/>
+        </w:rPr>
+      </w:pPr>
+      <w:r>
+        <w:rPr>
+          <w:rFonts w:asciiTheme="majorHAnsi" w:eastAsia="Times New Roman" w:hAnsiTheme="majorHAnsi" w:cs="Times New Roman"/>
+          <w:sz w:val="24"/>
+          <w:szCs w:val="24"/>
+          <w:lang w:val="en-US" w:eastAsia="ru-RU"/>
+        </w:rPr>
+        <w:t>O</w:t>
+      </w:r>
+      <w:proofErr w:type="spellStart"/>
+      <w:r>
+        <w:rPr>
+          <w:rFonts w:asciiTheme="majorHAnsi" w:eastAsia="Times New Roman" w:hAnsiTheme="majorHAnsi" w:cs="Times New Roman"/>
+          <w:sz w:val="24"/>
+          <w:szCs w:val="24"/>
+          <w:lang w:eastAsia="ru-RU"/>
+        </w:rPr>
+        <w:t>pen</w:t>
+      </w:r>
+      <w:proofErr w:type="spellEnd"/>
+      <w:r>
+        <w:rPr>
+          <w:rFonts w:asciiTheme="majorHAnsi" w:eastAsia="Times New Roman" w:hAnsiTheme="majorHAnsi" w:cs="Times New Roman"/>
+          <w:sz w:val="24"/>
+          <w:szCs w:val="24"/>
+          <w:lang w:eastAsia="ru-RU"/>
+        </w:rPr>
+        <w:t xml:space="preserve"> </w:t>
+      </w:r>
+      <w:proofErr w:type="spellStart"/>
+      <w:r>
+        <w:rPr>
+          <w:rFonts w:asciiTheme="majorHAnsi" w:eastAsia="Times New Roman" w:hAnsiTheme="majorHAnsi" w:cs="Times New Roman"/>
+          <w:sz w:val="24"/>
+          <w:szCs w:val="24"/>
+          <w:lang w:eastAsia="ru-RU"/>
+        </w:rPr>
+        <w:t>ports</w:t>
+      </w:r>
+      <w:proofErr w:type="spellEnd"/>
+      <w:r>
+        <w:rPr>
+          <w:rFonts w:asciiTheme="majorHAnsi" w:eastAsia="Times New Roman" w:hAnsiTheme="majorHAnsi" w:cs="Times New Roman"/>
+          <w:sz w:val="24"/>
+          <w:szCs w:val="24"/>
+          <w:lang w:eastAsia="ru-RU"/>
+        </w:rPr>
+        <w:t xml:space="preserve">; </w:t>
+      </w:r>
+    </w:p>
+    <w:p>
+      <w:pPr>
+        <w:numPr>
+          <w:ilvl w:val="0"/>
+          <w:numId w:val="4"/>
+        </w:numPr>
+        <w:spacing w:after="0" w:line="240" w:lineRule="auto"/>
+        <w:rPr>
+          <w:rFonts w:asciiTheme="majorHAnsi" w:eastAsia="Times New Roman" w:hAnsiTheme="majorHAnsi" w:cs="Times New Roman"/>
+          <w:sz w:val="24"/>
+          <w:szCs w:val="24"/>
+          <w:lang w:eastAsia="ru-RU"/>
+        </w:rPr>
+      </w:pPr>
+      <w:r>
+        <w:rPr>
+          <w:rFonts w:asciiTheme="majorHAnsi" w:eastAsia="Times New Roman" w:hAnsiTheme="majorHAnsi" w:cs="Times New Roman"/>
+          <w:sz w:val="24"/>
+          <w:szCs w:val="24"/>
+          <w:lang w:val="en-US" w:eastAsia="ru-RU"/>
+        </w:rPr>
+        <w:t>D</w:t>
+      </w:r>
+      <w:proofErr w:type="spellStart"/>
+      <w:r>
+        <w:rPr>
+          <w:rFonts w:asciiTheme="majorHAnsi" w:eastAsia="Times New Roman" w:hAnsiTheme="majorHAnsi" w:cs="Times New Roman"/>
+          <w:sz w:val="24"/>
+          <w:szCs w:val="24"/>
+          <w:lang w:eastAsia="ru-RU"/>
+        </w:rPr>
+        <w:t>etected</w:t>
+      </w:r>
+      <w:proofErr w:type="spellEnd"/>
+      <w:r>
+        <w:rPr>
+          <w:rFonts w:asciiTheme="majorHAnsi" w:eastAsia="Times New Roman" w:hAnsiTheme="majorHAnsi" w:cs="Times New Roman"/>
+          <w:sz w:val="24"/>
+          <w:szCs w:val="24"/>
+          <w:lang w:eastAsia="ru-RU"/>
+        </w:rPr>
+        <w:t xml:space="preserve"> </w:t>
+      </w:r>
+      <w:proofErr w:type="spellStart"/>
+      <w:r>
+        <w:rPr>
+          <w:rFonts w:asciiTheme="majorHAnsi" w:eastAsia="Times New Roman" w:hAnsiTheme="majorHAnsi" w:cs="Times New Roman"/>
+          <w:sz w:val="24"/>
+          <w:szCs w:val="24"/>
+          <w:lang w:eastAsia="ru-RU"/>
+        </w:rPr>
+        <w:t>services</w:t>
+      </w:r>
+      <w:proofErr w:type="spellEnd"/>
+      <w:r>
+        <w:rPr>
+          <w:rFonts w:asciiTheme="majorHAnsi" w:eastAsia="Times New Roman" w:hAnsiTheme="majorHAnsi" w:cs="Times New Roman"/>
+          <w:sz w:val="24"/>
+          <w:szCs w:val="24"/>
+          <w:lang w:eastAsia="ru-RU"/>
+        </w:rPr>
+        <w:t xml:space="preserve">; </w:t>
+      </w:r>
+    </w:p>
+    <w:p>
+      <w:pPr>
+        <w:numPr>
+          <w:ilvl w:val="0"/>
+          <w:numId w:val="4"/>
+        </w:numPr>
+        <w:spacing w:after="0" w:line="240" w:lineRule="auto"/>
+        <w:rPr>
+          <w:rFonts w:asciiTheme="majorHAnsi" w:eastAsia="Times New Roman" w:hAnsiTheme="majorHAnsi" w:cs="Times New Roman"/>
+          <w:sz w:val="24"/>
+          <w:szCs w:val="24"/>
+          <w:lang w:eastAsia="ru-RU"/>
+        </w:rPr>
+      </w:pPr>
+      <w:r>
+        <w:rPr>
+          <w:rFonts w:asciiTheme="majorHAnsi" w:eastAsia="Times New Roman" w:hAnsiTheme="majorHAnsi" w:cs="Times New Roman"/>
+          <w:sz w:val="24"/>
+          <w:szCs w:val="24"/>
+          <w:lang w:val="en-US" w:eastAsia="ru-RU"/>
+        </w:rPr>
+        <w:t>H</w:t>
+      </w:r>
+      <w:proofErr w:type="spellStart"/>
+      <w:r>
+        <w:rPr>
+          <w:rFonts w:asciiTheme="majorHAnsi" w:eastAsia="Times New Roman" w:hAnsiTheme="majorHAnsi" w:cs="Times New Roman"/>
+          <w:sz w:val="24"/>
+          <w:szCs w:val="24"/>
+          <w:lang w:eastAsia="ru-RU"/>
+        </w:rPr>
+        <w:t>ostnames</w:t>
+      </w:r>
+      <w:proofErr w:type="spellEnd"/>
+      <w:r>
+        <w:rPr>
+          <w:rFonts w:asciiTheme="majorHAnsi" w:eastAsia="Times New Roman" w:hAnsiTheme="majorHAnsi" w:cs="Times New Roman"/>
+          <w:sz w:val="24"/>
+          <w:szCs w:val="24"/>
+          <w:lang w:eastAsia="ru-RU"/>
+        </w:rPr>
+        <w:t xml:space="preserve">; </w:t>
+      </w:r>
+    </w:p>
+    <w:p>
+      <w:pPr>
+        <w:numPr>
+          <w:ilvl w:val="0"/>
+          <w:numId w:val="4"/>
+        </w:numPr>
+        <w:spacing w:after="0" w:line="240" w:lineRule="auto"/>
+        <w:rPr>
+          <w:rFonts w:asciiTheme="majorHAnsi" w:eastAsia="Times New Roman" w:hAnsiTheme="majorHAnsi" w:cs="Times New Roman"/>
+          <w:sz w:val="24"/>
+          <w:szCs w:val="24"/>
+          <w:lang w:eastAsia="ru-RU"/>
+        </w:rPr>
+      </w:pPr>
+      <w:r>
+        <w:rPr>
+          <w:rFonts w:asciiTheme="majorHAnsi" w:eastAsia="Times New Roman" w:hAnsiTheme="majorHAnsi" w:cs="Times New Roman"/>
+          <w:sz w:val="24"/>
+          <w:szCs w:val="24"/>
+          <w:lang w:val="en-US" w:eastAsia="ru-RU"/>
+        </w:rPr>
+        <w:t>O</w:t>
+      </w:r>
+      <w:proofErr w:type="spellStart"/>
+      <w:r>
+        <w:rPr>
+          <w:rFonts w:asciiTheme="majorHAnsi" w:eastAsia="Times New Roman" w:hAnsiTheme="majorHAnsi" w:cs="Times New Roman"/>
+          <w:sz w:val="24"/>
+          <w:szCs w:val="24"/>
+          <w:lang w:eastAsia="ru-RU"/>
+        </w:rPr>
+        <w:t>rganization</w:t>
+      </w:r>
+      <w:proofErr w:type="spellEnd"/>
+      <w:r>
+        <w:rPr>
+          <w:rFonts w:asciiTheme="majorHAnsi" w:eastAsia="Times New Roman" w:hAnsiTheme="majorHAnsi" w:cs="Times New Roman"/>
+          <w:sz w:val="24"/>
+          <w:szCs w:val="24"/>
+          <w:lang w:eastAsia="ru-RU"/>
+        </w:rPr>
+        <w:t xml:space="preserve">; </w:t>
+      </w:r>
+    </w:p>
+    <w:p>
+      <w:pPr>
+        <w:numPr>
+          <w:ilvl w:val="0"/>
+          <w:numId w:val="4"/>
+        </w:numPr>
+        <w:spacing w:after="0" w:line="240" w:lineRule="auto"/>
+        <w:rPr>
+          <w:rFonts w:asciiTheme="majorHAnsi" w:eastAsia="Times New Roman" w:hAnsiTheme="majorHAnsi" w:cs="Times New Roman"/>
+          <w:sz w:val="24"/>
+          <w:szCs w:val="24"/>
+          <w:lang w:eastAsia="ru-RU"/>
+        </w:rPr>
+      </w:pPr>
+      <w:r>
+        <w:rPr>
+          <w:rFonts w:asciiTheme="majorHAnsi" w:eastAsia="Times New Roman" w:hAnsiTheme="majorHAnsi" w:cs="Times New Roman"/>
+          <w:sz w:val="24"/>
+          <w:szCs w:val="24"/>
+          <w:lang w:eastAsia="ru-RU"/>
+        </w:rPr>
+        <w:t xml:space="preserve">ASN; </w:t>
+      </w:r>
+    </w:p>
+    <w:p>
+      <w:pPr>
+        <w:numPr>
+          <w:ilvl w:val="0"/>
+          <w:numId w:val="4"/>
+        </w:numPr>
+        <w:spacing w:after="0" w:line="240" w:lineRule="auto"/>
+        <w:rPr>
+          <w:rFonts w:asciiTheme="majorHAnsi" w:eastAsia="Times New Roman" w:hAnsiTheme="majorHAnsi" w:cs="Times New Roman"/>
+          <w:sz w:val="24"/>
+          <w:szCs w:val="24"/>
+          <w:lang w:eastAsia="ru-RU"/>
+        </w:rPr>
+      </w:pPr>
+      <w:r>
+        <w:rPr>
+          <w:rFonts w:asciiTheme="majorHAnsi" w:eastAsia="Times New Roman" w:hAnsiTheme="majorHAnsi" w:cs="Times New Roman"/>
+          <w:sz w:val="24"/>
+          <w:szCs w:val="24"/>
+          <w:lang w:val="en-US" w:eastAsia="ru-RU"/>
+        </w:rPr>
+        <w:t>G</w:t>
+      </w:r>
+      <w:proofErr w:type="spellStart"/>
+      <w:r>
+        <w:rPr>
+          <w:rFonts w:asciiTheme="majorHAnsi" w:eastAsia="Times New Roman" w:hAnsiTheme="majorHAnsi" w:cs="Times New Roman"/>
+          <w:sz w:val="24"/>
+          <w:szCs w:val="24"/>
+          <w:lang w:eastAsia="ru-RU"/>
+        </w:rPr>
+        <w:t>eographic</w:t>
+      </w:r>
+      <w:proofErr w:type="spellEnd"/>
+      <w:r>
+        <w:rPr>
+          <w:rFonts w:asciiTheme="majorHAnsi" w:eastAsia="Times New Roman" w:hAnsiTheme="majorHAnsi" w:cs="Times New Roman"/>
+          <w:sz w:val="24"/>
+          <w:szCs w:val="24"/>
+          <w:lang w:eastAsia="ru-RU"/>
+        </w:rPr>
+        <w:t xml:space="preserve"> </w:t>
+      </w:r>
+      <w:proofErr w:type="spellStart"/>
+      <w:r>
+        <w:rPr>
+          <w:rFonts w:asciiTheme="majorHAnsi" w:eastAsia="Times New Roman" w:hAnsiTheme="majorHAnsi" w:cs="Times New Roman"/>
+          <w:sz w:val="24"/>
+          <w:szCs w:val="24"/>
+          <w:lang w:eastAsia="ru-RU"/>
+        </w:rPr>
+        <w:t>information</w:t>
+      </w:r>
+      <w:proofErr w:type="spellEnd"/>
+      <w:r>
+        <w:rPr>
+          <w:rFonts w:asciiTheme="majorHAnsi" w:eastAsia="Times New Roman" w:hAnsiTheme="majorHAnsi" w:cs="Times New Roman"/>
+          <w:sz w:val="24"/>
+          <w:szCs w:val="24"/>
+          <w:lang w:eastAsia="ru-RU"/>
+        </w:rPr>
+        <w:t xml:space="preserve">; </w:t>
+      </w:r>
+    </w:p>
+    <w:p>
+      <w:pPr>
+        <w:numPr>
+          <w:ilvl w:val="0"/>
+          <w:numId w:val="4"/>
+        </w:numPr>
+        <w:spacing w:after="0" w:line="240" w:lineRule="auto"/>
+        <w:rPr>
+          <w:rFonts w:asciiTheme="majorHAnsi" w:eastAsia="Times New Roman" w:hAnsiTheme="majorHAnsi" w:cs="Times New Roman"/>
+          <w:sz w:val="24"/>
+          <w:szCs w:val="24"/>
+          <w:lang w:eastAsia="ru-RU"/>
+        </w:rPr>
+      </w:pPr>
+      <w:r>
+        <w:rPr>
+          <w:rFonts w:asciiTheme="majorHAnsi" w:eastAsia="Times New Roman" w:hAnsiTheme="majorHAnsi" w:cs="Times New Roman"/>
+          <w:sz w:val="24"/>
+          <w:szCs w:val="24"/>
+          <w:lang w:val="en-US" w:eastAsia="ru-RU"/>
+        </w:rPr>
+        <w:t>S</w:t>
+      </w:r>
+      <w:proofErr w:type="spellStart"/>
+      <w:r>
+        <w:rPr>
+          <w:rFonts w:asciiTheme="majorHAnsi" w:eastAsia="Times New Roman" w:hAnsiTheme="majorHAnsi" w:cs="Times New Roman"/>
+          <w:sz w:val="24"/>
+          <w:szCs w:val="24"/>
+          <w:lang w:eastAsia="ru-RU"/>
+        </w:rPr>
+        <w:t>ervice</w:t>
+      </w:r>
+      <w:proofErr w:type="spellEnd"/>
+      <w:r>
+        <w:rPr>
+          <w:rFonts w:asciiTheme="majorHAnsi" w:eastAsia="Times New Roman" w:hAnsiTheme="majorHAnsi" w:cs="Times New Roman"/>
+          <w:sz w:val="24"/>
+          <w:szCs w:val="24"/>
+          <w:lang w:eastAsia="ru-RU"/>
+        </w:rPr>
+        <w:t xml:space="preserve"> </w:t>
+      </w:r>
+      <w:proofErr w:type="spellStart"/>
+      <w:r>
+        <w:rPr>
+          <w:rFonts w:asciiTheme="majorHAnsi" w:eastAsia="Times New Roman" w:hAnsiTheme="majorHAnsi" w:cs="Times New Roman"/>
+          <w:sz w:val="24"/>
+          <w:szCs w:val="24"/>
+          <w:lang w:eastAsia="ru-RU"/>
+        </w:rPr>
+        <w:t>banners</w:t>
+      </w:r>
+      <w:proofErr w:type="spellEnd"/>
+      <w:r>
+        <w:rPr>
+          <w:rFonts w:asciiTheme="majorHAnsi" w:eastAsia="Times New Roman" w:hAnsiTheme="majorHAnsi" w:cs="Times New Roman"/>
+          <w:sz w:val="24"/>
+          <w:szCs w:val="24"/>
+          <w:lang w:eastAsia="ru-RU"/>
+        </w:rPr>
+        <w:t xml:space="preserve">. </w:t>
+      </w:r>
+    </w:p>
+    <w:p>
+      <w:pPr>
+        <w:spacing w:before="120" w:after="100" w:afterAutospacing="1" w:line="240" w:lineRule="auto"/>
+        <w:rPr>
+          <w:rFonts w:asciiTheme="majorHAnsi" w:eastAsia="Times New Roman" w:hAnsiTheme="majorHAnsi" w:cs="Times New Roman"/>
+          <w:sz w:val="24"/>
+          <w:szCs w:val="24"/>
+          <w:lang w:val="en-US" w:eastAsia="ru-RU"/>
+        </w:rPr>
+      </w:pPr>
+      <w:proofErr w:type="spellStart"/>
+      <w:r>
+        <w:rPr>
+          <w:rFonts w:asciiTheme="majorHAnsi" w:eastAsia="Times New Roman" w:hAnsiTheme="majorHAnsi" w:cs="Times New Roman"/>
+          <w:sz w:val="24"/>
+          <w:szCs w:val="24"/>
+          <w:lang w:val="en-US" w:eastAsia="ru-RU"/>
+        </w:rPr>
+        <w:t>Shodan</w:t>
+      </w:r>
+      <w:proofErr w:type="spellEnd"/>
+      <w:r>
+        <w:rPr>
+          <w:rFonts w:asciiTheme="majorHAnsi" w:eastAsia="Times New Roman" w:hAnsiTheme="majorHAnsi" w:cs="Times New Roman"/>
+          <w:sz w:val="24"/>
+          <w:szCs w:val="24"/>
+          <w:lang w:val="en-US" w:eastAsia="ru-RU"/>
+        </w:rPr>
+        <w:t xml:space="preserve"> can also be used through </w:t>
+      </w:r>
+      <w:proofErr w:type="spellStart"/>
+      <w:r>
+        <w:rPr>
+          <w:rFonts w:asciiTheme="majorHAnsi" w:eastAsia="Times New Roman" w:hAnsiTheme="majorHAnsi" w:cs="Times New Roman"/>
+          <w:sz w:val="24"/>
+          <w:szCs w:val="24"/>
+          <w:lang w:val="en-US" w:eastAsia="ru-RU"/>
+        </w:rPr>
+        <w:t>Maltego</w:t>
+      </w:r>
+      <w:proofErr w:type="spellEnd"/>
+      <w:r>
+        <w:rPr>
+          <w:rFonts w:asciiTheme="majorHAnsi" w:eastAsia="Times New Roman" w:hAnsiTheme="majorHAnsi" w:cs="Times New Roman"/>
+          <w:sz w:val="24"/>
+          <w:szCs w:val="24"/>
+          <w:lang w:val="en-US" w:eastAsia="ru-RU"/>
+        </w:rPr>
+        <w:t xml:space="preserve"> to find domains associated with an IP address or IP addresses associated with</w:t>
+      </w:r>
+      <w:bookmarkStart w:id="0" w:name="_GoBack"/>
+      <w:bookmarkEnd w:id="0"/>
+      <w:r>
+        <w:rPr>
+          <w:rFonts w:asciiTheme="majorHAnsi" w:eastAsia="Times New Roman" w:hAnsiTheme="majorHAnsi" w:cs="Times New Roman"/>
+          <w:sz w:val="24"/>
+          <w:szCs w:val="24"/>
+          <w:lang w:val="en-US" w:eastAsia="ru-RU"/>
+        </w:rPr>
+        <w:t xml:space="preserve"> hostnames. </w:t>
+      </w:r>
+    </w:p>
+    <w:p>
+      <w:pPr>
+        <w:spacing w:after="0" w:line="240" w:lineRule="auto"/>
+        <w:rPr>
+          <w:rFonts w:asciiTheme="majorHAnsi" w:eastAsia="Times New Roman" w:hAnsiTheme="majorHAnsi" w:cs="Times New Roman"/>
+          <w:sz w:val="24"/>
+          <w:szCs w:val="24"/>
+          <w:lang w:val="en-US" w:eastAsia="ru-RU"/>
+        </w:rPr>
+      </w:pPr>
+      <w:r>
+        <w:rPr>
+          <w:rFonts w:asciiTheme="majorHAnsi" w:eastAsia="Times New Roman" w:hAnsiTheme="majorHAnsi" w:cs="Times New Roman"/>
+          <w:b/>
+          <w:bCs/>
+          <w:sz w:val="24"/>
+          <w:szCs w:val="24"/>
+          <w:lang w:val="en-US" w:eastAsia="ru-RU"/>
+        </w:rPr>
+        <w:t>Purpose in our project:</w:t>
+      </w:r>
+    </w:p>
+    <w:p>
+      <w:pPr>
+        <w:spacing w:after="0" w:line="240" w:lineRule="auto"/>
+        <w:rPr>
+          <w:rFonts w:asciiTheme="majorHAnsi" w:eastAsia="Times New Roman" w:hAnsiTheme="majorHAnsi" w:cs="Times New Roman"/>
+          <w:sz w:val="24"/>
+          <w:szCs w:val="24"/>
+          <w:lang w:val="en-US" w:eastAsia="ru-RU"/>
+        </w:rPr>
+      </w:pPr>
+      <w:r>
+        <w:rPr>
+          <w:rFonts w:asciiTheme="majorHAnsi" w:eastAsia="Times New Roman" w:hAnsiTheme="majorHAnsi" w:cs="Times New Roman"/>
+          <w:sz w:val="24"/>
+          <w:szCs w:val="24"/>
+          <w:lang w:val="en-US" w:eastAsia="ru-RU"/>
+        </w:rPr>
+        <w:t>Identify publicly visible network infrastructure that may be relevant to the investigation.</w:t>
+      </w:r>
+    </w:p>
+    <w:p>
+      <w:pPr>
+        <w:spacing w:after="0" w:line="240" w:lineRule="auto"/>
+        <w:rPr>
+          <w:rFonts w:asciiTheme="majorHAnsi" w:eastAsia="Times New Roman" w:hAnsiTheme="majorHAnsi" w:cs="Times New Roman"/>
+          <w:sz w:val="24"/>
+          <w:szCs w:val="24"/>
+          <w:lang w:val="en-US" w:eastAsia="ru-RU"/>
+        </w:rPr>
+      </w:pPr>
+      <w:r>
+        <w:rPr>
+          <w:rFonts w:asciiTheme="majorHAnsi" w:eastAsia="Times New Roman" w:hAnsiTheme="majorHAnsi" w:cs="Times New Roman"/>
+          <w:sz w:val="24"/>
+          <w:szCs w:val="24"/>
+          <w:lang w:val="en-US" w:eastAsia="ru-RU"/>
+        </w:rPr>
+        <w:lastRenderedPageBreak/>
+        <w:t xml:space="preserve">Important: we should </w:t>
+      </w:r>
+      <w:r>
+        <w:rPr>
+          <w:rFonts w:asciiTheme="majorHAnsi" w:eastAsia="Times New Roman" w:hAnsiTheme="majorHAnsi" w:cs="Times New Roman"/>
+          <w:b/>
+          <w:bCs/>
+          <w:sz w:val="24"/>
+          <w:szCs w:val="24"/>
+          <w:lang w:val="en-US" w:eastAsia="ru-RU"/>
+        </w:rPr>
+        <w:t>only collect information passively</w:t>
+      </w:r>
+      <w:r>
+        <w:rPr>
+          <w:rFonts w:asciiTheme="majorHAnsi" w:eastAsia="Times New Roman" w:hAnsiTheme="majorHAnsi" w:cs="Times New Roman"/>
+          <w:sz w:val="24"/>
+          <w:szCs w:val="24"/>
+          <w:lang w:val="en-US" w:eastAsia="ru-RU"/>
+        </w:rPr>
+        <w:t xml:space="preserve"> and should not perform attacks, stress tests, or unauthorized scanning against third-party systems.</w:t>
+      </w:r>
+    </w:p>
+    <w:p>
+      <w:pPr>
+        <w:spacing w:after="0" w:line="240" w:lineRule="auto"/>
+        <w:rPr>
+          <w:rFonts w:asciiTheme="majorHAnsi" w:eastAsia="Times New Roman" w:hAnsiTheme="majorHAnsi" w:cs="Times New Roman"/>
+          <w:sz w:val="24"/>
+          <w:szCs w:val="24"/>
+          <w:lang w:val="en-US" w:eastAsia="ru-RU"/>
+        </w:rPr>
+      </w:pPr>
+    </w:p>
+    <w:p>
+      <w:pPr>
+        <w:spacing w:before="100" w:beforeAutospacing="1" w:after="100" w:afterAutospacing="1" w:line="240" w:lineRule="auto"/>
+        <w:outlineLvl w:val="2"/>
+        <w:rPr>
+          <w:rFonts w:asciiTheme="majorHAnsi" w:eastAsia="Times New Roman" w:hAnsiTheme="majorHAnsi" w:cs="Times New Roman"/>
+          <w:b/>
+          <w:bCs/>
+          <w:sz w:val="27"/>
+          <w:szCs w:val="27"/>
+          <w:lang w:val="en-US" w:eastAsia="ru-RU"/>
+        </w:rPr>
+      </w:pPr>
+      <w:r>
+        <w:rPr>
+          <w:rFonts w:asciiTheme="majorHAnsi" w:eastAsia="Times New Roman" w:hAnsiTheme="majorHAnsi" w:cs="Times New Roman"/>
+          <w:b/>
+          <w:bCs/>
+          <w:sz w:val="27"/>
+          <w:szCs w:val="27"/>
+          <w:lang w:val="en-US" w:eastAsia="ru-RU"/>
+        </w:rPr>
+        <w:t xml:space="preserve">2. </w:t>
+      </w:r>
+      <w:proofErr w:type="spellStart"/>
+      <w:r>
+        <w:rPr>
+          <w:rFonts w:asciiTheme="majorHAnsi" w:eastAsia="Times New Roman" w:hAnsiTheme="majorHAnsi" w:cs="Times New Roman"/>
+          <w:b/>
+          <w:bCs/>
+          <w:sz w:val="27"/>
+          <w:szCs w:val="27"/>
+          <w:lang w:val="en-US" w:eastAsia="ru-RU"/>
+        </w:rPr>
+        <w:t>VirusTotal</w:t>
+      </w:r>
+      <w:proofErr w:type="spellEnd"/>
+    </w:p>
+    <w:p>
+      <w:pPr>
+        <w:spacing w:after="0" w:line="240" w:lineRule="auto"/>
+        <w:rPr>
+          <w:rFonts w:asciiTheme="majorHAnsi" w:eastAsia="Times New Roman" w:hAnsiTheme="majorHAnsi" w:cs="Times New Roman"/>
+          <w:sz w:val="24"/>
+          <w:szCs w:val="24"/>
+          <w:lang w:val="en-US" w:eastAsia="ru-RU"/>
+        </w:rPr>
+      </w:pPr>
+      <w:proofErr w:type="spellStart"/>
+      <w:r>
+        <w:rPr>
+          <w:rFonts w:asciiTheme="majorHAnsi" w:eastAsia="Times New Roman" w:hAnsiTheme="majorHAnsi" w:cs="Times New Roman"/>
+          <w:sz w:val="24"/>
+          <w:szCs w:val="24"/>
+          <w:lang w:val="en-US" w:eastAsia="ru-RU"/>
+        </w:rPr>
+        <w:t>VirusTotal</w:t>
+      </w:r>
+      <w:proofErr w:type="spellEnd"/>
+      <w:r>
+        <w:rPr>
+          <w:rFonts w:asciiTheme="majorHAnsi" w:eastAsia="Times New Roman" w:hAnsiTheme="majorHAnsi" w:cs="Times New Roman"/>
+          <w:sz w:val="24"/>
+          <w:szCs w:val="24"/>
+          <w:lang w:val="en-US" w:eastAsia="ru-RU"/>
+        </w:rPr>
+        <w:t xml:space="preserve"> will be used to enrich the information collected from other sources.</w:t>
+      </w:r>
+    </w:p>
+    <w:p>
+      <w:pPr>
+        <w:spacing w:after="120" w:line="240" w:lineRule="auto"/>
+        <w:rPr>
+          <w:rFonts w:asciiTheme="majorHAnsi" w:eastAsia="Times New Roman" w:hAnsiTheme="majorHAnsi" w:cs="Times New Roman"/>
+          <w:sz w:val="24"/>
+          <w:szCs w:val="24"/>
+          <w:lang w:eastAsia="ru-RU"/>
+        </w:rPr>
+      </w:pPr>
+      <w:proofErr w:type="spellStart"/>
+      <w:r>
+        <w:rPr>
+          <w:rFonts w:asciiTheme="majorHAnsi" w:eastAsia="Times New Roman" w:hAnsiTheme="majorHAnsi" w:cs="Times New Roman"/>
+          <w:sz w:val="24"/>
+          <w:szCs w:val="24"/>
+          <w:lang w:eastAsia="ru-RU"/>
+        </w:rPr>
+        <w:t>It</w:t>
+      </w:r>
+      <w:proofErr w:type="spellEnd"/>
+      <w:r>
+        <w:rPr>
+          <w:rFonts w:asciiTheme="majorHAnsi" w:eastAsia="Times New Roman" w:hAnsiTheme="majorHAnsi" w:cs="Times New Roman"/>
+          <w:sz w:val="24"/>
+          <w:szCs w:val="24"/>
+          <w:lang w:eastAsia="ru-RU"/>
+        </w:rPr>
+        <w:t xml:space="preserve"> </w:t>
+      </w:r>
+      <w:proofErr w:type="spellStart"/>
+      <w:r>
+        <w:rPr>
+          <w:rFonts w:asciiTheme="majorHAnsi" w:eastAsia="Times New Roman" w:hAnsiTheme="majorHAnsi" w:cs="Times New Roman"/>
+          <w:sz w:val="24"/>
+          <w:szCs w:val="24"/>
+          <w:lang w:eastAsia="ru-RU"/>
+        </w:rPr>
+        <w:t>supports</w:t>
+      </w:r>
+      <w:proofErr w:type="spellEnd"/>
+      <w:r>
+        <w:rPr>
+          <w:rFonts w:asciiTheme="majorHAnsi" w:eastAsia="Times New Roman" w:hAnsiTheme="majorHAnsi" w:cs="Times New Roman"/>
+          <w:sz w:val="24"/>
+          <w:szCs w:val="24"/>
+          <w:lang w:eastAsia="ru-RU"/>
+        </w:rPr>
+        <w:t xml:space="preserve"> </w:t>
+      </w:r>
+      <w:proofErr w:type="spellStart"/>
+      <w:r>
+        <w:rPr>
+          <w:rFonts w:asciiTheme="majorHAnsi" w:eastAsia="Times New Roman" w:hAnsiTheme="majorHAnsi" w:cs="Times New Roman"/>
+          <w:sz w:val="24"/>
+          <w:szCs w:val="24"/>
+          <w:lang w:eastAsia="ru-RU"/>
+        </w:rPr>
+        <w:t>searches</w:t>
+      </w:r>
+      <w:proofErr w:type="spellEnd"/>
+      <w:r>
+        <w:rPr>
+          <w:rFonts w:asciiTheme="majorHAnsi" w:eastAsia="Times New Roman" w:hAnsiTheme="majorHAnsi" w:cs="Times New Roman"/>
+          <w:sz w:val="24"/>
+          <w:szCs w:val="24"/>
+          <w:lang w:eastAsia="ru-RU"/>
+        </w:rPr>
+        <w:t xml:space="preserve"> </w:t>
+      </w:r>
+      <w:proofErr w:type="spellStart"/>
+      <w:r>
+        <w:rPr>
+          <w:rFonts w:asciiTheme="majorHAnsi" w:eastAsia="Times New Roman" w:hAnsiTheme="majorHAnsi" w:cs="Times New Roman"/>
+          <w:sz w:val="24"/>
+          <w:szCs w:val="24"/>
+          <w:lang w:eastAsia="ru-RU"/>
+        </w:rPr>
+        <w:t>for</w:t>
+      </w:r>
+      <w:proofErr w:type="spellEnd"/>
+      <w:r>
+        <w:rPr>
+          <w:rFonts w:asciiTheme="majorHAnsi" w:eastAsia="Times New Roman" w:hAnsiTheme="majorHAnsi" w:cs="Times New Roman"/>
+          <w:sz w:val="24"/>
+          <w:szCs w:val="24"/>
+          <w:lang w:eastAsia="ru-RU"/>
+        </w:rPr>
+        <w:t>:</w:t>
+      </w:r>
+    </w:p>
+    <w:p>
+      <w:pPr>
+        <w:numPr>
+          <w:ilvl w:val="0"/>
+          <w:numId w:val="5"/>
+        </w:numPr>
+        <w:spacing w:after="0" w:line="240" w:lineRule="auto"/>
+        <w:rPr>
+          <w:rFonts w:asciiTheme="majorHAnsi" w:eastAsia="Times New Roman" w:hAnsiTheme="majorHAnsi" w:cs="Times New Roman"/>
+          <w:sz w:val="24"/>
+          <w:szCs w:val="24"/>
+          <w:lang w:eastAsia="ru-RU"/>
+        </w:rPr>
+      </w:pPr>
+      <w:r>
+        <w:rPr>
+          <w:rFonts w:asciiTheme="majorHAnsi" w:eastAsia="Times New Roman" w:hAnsiTheme="majorHAnsi" w:cs="Times New Roman"/>
+          <w:sz w:val="24"/>
+          <w:szCs w:val="24"/>
+          <w:lang w:eastAsia="ru-RU"/>
+        </w:rPr>
+        <w:t xml:space="preserve">IP </w:t>
+      </w:r>
+      <w:proofErr w:type="spellStart"/>
+      <w:r>
+        <w:rPr>
+          <w:rFonts w:asciiTheme="majorHAnsi" w:eastAsia="Times New Roman" w:hAnsiTheme="majorHAnsi" w:cs="Times New Roman"/>
+          <w:sz w:val="24"/>
+          <w:szCs w:val="24"/>
+          <w:lang w:eastAsia="ru-RU"/>
+        </w:rPr>
+        <w:t>addresses</w:t>
+      </w:r>
+      <w:proofErr w:type="spellEnd"/>
+      <w:r>
+        <w:rPr>
+          <w:rFonts w:asciiTheme="majorHAnsi" w:eastAsia="Times New Roman" w:hAnsiTheme="majorHAnsi" w:cs="Times New Roman"/>
+          <w:sz w:val="24"/>
+          <w:szCs w:val="24"/>
+          <w:lang w:eastAsia="ru-RU"/>
+        </w:rPr>
+        <w:t xml:space="preserve">; </w:t>
+      </w:r>
+    </w:p>
+    <w:p>
+      <w:pPr>
+        <w:numPr>
+          <w:ilvl w:val="0"/>
+          <w:numId w:val="5"/>
+        </w:numPr>
+        <w:spacing w:after="0" w:line="240" w:lineRule="auto"/>
+        <w:rPr>
+          <w:rFonts w:asciiTheme="majorHAnsi" w:eastAsia="Times New Roman" w:hAnsiTheme="majorHAnsi" w:cs="Times New Roman"/>
+          <w:sz w:val="24"/>
+          <w:szCs w:val="24"/>
+          <w:lang w:eastAsia="ru-RU"/>
+        </w:rPr>
+      </w:pPr>
+      <w:r>
+        <w:rPr>
+          <w:rFonts w:asciiTheme="majorHAnsi" w:eastAsia="Times New Roman" w:hAnsiTheme="majorHAnsi" w:cs="Times New Roman"/>
+          <w:sz w:val="24"/>
+          <w:szCs w:val="24"/>
+          <w:lang w:val="en-US" w:eastAsia="ru-RU"/>
+        </w:rPr>
+        <w:t>D</w:t>
+      </w:r>
+      <w:proofErr w:type="spellStart"/>
+      <w:r>
+        <w:rPr>
+          <w:rFonts w:asciiTheme="majorHAnsi" w:eastAsia="Times New Roman" w:hAnsiTheme="majorHAnsi" w:cs="Times New Roman"/>
+          <w:sz w:val="24"/>
+          <w:szCs w:val="24"/>
+          <w:lang w:eastAsia="ru-RU"/>
+        </w:rPr>
+        <w:t>omains</w:t>
+      </w:r>
+      <w:proofErr w:type="spellEnd"/>
+      <w:r>
+        <w:rPr>
+          <w:rFonts w:asciiTheme="majorHAnsi" w:eastAsia="Times New Roman" w:hAnsiTheme="majorHAnsi" w:cs="Times New Roman"/>
+          <w:sz w:val="24"/>
+          <w:szCs w:val="24"/>
+          <w:lang w:eastAsia="ru-RU"/>
+        </w:rPr>
+        <w:t xml:space="preserve">; </w:t>
+      </w:r>
+    </w:p>
+    <w:p>
+      <w:pPr>
+        <w:numPr>
+          <w:ilvl w:val="0"/>
+          <w:numId w:val="5"/>
+        </w:numPr>
+        <w:spacing w:after="0" w:line="240" w:lineRule="auto"/>
+        <w:rPr>
+          <w:rFonts w:asciiTheme="majorHAnsi" w:eastAsia="Times New Roman" w:hAnsiTheme="majorHAnsi" w:cs="Times New Roman"/>
+          <w:sz w:val="24"/>
+          <w:szCs w:val="24"/>
+          <w:lang w:eastAsia="ru-RU"/>
+        </w:rPr>
+      </w:pPr>
+      <w:r>
+        <w:rPr>
+          <w:rFonts w:asciiTheme="majorHAnsi" w:eastAsia="Times New Roman" w:hAnsiTheme="majorHAnsi" w:cs="Times New Roman"/>
+          <w:sz w:val="24"/>
+          <w:szCs w:val="24"/>
+          <w:lang w:val="en-US" w:eastAsia="ru-RU"/>
+        </w:rPr>
+        <w:t>U</w:t>
+      </w:r>
+      <w:proofErr w:type="spellStart"/>
+      <w:r>
+        <w:rPr>
+          <w:rFonts w:asciiTheme="majorHAnsi" w:eastAsia="Times New Roman" w:hAnsiTheme="majorHAnsi" w:cs="Times New Roman"/>
+          <w:sz w:val="24"/>
+          <w:szCs w:val="24"/>
+          <w:lang w:eastAsia="ru-RU"/>
+        </w:rPr>
+        <w:t>RLs</w:t>
+      </w:r>
+      <w:proofErr w:type="spellEnd"/>
+      <w:r>
+        <w:rPr>
+          <w:rFonts w:asciiTheme="majorHAnsi" w:eastAsia="Times New Roman" w:hAnsiTheme="majorHAnsi" w:cs="Times New Roman"/>
+          <w:sz w:val="24"/>
+          <w:szCs w:val="24"/>
+          <w:lang w:eastAsia="ru-RU"/>
+        </w:rPr>
+        <w:t xml:space="preserve">; </w:t>
+      </w:r>
+    </w:p>
+    <w:p>
+      <w:pPr>
+        <w:numPr>
+          <w:ilvl w:val="0"/>
+          <w:numId w:val="5"/>
+        </w:numPr>
+        <w:spacing w:after="0" w:line="240" w:lineRule="auto"/>
+        <w:rPr>
+          <w:rFonts w:asciiTheme="majorHAnsi" w:eastAsia="Times New Roman" w:hAnsiTheme="majorHAnsi" w:cs="Times New Roman"/>
+          <w:sz w:val="24"/>
+          <w:szCs w:val="24"/>
+          <w:lang w:eastAsia="ru-RU"/>
+        </w:rPr>
+      </w:pPr>
+      <w:r>
+        <w:rPr>
+          <w:rFonts w:asciiTheme="majorHAnsi" w:eastAsia="Times New Roman" w:hAnsiTheme="majorHAnsi" w:cs="Times New Roman"/>
+          <w:sz w:val="24"/>
+          <w:szCs w:val="24"/>
+          <w:lang w:val="en-US" w:eastAsia="ru-RU"/>
+        </w:rPr>
+        <w:t>Fi</w:t>
+      </w:r>
+      <w:proofErr w:type="spellStart"/>
+      <w:r>
+        <w:rPr>
+          <w:rFonts w:asciiTheme="majorHAnsi" w:eastAsia="Times New Roman" w:hAnsiTheme="majorHAnsi" w:cs="Times New Roman"/>
+          <w:sz w:val="24"/>
+          <w:szCs w:val="24"/>
+          <w:lang w:eastAsia="ru-RU"/>
+        </w:rPr>
+        <w:t>le</w:t>
+      </w:r>
+      <w:proofErr w:type="spellEnd"/>
+      <w:r>
+        <w:rPr>
+          <w:rFonts w:asciiTheme="majorHAnsi" w:eastAsia="Times New Roman" w:hAnsiTheme="majorHAnsi" w:cs="Times New Roman"/>
+          <w:sz w:val="24"/>
+          <w:szCs w:val="24"/>
+          <w:lang w:eastAsia="ru-RU"/>
+        </w:rPr>
+        <w:t xml:space="preserve"> </w:t>
+      </w:r>
+      <w:proofErr w:type="spellStart"/>
+      <w:r>
+        <w:rPr>
+          <w:rFonts w:asciiTheme="majorHAnsi" w:eastAsia="Times New Roman" w:hAnsiTheme="majorHAnsi" w:cs="Times New Roman"/>
+          <w:sz w:val="24"/>
+          <w:szCs w:val="24"/>
+          <w:lang w:eastAsia="ru-RU"/>
+        </w:rPr>
+        <w:t>hashes</w:t>
+      </w:r>
+      <w:proofErr w:type="spellEnd"/>
+      <w:r>
+        <w:rPr>
+          <w:rFonts w:asciiTheme="majorHAnsi" w:eastAsia="Times New Roman" w:hAnsiTheme="majorHAnsi" w:cs="Times New Roman"/>
+          <w:sz w:val="24"/>
+          <w:szCs w:val="24"/>
+          <w:lang w:eastAsia="ru-RU"/>
+        </w:rPr>
+        <w:t xml:space="preserve">; </w:t>
+      </w:r>
+    </w:p>
+    <w:p>
+      <w:pPr>
+        <w:numPr>
+          <w:ilvl w:val="0"/>
+          <w:numId w:val="5"/>
+        </w:numPr>
+        <w:spacing w:after="100" w:afterAutospacing="1" w:line="240" w:lineRule="auto"/>
+        <w:rPr>
+          <w:rFonts w:asciiTheme="majorHAnsi" w:eastAsia="Times New Roman" w:hAnsiTheme="majorHAnsi" w:cs="Times New Roman"/>
+          <w:sz w:val="24"/>
+          <w:szCs w:val="24"/>
+          <w:lang w:eastAsia="ru-RU"/>
+        </w:rPr>
+      </w:pPr>
+      <w:r>
+        <w:rPr>
+          <w:rFonts w:asciiTheme="majorHAnsi" w:eastAsia="Times New Roman" w:hAnsiTheme="majorHAnsi" w:cs="Times New Roman"/>
+          <w:sz w:val="24"/>
+          <w:szCs w:val="24"/>
+          <w:lang w:val="en-US" w:eastAsia="ru-RU"/>
+        </w:rPr>
+        <w:t>C</w:t>
+      </w:r>
+      <w:proofErr w:type="spellStart"/>
+      <w:r>
+        <w:rPr>
+          <w:rFonts w:asciiTheme="majorHAnsi" w:eastAsia="Times New Roman" w:hAnsiTheme="majorHAnsi" w:cs="Times New Roman"/>
+          <w:sz w:val="24"/>
+          <w:szCs w:val="24"/>
+          <w:lang w:eastAsia="ru-RU"/>
+        </w:rPr>
+        <w:t>omments</w:t>
+      </w:r>
+      <w:proofErr w:type="spellEnd"/>
+      <w:r>
+        <w:rPr>
+          <w:rFonts w:asciiTheme="majorHAnsi" w:eastAsia="Times New Roman" w:hAnsiTheme="majorHAnsi" w:cs="Times New Roman"/>
+          <w:sz w:val="24"/>
+          <w:szCs w:val="24"/>
+          <w:lang w:eastAsia="ru-RU"/>
+        </w:rPr>
+        <w:t xml:space="preserve"> </w:t>
+      </w:r>
+      <w:proofErr w:type="spellStart"/>
+      <w:r>
+        <w:rPr>
+          <w:rFonts w:asciiTheme="majorHAnsi" w:eastAsia="Times New Roman" w:hAnsiTheme="majorHAnsi" w:cs="Times New Roman"/>
+          <w:sz w:val="24"/>
+          <w:szCs w:val="24"/>
+          <w:lang w:eastAsia="ru-RU"/>
+        </w:rPr>
+        <w:t>and</w:t>
+      </w:r>
+      <w:proofErr w:type="spellEnd"/>
+      <w:r>
+        <w:rPr>
+          <w:rFonts w:asciiTheme="majorHAnsi" w:eastAsia="Times New Roman" w:hAnsiTheme="majorHAnsi" w:cs="Times New Roman"/>
+          <w:sz w:val="24"/>
+          <w:szCs w:val="24"/>
+          <w:lang w:eastAsia="ru-RU"/>
+        </w:rPr>
+        <w:t xml:space="preserve"> </w:t>
+      </w:r>
+      <w:proofErr w:type="spellStart"/>
+      <w:r>
+        <w:rPr>
+          <w:rFonts w:asciiTheme="majorHAnsi" w:eastAsia="Times New Roman" w:hAnsiTheme="majorHAnsi" w:cs="Times New Roman"/>
+          <w:sz w:val="24"/>
+          <w:szCs w:val="24"/>
+          <w:lang w:eastAsia="ru-RU"/>
+        </w:rPr>
+        <w:t>related</w:t>
+      </w:r>
+      <w:proofErr w:type="spellEnd"/>
+      <w:r>
+        <w:rPr>
+          <w:rFonts w:asciiTheme="majorHAnsi" w:eastAsia="Times New Roman" w:hAnsiTheme="majorHAnsi" w:cs="Times New Roman"/>
+          <w:sz w:val="24"/>
+          <w:szCs w:val="24"/>
+          <w:lang w:eastAsia="ru-RU"/>
+        </w:rPr>
+        <w:t xml:space="preserve"> </w:t>
+      </w:r>
+      <w:proofErr w:type="spellStart"/>
+      <w:r>
+        <w:rPr>
+          <w:rFonts w:asciiTheme="majorHAnsi" w:eastAsia="Times New Roman" w:hAnsiTheme="majorHAnsi" w:cs="Times New Roman"/>
+          <w:sz w:val="24"/>
+          <w:szCs w:val="24"/>
+          <w:lang w:eastAsia="ru-RU"/>
+        </w:rPr>
+        <w:t>objects</w:t>
+      </w:r>
+      <w:proofErr w:type="spellEnd"/>
+      <w:r>
+        <w:rPr>
+          <w:rFonts w:asciiTheme="majorHAnsi" w:eastAsia="Times New Roman" w:hAnsiTheme="majorHAnsi" w:cs="Times New Roman"/>
+          <w:sz w:val="24"/>
+          <w:szCs w:val="24"/>
+          <w:lang w:eastAsia="ru-RU"/>
+        </w:rPr>
+        <w:t xml:space="preserve">. </w:t>
+      </w:r>
+    </w:p>
+    <w:p>
+      <w:pPr>
+        <w:spacing w:after="0" w:line="240" w:lineRule="auto"/>
+        <w:rPr>
+          <w:rFonts w:asciiTheme="majorHAnsi" w:eastAsia="Times New Roman" w:hAnsiTheme="majorHAnsi" w:cs="Times New Roman"/>
+          <w:sz w:val="24"/>
+          <w:szCs w:val="24"/>
+          <w:lang w:val="en-US" w:eastAsia="ru-RU"/>
+        </w:rPr>
+      </w:pPr>
+      <w:r>
+        <w:rPr>
+          <w:rFonts w:asciiTheme="majorHAnsi" w:eastAsia="Times New Roman" w:hAnsiTheme="majorHAnsi" w:cs="Times New Roman"/>
+          <w:sz w:val="24"/>
+          <w:szCs w:val="24"/>
+          <w:lang w:val="en-US" w:eastAsia="ru-RU"/>
+        </w:rPr>
+        <w:t xml:space="preserve">For an IP address, </w:t>
+      </w:r>
+      <w:proofErr w:type="spellStart"/>
+      <w:r>
+        <w:rPr>
+          <w:rFonts w:asciiTheme="majorHAnsi" w:eastAsia="Times New Roman" w:hAnsiTheme="majorHAnsi" w:cs="Times New Roman"/>
+          <w:sz w:val="24"/>
+          <w:szCs w:val="24"/>
+          <w:lang w:val="en-US" w:eastAsia="ru-RU"/>
+        </w:rPr>
+        <w:t>VirusTotal</w:t>
+      </w:r>
+      <w:proofErr w:type="spellEnd"/>
+      <w:r>
+        <w:rPr>
+          <w:rFonts w:asciiTheme="majorHAnsi" w:eastAsia="Times New Roman" w:hAnsiTheme="majorHAnsi" w:cs="Times New Roman"/>
+          <w:sz w:val="24"/>
+          <w:szCs w:val="24"/>
+          <w:lang w:val="en-US" w:eastAsia="ru-RU"/>
+        </w:rPr>
+        <w:t xml:space="preserve"> can provide information such as:</w:t>
+      </w:r>
+    </w:p>
+    <w:p>
+      <w:pPr>
+        <w:numPr>
+          <w:ilvl w:val="0"/>
+          <w:numId w:val="6"/>
+        </w:numPr>
+        <w:spacing w:after="0" w:line="240" w:lineRule="auto"/>
+        <w:rPr>
+          <w:rFonts w:asciiTheme="majorHAnsi" w:eastAsia="Times New Roman" w:hAnsiTheme="majorHAnsi" w:cs="Times New Roman"/>
+          <w:sz w:val="24"/>
+          <w:szCs w:val="24"/>
+          <w:lang w:eastAsia="ru-RU"/>
+        </w:rPr>
+      </w:pPr>
+      <w:r>
+        <w:rPr>
+          <w:rFonts w:asciiTheme="majorHAnsi" w:eastAsia="Times New Roman" w:hAnsiTheme="majorHAnsi" w:cs="Times New Roman"/>
+          <w:sz w:val="24"/>
+          <w:szCs w:val="24"/>
+          <w:lang w:eastAsia="ru-RU"/>
+        </w:rPr>
+        <w:t xml:space="preserve">ASN; </w:t>
+      </w:r>
+    </w:p>
+    <w:p>
+      <w:pPr>
+        <w:numPr>
+          <w:ilvl w:val="0"/>
+          <w:numId w:val="6"/>
+        </w:numPr>
+        <w:spacing w:after="0" w:line="240" w:lineRule="auto"/>
+        <w:rPr>
+          <w:rFonts w:asciiTheme="majorHAnsi" w:eastAsia="Times New Roman" w:hAnsiTheme="majorHAnsi" w:cs="Times New Roman"/>
+          <w:sz w:val="24"/>
+          <w:szCs w:val="24"/>
+          <w:lang w:eastAsia="ru-RU"/>
+        </w:rPr>
+      </w:pPr>
+      <w:r>
+        <w:rPr>
+          <w:rFonts w:asciiTheme="majorHAnsi" w:eastAsia="Times New Roman" w:hAnsiTheme="majorHAnsi" w:cs="Times New Roman"/>
+          <w:sz w:val="24"/>
+          <w:szCs w:val="24"/>
+          <w:lang w:eastAsia="ru-RU"/>
+        </w:rPr>
+        <w:t xml:space="preserve">AS </w:t>
+      </w:r>
+      <w:proofErr w:type="spellStart"/>
+      <w:r>
+        <w:rPr>
+          <w:rFonts w:asciiTheme="majorHAnsi" w:eastAsia="Times New Roman" w:hAnsiTheme="majorHAnsi" w:cs="Times New Roman"/>
+          <w:sz w:val="24"/>
+          <w:szCs w:val="24"/>
+          <w:lang w:eastAsia="ru-RU"/>
+        </w:rPr>
+        <w:t>owner</w:t>
+      </w:r>
+      <w:proofErr w:type="spellEnd"/>
+      <w:r>
+        <w:rPr>
+          <w:rFonts w:asciiTheme="majorHAnsi" w:eastAsia="Times New Roman" w:hAnsiTheme="majorHAnsi" w:cs="Times New Roman"/>
+          <w:sz w:val="24"/>
+          <w:szCs w:val="24"/>
+          <w:lang w:eastAsia="ru-RU"/>
+        </w:rPr>
+        <w:t xml:space="preserve">; </w:t>
+      </w:r>
+    </w:p>
+    <w:p>
+      <w:pPr>
+        <w:numPr>
+          <w:ilvl w:val="0"/>
+          <w:numId w:val="6"/>
+        </w:numPr>
+        <w:spacing w:after="0" w:line="240" w:lineRule="auto"/>
+        <w:rPr>
+          <w:rFonts w:asciiTheme="majorHAnsi" w:eastAsia="Times New Roman" w:hAnsiTheme="majorHAnsi" w:cs="Times New Roman"/>
+          <w:sz w:val="24"/>
+          <w:szCs w:val="24"/>
+          <w:lang w:eastAsia="ru-RU"/>
+        </w:rPr>
+      </w:pPr>
+      <w:r>
+        <w:rPr>
+          <w:rFonts w:asciiTheme="majorHAnsi" w:eastAsia="Times New Roman" w:hAnsiTheme="majorHAnsi" w:cs="Times New Roman"/>
+          <w:sz w:val="24"/>
+          <w:szCs w:val="24"/>
+          <w:lang w:val="en-US" w:eastAsia="ru-RU"/>
+        </w:rPr>
+        <w:t>G</w:t>
+      </w:r>
+      <w:proofErr w:type="spellStart"/>
+      <w:r>
+        <w:rPr>
+          <w:rFonts w:asciiTheme="majorHAnsi" w:eastAsia="Times New Roman" w:hAnsiTheme="majorHAnsi" w:cs="Times New Roman"/>
+          <w:sz w:val="24"/>
+          <w:szCs w:val="24"/>
+          <w:lang w:eastAsia="ru-RU"/>
+        </w:rPr>
+        <w:t>eographical</w:t>
+      </w:r>
+      <w:proofErr w:type="spellEnd"/>
+      <w:r>
+        <w:rPr>
+          <w:rFonts w:asciiTheme="majorHAnsi" w:eastAsia="Times New Roman" w:hAnsiTheme="majorHAnsi" w:cs="Times New Roman"/>
+          <w:sz w:val="24"/>
+          <w:szCs w:val="24"/>
+          <w:lang w:eastAsia="ru-RU"/>
+        </w:rPr>
+        <w:t xml:space="preserve"> </w:t>
+      </w:r>
+      <w:proofErr w:type="spellStart"/>
+      <w:r>
+        <w:rPr>
+          <w:rFonts w:asciiTheme="majorHAnsi" w:eastAsia="Times New Roman" w:hAnsiTheme="majorHAnsi" w:cs="Times New Roman"/>
+          <w:sz w:val="24"/>
+          <w:szCs w:val="24"/>
+          <w:lang w:eastAsia="ru-RU"/>
+        </w:rPr>
+        <w:t>information</w:t>
+      </w:r>
+      <w:proofErr w:type="spellEnd"/>
+      <w:r>
+        <w:rPr>
+          <w:rFonts w:asciiTheme="majorHAnsi" w:eastAsia="Times New Roman" w:hAnsiTheme="majorHAnsi" w:cs="Times New Roman"/>
+          <w:sz w:val="24"/>
+          <w:szCs w:val="24"/>
+          <w:lang w:eastAsia="ru-RU"/>
+        </w:rPr>
+        <w:t xml:space="preserve">; </w:t>
+      </w:r>
+    </w:p>
+    <w:p>
+      <w:pPr>
+        <w:numPr>
+          <w:ilvl w:val="0"/>
+          <w:numId w:val="6"/>
+        </w:numPr>
+        <w:spacing w:after="0" w:line="240" w:lineRule="auto"/>
+        <w:rPr>
+          <w:rFonts w:asciiTheme="majorHAnsi" w:eastAsia="Times New Roman" w:hAnsiTheme="majorHAnsi" w:cs="Times New Roman"/>
+          <w:sz w:val="24"/>
+          <w:szCs w:val="24"/>
+          <w:lang w:eastAsia="ru-RU"/>
+        </w:rPr>
+      </w:pPr>
+      <w:r>
+        <w:rPr>
+          <w:rFonts w:asciiTheme="majorHAnsi" w:eastAsia="Times New Roman" w:hAnsiTheme="majorHAnsi" w:cs="Times New Roman"/>
+          <w:sz w:val="24"/>
+          <w:szCs w:val="24"/>
+          <w:lang w:val="en-US" w:eastAsia="ru-RU"/>
+        </w:rPr>
+        <w:t>R</w:t>
+      </w:r>
+      <w:proofErr w:type="spellStart"/>
+      <w:r>
+        <w:rPr>
+          <w:rFonts w:asciiTheme="majorHAnsi" w:eastAsia="Times New Roman" w:hAnsiTheme="majorHAnsi" w:cs="Times New Roman"/>
+          <w:sz w:val="24"/>
+          <w:szCs w:val="24"/>
+          <w:lang w:eastAsia="ru-RU"/>
+        </w:rPr>
+        <w:t>eputation</w:t>
+      </w:r>
+      <w:proofErr w:type="spellEnd"/>
+      <w:r>
+        <w:rPr>
+          <w:rFonts w:asciiTheme="majorHAnsi" w:eastAsia="Times New Roman" w:hAnsiTheme="majorHAnsi" w:cs="Times New Roman"/>
+          <w:sz w:val="24"/>
+          <w:szCs w:val="24"/>
+          <w:lang w:eastAsia="ru-RU"/>
+        </w:rPr>
+        <w:t>/</w:t>
+      </w:r>
+      <w:proofErr w:type="spellStart"/>
+      <w:r>
+        <w:rPr>
+          <w:rFonts w:asciiTheme="majorHAnsi" w:eastAsia="Times New Roman" w:hAnsiTheme="majorHAnsi" w:cs="Times New Roman"/>
+          <w:sz w:val="24"/>
+          <w:szCs w:val="24"/>
+          <w:lang w:eastAsia="ru-RU"/>
+        </w:rPr>
+        <w:t>detections</w:t>
+      </w:r>
+      <w:proofErr w:type="spellEnd"/>
+      <w:r>
+        <w:rPr>
+          <w:rFonts w:asciiTheme="majorHAnsi" w:eastAsia="Times New Roman" w:hAnsiTheme="majorHAnsi" w:cs="Times New Roman"/>
+          <w:sz w:val="24"/>
+          <w:szCs w:val="24"/>
+          <w:lang w:eastAsia="ru-RU"/>
+        </w:rPr>
+        <w:t xml:space="preserve">; </w:t>
+      </w:r>
+    </w:p>
+    <w:p>
+      <w:pPr>
+        <w:numPr>
+          <w:ilvl w:val="0"/>
+          <w:numId w:val="6"/>
+        </w:numPr>
+        <w:spacing w:after="0" w:line="240" w:lineRule="auto"/>
+        <w:rPr>
+          <w:rFonts w:asciiTheme="majorHAnsi" w:eastAsia="Times New Roman" w:hAnsiTheme="majorHAnsi" w:cs="Times New Roman"/>
+          <w:sz w:val="24"/>
+          <w:szCs w:val="24"/>
+          <w:lang w:eastAsia="ru-RU"/>
+        </w:rPr>
+      </w:pPr>
+      <w:r>
+        <w:rPr>
+          <w:rFonts w:asciiTheme="majorHAnsi" w:eastAsia="Times New Roman" w:hAnsiTheme="majorHAnsi" w:cs="Times New Roman"/>
+          <w:sz w:val="24"/>
+          <w:szCs w:val="24"/>
+          <w:lang w:val="en-US" w:eastAsia="ru-RU"/>
+        </w:rPr>
+        <w:t>R</w:t>
+      </w:r>
+      <w:proofErr w:type="spellStart"/>
+      <w:r>
+        <w:rPr>
+          <w:rFonts w:asciiTheme="majorHAnsi" w:eastAsia="Times New Roman" w:hAnsiTheme="majorHAnsi" w:cs="Times New Roman"/>
+          <w:sz w:val="24"/>
+          <w:szCs w:val="24"/>
+          <w:lang w:eastAsia="ru-RU"/>
+        </w:rPr>
+        <w:t>elated</w:t>
+      </w:r>
+      <w:proofErr w:type="spellEnd"/>
+      <w:r>
+        <w:rPr>
+          <w:rFonts w:asciiTheme="majorHAnsi" w:eastAsia="Times New Roman" w:hAnsiTheme="majorHAnsi" w:cs="Times New Roman"/>
+          <w:sz w:val="24"/>
+          <w:szCs w:val="24"/>
+          <w:lang w:eastAsia="ru-RU"/>
+        </w:rPr>
+        <w:t xml:space="preserve"> </w:t>
+      </w:r>
+      <w:proofErr w:type="spellStart"/>
+      <w:r>
+        <w:rPr>
+          <w:rFonts w:asciiTheme="majorHAnsi" w:eastAsia="Times New Roman" w:hAnsiTheme="majorHAnsi" w:cs="Times New Roman"/>
+          <w:sz w:val="24"/>
+          <w:szCs w:val="24"/>
+          <w:lang w:eastAsia="ru-RU"/>
+        </w:rPr>
+        <w:t>domains</w:t>
+      </w:r>
+      <w:proofErr w:type="spellEnd"/>
+      <w:r>
+        <w:rPr>
+          <w:rFonts w:asciiTheme="majorHAnsi" w:eastAsia="Times New Roman" w:hAnsiTheme="majorHAnsi" w:cs="Times New Roman"/>
+          <w:sz w:val="24"/>
+          <w:szCs w:val="24"/>
+          <w:lang w:eastAsia="ru-RU"/>
+        </w:rPr>
+        <w:t xml:space="preserve">; </w:t>
+      </w:r>
+    </w:p>
+    <w:p>
+      <w:pPr>
+        <w:numPr>
+          <w:ilvl w:val="0"/>
+          <w:numId w:val="6"/>
+        </w:numPr>
+        <w:spacing w:after="120" w:line="240" w:lineRule="auto"/>
+        <w:rPr>
+          <w:rFonts w:asciiTheme="majorHAnsi" w:eastAsia="Times New Roman" w:hAnsiTheme="majorHAnsi" w:cs="Times New Roman"/>
+          <w:sz w:val="24"/>
+          <w:szCs w:val="24"/>
+          <w:lang w:eastAsia="ru-RU"/>
+        </w:rPr>
+      </w:pPr>
+      <w:proofErr w:type="spellStart"/>
+      <w:r>
+        <w:rPr>
+          <w:rFonts w:asciiTheme="majorHAnsi" w:eastAsia="Times New Roman" w:hAnsiTheme="majorHAnsi" w:cs="Times New Roman"/>
+          <w:sz w:val="24"/>
+          <w:szCs w:val="24"/>
+          <w:lang w:eastAsia="ru-RU"/>
+        </w:rPr>
+        <w:t>relationships</w:t>
+      </w:r>
+      <w:proofErr w:type="spellEnd"/>
+      <w:r>
+        <w:rPr>
+          <w:rFonts w:asciiTheme="majorHAnsi" w:eastAsia="Times New Roman" w:hAnsiTheme="majorHAnsi" w:cs="Times New Roman"/>
+          <w:sz w:val="24"/>
+          <w:szCs w:val="24"/>
+          <w:lang w:eastAsia="ru-RU"/>
+        </w:rPr>
+        <w:t xml:space="preserve"> </w:t>
+      </w:r>
+      <w:proofErr w:type="spellStart"/>
+      <w:r>
+        <w:rPr>
+          <w:rFonts w:asciiTheme="majorHAnsi" w:eastAsia="Times New Roman" w:hAnsiTheme="majorHAnsi" w:cs="Times New Roman"/>
+          <w:sz w:val="24"/>
+          <w:szCs w:val="24"/>
+          <w:lang w:eastAsia="ru-RU"/>
+        </w:rPr>
+        <w:t>with</w:t>
+      </w:r>
+      <w:proofErr w:type="spellEnd"/>
+      <w:r>
+        <w:rPr>
+          <w:rFonts w:asciiTheme="majorHAnsi" w:eastAsia="Times New Roman" w:hAnsiTheme="majorHAnsi" w:cs="Times New Roman"/>
+          <w:sz w:val="24"/>
+          <w:szCs w:val="24"/>
+          <w:lang w:eastAsia="ru-RU"/>
+        </w:rPr>
+        <w:t xml:space="preserve"> </w:t>
+      </w:r>
+      <w:proofErr w:type="spellStart"/>
+      <w:r>
+        <w:rPr>
+          <w:rFonts w:asciiTheme="majorHAnsi" w:eastAsia="Times New Roman" w:hAnsiTheme="majorHAnsi" w:cs="Times New Roman"/>
+          <w:sz w:val="24"/>
+          <w:szCs w:val="24"/>
+          <w:lang w:eastAsia="ru-RU"/>
+        </w:rPr>
+        <w:t>other</w:t>
+      </w:r>
+      <w:proofErr w:type="spellEnd"/>
+      <w:r>
+        <w:rPr>
+          <w:rFonts w:asciiTheme="majorHAnsi" w:eastAsia="Times New Roman" w:hAnsiTheme="majorHAnsi" w:cs="Times New Roman"/>
+          <w:sz w:val="24"/>
+          <w:szCs w:val="24"/>
+          <w:lang w:eastAsia="ru-RU"/>
+        </w:rPr>
+        <w:t xml:space="preserve"> </w:t>
+      </w:r>
+      <w:proofErr w:type="spellStart"/>
+      <w:r>
+        <w:rPr>
+          <w:rFonts w:asciiTheme="majorHAnsi" w:eastAsia="Times New Roman" w:hAnsiTheme="majorHAnsi" w:cs="Times New Roman"/>
+          <w:sz w:val="24"/>
+          <w:szCs w:val="24"/>
+          <w:lang w:eastAsia="ru-RU"/>
+        </w:rPr>
+        <w:t>objects</w:t>
+      </w:r>
+      <w:proofErr w:type="spellEnd"/>
+      <w:r>
+        <w:rPr>
+          <w:rFonts w:asciiTheme="majorHAnsi" w:eastAsia="Times New Roman" w:hAnsiTheme="majorHAnsi" w:cs="Times New Roman"/>
+          <w:sz w:val="24"/>
+          <w:szCs w:val="24"/>
+          <w:lang w:eastAsia="ru-RU"/>
+        </w:rPr>
+        <w:t xml:space="preserve">. </w:t>
+      </w:r>
+    </w:p>
+    <w:p>
+      <w:pPr>
+        <w:spacing w:after="0" w:line="240" w:lineRule="auto"/>
+        <w:rPr>
+          <w:rFonts w:asciiTheme="majorHAnsi" w:eastAsia="Times New Roman" w:hAnsiTheme="majorHAnsi" w:cs="Times New Roman"/>
+          <w:sz w:val="24"/>
+          <w:szCs w:val="24"/>
+          <w:lang w:val="en-US" w:eastAsia="ru-RU"/>
+        </w:rPr>
+      </w:pPr>
+      <w:r>
+        <w:rPr>
+          <w:rFonts w:asciiTheme="majorHAnsi" w:eastAsia="Times New Roman" w:hAnsiTheme="majorHAnsi" w:cs="Times New Roman"/>
+          <w:sz w:val="24"/>
+          <w:szCs w:val="24"/>
+          <w:lang w:val="en-US" w:eastAsia="ru-RU"/>
+        </w:rPr>
+        <w:t xml:space="preserve">The </w:t>
+      </w:r>
+      <w:proofErr w:type="spellStart"/>
+      <w:r>
+        <w:rPr>
+          <w:rFonts w:asciiTheme="majorHAnsi" w:eastAsia="Times New Roman" w:hAnsiTheme="majorHAnsi" w:cs="Times New Roman"/>
+          <w:sz w:val="24"/>
+          <w:szCs w:val="24"/>
+          <w:lang w:val="en-US" w:eastAsia="ru-RU"/>
+        </w:rPr>
+        <w:t>VirusTotal</w:t>
+      </w:r>
+      <w:proofErr w:type="spellEnd"/>
+      <w:r>
+        <w:rPr>
+          <w:rFonts w:asciiTheme="majorHAnsi" w:eastAsia="Times New Roman" w:hAnsiTheme="majorHAnsi" w:cs="Times New Roman"/>
+          <w:sz w:val="24"/>
+          <w:szCs w:val="24"/>
+          <w:lang w:val="en-US" w:eastAsia="ru-RU"/>
+        </w:rPr>
+        <w:t xml:space="preserve"> API also provides a dedicated IP-address report endpoint. </w:t>
+      </w:r>
+    </w:p>
+    <w:p>
+      <w:pPr>
+        <w:spacing w:after="0" w:line="240" w:lineRule="auto"/>
+        <w:rPr>
+          <w:rFonts w:asciiTheme="majorHAnsi" w:eastAsia="Times New Roman" w:hAnsiTheme="majorHAnsi" w:cs="Times New Roman"/>
+          <w:sz w:val="24"/>
+          <w:szCs w:val="24"/>
+          <w:lang w:val="en-US" w:eastAsia="ru-RU"/>
+        </w:rPr>
+      </w:pPr>
+      <w:r>
+        <w:rPr>
+          <w:rFonts w:asciiTheme="majorHAnsi" w:eastAsia="Times New Roman" w:hAnsiTheme="majorHAnsi" w:cs="Times New Roman"/>
+          <w:b/>
+          <w:bCs/>
+          <w:sz w:val="24"/>
+          <w:szCs w:val="24"/>
+          <w:lang w:val="en-US" w:eastAsia="ru-RU"/>
+        </w:rPr>
+        <w:t>Purpose in our project:</w:t>
+      </w:r>
+    </w:p>
+    <w:p>
+      <w:pPr>
+        <w:spacing w:after="0" w:line="240" w:lineRule="auto"/>
+        <w:rPr>
+          <w:rFonts w:asciiTheme="majorHAnsi" w:eastAsia="Times New Roman" w:hAnsiTheme="majorHAnsi" w:cs="Times New Roman"/>
+          <w:sz w:val="24"/>
+          <w:szCs w:val="24"/>
+          <w:lang w:val="en-US" w:eastAsia="ru-RU"/>
+        </w:rPr>
+      </w:pPr>
+      <w:r>
+        <w:rPr>
+          <w:rFonts w:asciiTheme="majorHAnsi" w:eastAsia="Times New Roman" w:hAnsiTheme="majorHAnsi" w:cs="Times New Roman"/>
+          <w:sz w:val="24"/>
+          <w:szCs w:val="24"/>
+          <w:lang w:val="en-US" w:eastAsia="ru-RU"/>
+        </w:rPr>
+        <w:t>Check whether collected infrastructure has existing threat intelligence or reputation information.</w:t>
+      </w:r>
+    </w:p>
+    <w:p>
+      <w:pPr>
+        <w:spacing w:after="0" w:line="240" w:lineRule="auto"/>
+        <w:rPr>
+          <w:rFonts w:asciiTheme="majorHAnsi" w:eastAsia="Times New Roman" w:hAnsiTheme="majorHAnsi" w:cs="Times New Roman"/>
+          <w:sz w:val="24"/>
+          <w:szCs w:val="24"/>
+          <w:lang w:val="en-US" w:eastAsia="ru-RU"/>
+        </w:rPr>
+      </w:pPr>
+    </w:p>
+    <w:p>
+      <w:pPr>
+        <w:spacing w:before="100" w:beforeAutospacing="1" w:after="100" w:afterAutospacing="1" w:line="240" w:lineRule="auto"/>
+        <w:outlineLvl w:val="2"/>
+        <w:rPr>
+          <w:rFonts w:asciiTheme="majorHAnsi" w:eastAsia="Times New Roman" w:hAnsiTheme="majorHAnsi" w:cs="Times New Roman"/>
+          <w:b/>
+          <w:bCs/>
+          <w:sz w:val="27"/>
+          <w:szCs w:val="27"/>
+          <w:lang w:val="en-US" w:eastAsia="ru-RU"/>
+        </w:rPr>
+      </w:pPr>
+      <w:r>
+        <w:rPr>
+          <w:rFonts w:asciiTheme="majorHAnsi" w:eastAsia="Times New Roman" w:hAnsiTheme="majorHAnsi" w:cs="Times New Roman"/>
+          <w:b/>
+          <w:bCs/>
+          <w:sz w:val="27"/>
+          <w:szCs w:val="27"/>
+          <w:lang w:val="en-US" w:eastAsia="ru-RU"/>
+        </w:rPr>
+        <w:t xml:space="preserve">3. </w:t>
+      </w:r>
+      <w:proofErr w:type="spellStart"/>
+      <w:r>
+        <w:rPr>
+          <w:rFonts w:asciiTheme="majorHAnsi" w:eastAsia="Times New Roman" w:hAnsiTheme="majorHAnsi" w:cs="Times New Roman"/>
+          <w:b/>
+          <w:bCs/>
+          <w:sz w:val="27"/>
+          <w:szCs w:val="27"/>
+          <w:lang w:val="en-US" w:eastAsia="ru-RU"/>
+        </w:rPr>
+        <w:t>Maltego</w:t>
+      </w:r>
+      <w:proofErr w:type="spellEnd"/>
+    </w:p>
+    <w:p>
+      <w:pPr>
+        <w:spacing w:before="100" w:beforeAutospacing="1" w:after="100" w:afterAutospacing="1" w:line="240" w:lineRule="auto"/>
+        <w:rPr>
+          <w:rFonts w:asciiTheme="majorHAnsi" w:eastAsia="Times New Roman" w:hAnsiTheme="majorHAnsi" w:cs="Times New Roman"/>
+          <w:sz w:val="24"/>
+          <w:szCs w:val="24"/>
+          <w:lang w:val="en-US" w:eastAsia="ru-RU"/>
+        </w:rPr>
+      </w:pPr>
+      <w:proofErr w:type="spellStart"/>
+      <w:r>
+        <w:rPr>
+          <w:rFonts w:asciiTheme="majorHAnsi" w:eastAsia="Times New Roman" w:hAnsiTheme="majorHAnsi" w:cs="Times New Roman"/>
+          <w:sz w:val="24"/>
+          <w:szCs w:val="24"/>
+          <w:lang w:val="en-US" w:eastAsia="ru-RU"/>
+        </w:rPr>
+        <w:t>Maltego</w:t>
+      </w:r>
+      <w:proofErr w:type="spellEnd"/>
+      <w:r>
+        <w:rPr>
+          <w:rFonts w:asciiTheme="majorHAnsi" w:eastAsia="Times New Roman" w:hAnsiTheme="majorHAnsi" w:cs="Times New Roman"/>
+          <w:sz w:val="24"/>
+          <w:szCs w:val="24"/>
+          <w:lang w:val="en-US" w:eastAsia="ru-RU"/>
+        </w:rPr>
+        <w:t xml:space="preserve"> will be used to connect the information collected from different sources.</w:t>
+      </w:r>
+    </w:p>
+    <w:p>
+      <w:pPr>
+        <w:spacing w:before="100" w:beforeAutospacing="1" w:after="100" w:afterAutospacing="1" w:line="240" w:lineRule="auto"/>
+        <w:rPr>
+          <w:rFonts w:asciiTheme="majorHAnsi" w:eastAsia="Times New Roman" w:hAnsiTheme="majorHAnsi" w:cs="Times New Roman"/>
+          <w:sz w:val="24"/>
+          <w:szCs w:val="24"/>
+          <w:lang w:val="en-US" w:eastAsia="ru-RU"/>
+        </w:rPr>
+      </w:pPr>
+      <w:r>
+        <w:rPr>
+          <w:rFonts w:asciiTheme="majorHAnsi" w:eastAsia="Times New Roman" w:hAnsiTheme="majorHAnsi" w:cs="Times New Roman"/>
+          <w:sz w:val="24"/>
+          <w:szCs w:val="24"/>
+          <w:lang w:val="en-US" w:eastAsia="ru-RU"/>
+        </w:rPr>
+        <w:t>For example:</w:t>
+      </w:r>
+    </w:p>
+    <w:p>
+      <w:pPr>
+        <w:spacing w:before="100" w:beforeAutospacing="1" w:after="100" w:afterAutospacing="1" w:line="240" w:lineRule="auto"/>
+        <w:rPr>
+          <w:rFonts w:asciiTheme="majorHAnsi" w:eastAsia="Times New Roman" w:hAnsiTheme="majorHAnsi" w:cs="Courier New"/>
+          <w:sz w:val="20"/>
+          <w:szCs w:val="20"/>
+          <w:lang w:val="en-US" w:eastAsia="ru-RU"/>
+        </w:rPr>
+      </w:pPr>
+      <w:r>
+        <w:rPr>
+          <w:rFonts w:asciiTheme="majorHAnsi" w:eastAsia="Times New Roman" w:hAnsiTheme="majorHAnsi" w:cs="Courier New"/>
+          <w:sz w:val="20"/>
+          <w:szCs w:val="20"/>
+          <w:lang w:val="en-US" w:eastAsia="ru-RU"/>
+        </w:rPr>
+        <w:drawing>
+          <wp:inline distT="0" distB="0" distL="0" distR="0" wp14:anchorId="0AEE4E5A" wp14:editId="734080EC">
+            <wp:extent cx="1859280" cy="1501140"/>
+            <wp:effectExtent l="0" t="0" r="7620" b="3810"/>
+            <wp:docPr id="1" name="Рисунок 1"/>
+            <wp:cNvGraphicFramePr>
+              <a:graphicFrameLocks xmlns:a="http://schemas.openxmlformats.org/drawingml/2006/main" noChangeAspect="1"/>
+            </wp:cNvGraphicFramePr>
+            <a:graphic xmlns:a="http://schemas.openxmlformats.org/drawingml/2006/main">
+              <a:graphicData uri="http://schemas.openxmlformats.org/drawingml/2006/picture">
+                <pic:pic xmlns:pic="http://schemas.openxmlformats.org/drawingml/2006/picture">
+                  <pic:nvPicPr>
+                    <pic:cNvPr id="0" name=""/>
+                    <pic:cNvPicPr/>
+                  </pic:nvPicPr>
+                  <pic:blipFill>
+                    <a:blip r:embed="rId6"/>
+                    <a:stretch>
+                      <a:fillRect/>
+                    </a:stretch>
+                  </pic:blipFill>
+                  <pic:spPr>
+                    <a:xfrm>
+                      <a:off x="0" y="0"/>
+                      <a:ext cx="1859280" cy="1501140"/>
+                    </a:xfrm>
+                    <a:prstGeom prst="rect">
+                      <a:avLst/>
+                    </a:prstGeom>
+                  </pic:spPr>
+                </pic:pic>
+              </a:graphicData>
+            </a:graphic>
+          </wp:inline>
+        </w:drawing>
+      </w:r>
+      <w:r>
+        <w:rPr>
+          <w:rFonts w:asciiTheme="majorHAnsi" w:eastAsia="Times New Roman" w:hAnsiTheme="majorHAnsi" w:cs="Courier New"/>
+          <w:sz w:val="20"/>
+          <w:szCs w:val="20"/>
+          <w:lang w:val="en-US" w:eastAsia="ru-RU"/>
+        </w:rPr>
+        <w:t xml:space="preserve"> </w:t>
+      </w:r>
+    </w:p>
+    <w:p>
+      <w:pPr>
+        <w:spacing w:before="100" w:beforeAutospacing="1" w:after="100" w:afterAutospacing="1" w:line="240" w:lineRule="auto"/>
+        <w:rPr>
+          <w:rFonts w:asciiTheme="majorHAnsi" w:eastAsia="Times New Roman" w:hAnsiTheme="majorHAnsi" w:cs="Times New Roman"/>
+          <w:sz w:val="24"/>
+          <w:szCs w:val="24"/>
+          <w:lang w:val="en-US" w:eastAsia="ru-RU"/>
+        </w:rPr>
+      </w:pPr>
+      <w:proofErr w:type="spellStart"/>
+      <w:r>
+        <w:rPr>
+          <w:rFonts w:asciiTheme="majorHAnsi" w:eastAsia="Times New Roman" w:hAnsiTheme="majorHAnsi" w:cs="Times New Roman"/>
+          <w:sz w:val="24"/>
+          <w:szCs w:val="24"/>
+          <w:lang w:val="en-US" w:eastAsia="ru-RU"/>
+        </w:rPr>
+        <w:t>Maltego</w:t>
+      </w:r>
+      <w:proofErr w:type="spellEnd"/>
+      <w:r>
+        <w:rPr>
+          <w:rFonts w:asciiTheme="majorHAnsi" w:eastAsia="Times New Roman" w:hAnsiTheme="majorHAnsi" w:cs="Times New Roman"/>
+          <w:sz w:val="24"/>
+          <w:szCs w:val="24"/>
+          <w:lang w:val="en-US" w:eastAsia="ru-RU"/>
+        </w:rPr>
+        <w:t xml:space="preserve"> is particularly useful because it represents relationships visually. Its standard transforms can investigate infrastructure by starting from a domain, IP, DNS name or website and discovering related entities. </w:t>
+      </w:r>
+    </w:p>
+    <w:p>
+      <w:pPr>
+        <w:spacing w:before="100" w:beforeAutospacing="1" w:after="100" w:afterAutospacing="1" w:line="240" w:lineRule="auto"/>
+        <w:rPr>
+          <w:rFonts w:asciiTheme="majorHAnsi" w:eastAsia="Times New Roman" w:hAnsiTheme="majorHAnsi" w:cs="Times New Roman"/>
+          <w:sz w:val="24"/>
+          <w:szCs w:val="24"/>
+          <w:lang w:val="en-US" w:eastAsia="ru-RU"/>
+        </w:rPr>
+      </w:pPr>
+      <w:r>
+        <w:rPr>
+          <w:rFonts w:asciiTheme="majorHAnsi" w:eastAsia="Times New Roman" w:hAnsiTheme="majorHAnsi" w:cs="Times New Roman"/>
+          <w:sz w:val="24"/>
+          <w:szCs w:val="24"/>
+          <w:lang w:val="en-US" w:eastAsia="ru-RU"/>
+        </w:rPr>
+        <w:t>For example:</w:t>
+      </w:r>
+    </w:p>
+    <w:p>
+      <w:pPr>
+        <w:spacing w:before="100" w:beforeAutospacing="1" w:after="100" w:afterAutospacing="1" w:line="240" w:lineRule="auto"/>
+        <w:rPr>
+          <w:rFonts w:asciiTheme="majorHAnsi" w:eastAsia="Times New Roman" w:hAnsiTheme="majorHAnsi" w:cs="Courier New"/>
+          <w:sz w:val="20"/>
+          <w:szCs w:val="20"/>
+          <w:lang w:val="en-US" w:eastAsia="ru-RU"/>
+        </w:rPr>
+      </w:pPr>
+      <w:r>
+        <w:rPr>
+          <w:rFonts w:asciiTheme="majorHAnsi" w:eastAsia="Times New Roman" w:hAnsiTheme="majorHAnsi" w:cs="Courier New"/>
+          <w:sz w:val="20"/>
+          <w:szCs w:val="20"/>
+          <w:lang w:val="en-US" w:eastAsia="ru-RU"/>
+        </w:rPr>
+        <w:lastRenderedPageBreak/>
+        <w:drawing>
+          <wp:inline distT="0" distB="0" distL="0" distR="0" wp14:anchorId="0C9EE0B6" wp14:editId="461F6D13">
+            <wp:extent cx="2423160" cy="2705100"/>
+            <wp:effectExtent l="0" t="0" r="0" b="0"/>
+            <wp:docPr id="2" name="Рисунок 2"/>
+            <wp:cNvGraphicFramePr>
+              <a:graphicFrameLocks xmlns:a="http://schemas.openxmlformats.org/drawingml/2006/main" noChangeAspect="1"/>
+            </wp:cNvGraphicFramePr>
+            <a:graphic xmlns:a="http://schemas.openxmlformats.org/drawingml/2006/main">
+              <a:graphicData uri="http://schemas.openxmlformats.org/drawingml/2006/picture">
+                <pic:pic xmlns:pic="http://schemas.openxmlformats.org/drawingml/2006/picture">
+                  <pic:nvPicPr>
+                    <pic:cNvPr id="0" name=""/>
+                    <pic:cNvPicPr/>
+                  </pic:nvPicPr>
+                  <pic:blipFill>
+                    <a:blip r:embed="rId7"/>
+                    <a:stretch>
+                      <a:fillRect/>
+                    </a:stretch>
+                  </pic:blipFill>
+                  <pic:spPr>
+                    <a:xfrm>
+                      <a:off x="0" y="0"/>
+                      <a:ext cx="2423160" cy="2705100"/>
+                    </a:xfrm>
+                    <a:prstGeom prst="rect">
+                      <a:avLst/>
+                    </a:prstGeom>
+                  </pic:spPr>
+                </pic:pic>
+              </a:graphicData>
+            </a:graphic>
+          </wp:inline>
+        </w:drawing>
+      </w:r>
+    </w:p>
+    <w:p>
+      <w:pPr>
+        <w:spacing w:before="100" w:beforeAutospacing="1" w:after="100" w:afterAutospacing="1" w:line="240" w:lineRule="auto"/>
+        <w:rPr>
+          <w:rFonts w:asciiTheme="majorHAnsi" w:eastAsia="Times New Roman" w:hAnsiTheme="majorHAnsi" w:cs="Times New Roman"/>
+          <w:sz w:val="24"/>
+          <w:szCs w:val="24"/>
+          <w:lang w:val="en-US" w:eastAsia="ru-RU"/>
+        </w:rPr>
+      </w:pPr>
+      <w:r>
+        <w:rPr>
+          <w:rFonts w:asciiTheme="majorHAnsi" w:eastAsia="Times New Roman" w:hAnsiTheme="majorHAnsi" w:cs="Times New Roman"/>
+          <w:sz w:val="24"/>
+          <w:szCs w:val="24"/>
+          <w:lang w:val="en-US" w:eastAsia="ru-RU"/>
+        </w:rPr>
+        <w:t>This makes it easier to identify connections that may not be obvious when looking at individual records.</w:t>
+      </w:r>
+    </w:p>
+    <w:p>
+      <w:pPr>
         <w:rPr>
           <w:lang w:val="en-US"/>
         </w:rPr>
@@ -3277,9 +5206,9 @@
 <file path=word/numbering.xml><?xml version="1.0" encoding="utf-8"?>
 <w:numbering xmlns:wpc="http://schemas.microsoft.com/office/word/2010/wordprocessingCanvas" xmlns:mc="http://schemas.openxmlformats.org/markup-compatibility/2006" xmlns:o="urn:schemas-microsoft-com:office:office" xmlns:r="http://schemas.openxmlformats.org/officeDocument/2006/relationships" xmlns:m="http://schemas.openxmlformats.org/officeDocument/2006/math" xmlns:v="urn:schemas-microsoft-com:vml" xmlns:wp14="http://schemas.microsoft.com/office/word/2010/wordprocessingDrawing" xmlns:wp="http://schemas.openxmlformats.org/drawingml/2006/wordprocessingDrawing" xmlns:w10="urn:schemas-microsoft-com:office:word" xmlns:w="http://schemas.openxmlformats.org/wordprocessingml/2006/main" xmlns:w14="http://schemas.microsoft.com/office/word/2010/wordml" xmlns:wpg="http://schemas.microsoft.com/office/word/2010/wordprocessingGroup" xmlns:wpi="http://schemas.microsoft.com/office/word/2010/wordprocessingInk" xmlns:wne="http://schemas.microsoft.com/office/word/2006/wordml" xmlns:wps="http://schemas.microsoft.com/office/word/2010/wordprocessingShape" mc:Ignorable="w14 wp14">
   <w:abstractNum w:abstractNumId="0">
-    <w:nsid w:val="470E1D01"/>
+    <w:nsid w:val="03CF45F8"/>
     <w:multiLevelType w:val="multilevel"/>
-    <w:tmpl w:val="C082C17E"/>
+    <w:tmpl w:val="1E6C847C"/>
     <w:lvl w:ilvl="0">
       <w:start w:val="1"/>
       <w:numFmt w:val="bullet"/>
@@ -3426,9 +5355,9 @@
     </w:lvl>
   </w:abstractNum>
   <w:abstractNum w:abstractNumId="1">
-    <w:nsid w:val="49697877"/>
+    <w:nsid w:val="0B2C5838"/>
     <w:multiLevelType w:val="multilevel"/>
-    <w:tmpl w:val="A4D0558A"/>
+    <w:tmpl w:val="70248C4A"/>
     <w:lvl w:ilvl="0">
       <w:start w:val="1"/>
       <w:numFmt w:val="bullet"/>
@@ -3575,9 +5504,9 @@
     </w:lvl>
   </w:abstractNum>
   <w:abstractNum w:abstractNumId="2">
-    <w:nsid w:val="4B23434C"/>
+    <w:nsid w:val="470E1D01"/>
     <w:multiLevelType w:val="multilevel"/>
-    <w:tmpl w:val="F566DB02"/>
+    <w:tmpl w:val="C082C17E"/>
     <w:lvl w:ilvl="0">
       <w:start w:val="1"/>
       <w:numFmt w:val="bullet"/>
@@ -3723,13 +5652,469 @@
       </w:rPr>
     </w:lvl>
   </w:abstractNum>
+  <w:abstractNum w:abstractNumId="3">
+    <w:nsid w:val="49697877"/>
+    <w:multiLevelType w:val="multilevel"/>
+    <w:tmpl w:val="A4D0558A"/>
+    <w:lvl w:ilvl="0">
+      <w:start w:val="1"/>
+      <w:numFmt w:val="bullet"/>
+      <w:lvlText w:val=""/>
+      <w:lvlJc w:val="left"/>
+      <w:pPr>
+        <w:tabs>
+          <w:tab w:val="num" w:pos="720"/>
+        </w:tabs>
+        <w:ind w:left="720" w:hanging="360"/>
+      </w:pPr>
+      <w:rPr>
+        <w:rFonts w:ascii="Symbol" w:hAnsi="Symbol" w:hint="default"/>
+        <w:sz w:val="20"/>
+      </w:rPr>
+    </w:lvl>
+    <w:lvl w:ilvl="1" w:tentative="1">
+      <w:start w:val="1"/>
+      <w:numFmt w:val="bullet"/>
+      <w:lvlText w:val="o"/>
+      <w:lvlJc w:val="left"/>
+      <w:pPr>
+        <w:tabs>
+          <w:tab w:val="num" w:pos="1440"/>
+        </w:tabs>
+        <w:ind w:left="1440" w:hanging="360"/>
+      </w:pPr>
+      <w:rPr>
+        <w:rFonts w:ascii="Courier New" w:hAnsi="Courier New" w:hint="default"/>
+        <w:sz w:val="20"/>
+      </w:rPr>
+    </w:lvl>
+    <w:lvl w:ilvl="2" w:tentative="1">
+      <w:start w:val="1"/>
+      <w:numFmt w:val="bullet"/>
+      <w:lvlText w:val=""/>
+      <w:lvlJc w:val="left"/>
+      <w:pPr>
+        <w:tabs>
+          <w:tab w:val="num" w:pos="2160"/>
+        </w:tabs>
+        <w:ind w:left="2160" w:hanging="360"/>
+      </w:pPr>
+      <w:rPr>
+        <w:rFonts w:ascii="Wingdings" w:hAnsi="Wingdings" w:hint="default"/>
+        <w:sz w:val="20"/>
+      </w:rPr>
+    </w:lvl>
+    <w:lvl w:ilvl="3" w:tentative="1">
+      <w:start w:val="1"/>
+      <w:numFmt w:val="bullet"/>
+      <w:lvlText w:val=""/>
+      <w:lvlJc w:val="left"/>
+      <w:pPr>
+        <w:tabs>
+          <w:tab w:val="num" w:pos="2880"/>
+        </w:tabs>
+        <w:ind w:left="2880" w:hanging="360"/>
+      </w:pPr>
+      <w:rPr>
+        <w:rFonts w:ascii="Wingdings" w:hAnsi="Wingdings" w:hint="default"/>
+        <w:sz w:val="20"/>
+      </w:rPr>
+    </w:lvl>
+    <w:lvl w:ilvl="4" w:tentative="1">
+      <w:start w:val="1"/>
+      <w:numFmt w:val="bullet"/>
+      <w:lvlText w:val=""/>
+      <w:lvlJc w:val="left"/>
+      <w:pPr>
+        <w:tabs>
+          <w:tab w:val="num" w:pos="3600"/>
+        </w:tabs>
+        <w:ind w:left="3600" w:hanging="360"/>
+      </w:pPr>
+      <w:rPr>
+        <w:rFonts w:ascii="Wingdings" w:hAnsi="Wingdings" w:hint="default"/>
+        <w:sz w:val="20"/>
+      </w:rPr>
+    </w:lvl>
+    <w:lvl w:ilvl="5" w:tentative="1">
+      <w:start w:val="1"/>
+      <w:numFmt w:val="bullet"/>
+      <w:lvlText w:val=""/>
+      <w:lvlJc w:val="left"/>
+      <w:pPr>
+        <w:tabs>
+          <w:tab w:val="num" w:pos="4320"/>
+        </w:tabs>
+        <w:ind w:left="4320" w:hanging="360"/>
+      </w:pPr>
+      <w:rPr>
+        <w:rFonts w:ascii="Wingdings" w:hAnsi="Wingdings" w:hint="default"/>
+        <w:sz w:val="20"/>
+      </w:rPr>
+    </w:lvl>
+    <w:lvl w:ilvl="6" w:tentative="1">
+      <w:start w:val="1"/>
+      <w:numFmt w:val="bullet"/>
+      <w:lvlText w:val=""/>
+      <w:lvlJc w:val="left"/>
+      <w:pPr>
+        <w:tabs>
+          <w:tab w:val="num" w:pos="5040"/>
+        </w:tabs>
+        <w:ind w:left="5040" w:hanging="360"/>
+      </w:pPr>
+      <w:rPr>
+        <w:rFonts w:ascii="Wingdings" w:hAnsi="Wingdings" w:hint="default"/>
+        <w:sz w:val="20"/>
+      </w:rPr>
+    </w:lvl>
+    <w:lvl w:ilvl="7" w:tentative="1">
+      <w:start w:val="1"/>
+      <w:numFmt w:val="bullet"/>
+      <w:lvlText w:val=""/>
+      <w:lvlJc w:val="left"/>
+      <w:pPr>
+        <w:tabs>
+          <w:tab w:val="num" w:pos="5760"/>
+        </w:tabs>
+        <w:ind w:left="5760" w:hanging="360"/>
+      </w:pPr>
+      <w:rPr>
+        <w:rFonts w:ascii="Wingdings" w:hAnsi="Wingdings" w:hint="default"/>
+        <w:sz w:val="20"/>
+      </w:rPr>
+    </w:lvl>
+    <w:lvl w:ilvl="8" w:tentative="1">
+      <w:start w:val="1"/>
+      <w:numFmt w:val="bullet"/>
+      <w:lvlText w:val=""/>
+      <w:lvlJc w:val="left"/>
+      <w:pPr>
+        <w:tabs>
+          <w:tab w:val="num" w:pos="6480"/>
+        </w:tabs>
+        <w:ind w:left="6480" w:hanging="360"/>
+      </w:pPr>
+      <w:rPr>
+        <w:rFonts w:ascii="Wingdings" w:hAnsi="Wingdings" w:hint="default"/>
+        <w:sz w:val="20"/>
+      </w:rPr>
+    </w:lvl>
+  </w:abstractNum>
+  <w:abstractNum w:abstractNumId="4">
+    <w:nsid w:val="4B23434C"/>
+    <w:multiLevelType w:val="multilevel"/>
+    <w:tmpl w:val="F566DB02"/>
+    <w:lvl w:ilvl="0">
+      <w:start w:val="1"/>
+      <w:numFmt w:val="bullet"/>
+      <w:lvlText w:val=""/>
+      <w:lvlJc w:val="left"/>
+      <w:pPr>
+        <w:tabs>
+          <w:tab w:val="num" w:pos="720"/>
+        </w:tabs>
+        <w:ind w:left="720" w:hanging="360"/>
+      </w:pPr>
+      <w:rPr>
+        <w:rFonts w:ascii="Symbol" w:hAnsi="Symbol" w:hint="default"/>
+        <w:sz w:val="20"/>
+      </w:rPr>
+    </w:lvl>
+    <w:lvl w:ilvl="1" w:tentative="1">
+      <w:start w:val="1"/>
+      <w:numFmt w:val="bullet"/>
+      <w:lvlText w:val="o"/>
+      <w:lvlJc w:val="left"/>
+      <w:pPr>
+        <w:tabs>
+          <w:tab w:val="num" w:pos="1440"/>
+        </w:tabs>
+        <w:ind w:left="1440" w:hanging="360"/>
+      </w:pPr>
+      <w:rPr>
+        <w:rFonts w:ascii="Courier New" w:hAnsi="Courier New" w:hint="default"/>
+        <w:sz w:val="20"/>
+      </w:rPr>
+    </w:lvl>
+    <w:lvl w:ilvl="2" w:tentative="1">
+      <w:start w:val="1"/>
+      <w:numFmt w:val="bullet"/>
+      <w:lvlText w:val=""/>
+      <w:lvlJc w:val="left"/>
+      <w:pPr>
+        <w:tabs>
+          <w:tab w:val="num" w:pos="2160"/>
+        </w:tabs>
+        <w:ind w:left="2160" w:hanging="360"/>
+      </w:pPr>
+      <w:rPr>
+        <w:rFonts w:ascii="Wingdings" w:hAnsi="Wingdings" w:hint="default"/>
+        <w:sz w:val="20"/>
+      </w:rPr>
+    </w:lvl>
+    <w:lvl w:ilvl="3" w:tentative="1">
+      <w:start w:val="1"/>
+      <w:numFmt w:val="bullet"/>
+      <w:lvlText w:val=""/>
+      <w:lvlJc w:val="left"/>
+      <w:pPr>
+        <w:tabs>
+          <w:tab w:val="num" w:pos="2880"/>
+        </w:tabs>
+        <w:ind w:left="2880" w:hanging="360"/>
+      </w:pPr>
+      <w:rPr>
+        <w:rFonts w:ascii="Wingdings" w:hAnsi="Wingdings" w:hint="default"/>
+        <w:sz w:val="20"/>
+      </w:rPr>
+    </w:lvl>
+    <w:lvl w:ilvl="4" w:tentative="1">
+      <w:start w:val="1"/>
+      <w:numFmt w:val="bullet"/>
+      <w:lvlText w:val=""/>
+      <w:lvlJc w:val="left"/>
+      <w:pPr>
+        <w:tabs>
+          <w:tab w:val="num" w:pos="3600"/>
+        </w:tabs>
+        <w:ind w:left="3600" w:hanging="360"/>
+      </w:pPr>
+      <w:rPr>
+        <w:rFonts w:ascii="Wingdings" w:hAnsi="Wingdings" w:hint="default"/>
+        <w:sz w:val="20"/>
+      </w:rPr>
+    </w:lvl>
+    <w:lvl w:ilvl="5" w:tentative="1">
+      <w:start w:val="1"/>
+      <w:numFmt w:val="bullet"/>
+      <w:lvlText w:val=""/>
+      <w:lvlJc w:val="left"/>
+      <w:pPr>
+        <w:tabs>
+          <w:tab w:val="num" w:pos="4320"/>
+        </w:tabs>
+        <w:ind w:left="4320" w:hanging="360"/>
+      </w:pPr>
+      <w:rPr>
+        <w:rFonts w:ascii="Wingdings" w:hAnsi="Wingdings" w:hint="default"/>
+        <w:sz w:val="20"/>
+      </w:rPr>
+    </w:lvl>
+    <w:lvl w:ilvl="6" w:tentative="1">
+      <w:start w:val="1"/>
+      <w:numFmt w:val="bullet"/>
+      <w:lvlText w:val=""/>
+      <w:lvlJc w:val="left"/>
+      <w:pPr>
+        <w:tabs>
+          <w:tab w:val="num" w:pos="5040"/>
+        </w:tabs>
+        <w:ind w:left="5040" w:hanging="360"/>
+      </w:pPr>
+      <w:rPr>
+        <w:rFonts w:ascii="Wingdings" w:hAnsi="Wingdings" w:hint="default"/>
+        <w:sz w:val="20"/>
+      </w:rPr>
+    </w:lvl>
+    <w:lvl w:ilvl="7" w:tentative="1">
+      <w:start w:val="1"/>
+      <w:numFmt w:val="bullet"/>
+      <w:lvlText w:val=""/>
+      <w:lvlJc w:val="left"/>
+      <w:pPr>
+        <w:tabs>
+          <w:tab w:val="num" w:pos="5760"/>
+        </w:tabs>
+        <w:ind w:left="5760" w:hanging="360"/>
+      </w:pPr>
+      <w:rPr>
+        <w:rFonts w:ascii="Wingdings" w:hAnsi="Wingdings" w:hint="default"/>
+        <w:sz w:val="20"/>
+      </w:rPr>
+    </w:lvl>
+    <w:lvl w:ilvl="8" w:tentative="1">
+      <w:start w:val="1"/>
+      <w:numFmt w:val="bullet"/>
+      <w:lvlText w:val=""/>
+      <w:lvlJc w:val="left"/>
+      <w:pPr>
+        <w:tabs>
+          <w:tab w:val="num" w:pos="6480"/>
+        </w:tabs>
+        <w:ind w:left="6480" w:hanging="360"/>
+      </w:pPr>
+      <w:rPr>
+        <w:rFonts w:ascii="Wingdings" w:hAnsi="Wingdings" w:hint="default"/>
+        <w:sz w:val="20"/>
+      </w:rPr>
+    </w:lvl>
+  </w:abstractNum>
+  <w:abstractNum w:abstractNumId="5">
+    <w:nsid w:val="6BA26F82"/>
+    <w:multiLevelType w:val="multilevel"/>
+    <w:tmpl w:val="47A88E54"/>
+    <w:lvl w:ilvl="0">
+      <w:start w:val="1"/>
+      <w:numFmt w:val="bullet"/>
+      <w:lvlText w:val=""/>
+      <w:lvlJc w:val="left"/>
+      <w:pPr>
+        <w:tabs>
+          <w:tab w:val="num" w:pos="720"/>
+        </w:tabs>
+        <w:ind w:left="720" w:hanging="360"/>
+      </w:pPr>
+      <w:rPr>
+        <w:rFonts w:ascii="Symbol" w:hAnsi="Symbol" w:hint="default"/>
+        <w:sz w:val="20"/>
+      </w:rPr>
+    </w:lvl>
+    <w:lvl w:ilvl="1" w:tentative="1">
+      <w:start w:val="1"/>
+      <w:numFmt w:val="bullet"/>
+      <w:lvlText w:val="o"/>
+      <w:lvlJc w:val="left"/>
+      <w:pPr>
+        <w:tabs>
+          <w:tab w:val="num" w:pos="1440"/>
+        </w:tabs>
+        <w:ind w:left="1440" w:hanging="360"/>
+      </w:pPr>
+      <w:rPr>
+        <w:rFonts w:ascii="Courier New" w:hAnsi="Courier New" w:hint="default"/>
+        <w:sz w:val="20"/>
+      </w:rPr>
+    </w:lvl>
+    <w:lvl w:ilvl="2" w:tentative="1">
+      <w:start w:val="1"/>
+      <w:numFmt w:val="bullet"/>
+      <w:lvlText w:val=""/>
+      <w:lvlJc w:val="left"/>
+      <w:pPr>
+        <w:tabs>
+          <w:tab w:val="num" w:pos="2160"/>
+        </w:tabs>
+        <w:ind w:left="2160" w:hanging="360"/>
+      </w:pPr>
+      <w:rPr>
+        <w:rFonts w:ascii="Wingdings" w:hAnsi="Wingdings" w:hint="default"/>
+        <w:sz w:val="20"/>
+      </w:rPr>
+    </w:lvl>
+    <w:lvl w:ilvl="3" w:tentative="1">
+      <w:start w:val="1"/>
+      <w:numFmt w:val="bullet"/>
+      <w:lvlText w:val=""/>
+      <w:lvlJc w:val="left"/>
+      <w:pPr>
+        <w:tabs>
+          <w:tab w:val="num" w:pos="2880"/>
+        </w:tabs>
+        <w:ind w:left="2880" w:hanging="360"/>
+      </w:pPr>
+      <w:rPr>
+        <w:rFonts w:ascii="Wingdings" w:hAnsi="Wingdings" w:hint="default"/>
+        <w:sz w:val="20"/>
+      </w:rPr>
+    </w:lvl>
+    <w:lvl w:ilvl="4" w:tentative="1">
+      <w:start w:val="1"/>
+      <w:numFmt w:val="bullet"/>
+      <w:lvlText w:val=""/>
+      <w:lvlJc w:val="left"/>
+      <w:pPr>
+        <w:tabs>
+          <w:tab w:val="num" w:pos="3600"/>
+        </w:tabs>
+        <w:ind w:left="3600" w:hanging="360"/>
+      </w:pPr>
+      <w:rPr>
+        <w:rFonts w:ascii="Wingdings" w:hAnsi="Wingdings" w:hint="default"/>
+        <w:sz w:val="20"/>
+      </w:rPr>
+    </w:lvl>
+    <w:lvl w:ilvl="5" w:tentative="1">
+      <w:start w:val="1"/>
+      <w:numFmt w:val="bullet"/>
+      <w:lvlText w:val=""/>
+      <w:lvlJc w:val="left"/>
+      <w:pPr>
+        <w:tabs>
+          <w:tab w:val="num" w:pos="4320"/>
+        </w:tabs>
+        <w:ind w:left="4320" w:hanging="360"/>
+      </w:pPr>
+      <w:rPr>
+        <w:rFonts w:ascii="Wingdings" w:hAnsi="Wingdings" w:hint="default"/>
+        <w:sz w:val="20"/>
+      </w:rPr>
+    </w:lvl>
+    <w:lvl w:ilvl="6" w:tentative="1">
+      <w:start w:val="1"/>
+      <w:numFmt w:val="bullet"/>
+      <w:lvlText w:val=""/>
+      <w:lvlJc w:val="left"/>
+      <w:pPr>
+        <w:tabs>
+          <w:tab w:val="num" w:pos="5040"/>
+        </w:tabs>
+        <w:ind w:left="5040" w:hanging="360"/>
+      </w:pPr>
+      <w:rPr>
+        <w:rFonts w:ascii="Wingdings" w:hAnsi="Wingdings" w:hint="default"/>
+        <w:sz w:val="20"/>
+      </w:rPr>
+    </w:lvl>
+    <w:lvl w:ilvl="7" w:tentative="1">
+      <w:start w:val="1"/>
+      <w:numFmt w:val="bullet"/>
+      <w:lvlText w:val=""/>
+      <w:lvlJc w:val="left"/>
+      <w:pPr>
+        <w:tabs>
+          <w:tab w:val="num" w:pos="5760"/>
+        </w:tabs>
+        <w:ind w:left="5760" w:hanging="360"/>
+      </w:pPr>
+      <w:rPr>
+        <w:rFonts w:ascii="Wingdings" w:hAnsi="Wingdings" w:hint="default"/>
+        <w:sz w:val="20"/>
+      </w:rPr>
+    </w:lvl>
+    <w:lvl w:ilvl="8" w:tentative="1">
+      <w:start w:val="1"/>
+      <w:numFmt w:val="bullet"/>
+      <w:lvlText w:val=""/>
+      <w:lvlJc w:val="left"/>
+      <w:pPr>
+        <w:tabs>
+          <w:tab w:val="num" w:pos="6480"/>
+        </w:tabs>
+        <w:ind w:left="6480" w:hanging="360"/>
+      </w:pPr>
+      <w:rPr>
+        <w:rFonts w:ascii="Wingdings" w:hAnsi="Wingdings" w:hint="default"/>
+        <w:sz w:val="20"/>
+      </w:rPr>
+    </w:lvl>
+  </w:abstractNum>
   <w:num w:numId="1">
+    <w:abstractNumId w:val="2"/>
+  </w:num>
+  <w:num w:numId="2">
+    <w:abstractNumId w:val="4"/>
+  </w:num>
+  <w:num w:numId="3">
+    <w:abstractNumId w:val="3"/>
+  </w:num>
+  <w:num w:numId="4">
+    <w:abstractNumId w:val="5"/>
+  </w:num>
+  <w:num w:numId="5">
     <w:abstractNumId w:val="0"/>
   </w:num>
-  <w:num w:numId="2">
-    <w:abstractNumId w:val="2"/>
-  </w:num>
-  <w:num w:numId="3">
+  <w:num w:numId="6">
     <w:abstractNumId w:val="1"/>
   </w:num>
 </w:numbering>
@@ -3949,6 +6334,36 @@
       </w:tblCellMar>
     </w:tblPr>
   </w:style>
+  <w:style w:type="paragraph" w:styleId="a4">
+    <w:name w:val="Balloon Text"/>
+    <w:basedOn w:val="a"/>
+    <w:link w:val="a5"/>
+    <w:uiPriority w:val="99"/>
+    <w:semiHidden/>
+    <w:unhideWhenUsed/>
+    <w:rsid w:val="0062672A"/>
+    <w:pPr>
+      <w:spacing w:after="0" w:line="240" w:lineRule="auto"/>
+    </w:pPr>
+    <w:rPr>
+      <w:rFonts w:ascii="Tahoma" w:hAnsi="Tahoma" w:cs="Tahoma"/>
+      <w:sz w:val="16"/>
+      <w:szCs w:val="16"/>
+    </w:rPr>
+  </w:style>
+  <w:style w:type="character" w:customStyle="1" w:styleId="a5">
+    <w:name w:val="Текст выноски Знак"/>
+    <w:basedOn w:val="a0"/>
+    <w:link w:val="a4"/>
+    <w:uiPriority w:val="99"/>
+    <w:semiHidden/>
+    <w:rsid w:val="0062672A"/>
+    <w:rPr>
+      <w:rFonts w:ascii="Tahoma" w:hAnsi="Tahoma" w:cs="Tahoma"/>
+      <w:sz w:val="16"/>
+      <w:szCs w:val="16"/>
+    </w:rPr>
+  </w:style>
 </w:styles>
 </file>
 
@@ -4165,6 +6580,36 @@
         <w:right w:w="108" w:type="dxa"/>
       </w:tblCellMar>
     </w:tblPr>
+  </w:style>
+  <w:style w:type="paragraph" w:styleId="a4">
+    <w:name w:val="Balloon Text"/>
+    <w:basedOn w:val="a"/>
+    <w:link w:val="a5"/>
+    <w:uiPriority w:val="99"/>
+    <w:semiHidden/>
+    <w:unhideWhenUsed/>
+    <w:rsid w:val="0062672A"/>
+    <w:pPr>
+      <w:spacing w:after="0" w:line="240" w:lineRule="auto"/>
+    </w:pPr>
+    <w:rPr>
+      <w:rFonts w:ascii="Tahoma" w:hAnsi="Tahoma" w:cs="Tahoma"/>
+      <w:sz w:val="16"/>
+      <w:szCs w:val="16"/>
+    </w:rPr>
+  </w:style>
+  <w:style w:type="character" w:customStyle="1" w:styleId="a5">
+    <w:name w:val="Текст выноски Знак"/>
+    <w:basedOn w:val="a0"/>
+    <w:link w:val="a4"/>
+    <w:uiPriority w:val="99"/>
+    <w:semiHidden/>
+    <w:rsid w:val="0062672A"/>
+    <w:rPr>
+      <w:rFonts w:ascii="Tahoma" w:hAnsi="Tahoma" w:cs="Tahoma"/>
+      <w:sz w:val="16"/>
+      <w:szCs w:val="16"/>
+    </w:rPr>
   </w:style>
 </w:styles>
 </file>

</xml_diff>

<commit_message>
Added Data Collection Workflow and VirusTotal Enrichment
</commit_message>
<xml_diff>
--- a/week 2/Data collection proccess.docx
+++ b/week 2/Data collection proccess.docx
@@ -3852,18 +3852,7 @@
           <w:szCs w:val="24"/>
           <w:lang w:val="en-US" w:eastAsia="ru-RU"/>
         </w:rPr>
-        <w:t xml:space="preserve"> to find domains associated with an IP address or IP addresses associated with</w:t>
-      </w:r>
-      <w:bookmarkStart w:id="0" w:name="_GoBack"/>
-      <w:bookmarkEnd w:id="0"/>
-      <w:r>
-        <w:rPr>
-          <w:rFonts w:asciiTheme="majorHAnsi" w:eastAsia="Times New Roman" w:hAnsiTheme="majorHAnsi" w:cs="Times New Roman"/>
-          <w:sz w:val="24"/>
-          <w:szCs w:val="24"/>
-          <w:lang w:val="en-US" w:eastAsia="ru-RU"/>
-        </w:rPr>
-        <w:t xml:space="preserve"> hostnames. </w:t>
+        <w:t xml:space="preserve"> to find domains associated with an IP address or IP addresses associated with hostnames. </w:t>
       </w:r>
     </w:p>
     <w:p>
@@ -5184,6 +5173,2743 @@
           <w:lang w:val="en-US" w:eastAsia="ru-RU"/>
         </w:rPr>
         <w:t>This makes it easier to identify connections that may not be obvious when looking at individual records.</w:t>
+      </w:r>
+    </w:p>
+    <w:p>
+      <w:pPr>
+        <w:spacing w:before="100" w:beforeAutospacing="1" w:after="100" w:afterAutospacing="1" w:line="240" w:lineRule="auto"/>
+        <w:jc w:val="center"/>
+        <w:outlineLvl w:val="0"/>
+        <w:rPr>
+          <w:rFonts w:asciiTheme="majorHAnsi" w:eastAsia="Times New Roman" w:hAnsiTheme="majorHAnsi" w:cs="Times New Roman"/>
+          <w:b/>
+          <w:bCs/>
+          <w:kern w:val="36"/>
+          <w:sz w:val="48"/>
+          <w:szCs w:val="48"/>
+          <w:lang w:val="en-US" w:eastAsia="ru-RU"/>
+        </w:rPr>
+      </w:pPr>
+      <w:r>
+        <w:rPr>
+          <w:rFonts w:asciiTheme="majorHAnsi" w:eastAsia="Times New Roman" w:hAnsiTheme="majorHAnsi" w:cs="Times New Roman"/>
+          <w:b/>
+          <w:bCs/>
+          <w:kern w:val="36"/>
+          <w:sz w:val="48"/>
+          <w:szCs w:val="48"/>
+          <w:lang w:val="en-US" w:eastAsia="ru-RU"/>
+        </w:rPr>
+        <w:t xml:space="preserve">2.4. </w:t>
+      </w:r>
+      <w:bookmarkStart w:id="0" w:name="_GoBack"/>
+      <w:r>
+        <w:rPr>
+          <w:rFonts w:asciiTheme="majorHAnsi" w:eastAsia="Times New Roman" w:hAnsiTheme="majorHAnsi" w:cs="Times New Roman"/>
+          <w:b/>
+          <w:bCs/>
+          <w:kern w:val="36"/>
+          <w:sz w:val="48"/>
+          <w:szCs w:val="48"/>
+          <w:lang w:val="en-US" w:eastAsia="ru-RU"/>
+        </w:rPr>
+        <w:t>Data Collection Workflow</w:t>
+      </w:r>
+      <w:bookmarkEnd w:id="0"/>
+    </w:p>
+    <w:p>
+      <w:pPr>
+        <w:spacing w:before="100" w:beforeAutospacing="1" w:after="100" w:afterAutospacing="1" w:line="240" w:lineRule="auto"/>
+        <w:rPr>
+          <w:rFonts w:asciiTheme="majorHAnsi" w:eastAsia="Times New Roman" w:hAnsiTheme="majorHAnsi" w:cs="Times New Roman"/>
+          <w:sz w:val="24"/>
+          <w:szCs w:val="24"/>
+          <w:lang w:val="en-US" w:eastAsia="ru-RU"/>
+        </w:rPr>
+      </w:pPr>
+      <w:r>
+        <w:rPr>
+          <w:rFonts w:asciiTheme="majorHAnsi" w:eastAsia="Times New Roman" w:hAnsiTheme="majorHAnsi" w:cs="Times New Roman"/>
+          <w:sz w:val="24"/>
+          <w:szCs w:val="24"/>
+          <w:lang w:val="en-US" w:eastAsia="ru-RU"/>
+        </w:rPr>
+        <w:t>Our proposed workflow is:</w:t>
+      </w:r>
+    </w:p>
+    <w:p>
+      <w:pPr>
+        <w:spacing w:before="100" w:beforeAutospacing="1" w:after="100" w:afterAutospacing="1" w:line="240" w:lineRule="auto"/>
+        <w:outlineLvl w:val="2"/>
+        <w:rPr>
+          <w:rFonts w:asciiTheme="majorHAnsi" w:eastAsia="Times New Roman" w:hAnsiTheme="majorHAnsi" w:cs="Courier New"/>
+          <w:sz w:val="20"/>
+          <w:szCs w:val="20"/>
+          <w:lang w:val="en-US" w:eastAsia="ru-RU"/>
+        </w:rPr>
+      </w:pPr>
+      <w:r>
+        <w:rPr>
+          <w:rFonts w:asciiTheme="majorHAnsi" w:eastAsia="Times New Roman" w:hAnsiTheme="majorHAnsi" w:cs="Courier New"/>
+          <w:sz w:val="20"/>
+          <w:szCs w:val="20"/>
+          <w:lang w:val="en-US" w:eastAsia="ru-RU"/>
+        </w:rPr>
+        <w:drawing>
+          <wp:inline distT="0" distB="0" distL="0" distR="0" wp14:anchorId="2945BFBF" wp14:editId="73D9D554">
+            <wp:extent cx="3406140" cy="3741420"/>
+            <wp:effectExtent l="0" t="0" r="3810" b="0"/>
+            <wp:docPr id="3" name="Рисунок 3"/>
+            <wp:cNvGraphicFramePr>
+              <a:graphicFrameLocks xmlns:a="http://schemas.openxmlformats.org/drawingml/2006/main" noChangeAspect="1"/>
+            </wp:cNvGraphicFramePr>
+            <a:graphic xmlns:a="http://schemas.openxmlformats.org/drawingml/2006/main">
+              <a:graphicData uri="http://schemas.openxmlformats.org/drawingml/2006/picture">
+                <pic:pic xmlns:pic="http://schemas.openxmlformats.org/drawingml/2006/picture">
+                  <pic:nvPicPr>
+                    <pic:cNvPr id="0" name=""/>
+                    <pic:cNvPicPr/>
+                  </pic:nvPicPr>
+                  <pic:blipFill>
+                    <a:blip r:embed="rId8"/>
+                    <a:stretch>
+                      <a:fillRect/>
+                    </a:stretch>
+                  </pic:blipFill>
+                  <pic:spPr>
+                    <a:xfrm>
+                      <a:off x="0" y="0"/>
+                      <a:ext cx="3406140" cy="3741420"/>
+                    </a:xfrm>
+                    <a:prstGeom prst="rect">
+                      <a:avLst/>
+                    </a:prstGeom>
+                  </pic:spPr>
+                </pic:pic>
+              </a:graphicData>
+            </a:graphic>
+          </wp:inline>
+        </w:drawing>
+      </w:r>
+      <w:r>
+        <w:rPr>
+          <w:rFonts w:asciiTheme="majorHAnsi" w:eastAsia="Times New Roman" w:hAnsiTheme="majorHAnsi" w:cs="Courier New"/>
+          <w:sz w:val="20"/>
+          <w:szCs w:val="20"/>
+          <w:lang w:val="en-US" w:eastAsia="ru-RU"/>
+        </w:rPr>
+        <w:t xml:space="preserve"> </w:t>
+      </w:r>
+    </w:p>
+    <w:p>
+      <w:pPr>
+        <w:spacing w:before="100" w:beforeAutospacing="1" w:after="100" w:afterAutospacing="1" w:line="240" w:lineRule="auto"/>
+        <w:outlineLvl w:val="2"/>
+        <w:rPr>
+          <w:rFonts w:asciiTheme="majorHAnsi" w:eastAsia="Times New Roman" w:hAnsiTheme="majorHAnsi" w:cs="Times New Roman"/>
+          <w:b/>
+          <w:bCs/>
+          <w:sz w:val="27"/>
+          <w:szCs w:val="27"/>
+          <w:lang w:val="en-US" w:eastAsia="ru-RU"/>
+        </w:rPr>
+      </w:pPr>
+      <w:r>
+        <w:rPr>
+          <w:rFonts w:asciiTheme="majorHAnsi" w:eastAsia="Times New Roman" w:hAnsiTheme="majorHAnsi" w:cs="Times New Roman"/>
+          <w:b/>
+          <w:bCs/>
+          <w:sz w:val="27"/>
+          <w:szCs w:val="27"/>
+          <w:lang w:val="en-US" w:eastAsia="ru-RU"/>
+        </w:rPr>
+        <w:t xml:space="preserve">Step 1 — </w:t>
+      </w:r>
+      <w:proofErr w:type="gramStart"/>
+      <w:r>
+        <w:rPr>
+          <w:rFonts w:asciiTheme="majorHAnsi" w:eastAsia="Times New Roman" w:hAnsiTheme="majorHAnsi" w:cs="Times New Roman"/>
+          <w:b/>
+          <w:bCs/>
+          <w:sz w:val="27"/>
+          <w:szCs w:val="27"/>
+          <w:lang w:val="en-US" w:eastAsia="ru-RU"/>
+        </w:rPr>
+        <w:t>Define</w:t>
+      </w:r>
+      <w:proofErr w:type="gramEnd"/>
+      <w:r>
+        <w:rPr>
+          <w:rFonts w:asciiTheme="majorHAnsi" w:eastAsia="Times New Roman" w:hAnsiTheme="majorHAnsi" w:cs="Times New Roman"/>
+          <w:b/>
+          <w:bCs/>
+          <w:sz w:val="27"/>
+          <w:szCs w:val="27"/>
+          <w:lang w:val="en-US" w:eastAsia="ru-RU"/>
+        </w:rPr>
+        <w:t xml:space="preserve"> the data requirements</w:t>
+      </w:r>
+    </w:p>
+    <w:p>
+      <w:pPr>
+        <w:spacing w:before="100" w:beforeAutospacing="1" w:after="100" w:afterAutospacing="1" w:line="240" w:lineRule="auto"/>
+        <w:rPr>
+          <w:rFonts w:asciiTheme="majorHAnsi" w:eastAsia="Times New Roman" w:hAnsiTheme="majorHAnsi" w:cs="Times New Roman"/>
+          <w:sz w:val="24"/>
+          <w:szCs w:val="24"/>
+          <w:lang w:val="en-US" w:eastAsia="ru-RU"/>
+        </w:rPr>
+      </w:pPr>
+      <w:r>
+        <w:rPr>
+          <w:rFonts w:asciiTheme="majorHAnsi" w:eastAsia="Times New Roman" w:hAnsiTheme="majorHAnsi" w:cs="Times New Roman"/>
+          <w:sz w:val="24"/>
+          <w:szCs w:val="24"/>
+          <w:lang w:val="en-US" w:eastAsia="ru-RU"/>
+        </w:rPr>
+        <w:t>Before collecting information, we define what information is needed.</w:t>
+      </w:r>
+    </w:p>
+    <w:tbl>
+      <w:tblPr>
+        <w:tblStyle w:val="a6"/>
+        <w:tblW w:w="0" w:type="auto"/>
+        <w:tblLook w:val="04A0" w:firstRow="1" w:lastRow="0" w:firstColumn="1" w:lastColumn="0" w:noHBand="0" w:noVBand="1"/>
+      </w:tblPr>
+      <w:tblGrid>
+        <w:gridCol w:w="1753"/>
+        <w:gridCol w:w="4176"/>
+      </w:tblGrid>
+      <w:tr>
+        <w:trPr>
+          <w:cnfStyle w:val="100000000000" w:firstRow="1" w:lastRow="0" w:firstColumn="0" w:lastColumn="0" w:oddVBand="0" w:evenVBand="0" w:oddHBand="0" w:evenHBand="0" w:firstRowFirstColumn="0" w:firstRowLastColumn="0" w:lastRowFirstColumn="0" w:lastRowLastColumn="0"/>
+        </w:trPr>
+        <w:tc>
+          <w:tcPr>
+            <w:cnfStyle w:val="001000000000" w:firstRow="0" w:lastRow="0" w:firstColumn="1" w:lastColumn="0" w:oddVBand="0" w:evenVBand="0" w:oddHBand="0" w:evenHBand="0" w:firstRowFirstColumn="0" w:firstRowLastColumn="0" w:lastRowFirstColumn="0" w:lastRowLastColumn="0"/>
+            <w:tcW w:w="0" w:type="auto"/>
+            <w:hideMark/>
+          </w:tcPr>
+          <w:p>
+            <w:pPr>
+              <w:jc w:val="center"/>
+              <w:rPr>
+                <w:rFonts w:asciiTheme="majorHAnsi" w:eastAsia="Times New Roman" w:hAnsiTheme="majorHAnsi" w:cs="Times New Roman"/>
+                <w:sz w:val="24"/>
+                <w:szCs w:val="24"/>
+                <w:lang w:eastAsia="ru-RU"/>
+              </w:rPr>
+            </w:pPr>
+            <w:proofErr w:type="spellStart"/>
+            <w:r>
+              <w:rPr>
+                <w:rFonts w:asciiTheme="majorHAnsi" w:eastAsia="Times New Roman" w:hAnsiTheme="majorHAnsi" w:cs="Times New Roman"/>
+                <w:sz w:val="24"/>
+                <w:szCs w:val="24"/>
+                <w:lang w:eastAsia="ru-RU"/>
+              </w:rPr>
+              <w:t>Data</w:t>
+            </w:r>
+            <w:proofErr w:type="spellEnd"/>
+          </w:p>
+        </w:tc>
+        <w:tc>
+          <w:tcPr>
+            <w:tcW w:w="0" w:type="auto"/>
+            <w:hideMark/>
+          </w:tcPr>
+          <w:p>
+            <w:pPr>
+              <w:jc w:val="center"/>
+              <w:cnfStyle w:val="100000000000" w:firstRow="1" w:lastRow="0" w:firstColumn="0" w:lastColumn="0" w:oddVBand="0" w:evenVBand="0" w:oddHBand="0" w:evenHBand="0" w:firstRowFirstColumn="0" w:firstRowLastColumn="0" w:lastRowFirstColumn="0" w:lastRowLastColumn="0"/>
+              <w:rPr>
+                <w:rFonts w:asciiTheme="majorHAnsi" w:eastAsia="Times New Roman" w:hAnsiTheme="majorHAnsi" w:cs="Times New Roman"/>
+                <w:sz w:val="24"/>
+                <w:szCs w:val="24"/>
+                <w:lang w:eastAsia="ru-RU"/>
+              </w:rPr>
+            </w:pPr>
+            <w:proofErr w:type="spellStart"/>
+            <w:r>
+              <w:rPr>
+                <w:rFonts w:asciiTheme="majorHAnsi" w:eastAsia="Times New Roman" w:hAnsiTheme="majorHAnsi" w:cs="Times New Roman"/>
+                <w:sz w:val="24"/>
+                <w:szCs w:val="24"/>
+                <w:lang w:eastAsia="ru-RU"/>
+              </w:rPr>
+              <w:t>Purpose</w:t>
+            </w:r>
+            <w:proofErr w:type="spellEnd"/>
+          </w:p>
+        </w:tc>
+      </w:tr>
+      <w:tr>
+        <w:trPr>
+          <w:cnfStyle w:val="000000100000" w:firstRow="0" w:lastRow="0" w:firstColumn="0" w:lastColumn="0" w:oddVBand="0" w:evenVBand="0" w:oddHBand="1" w:evenHBand="0" w:firstRowFirstColumn="0" w:firstRowLastColumn="0" w:lastRowFirstColumn="0" w:lastRowLastColumn="0"/>
+        </w:trPr>
+        <w:tc>
+          <w:tcPr>
+            <w:cnfStyle w:val="001000000000" w:firstRow="0" w:lastRow="0" w:firstColumn="1" w:lastColumn="0" w:oddVBand="0" w:evenVBand="0" w:oddHBand="0" w:evenHBand="0" w:firstRowFirstColumn="0" w:firstRowLastColumn="0" w:lastRowFirstColumn="0" w:lastRowLastColumn="0"/>
+            <w:tcW w:w="0" w:type="auto"/>
+            <w:hideMark/>
+          </w:tcPr>
+          <w:p>
+            <w:pPr>
+              <w:rPr>
+                <w:rFonts w:asciiTheme="majorHAnsi" w:eastAsia="Times New Roman" w:hAnsiTheme="majorHAnsi" w:cs="Times New Roman"/>
+                <w:sz w:val="24"/>
+                <w:szCs w:val="24"/>
+                <w:lang w:eastAsia="ru-RU"/>
+              </w:rPr>
+            </w:pPr>
+            <w:r>
+              <w:rPr>
+                <w:rFonts w:asciiTheme="majorHAnsi" w:eastAsia="Times New Roman" w:hAnsiTheme="majorHAnsi" w:cs="Times New Roman"/>
+                <w:sz w:val="24"/>
+                <w:szCs w:val="24"/>
+                <w:lang w:eastAsia="ru-RU"/>
+              </w:rPr>
+              <w:t xml:space="preserve">IP </w:t>
+            </w:r>
+            <w:proofErr w:type="spellStart"/>
+            <w:r>
+              <w:rPr>
+                <w:rFonts w:asciiTheme="majorHAnsi" w:eastAsia="Times New Roman" w:hAnsiTheme="majorHAnsi" w:cs="Times New Roman"/>
+                <w:sz w:val="24"/>
+                <w:szCs w:val="24"/>
+                <w:lang w:eastAsia="ru-RU"/>
+              </w:rPr>
+              <w:t>address</w:t>
+            </w:r>
+            <w:proofErr w:type="spellEnd"/>
+          </w:p>
+        </w:tc>
+        <w:tc>
+          <w:tcPr>
+            <w:tcW w:w="0" w:type="auto"/>
+            <w:hideMark/>
+          </w:tcPr>
+          <w:p>
+            <w:pPr>
+              <w:cnfStyle w:val="000000100000" w:firstRow="0" w:lastRow="0" w:firstColumn="0" w:lastColumn="0" w:oddVBand="0" w:evenVBand="0" w:oddHBand="1" w:evenHBand="0" w:firstRowFirstColumn="0" w:firstRowLastColumn="0" w:lastRowFirstColumn="0" w:lastRowLastColumn="0"/>
+              <w:rPr>
+                <w:rFonts w:asciiTheme="majorHAnsi" w:eastAsia="Times New Roman" w:hAnsiTheme="majorHAnsi" w:cs="Times New Roman"/>
+                <w:sz w:val="24"/>
+                <w:szCs w:val="24"/>
+                <w:lang w:eastAsia="ru-RU"/>
+              </w:rPr>
+            </w:pPr>
+            <w:proofErr w:type="spellStart"/>
+            <w:r>
+              <w:rPr>
+                <w:rFonts w:asciiTheme="majorHAnsi" w:eastAsia="Times New Roman" w:hAnsiTheme="majorHAnsi" w:cs="Times New Roman"/>
+                <w:sz w:val="24"/>
+                <w:szCs w:val="24"/>
+                <w:lang w:eastAsia="ru-RU"/>
+              </w:rPr>
+              <w:t>Identify</w:t>
+            </w:r>
+            <w:proofErr w:type="spellEnd"/>
+            <w:r>
+              <w:rPr>
+                <w:rFonts w:asciiTheme="majorHAnsi" w:eastAsia="Times New Roman" w:hAnsiTheme="majorHAnsi" w:cs="Times New Roman"/>
+                <w:sz w:val="24"/>
+                <w:szCs w:val="24"/>
+                <w:lang w:eastAsia="ru-RU"/>
+              </w:rPr>
+              <w:t xml:space="preserve"> </w:t>
+            </w:r>
+            <w:proofErr w:type="spellStart"/>
+            <w:r>
+              <w:rPr>
+                <w:rFonts w:asciiTheme="majorHAnsi" w:eastAsia="Times New Roman" w:hAnsiTheme="majorHAnsi" w:cs="Times New Roman"/>
+                <w:sz w:val="24"/>
+                <w:szCs w:val="24"/>
+                <w:lang w:eastAsia="ru-RU"/>
+              </w:rPr>
+              <w:t>network</w:t>
+            </w:r>
+            <w:proofErr w:type="spellEnd"/>
+            <w:r>
+              <w:rPr>
+                <w:rFonts w:asciiTheme="majorHAnsi" w:eastAsia="Times New Roman" w:hAnsiTheme="majorHAnsi" w:cs="Times New Roman"/>
+                <w:sz w:val="24"/>
+                <w:szCs w:val="24"/>
+                <w:lang w:eastAsia="ru-RU"/>
+              </w:rPr>
+              <w:t xml:space="preserve"> </w:t>
+            </w:r>
+            <w:proofErr w:type="spellStart"/>
+            <w:r>
+              <w:rPr>
+                <w:rFonts w:asciiTheme="majorHAnsi" w:eastAsia="Times New Roman" w:hAnsiTheme="majorHAnsi" w:cs="Times New Roman"/>
+                <w:sz w:val="24"/>
+                <w:szCs w:val="24"/>
+                <w:lang w:eastAsia="ru-RU"/>
+              </w:rPr>
+              <w:t>infrastructure</w:t>
+            </w:r>
+            <w:proofErr w:type="spellEnd"/>
+          </w:p>
+        </w:tc>
+      </w:tr>
+      <w:tr>
+        <w:tc>
+          <w:tcPr>
+            <w:cnfStyle w:val="001000000000" w:firstRow="0" w:lastRow="0" w:firstColumn="1" w:lastColumn="0" w:oddVBand="0" w:evenVBand="0" w:oddHBand="0" w:evenHBand="0" w:firstRowFirstColumn="0" w:firstRowLastColumn="0" w:lastRowFirstColumn="0" w:lastRowLastColumn="0"/>
+            <w:tcW w:w="0" w:type="auto"/>
+            <w:hideMark/>
+          </w:tcPr>
+          <w:p>
+            <w:pPr>
+              <w:rPr>
+                <w:rFonts w:asciiTheme="majorHAnsi" w:eastAsia="Times New Roman" w:hAnsiTheme="majorHAnsi" w:cs="Times New Roman"/>
+                <w:sz w:val="24"/>
+                <w:szCs w:val="24"/>
+                <w:lang w:eastAsia="ru-RU"/>
+              </w:rPr>
+            </w:pPr>
+            <w:proofErr w:type="spellStart"/>
+            <w:r>
+              <w:rPr>
+                <w:rFonts w:asciiTheme="majorHAnsi" w:eastAsia="Times New Roman" w:hAnsiTheme="majorHAnsi" w:cs="Times New Roman"/>
+                <w:sz w:val="24"/>
+                <w:szCs w:val="24"/>
+                <w:lang w:eastAsia="ru-RU"/>
+              </w:rPr>
+              <w:t>Domain</w:t>
+            </w:r>
+            <w:proofErr w:type="spellEnd"/>
+          </w:p>
+        </w:tc>
+        <w:tc>
+          <w:tcPr>
+            <w:tcW w:w="0" w:type="auto"/>
+            <w:hideMark/>
+          </w:tcPr>
+          <w:p>
+            <w:pPr>
+              <w:cnfStyle w:val="000000000000" w:firstRow="0" w:lastRow="0" w:firstColumn="0" w:lastColumn="0" w:oddVBand="0" w:evenVBand="0" w:oddHBand="0" w:evenHBand="0" w:firstRowFirstColumn="0" w:firstRowLastColumn="0" w:lastRowFirstColumn="0" w:lastRowLastColumn="0"/>
+              <w:rPr>
+                <w:rFonts w:asciiTheme="majorHAnsi" w:eastAsia="Times New Roman" w:hAnsiTheme="majorHAnsi" w:cs="Times New Roman"/>
+                <w:sz w:val="24"/>
+                <w:szCs w:val="24"/>
+                <w:lang w:eastAsia="ru-RU"/>
+              </w:rPr>
+            </w:pPr>
+            <w:proofErr w:type="spellStart"/>
+            <w:r>
+              <w:rPr>
+                <w:rFonts w:asciiTheme="majorHAnsi" w:eastAsia="Times New Roman" w:hAnsiTheme="majorHAnsi" w:cs="Times New Roman"/>
+                <w:sz w:val="24"/>
+                <w:szCs w:val="24"/>
+                <w:lang w:eastAsia="ru-RU"/>
+              </w:rPr>
+              <w:t>Identify</w:t>
+            </w:r>
+            <w:proofErr w:type="spellEnd"/>
+            <w:r>
+              <w:rPr>
+                <w:rFonts w:asciiTheme="majorHAnsi" w:eastAsia="Times New Roman" w:hAnsiTheme="majorHAnsi" w:cs="Times New Roman"/>
+                <w:sz w:val="24"/>
+                <w:szCs w:val="24"/>
+                <w:lang w:eastAsia="ru-RU"/>
+              </w:rPr>
+              <w:t xml:space="preserve"> </w:t>
+            </w:r>
+            <w:proofErr w:type="spellStart"/>
+            <w:r>
+              <w:rPr>
+                <w:rFonts w:asciiTheme="majorHAnsi" w:eastAsia="Times New Roman" w:hAnsiTheme="majorHAnsi" w:cs="Times New Roman"/>
+                <w:sz w:val="24"/>
+                <w:szCs w:val="24"/>
+                <w:lang w:eastAsia="ru-RU"/>
+              </w:rPr>
+              <w:t>associated</w:t>
+            </w:r>
+            <w:proofErr w:type="spellEnd"/>
+            <w:r>
+              <w:rPr>
+                <w:rFonts w:asciiTheme="majorHAnsi" w:eastAsia="Times New Roman" w:hAnsiTheme="majorHAnsi" w:cs="Times New Roman"/>
+                <w:sz w:val="24"/>
+                <w:szCs w:val="24"/>
+                <w:lang w:eastAsia="ru-RU"/>
+              </w:rPr>
+              <w:t xml:space="preserve"> </w:t>
+            </w:r>
+            <w:proofErr w:type="spellStart"/>
+            <w:r>
+              <w:rPr>
+                <w:rFonts w:asciiTheme="majorHAnsi" w:eastAsia="Times New Roman" w:hAnsiTheme="majorHAnsi" w:cs="Times New Roman"/>
+                <w:sz w:val="24"/>
+                <w:szCs w:val="24"/>
+                <w:lang w:eastAsia="ru-RU"/>
+              </w:rPr>
+              <w:t>infrastructure</w:t>
+            </w:r>
+            <w:proofErr w:type="spellEnd"/>
+          </w:p>
+        </w:tc>
+      </w:tr>
+      <w:tr>
+        <w:trPr>
+          <w:cnfStyle w:val="000000100000" w:firstRow="0" w:lastRow="0" w:firstColumn="0" w:lastColumn="0" w:oddVBand="0" w:evenVBand="0" w:oddHBand="1" w:evenHBand="0" w:firstRowFirstColumn="0" w:firstRowLastColumn="0" w:lastRowFirstColumn="0" w:lastRowLastColumn="0"/>
+        </w:trPr>
+        <w:tc>
+          <w:tcPr>
+            <w:cnfStyle w:val="001000000000" w:firstRow="0" w:lastRow="0" w:firstColumn="1" w:lastColumn="0" w:oddVBand="0" w:evenVBand="0" w:oddHBand="0" w:evenHBand="0" w:firstRowFirstColumn="0" w:firstRowLastColumn="0" w:lastRowFirstColumn="0" w:lastRowLastColumn="0"/>
+            <w:tcW w:w="0" w:type="auto"/>
+            <w:hideMark/>
+          </w:tcPr>
+          <w:p>
+            <w:pPr>
+              <w:rPr>
+                <w:rFonts w:asciiTheme="majorHAnsi" w:eastAsia="Times New Roman" w:hAnsiTheme="majorHAnsi" w:cs="Times New Roman"/>
+                <w:sz w:val="24"/>
+                <w:szCs w:val="24"/>
+                <w:lang w:eastAsia="ru-RU"/>
+              </w:rPr>
+            </w:pPr>
+            <w:proofErr w:type="spellStart"/>
+            <w:r>
+              <w:rPr>
+                <w:rFonts w:asciiTheme="majorHAnsi" w:eastAsia="Times New Roman" w:hAnsiTheme="majorHAnsi" w:cs="Times New Roman"/>
+                <w:sz w:val="24"/>
+                <w:szCs w:val="24"/>
+                <w:lang w:eastAsia="ru-RU"/>
+              </w:rPr>
+              <w:t>Hostname</w:t>
+            </w:r>
+            <w:proofErr w:type="spellEnd"/>
+          </w:p>
+        </w:tc>
+        <w:tc>
+          <w:tcPr>
+            <w:tcW w:w="0" w:type="auto"/>
+            <w:hideMark/>
+          </w:tcPr>
+          <w:p>
+            <w:pPr>
+              <w:cnfStyle w:val="000000100000" w:firstRow="0" w:lastRow="0" w:firstColumn="0" w:lastColumn="0" w:oddVBand="0" w:evenVBand="0" w:oddHBand="1" w:evenHBand="0" w:firstRowFirstColumn="0" w:firstRowLastColumn="0" w:lastRowFirstColumn="0" w:lastRowLastColumn="0"/>
+              <w:rPr>
+                <w:rFonts w:asciiTheme="majorHAnsi" w:eastAsia="Times New Roman" w:hAnsiTheme="majorHAnsi" w:cs="Times New Roman"/>
+                <w:sz w:val="24"/>
+                <w:szCs w:val="24"/>
+                <w:lang w:val="en-US" w:eastAsia="ru-RU"/>
+              </w:rPr>
+            </w:pPr>
+            <w:r>
+              <w:rPr>
+                <w:rFonts w:asciiTheme="majorHAnsi" w:eastAsia="Times New Roman" w:hAnsiTheme="majorHAnsi" w:cs="Times New Roman"/>
+                <w:sz w:val="24"/>
+                <w:szCs w:val="24"/>
+                <w:lang w:val="en-US" w:eastAsia="ru-RU"/>
+              </w:rPr>
+              <w:t>Connect IP and domain information</w:t>
+            </w:r>
+          </w:p>
+        </w:tc>
+      </w:tr>
+      <w:tr>
+        <w:tc>
+          <w:tcPr>
+            <w:cnfStyle w:val="001000000000" w:firstRow="0" w:lastRow="0" w:firstColumn="1" w:lastColumn="0" w:oddVBand="0" w:evenVBand="0" w:oddHBand="0" w:evenHBand="0" w:firstRowFirstColumn="0" w:firstRowLastColumn="0" w:lastRowFirstColumn="0" w:lastRowLastColumn="0"/>
+            <w:tcW w:w="0" w:type="auto"/>
+            <w:hideMark/>
+          </w:tcPr>
+          <w:p>
+            <w:pPr>
+              <w:rPr>
+                <w:rFonts w:asciiTheme="majorHAnsi" w:eastAsia="Times New Roman" w:hAnsiTheme="majorHAnsi" w:cs="Times New Roman"/>
+                <w:sz w:val="24"/>
+                <w:szCs w:val="24"/>
+                <w:lang w:eastAsia="ru-RU"/>
+              </w:rPr>
+            </w:pPr>
+            <w:r>
+              <w:rPr>
+                <w:rFonts w:asciiTheme="majorHAnsi" w:eastAsia="Times New Roman" w:hAnsiTheme="majorHAnsi" w:cs="Times New Roman"/>
+                <w:sz w:val="24"/>
+                <w:szCs w:val="24"/>
+                <w:lang w:eastAsia="ru-RU"/>
+              </w:rPr>
+              <w:lastRenderedPageBreak/>
+              <w:t>ASN</w:t>
+            </w:r>
+          </w:p>
+        </w:tc>
+        <w:tc>
+          <w:tcPr>
+            <w:tcW w:w="0" w:type="auto"/>
+            <w:hideMark/>
+          </w:tcPr>
+          <w:p>
+            <w:pPr>
+              <w:cnfStyle w:val="000000000000" w:firstRow="0" w:lastRow="0" w:firstColumn="0" w:lastColumn="0" w:oddVBand="0" w:evenVBand="0" w:oddHBand="0" w:evenHBand="0" w:firstRowFirstColumn="0" w:firstRowLastColumn="0" w:lastRowFirstColumn="0" w:lastRowLastColumn="0"/>
+              <w:rPr>
+                <w:rFonts w:asciiTheme="majorHAnsi" w:eastAsia="Times New Roman" w:hAnsiTheme="majorHAnsi" w:cs="Times New Roman"/>
+                <w:sz w:val="24"/>
+                <w:szCs w:val="24"/>
+                <w:lang w:eastAsia="ru-RU"/>
+              </w:rPr>
+            </w:pPr>
+            <w:proofErr w:type="spellStart"/>
+            <w:r>
+              <w:rPr>
+                <w:rFonts w:asciiTheme="majorHAnsi" w:eastAsia="Times New Roman" w:hAnsiTheme="majorHAnsi" w:cs="Times New Roman"/>
+                <w:sz w:val="24"/>
+                <w:szCs w:val="24"/>
+                <w:lang w:eastAsia="ru-RU"/>
+              </w:rPr>
+              <w:t>Identify</w:t>
+            </w:r>
+            <w:proofErr w:type="spellEnd"/>
+            <w:r>
+              <w:rPr>
+                <w:rFonts w:asciiTheme="majorHAnsi" w:eastAsia="Times New Roman" w:hAnsiTheme="majorHAnsi" w:cs="Times New Roman"/>
+                <w:sz w:val="24"/>
+                <w:szCs w:val="24"/>
+                <w:lang w:eastAsia="ru-RU"/>
+              </w:rPr>
+              <w:t xml:space="preserve"> </w:t>
+            </w:r>
+            <w:proofErr w:type="spellStart"/>
+            <w:r>
+              <w:rPr>
+                <w:rFonts w:asciiTheme="majorHAnsi" w:eastAsia="Times New Roman" w:hAnsiTheme="majorHAnsi" w:cs="Times New Roman"/>
+                <w:sz w:val="24"/>
+                <w:szCs w:val="24"/>
+                <w:lang w:eastAsia="ru-RU"/>
+              </w:rPr>
+              <w:t>network</w:t>
+            </w:r>
+            <w:proofErr w:type="spellEnd"/>
+            <w:r>
+              <w:rPr>
+                <w:rFonts w:asciiTheme="majorHAnsi" w:eastAsia="Times New Roman" w:hAnsiTheme="majorHAnsi" w:cs="Times New Roman"/>
+                <w:sz w:val="24"/>
+                <w:szCs w:val="24"/>
+                <w:lang w:eastAsia="ru-RU"/>
+              </w:rPr>
+              <w:t>/</w:t>
+            </w:r>
+            <w:proofErr w:type="spellStart"/>
+            <w:r>
+              <w:rPr>
+                <w:rFonts w:asciiTheme="majorHAnsi" w:eastAsia="Times New Roman" w:hAnsiTheme="majorHAnsi" w:cs="Times New Roman"/>
+                <w:sz w:val="24"/>
+                <w:szCs w:val="24"/>
+                <w:lang w:eastAsia="ru-RU"/>
+              </w:rPr>
+              <w:t>hosting</w:t>
+            </w:r>
+            <w:proofErr w:type="spellEnd"/>
+            <w:r>
+              <w:rPr>
+                <w:rFonts w:asciiTheme="majorHAnsi" w:eastAsia="Times New Roman" w:hAnsiTheme="majorHAnsi" w:cs="Times New Roman"/>
+                <w:sz w:val="24"/>
+                <w:szCs w:val="24"/>
+                <w:lang w:eastAsia="ru-RU"/>
+              </w:rPr>
+              <w:t xml:space="preserve"> </w:t>
+            </w:r>
+            <w:proofErr w:type="spellStart"/>
+            <w:r>
+              <w:rPr>
+                <w:rFonts w:asciiTheme="majorHAnsi" w:eastAsia="Times New Roman" w:hAnsiTheme="majorHAnsi" w:cs="Times New Roman"/>
+                <w:sz w:val="24"/>
+                <w:szCs w:val="24"/>
+                <w:lang w:eastAsia="ru-RU"/>
+              </w:rPr>
+              <w:t>organization</w:t>
+            </w:r>
+            <w:proofErr w:type="spellEnd"/>
+          </w:p>
+        </w:tc>
+      </w:tr>
+      <w:tr>
+        <w:trPr>
+          <w:cnfStyle w:val="000000100000" w:firstRow="0" w:lastRow="0" w:firstColumn="0" w:lastColumn="0" w:oddVBand="0" w:evenVBand="0" w:oddHBand="1" w:evenHBand="0" w:firstRowFirstColumn="0" w:firstRowLastColumn="0" w:lastRowFirstColumn="0" w:lastRowLastColumn="0"/>
+        </w:trPr>
+        <w:tc>
+          <w:tcPr>
+            <w:cnfStyle w:val="001000000000" w:firstRow="0" w:lastRow="0" w:firstColumn="1" w:lastColumn="0" w:oddVBand="0" w:evenVBand="0" w:oddHBand="0" w:evenHBand="0" w:firstRowFirstColumn="0" w:firstRowLastColumn="0" w:lastRowFirstColumn="0" w:lastRowLastColumn="0"/>
+            <w:tcW w:w="0" w:type="auto"/>
+            <w:hideMark/>
+          </w:tcPr>
+          <w:p>
+            <w:pPr>
+              <w:rPr>
+                <w:rFonts w:asciiTheme="majorHAnsi" w:eastAsia="Times New Roman" w:hAnsiTheme="majorHAnsi" w:cs="Times New Roman"/>
+                <w:sz w:val="24"/>
+                <w:szCs w:val="24"/>
+                <w:lang w:eastAsia="ru-RU"/>
+              </w:rPr>
+            </w:pPr>
+            <w:proofErr w:type="spellStart"/>
+            <w:r>
+              <w:rPr>
+                <w:rFonts w:asciiTheme="majorHAnsi" w:eastAsia="Times New Roman" w:hAnsiTheme="majorHAnsi" w:cs="Times New Roman"/>
+                <w:sz w:val="24"/>
+                <w:szCs w:val="24"/>
+                <w:lang w:eastAsia="ru-RU"/>
+              </w:rPr>
+              <w:t>Country</w:t>
+            </w:r>
+            <w:proofErr w:type="spellEnd"/>
+          </w:p>
+        </w:tc>
+        <w:tc>
+          <w:tcPr>
+            <w:tcW w:w="0" w:type="auto"/>
+            <w:hideMark/>
+          </w:tcPr>
+          <w:p>
+            <w:pPr>
+              <w:cnfStyle w:val="000000100000" w:firstRow="0" w:lastRow="0" w:firstColumn="0" w:lastColumn="0" w:oddVBand="0" w:evenVBand="0" w:oddHBand="1" w:evenHBand="0" w:firstRowFirstColumn="0" w:firstRowLastColumn="0" w:lastRowFirstColumn="0" w:lastRowLastColumn="0"/>
+              <w:rPr>
+                <w:rFonts w:asciiTheme="majorHAnsi" w:eastAsia="Times New Roman" w:hAnsiTheme="majorHAnsi" w:cs="Times New Roman"/>
+                <w:sz w:val="24"/>
+                <w:szCs w:val="24"/>
+                <w:lang w:eastAsia="ru-RU"/>
+              </w:rPr>
+            </w:pPr>
+            <w:proofErr w:type="spellStart"/>
+            <w:r>
+              <w:rPr>
+                <w:rFonts w:asciiTheme="majorHAnsi" w:eastAsia="Times New Roman" w:hAnsiTheme="majorHAnsi" w:cs="Times New Roman"/>
+                <w:sz w:val="24"/>
+                <w:szCs w:val="24"/>
+                <w:lang w:eastAsia="ru-RU"/>
+              </w:rPr>
+              <w:t>Geographic</w:t>
+            </w:r>
+            <w:proofErr w:type="spellEnd"/>
+            <w:r>
+              <w:rPr>
+                <w:rFonts w:asciiTheme="majorHAnsi" w:eastAsia="Times New Roman" w:hAnsiTheme="majorHAnsi" w:cs="Times New Roman"/>
+                <w:sz w:val="24"/>
+                <w:szCs w:val="24"/>
+                <w:lang w:eastAsia="ru-RU"/>
+              </w:rPr>
+              <w:t xml:space="preserve"> </w:t>
+            </w:r>
+            <w:proofErr w:type="spellStart"/>
+            <w:r>
+              <w:rPr>
+                <w:rFonts w:asciiTheme="majorHAnsi" w:eastAsia="Times New Roman" w:hAnsiTheme="majorHAnsi" w:cs="Times New Roman"/>
+                <w:sz w:val="24"/>
+                <w:szCs w:val="24"/>
+                <w:lang w:eastAsia="ru-RU"/>
+              </w:rPr>
+              <w:t>analysis</w:t>
+            </w:r>
+            <w:proofErr w:type="spellEnd"/>
+          </w:p>
+        </w:tc>
+      </w:tr>
+      <w:tr>
+        <w:tc>
+          <w:tcPr>
+            <w:cnfStyle w:val="001000000000" w:firstRow="0" w:lastRow="0" w:firstColumn="1" w:lastColumn="0" w:oddVBand="0" w:evenVBand="0" w:oddHBand="0" w:evenHBand="0" w:firstRowFirstColumn="0" w:firstRowLastColumn="0" w:lastRowFirstColumn="0" w:lastRowLastColumn="0"/>
+            <w:tcW w:w="0" w:type="auto"/>
+            <w:hideMark/>
+          </w:tcPr>
+          <w:p>
+            <w:pPr>
+              <w:rPr>
+                <w:rFonts w:asciiTheme="majorHAnsi" w:eastAsia="Times New Roman" w:hAnsiTheme="majorHAnsi" w:cs="Times New Roman"/>
+                <w:sz w:val="24"/>
+                <w:szCs w:val="24"/>
+                <w:lang w:eastAsia="ru-RU"/>
+              </w:rPr>
+            </w:pPr>
+            <w:proofErr w:type="spellStart"/>
+            <w:r>
+              <w:rPr>
+                <w:rFonts w:asciiTheme="majorHAnsi" w:eastAsia="Times New Roman" w:hAnsiTheme="majorHAnsi" w:cs="Times New Roman"/>
+                <w:sz w:val="24"/>
+                <w:szCs w:val="24"/>
+                <w:lang w:eastAsia="ru-RU"/>
+              </w:rPr>
+              <w:t>Open</w:t>
+            </w:r>
+            <w:proofErr w:type="spellEnd"/>
+            <w:r>
+              <w:rPr>
+                <w:rFonts w:asciiTheme="majorHAnsi" w:eastAsia="Times New Roman" w:hAnsiTheme="majorHAnsi" w:cs="Times New Roman"/>
+                <w:sz w:val="24"/>
+                <w:szCs w:val="24"/>
+                <w:lang w:eastAsia="ru-RU"/>
+              </w:rPr>
+              <w:t xml:space="preserve"> </w:t>
+            </w:r>
+            <w:proofErr w:type="spellStart"/>
+            <w:r>
+              <w:rPr>
+                <w:rFonts w:asciiTheme="majorHAnsi" w:eastAsia="Times New Roman" w:hAnsiTheme="majorHAnsi" w:cs="Times New Roman"/>
+                <w:sz w:val="24"/>
+                <w:szCs w:val="24"/>
+                <w:lang w:eastAsia="ru-RU"/>
+              </w:rPr>
+              <w:t>services</w:t>
+            </w:r>
+            <w:proofErr w:type="spellEnd"/>
+          </w:p>
+        </w:tc>
+        <w:tc>
+          <w:tcPr>
+            <w:tcW w:w="0" w:type="auto"/>
+            <w:hideMark/>
+          </w:tcPr>
+          <w:p>
+            <w:pPr>
+              <w:cnfStyle w:val="000000000000" w:firstRow="0" w:lastRow="0" w:firstColumn="0" w:lastColumn="0" w:oddVBand="0" w:evenVBand="0" w:oddHBand="0" w:evenHBand="0" w:firstRowFirstColumn="0" w:firstRowLastColumn="0" w:lastRowFirstColumn="0" w:lastRowLastColumn="0"/>
+              <w:rPr>
+                <w:rFonts w:asciiTheme="majorHAnsi" w:eastAsia="Times New Roman" w:hAnsiTheme="majorHAnsi" w:cs="Times New Roman"/>
+                <w:sz w:val="24"/>
+                <w:szCs w:val="24"/>
+                <w:lang w:eastAsia="ru-RU"/>
+              </w:rPr>
+            </w:pPr>
+            <w:proofErr w:type="spellStart"/>
+            <w:r>
+              <w:rPr>
+                <w:rFonts w:asciiTheme="majorHAnsi" w:eastAsia="Times New Roman" w:hAnsiTheme="majorHAnsi" w:cs="Times New Roman"/>
+                <w:sz w:val="24"/>
+                <w:szCs w:val="24"/>
+                <w:lang w:eastAsia="ru-RU"/>
+              </w:rPr>
+              <w:t>Infrastructure</w:t>
+            </w:r>
+            <w:proofErr w:type="spellEnd"/>
+            <w:r>
+              <w:rPr>
+                <w:rFonts w:asciiTheme="majorHAnsi" w:eastAsia="Times New Roman" w:hAnsiTheme="majorHAnsi" w:cs="Times New Roman"/>
+                <w:sz w:val="24"/>
+                <w:szCs w:val="24"/>
+                <w:lang w:eastAsia="ru-RU"/>
+              </w:rPr>
+              <w:t xml:space="preserve"> </w:t>
+            </w:r>
+            <w:proofErr w:type="spellStart"/>
+            <w:r>
+              <w:rPr>
+                <w:rFonts w:asciiTheme="majorHAnsi" w:eastAsia="Times New Roman" w:hAnsiTheme="majorHAnsi" w:cs="Times New Roman"/>
+                <w:sz w:val="24"/>
+                <w:szCs w:val="24"/>
+                <w:lang w:eastAsia="ru-RU"/>
+              </w:rPr>
+              <w:t>profiling</w:t>
+            </w:r>
+            <w:proofErr w:type="spellEnd"/>
+          </w:p>
+        </w:tc>
+      </w:tr>
+      <w:tr>
+        <w:trPr>
+          <w:cnfStyle w:val="000000100000" w:firstRow="0" w:lastRow="0" w:firstColumn="0" w:lastColumn="0" w:oddVBand="0" w:evenVBand="0" w:oddHBand="1" w:evenHBand="0" w:firstRowFirstColumn="0" w:firstRowLastColumn="0" w:lastRowFirstColumn="0" w:lastRowLastColumn="0"/>
+        </w:trPr>
+        <w:tc>
+          <w:tcPr>
+            <w:cnfStyle w:val="001000000000" w:firstRow="0" w:lastRow="0" w:firstColumn="1" w:lastColumn="0" w:oddVBand="0" w:evenVBand="0" w:oddHBand="0" w:evenHBand="0" w:firstRowFirstColumn="0" w:firstRowLastColumn="0" w:lastRowFirstColumn="0" w:lastRowLastColumn="0"/>
+            <w:tcW w:w="0" w:type="auto"/>
+            <w:hideMark/>
+          </w:tcPr>
+          <w:p>
+            <w:pPr>
+              <w:rPr>
+                <w:rFonts w:asciiTheme="majorHAnsi" w:eastAsia="Times New Roman" w:hAnsiTheme="majorHAnsi" w:cs="Times New Roman"/>
+                <w:sz w:val="24"/>
+                <w:szCs w:val="24"/>
+                <w:lang w:eastAsia="ru-RU"/>
+              </w:rPr>
+            </w:pPr>
+            <w:proofErr w:type="spellStart"/>
+            <w:r>
+              <w:rPr>
+                <w:rFonts w:asciiTheme="majorHAnsi" w:eastAsia="Times New Roman" w:hAnsiTheme="majorHAnsi" w:cs="Times New Roman"/>
+                <w:sz w:val="24"/>
+                <w:szCs w:val="24"/>
+                <w:lang w:eastAsia="ru-RU"/>
+              </w:rPr>
+              <w:t>Reputation</w:t>
+            </w:r>
+            <w:proofErr w:type="spellEnd"/>
+          </w:p>
+        </w:tc>
+        <w:tc>
+          <w:tcPr>
+            <w:tcW w:w="0" w:type="auto"/>
+            <w:hideMark/>
+          </w:tcPr>
+          <w:p>
+            <w:pPr>
+              <w:cnfStyle w:val="000000100000" w:firstRow="0" w:lastRow="0" w:firstColumn="0" w:lastColumn="0" w:oddVBand="0" w:evenVBand="0" w:oddHBand="1" w:evenHBand="0" w:firstRowFirstColumn="0" w:firstRowLastColumn="0" w:lastRowFirstColumn="0" w:lastRowLastColumn="0"/>
+              <w:rPr>
+                <w:rFonts w:asciiTheme="majorHAnsi" w:eastAsia="Times New Roman" w:hAnsiTheme="majorHAnsi" w:cs="Times New Roman"/>
+                <w:sz w:val="24"/>
+                <w:szCs w:val="24"/>
+                <w:lang w:eastAsia="ru-RU"/>
+              </w:rPr>
+            </w:pPr>
+            <w:proofErr w:type="spellStart"/>
+            <w:r>
+              <w:rPr>
+                <w:rFonts w:asciiTheme="majorHAnsi" w:eastAsia="Times New Roman" w:hAnsiTheme="majorHAnsi" w:cs="Times New Roman"/>
+                <w:sz w:val="24"/>
+                <w:szCs w:val="24"/>
+                <w:lang w:eastAsia="ru-RU"/>
+              </w:rPr>
+              <w:t>Determine</w:t>
+            </w:r>
+            <w:proofErr w:type="spellEnd"/>
+            <w:r>
+              <w:rPr>
+                <w:rFonts w:asciiTheme="majorHAnsi" w:eastAsia="Times New Roman" w:hAnsiTheme="majorHAnsi" w:cs="Times New Roman"/>
+                <w:sz w:val="24"/>
+                <w:szCs w:val="24"/>
+                <w:lang w:eastAsia="ru-RU"/>
+              </w:rPr>
+              <w:t xml:space="preserve"> </w:t>
+            </w:r>
+            <w:proofErr w:type="spellStart"/>
+            <w:r>
+              <w:rPr>
+                <w:rFonts w:asciiTheme="majorHAnsi" w:eastAsia="Times New Roman" w:hAnsiTheme="majorHAnsi" w:cs="Times New Roman"/>
+                <w:sz w:val="24"/>
+                <w:szCs w:val="24"/>
+                <w:lang w:eastAsia="ru-RU"/>
+              </w:rPr>
+              <w:t>existing</w:t>
+            </w:r>
+            <w:proofErr w:type="spellEnd"/>
+            <w:r>
+              <w:rPr>
+                <w:rFonts w:asciiTheme="majorHAnsi" w:eastAsia="Times New Roman" w:hAnsiTheme="majorHAnsi" w:cs="Times New Roman"/>
+                <w:sz w:val="24"/>
+                <w:szCs w:val="24"/>
+                <w:lang w:eastAsia="ru-RU"/>
+              </w:rPr>
+              <w:t xml:space="preserve"> </w:t>
+            </w:r>
+            <w:proofErr w:type="spellStart"/>
+            <w:r>
+              <w:rPr>
+                <w:rFonts w:asciiTheme="majorHAnsi" w:eastAsia="Times New Roman" w:hAnsiTheme="majorHAnsi" w:cs="Times New Roman"/>
+                <w:sz w:val="24"/>
+                <w:szCs w:val="24"/>
+                <w:lang w:eastAsia="ru-RU"/>
+              </w:rPr>
+              <w:t>threat</w:t>
+            </w:r>
+            <w:proofErr w:type="spellEnd"/>
+            <w:r>
+              <w:rPr>
+                <w:rFonts w:asciiTheme="majorHAnsi" w:eastAsia="Times New Roman" w:hAnsiTheme="majorHAnsi" w:cs="Times New Roman"/>
+                <w:sz w:val="24"/>
+                <w:szCs w:val="24"/>
+                <w:lang w:eastAsia="ru-RU"/>
+              </w:rPr>
+              <w:t xml:space="preserve"> </w:t>
+            </w:r>
+            <w:proofErr w:type="spellStart"/>
+            <w:r>
+              <w:rPr>
+                <w:rFonts w:asciiTheme="majorHAnsi" w:eastAsia="Times New Roman" w:hAnsiTheme="majorHAnsi" w:cs="Times New Roman"/>
+                <w:sz w:val="24"/>
+                <w:szCs w:val="24"/>
+                <w:lang w:eastAsia="ru-RU"/>
+              </w:rPr>
+              <w:t>reports</w:t>
+            </w:r>
+            <w:proofErr w:type="spellEnd"/>
+          </w:p>
+        </w:tc>
+      </w:tr>
+      <w:tr>
+        <w:tc>
+          <w:tcPr>
+            <w:cnfStyle w:val="001000000000" w:firstRow="0" w:lastRow="0" w:firstColumn="1" w:lastColumn="0" w:oddVBand="0" w:evenVBand="0" w:oddHBand="0" w:evenHBand="0" w:firstRowFirstColumn="0" w:firstRowLastColumn="0" w:lastRowFirstColumn="0" w:lastRowLastColumn="0"/>
+            <w:tcW w:w="0" w:type="auto"/>
+            <w:hideMark/>
+          </w:tcPr>
+          <w:p>
+            <w:pPr>
+              <w:rPr>
+                <w:rFonts w:asciiTheme="majorHAnsi" w:eastAsia="Times New Roman" w:hAnsiTheme="majorHAnsi" w:cs="Times New Roman"/>
+                <w:sz w:val="24"/>
+                <w:szCs w:val="24"/>
+                <w:lang w:eastAsia="ru-RU"/>
+              </w:rPr>
+            </w:pPr>
+            <w:proofErr w:type="spellStart"/>
+            <w:r>
+              <w:rPr>
+                <w:rFonts w:asciiTheme="majorHAnsi" w:eastAsia="Times New Roman" w:hAnsiTheme="majorHAnsi" w:cs="Times New Roman"/>
+                <w:sz w:val="24"/>
+                <w:szCs w:val="24"/>
+                <w:lang w:eastAsia="ru-RU"/>
+              </w:rPr>
+              <w:t>Source</w:t>
+            </w:r>
+            <w:proofErr w:type="spellEnd"/>
+          </w:p>
+        </w:tc>
+        <w:tc>
+          <w:tcPr>
+            <w:tcW w:w="0" w:type="auto"/>
+            <w:hideMark/>
+          </w:tcPr>
+          <w:p>
+            <w:pPr>
+              <w:cnfStyle w:val="000000000000" w:firstRow="0" w:lastRow="0" w:firstColumn="0" w:lastColumn="0" w:oddVBand="0" w:evenVBand="0" w:oddHBand="0" w:evenHBand="0" w:firstRowFirstColumn="0" w:firstRowLastColumn="0" w:lastRowFirstColumn="0" w:lastRowLastColumn="0"/>
+              <w:rPr>
+                <w:rFonts w:asciiTheme="majorHAnsi" w:eastAsia="Times New Roman" w:hAnsiTheme="majorHAnsi" w:cs="Times New Roman"/>
+                <w:sz w:val="24"/>
+                <w:szCs w:val="24"/>
+                <w:lang w:val="en-US" w:eastAsia="ru-RU"/>
+              </w:rPr>
+            </w:pPr>
+            <w:r>
+              <w:rPr>
+                <w:rFonts w:asciiTheme="majorHAnsi" w:eastAsia="Times New Roman" w:hAnsiTheme="majorHAnsi" w:cs="Times New Roman"/>
+                <w:sz w:val="24"/>
+                <w:szCs w:val="24"/>
+                <w:lang w:val="en-US" w:eastAsia="ru-RU"/>
+              </w:rPr>
+              <w:t>Track where information came from</w:t>
+            </w:r>
+          </w:p>
+        </w:tc>
+      </w:tr>
+      <w:tr>
+        <w:trPr>
+          <w:cnfStyle w:val="000000100000" w:firstRow="0" w:lastRow="0" w:firstColumn="0" w:lastColumn="0" w:oddVBand="0" w:evenVBand="0" w:oddHBand="1" w:evenHBand="0" w:firstRowFirstColumn="0" w:firstRowLastColumn="0" w:lastRowFirstColumn="0" w:lastRowLastColumn="0"/>
+        </w:trPr>
+        <w:tc>
+          <w:tcPr>
+            <w:cnfStyle w:val="001000000000" w:firstRow="0" w:lastRow="0" w:firstColumn="1" w:lastColumn="0" w:oddVBand="0" w:evenVBand="0" w:oddHBand="0" w:evenHBand="0" w:firstRowFirstColumn="0" w:firstRowLastColumn="0" w:lastRowFirstColumn="0" w:lastRowLastColumn="0"/>
+            <w:tcW w:w="0" w:type="auto"/>
+            <w:hideMark/>
+          </w:tcPr>
+          <w:p>
+            <w:pPr>
+              <w:rPr>
+                <w:rFonts w:asciiTheme="majorHAnsi" w:eastAsia="Times New Roman" w:hAnsiTheme="majorHAnsi" w:cs="Times New Roman"/>
+                <w:sz w:val="24"/>
+                <w:szCs w:val="24"/>
+                <w:lang w:eastAsia="ru-RU"/>
+              </w:rPr>
+            </w:pPr>
+            <w:proofErr w:type="spellStart"/>
+            <w:r>
+              <w:rPr>
+                <w:rFonts w:asciiTheme="majorHAnsi" w:eastAsia="Times New Roman" w:hAnsiTheme="majorHAnsi" w:cs="Times New Roman"/>
+                <w:sz w:val="24"/>
+                <w:szCs w:val="24"/>
+                <w:lang w:eastAsia="ru-RU"/>
+              </w:rPr>
+              <w:t>Timestamp</w:t>
+            </w:r>
+            <w:proofErr w:type="spellEnd"/>
+          </w:p>
+        </w:tc>
+        <w:tc>
+          <w:tcPr>
+            <w:tcW w:w="0" w:type="auto"/>
+            <w:hideMark/>
+          </w:tcPr>
+          <w:p>
+            <w:pPr>
+              <w:cnfStyle w:val="000000100000" w:firstRow="0" w:lastRow="0" w:firstColumn="0" w:lastColumn="0" w:oddVBand="0" w:evenVBand="0" w:oddHBand="1" w:evenHBand="0" w:firstRowFirstColumn="0" w:firstRowLastColumn="0" w:lastRowFirstColumn="0" w:lastRowLastColumn="0"/>
+              <w:rPr>
+                <w:rFonts w:asciiTheme="majorHAnsi" w:eastAsia="Times New Roman" w:hAnsiTheme="majorHAnsi" w:cs="Times New Roman"/>
+                <w:sz w:val="24"/>
+                <w:szCs w:val="24"/>
+                <w:lang w:val="en-US" w:eastAsia="ru-RU"/>
+              </w:rPr>
+            </w:pPr>
+            <w:r>
+              <w:rPr>
+                <w:rFonts w:asciiTheme="majorHAnsi" w:eastAsia="Times New Roman" w:hAnsiTheme="majorHAnsi" w:cs="Times New Roman"/>
+                <w:sz w:val="24"/>
+                <w:szCs w:val="24"/>
+                <w:lang w:val="en-US" w:eastAsia="ru-RU"/>
+              </w:rPr>
+              <w:t>Track when information was collected</w:t>
+            </w:r>
+          </w:p>
+        </w:tc>
+      </w:tr>
+    </w:tbl>
+    <w:p>
+      <w:pPr>
+        <w:spacing w:after="0" w:line="240" w:lineRule="auto"/>
+        <w:rPr>
+          <w:rFonts w:asciiTheme="majorHAnsi" w:eastAsia="Times New Roman" w:hAnsiTheme="majorHAnsi" w:cs="Times New Roman"/>
+          <w:sz w:val="24"/>
+          <w:szCs w:val="24"/>
+          <w:lang w:val="en-US" w:eastAsia="ru-RU"/>
+        </w:rPr>
+      </w:pPr>
+    </w:p>
+    <w:p>
+      <w:pPr>
+        <w:spacing w:before="100" w:beforeAutospacing="1" w:after="100" w:afterAutospacing="1" w:line="240" w:lineRule="auto"/>
+        <w:outlineLvl w:val="2"/>
+        <w:rPr>
+          <w:rFonts w:asciiTheme="majorHAnsi" w:eastAsia="Times New Roman" w:hAnsiTheme="majorHAnsi" w:cs="Times New Roman"/>
+          <w:b/>
+          <w:bCs/>
+          <w:sz w:val="27"/>
+          <w:szCs w:val="27"/>
+          <w:lang w:val="en-US" w:eastAsia="ru-RU"/>
+        </w:rPr>
+      </w:pPr>
+      <w:r>
+        <w:rPr>
+          <w:rFonts w:asciiTheme="majorHAnsi" w:eastAsia="Times New Roman" w:hAnsiTheme="majorHAnsi" w:cs="Times New Roman"/>
+          <w:b/>
+          <w:bCs/>
+          <w:sz w:val="27"/>
+          <w:szCs w:val="27"/>
+          <w:lang w:val="en-US" w:eastAsia="ru-RU"/>
+        </w:rPr>
+        <w:t>Step 2 — Initial infrastructure discovery</w:t>
+      </w:r>
+    </w:p>
+    <w:p>
+      <w:pPr>
+        <w:spacing w:before="100" w:beforeAutospacing="1" w:after="100" w:afterAutospacing="1" w:line="240" w:lineRule="auto"/>
+        <w:rPr>
+          <w:rFonts w:asciiTheme="majorHAnsi" w:eastAsia="Times New Roman" w:hAnsiTheme="majorHAnsi" w:cs="Times New Roman"/>
+          <w:sz w:val="24"/>
+          <w:szCs w:val="24"/>
+          <w:lang w:val="en-US" w:eastAsia="ru-RU"/>
+        </w:rPr>
+      </w:pPr>
+      <w:r>
+        <w:rPr>
+          <w:rFonts w:asciiTheme="majorHAnsi" w:eastAsia="Times New Roman" w:hAnsiTheme="majorHAnsi" w:cs="Times New Roman"/>
+          <w:sz w:val="24"/>
+          <w:szCs w:val="24"/>
+          <w:lang w:val="en-US" w:eastAsia="ru-RU"/>
+        </w:rPr>
+        <w:t xml:space="preserve">An IP address or domain can be selected as the starting point from a </w:t>
+      </w:r>
+      <w:r>
+        <w:rPr>
+          <w:rFonts w:asciiTheme="majorHAnsi" w:eastAsia="Times New Roman" w:hAnsiTheme="majorHAnsi" w:cs="Times New Roman"/>
+          <w:b/>
+          <w:bCs/>
+          <w:sz w:val="24"/>
+          <w:szCs w:val="24"/>
+          <w:lang w:val="en-US" w:eastAsia="ru-RU"/>
+        </w:rPr>
+        <w:t>publicly documented security report or threat-intelligence dataset</w:t>
+      </w:r>
+      <w:r>
+        <w:rPr>
+          <w:rFonts w:asciiTheme="majorHAnsi" w:eastAsia="Times New Roman" w:hAnsiTheme="majorHAnsi" w:cs="Times New Roman"/>
+          <w:sz w:val="24"/>
+          <w:szCs w:val="24"/>
+          <w:lang w:val="en-US" w:eastAsia="ru-RU"/>
+        </w:rPr>
+        <w:t>.</w:t>
+      </w:r>
+    </w:p>
+    <w:p>
+      <w:pPr>
+        <w:spacing w:before="100" w:beforeAutospacing="1" w:after="100" w:afterAutospacing="1" w:line="240" w:lineRule="auto"/>
+        <w:rPr>
+          <w:rFonts w:asciiTheme="majorHAnsi" w:eastAsia="Times New Roman" w:hAnsiTheme="majorHAnsi" w:cs="Times New Roman"/>
+          <w:sz w:val="24"/>
+          <w:szCs w:val="24"/>
+          <w:lang w:val="en-US" w:eastAsia="ru-RU"/>
+        </w:rPr>
+      </w:pPr>
+      <w:r>
+        <w:rPr>
+          <w:rFonts w:asciiTheme="majorHAnsi" w:eastAsia="Times New Roman" w:hAnsiTheme="majorHAnsi" w:cs="Times New Roman"/>
+          <w:sz w:val="24"/>
+          <w:szCs w:val="24"/>
+          <w:lang w:val="en-US" w:eastAsia="ru-RU"/>
+        </w:rPr>
+        <w:t xml:space="preserve">We then use </w:t>
+      </w:r>
+      <w:proofErr w:type="spellStart"/>
+      <w:r>
+        <w:rPr>
+          <w:rFonts w:asciiTheme="majorHAnsi" w:eastAsia="Times New Roman" w:hAnsiTheme="majorHAnsi" w:cs="Times New Roman"/>
+          <w:sz w:val="24"/>
+          <w:szCs w:val="24"/>
+          <w:lang w:val="en-US" w:eastAsia="ru-RU"/>
+        </w:rPr>
+        <w:t>Shodan</w:t>
+      </w:r>
+      <w:proofErr w:type="spellEnd"/>
+      <w:r>
+        <w:rPr>
+          <w:rFonts w:asciiTheme="majorHAnsi" w:eastAsia="Times New Roman" w:hAnsiTheme="majorHAnsi" w:cs="Times New Roman"/>
+          <w:sz w:val="24"/>
+          <w:szCs w:val="24"/>
+          <w:lang w:val="en-US" w:eastAsia="ru-RU"/>
+        </w:rPr>
+        <w:t xml:space="preserve"> to obtain publicly indexed information about the infrastructure.</w:t>
+      </w:r>
+    </w:p>
+    <w:p>
+      <w:pPr>
+        <w:spacing w:before="100" w:beforeAutospacing="1" w:after="100" w:afterAutospacing="1" w:line="240" w:lineRule="auto"/>
+        <w:rPr>
+          <w:rFonts w:asciiTheme="majorHAnsi" w:eastAsia="Times New Roman" w:hAnsiTheme="majorHAnsi" w:cs="Times New Roman"/>
+          <w:sz w:val="24"/>
+          <w:szCs w:val="24"/>
+          <w:lang w:eastAsia="ru-RU"/>
+        </w:rPr>
+      </w:pPr>
+      <w:proofErr w:type="spellStart"/>
+      <w:r>
+        <w:rPr>
+          <w:rFonts w:asciiTheme="majorHAnsi" w:eastAsia="Times New Roman" w:hAnsiTheme="majorHAnsi" w:cs="Times New Roman"/>
+          <w:sz w:val="24"/>
+          <w:szCs w:val="24"/>
+          <w:lang w:eastAsia="ru-RU"/>
+        </w:rPr>
+        <w:t>Example</w:t>
+      </w:r>
+      <w:proofErr w:type="spellEnd"/>
+      <w:r>
+        <w:rPr>
+          <w:rFonts w:asciiTheme="majorHAnsi" w:eastAsia="Times New Roman" w:hAnsiTheme="majorHAnsi" w:cs="Times New Roman"/>
+          <w:sz w:val="24"/>
+          <w:szCs w:val="24"/>
+          <w:lang w:eastAsia="ru-RU"/>
+        </w:rPr>
+        <w:t xml:space="preserve"> </w:t>
+      </w:r>
+      <w:proofErr w:type="spellStart"/>
+      <w:r>
+        <w:rPr>
+          <w:rFonts w:asciiTheme="majorHAnsi" w:eastAsia="Times New Roman" w:hAnsiTheme="majorHAnsi" w:cs="Times New Roman"/>
+          <w:sz w:val="24"/>
+          <w:szCs w:val="24"/>
+          <w:lang w:eastAsia="ru-RU"/>
+        </w:rPr>
+        <w:t>dataset</w:t>
+      </w:r>
+      <w:proofErr w:type="spellEnd"/>
+      <w:r>
+        <w:rPr>
+          <w:rFonts w:asciiTheme="majorHAnsi" w:eastAsia="Times New Roman" w:hAnsiTheme="majorHAnsi" w:cs="Times New Roman"/>
+          <w:sz w:val="24"/>
+          <w:szCs w:val="24"/>
+          <w:lang w:eastAsia="ru-RU"/>
+        </w:rPr>
+        <w:t>:</w:t>
+      </w:r>
+    </w:p>
+    <w:tbl>
+      <w:tblPr>
+        <w:tblStyle w:val="a6"/>
+        <w:tblW w:w="0" w:type="auto"/>
+        <w:tblLook w:val="04A0" w:firstRow="1" w:lastRow="0" w:firstColumn="1" w:lastColumn="0" w:noHBand="0" w:noVBand="1"/>
+      </w:tblPr>
+      <w:tblGrid>
+        <w:gridCol w:w="1246"/>
+        <w:gridCol w:w="699"/>
+        <w:gridCol w:w="1021"/>
+        <w:gridCol w:w="1171"/>
+        <w:gridCol w:w="1656"/>
+        <w:gridCol w:w="980"/>
+      </w:tblGrid>
+      <w:tr>
+        <w:trPr>
+          <w:cnfStyle w:val="100000000000" w:firstRow="1" w:lastRow="0" w:firstColumn="0" w:lastColumn="0" w:oddVBand="0" w:evenVBand="0" w:oddHBand="0" w:evenHBand="0" w:firstRowFirstColumn="0" w:firstRowLastColumn="0" w:lastRowFirstColumn="0" w:lastRowLastColumn="0"/>
+        </w:trPr>
+        <w:tc>
+          <w:tcPr>
+            <w:cnfStyle w:val="001000000000" w:firstRow="0" w:lastRow="0" w:firstColumn="1" w:lastColumn="0" w:oddVBand="0" w:evenVBand="0" w:oddHBand="0" w:evenHBand="0" w:firstRowFirstColumn="0" w:firstRowLastColumn="0" w:lastRowFirstColumn="0" w:lastRowLastColumn="0"/>
+            <w:tcW w:w="0" w:type="auto"/>
+            <w:hideMark/>
+          </w:tcPr>
+          <w:p>
+            <w:pPr>
+              <w:jc w:val="center"/>
+              <w:rPr>
+                <w:rFonts w:asciiTheme="majorHAnsi" w:eastAsia="Times New Roman" w:hAnsiTheme="majorHAnsi" w:cs="Times New Roman"/>
+                <w:sz w:val="24"/>
+                <w:szCs w:val="24"/>
+                <w:lang w:eastAsia="ru-RU"/>
+              </w:rPr>
+            </w:pPr>
+            <w:r>
+              <w:rPr>
+                <w:rFonts w:asciiTheme="majorHAnsi" w:eastAsia="Times New Roman" w:hAnsiTheme="majorHAnsi" w:cs="Times New Roman"/>
+                <w:sz w:val="24"/>
+                <w:szCs w:val="24"/>
+                <w:lang w:eastAsia="ru-RU"/>
+              </w:rPr>
+              <w:t>IP</w:t>
+            </w:r>
+          </w:p>
+        </w:tc>
+        <w:tc>
+          <w:tcPr>
+            <w:tcW w:w="0" w:type="auto"/>
+            <w:hideMark/>
+          </w:tcPr>
+          <w:p>
+            <w:pPr>
+              <w:jc w:val="center"/>
+              <w:cnfStyle w:val="100000000000" w:firstRow="1" w:lastRow="0" w:firstColumn="0" w:lastColumn="0" w:oddVBand="0" w:evenVBand="0" w:oddHBand="0" w:evenHBand="0" w:firstRowFirstColumn="0" w:firstRowLastColumn="0" w:lastRowFirstColumn="0" w:lastRowLastColumn="0"/>
+              <w:rPr>
+                <w:rFonts w:asciiTheme="majorHAnsi" w:eastAsia="Times New Roman" w:hAnsiTheme="majorHAnsi" w:cs="Times New Roman"/>
+                <w:sz w:val="24"/>
+                <w:szCs w:val="24"/>
+                <w:lang w:eastAsia="ru-RU"/>
+              </w:rPr>
+            </w:pPr>
+            <w:proofErr w:type="spellStart"/>
+            <w:r>
+              <w:rPr>
+                <w:rFonts w:asciiTheme="majorHAnsi" w:eastAsia="Times New Roman" w:hAnsiTheme="majorHAnsi" w:cs="Times New Roman"/>
+                <w:sz w:val="24"/>
+                <w:szCs w:val="24"/>
+                <w:lang w:eastAsia="ru-RU"/>
+              </w:rPr>
+              <w:t>Port</w:t>
+            </w:r>
+            <w:proofErr w:type="spellEnd"/>
+          </w:p>
+        </w:tc>
+        <w:tc>
+          <w:tcPr>
+            <w:tcW w:w="0" w:type="auto"/>
+            <w:hideMark/>
+          </w:tcPr>
+          <w:p>
+            <w:pPr>
+              <w:jc w:val="center"/>
+              <w:cnfStyle w:val="100000000000" w:firstRow="1" w:lastRow="0" w:firstColumn="0" w:lastColumn="0" w:oddVBand="0" w:evenVBand="0" w:oddHBand="0" w:evenHBand="0" w:firstRowFirstColumn="0" w:firstRowLastColumn="0" w:lastRowFirstColumn="0" w:lastRowLastColumn="0"/>
+              <w:rPr>
+                <w:rFonts w:asciiTheme="majorHAnsi" w:eastAsia="Times New Roman" w:hAnsiTheme="majorHAnsi" w:cs="Times New Roman"/>
+                <w:sz w:val="24"/>
+                <w:szCs w:val="24"/>
+                <w:lang w:eastAsia="ru-RU"/>
+              </w:rPr>
+            </w:pPr>
+            <w:proofErr w:type="spellStart"/>
+            <w:r>
+              <w:rPr>
+                <w:rFonts w:asciiTheme="majorHAnsi" w:eastAsia="Times New Roman" w:hAnsiTheme="majorHAnsi" w:cs="Times New Roman"/>
+                <w:sz w:val="24"/>
+                <w:szCs w:val="24"/>
+                <w:lang w:eastAsia="ru-RU"/>
+              </w:rPr>
+              <w:t>Service</w:t>
+            </w:r>
+            <w:proofErr w:type="spellEnd"/>
+          </w:p>
+        </w:tc>
+        <w:tc>
+          <w:tcPr>
+            <w:tcW w:w="0" w:type="auto"/>
+            <w:hideMark/>
+          </w:tcPr>
+          <w:p>
+            <w:pPr>
+              <w:jc w:val="center"/>
+              <w:cnfStyle w:val="100000000000" w:firstRow="1" w:lastRow="0" w:firstColumn="0" w:lastColumn="0" w:oddVBand="0" w:evenVBand="0" w:oddHBand="0" w:evenHBand="0" w:firstRowFirstColumn="0" w:firstRowLastColumn="0" w:lastRowFirstColumn="0" w:lastRowLastColumn="0"/>
+              <w:rPr>
+                <w:rFonts w:asciiTheme="majorHAnsi" w:eastAsia="Times New Roman" w:hAnsiTheme="majorHAnsi" w:cs="Times New Roman"/>
+                <w:sz w:val="24"/>
+                <w:szCs w:val="24"/>
+                <w:lang w:eastAsia="ru-RU"/>
+              </w:rPr>
+            </w:pPr>
+            <w:r>
+              <w:rPr>
+                <w:rFonts w:asciiTheme="majorHAnsi" w:eastAsia="Times New Roman" w:hAnsiTheme="majorHAnsi" w:cs="Times New Roman"/>
+                <w:sz w:val="24"/>
+                <w:szCs w:val="24"/>
+                <w:lang w:eastAsia="ru-RU"/>
+              </w:rPr>
+              <w:t>ASN</w:t>
+            </w:r>
+          </w:p>
+        </w:tc>
+        <w:tc>
+          <w:tcPr>
+            <w:tcW w:w="0" w:type="auto"/>
+            <w:hideMark/>
+          </w:tcPr>
+          <w:p>
+            <w:pPr>
+              <w:jc w:val="center"/>
+              <w:cnfStyle w:val="100000000000" w:firstRow="1" w:lastRow="0" w:firstColumn="0" w:lastColumn="0" w:oddVBand="0" w:evenVBand="0" w:oddHBand="0" w:evenHBand="0" w:firstRowFirstColumn="0" w:firstRowLastColumn="0" w:lastRowFirstColumn="0" w:lastRowLastColumn="0"/>
+              <w:rPr>
+                <w:rFonts w:asciiTheme="majorHAnsi" w:eastAsia="Times New Roman" w:hAnsiTheme="majorHAnsi" w:cs="Times New Roman"/>
+                <w:sz w:val="24"/>
+                <w:szCs w:val="24"/>
+                <w:lang w:eastAsia="ru-RU"/>
+              </w:rPr>
+            </w:pPr>
+            <w:proofErr w:type="spellStart"/>
+            <w:r>
+              <w:rPr>
+                <w:rFonts w:asciiTheme="majorHAnsi" w:eastAsia="Times New Roman" w:hAnsiTheme="majorHAnsi" w:cs="Times New Roman"/>
+                <w:sz w:val="24"/>
+                <w:szCs w:val="24"/>
+                <w:lang w:eastAsia="ru-RU"/>
+              </w:rPr>
+              <w:t>Organization</w:t>
+            </w:r>
+            <w:proofErr w:type="spellEnd"/>
+          </w:p>
+        </w:tc>
+        <w:tc>
+          <w:tcPr>
+            <w:tcW w:w="0" w:type="auto"/>
+            <w:hideMark/>
+          </w:tcPr>
+          <w:p>
+            <w:pPr>
+              <w:jc w:val="center"/>
+              <w:cnfStyle w:val="100000000000" w:firstRow="1" w:lastRow="0" w:firstColumn="0" w:lastColumn="0" w:oddVBand="0" w:evenVBand="0" w:oddHBand="0" w:evenHBand="0" w:firstRowFirstColumn="0" w:firstRowLastColumn="0" w:lastRowFirstColumn="0" w:lastRowLastColumn="0"/>
+              <w:rPr>
+                <w:rFonts w:asciiTheme="majorHAnsi" w:eastAsia="Times New Roman" w:hAnsiTheme="majorHAnsi" w:cs="Times New Roman"/>
+                <w:sz w:val="24"/>
+                <w:szCs w:val="24"/>
+                <w:lang w:eastAsia="ru-RU"/>
+              </w:rPr>
+            </w:pPr>
+            <w:proofErr w:type="spellStart"/>
+            <w:r>
+              <w:rPr>
+                <w:rFonts w:asciiTheme="majorHAnsi" w:eastAsia="Times New Roman" w:hAnsiTheme="majorHAnsi" w:cs="Times New Roman"/>
+                <w:sz w:val="24"/>
+                <w:szCs w:val="24"/>
+                <w:lang w:eastAsia="ru-RU"/>
+              </w:rPr>
+              <w:t>Source</w:t>
+            </w:r>
+            <w:proofErr w:type="spellEnd"/>
+          </w:p>
+        </w:tc>
+      </w:tr>
+      <w:tr>
+        <w:trPr>
+          <w:cnfStyle w:val="000000100000" w:firstRow="0" w:lastRow="0" w:firstColumn="0" w:lastColumn="0" w:oddVBand="0" w:evenVBand="0" w:oddHBand="1" w:evenHBand="0" w:firstRowFirstColumn="0" w:firstRowLastColumn="0" w:lastRowFirstColumn="0" w:lastRowLastColumn="0"/>
+        </w:trPr>
+        <w:tc>
+          <w:tcPr>
+            <w:cnfStyle w:val="001000000000" w:firstRow="0" w:lastRow="0" w:firstColumn="1" w:lastColumn="0" w:oddVBand="0" w:evenVBand="0" w:oddHBand="0" w:evenHBand="0" w:firstRowFirstColumn="0" w:firstRowLastColumn="0" w:lastRowFirstColumn="0" w:lastRowLastColumn="0"/>
+            <w:tcW w:w="0" w:type="auto"/>
+            <w:hideMark/>
+          </w:tcPr>
+          <w:p>
+            <w:pPr>
+              <w:rPr>
+                <w:rFonts w:asciiTheme="majorHAnsi" w:eastAsia="Times New Roman" w:hAnsiTheme="majorHAnsi" w:cs="Times New Roman"/>
+                <w:sz w:val="24"/>
+                <w:szCs w:val="24"/>
+                <w:lang w:eastAsia="ru-RU"/>
+              </w:rPr>
+            </w:pPr>
+            <w:proofErr w:type="spellStart"/>
+            <w:r>
+              <w:rPr>
+                <w:rFonts w:asciiTheme="majorHAnsi" w:eastAsia="Times New Roman" w:hAnsiTheme="majorHAnsi" w:cs="Courier New"/>
+                <w:sz w:val="20"/>
+                <w:szCs w:val="20"/>
+                <w:lang w:eastAsia="ru-RU"/>
+              </w:rPr>
+              <w:t>Example</w:t>
+            </w:r>
+            <w:proofErr w:type="spellEnd"/>
+            <w:r>
+              <w:rPr>
+                <w:rFonts w:asciiTheme="majorHAnsi" w:eastAsia="Times New Roman" w:hAnsiTheme="majorHAnsi" w:cs="Courier New"/>
+                <w:sz w:val="20"/>
+                <w:szCs w:val="20"/>
+                <w:lang w:eastAsia="ru-RU"/>
+              </w:rPr>
+              <w:t xml:space="preserve"> IP</w:t>
+            </w:r>
+          </w:p>
+        </w:tc>
+        <w:tc>
+          <w:tcPr>
+            <w:tcW w:w="0" w:type="auto"/>
+            <w:hideMark/>
+          </w:tcPr>
+          <w:p>
+            <w:pPr>
+              <w:cnfStyle w:val="000000100000" w:firstRow="0" w:lastRow="0" w:firstColumn="0" w:lastColumn="0" w:oddVBand="0" w:evenVBand="0" w:oddHBand="1" w:evenHBand="0" w:firstRowFirstColumn="0" w:firstRowLastColumn="0" w:lastRowFirstColumn="0" w:lastRowLastColumn="0"/>
+              <w:rPr>
+                <w:rFonts w:asciiTheme="majorHAnsi" w:eastAsia="Times New Roman" w:hAnsiTheme="majorHAnsi" w:cs="Times New Roman"/>
+                <w:sz w:val="24"/>
+                <w:szCs w:val="24"/>
+                <w:lang w:eastAsia="ru-RU"/>
+              </w:rPr>
+            </w:pPr>
+            <w:r>
+              <w:rPr>
+                <w:rFonts w:asciiTheme="majorHAnsi" w:eastAsia="Times New Roman" w:hAnsiTheme="majorHAnsi" w:cs="Times New Roman"/>
+                <w:sz w:val="24"/>
+                <w:szCs w:val="24"/>
+                <w:lang w:eastAsia="ru-RU"/>
+              </w:rPr>
+              <w:t>443</w:t>
+            </w:r>
+          </w:p>
+        </w:tc>
+        <w:tc>
+          <w:tcPr>
+            <w:tcW w:w="0" w:type="auto"/>
+            <w:hideMark/>
+          </w:tcPr>
+          <w:p>
+            <w:pPr>
+              <w:cnfStyle w:val="000000100000" w:firstRow="0" w:lastRow="0" w:firstColumn="0" w:lastColumn="0" w:oddVBand="0" w:evenVBand="0" w:oddHBand="1" w:evenHBand="0" w:firstRowFirstColumn="0" w:firstRowLastColumn="0" w:lastRowFirstColumn="0" w:lastRowLastColumn="0"/>
+              <w:rPr>
+                <w:rFonts w:asciiTheme="majorHAnsi" w:eastAsia="Times New Roman" w:hAnsiTheme="majorHAnsi" w:cs="Times New Roman"/>
+                <w:sz w:val="24"/>
+                <w:szCs w:val="24"/>
+                <w:lang w:eastAsia="ru-RU"/>
+              </w:rPr>
+            </w:pPr>
+            <w:r>
+              <w:rPr>
+                <w:rFonts w:asciiTheme="majorHAnsi" w:eastAsia="Times New Roman" w:hAnsiTheme="majorHAnsi" w:cs="Times New Roman"/>
+                <w:sz w:val="24"/>
+                <w:szCs w:val="24"/>
+                <w:lang w:eastAsia="ru-RU"/>
+              </w:rPr>
+              <w:t>HTTPS</w:t>
+            </w:r>
+          </w:p>
+        </w:tc>
+        <w:tc>
+          <w:tcPr>
+            <w:tcW w:w="0" w:type="auto"/>
+            <w:hideMark/>
+          </w:tcPr>
+          <w:p>
+            <w:pPr>
+              <w:cnfStyle w:val="000000100000" w:firstRow="0" w:lastRow="0" w:firstColumn="0" w:lastColumn="0" w:oddVBand="0" w:evenVBand="0" w:oddHBand="1" w:evenHBand="0" w:firstRowFirstColumn="0" w:firstRowLastColumn="0" w:lastRowFirstColumn="0" w:lastRowLastColumn="0"/>
+              <w:rPr>
+                <w:rFonts w:asciiTheme="majorHAnsi" w:eastAsia="Times New Roman" w:hAnsiTheme="majorHAnsi" w:cs="Times New Roman"/>
+                <w:sz w:val="24"/>
+                <w:szCs w:val="24"/>
+                <w:lang w:eastAsia="ru-RU"/>
+              </w:rPr>
+            </w:pPr>
+            <w:r>
+              <w:rPr>
+                <w:rFonts w:asciiTheme="majorHAnsi" w:eastAsia="Times New Roman" w:hAnsiTheme="majorHAnsi" w:cs="Times New Roman"/>
+                <w:sz w:val="24"/>
+                <w:szCs w:val="24"/>
+                <w:lang w:eastAsia="ru-RU"/>
+              </w:rPr>
+              <w:t>ASXXXXX</w:t>
+            </w:r>
+          </w:p>
+        </w:tc>
+        <w:tc>
+          <w:tcPr>
+            <w:tcW w:w="0" w:type="auto"/>
+            <w:hideMark/>
+          </w:tcPr>
+          <w:p>
+            <w:pPr>
+              <w:cnfStyle w:val="000000100000" w:firstRow="0" w:lastRow="0" w:firstColumn="0" w:lastColumn="0" w:oddVBand="0" w:evenVBand="0" w:oddHBand="1" w:evenHBand="0" w:firstRowFirstColumn="0" w:firstRowLastColumn="0" w:lastRowFirstColumn="0" w:lastRowLastColumn="0"/>
+              <w:rPr>
+                <w:rFonts w:asciiTheme="majorHAnsi" w:eastAsia="Times New Roman" w:hAnsiTheme="majorHAnsi" w:cs="Times New Roman"/>
+                <w:sz w:val="24"/>
+                <w:szCs w:val="24"/>
+                <w:lang w:eastAsia="ru-RU"/>
+              </w:rPr>
+            </w:pPr>
+            <w:proofErr w:type="spellStart"/>
+            <w:r>
+              <w:rPr>
+                <w:rFonts w:asciiTheme="majorHAnsi" w:eastAsia="Times New Roman" w:hAnsiTheme="majorHAnsi" w:cs="Times New Roman"/>
+                <w:sz w:val="24"/>
+                <w:szCs w:val="24"/>
+                <w:lang w:eastAsia="ru-RU"/>
+              </w:rPr>
+              <w:t>Example</w:t>
+            </w:r>
+            <w:proofErr w:type="spellEnd"/>
+            <w:r>
+              <w:rPr>
+                <w:rFonts w:asciiTheme="majorHAnsi" w:eastAsia="Times New Roman" w:hAnsiTheme="majorHAnsi" w:cs="Times New Roman"/>
+                <w:sz w:val="24"/>
+                <w:szCs w:val="24"/>
+                <w:lang w:eastAsia="ru-RU"/>
+              </w:rPr>
+              <w:t xml:space="preserve"> ISP</w:t>
+            </w:r>
+          </w:p>
+        </w:tc>
+        <w:tc>
+          <w:tcPr>
+            <w:tcW w:w="0" w:type="auto"/>
+            <w:hideMark/>
+          </w:tcPr>
+          <w:p>
+            <w:pPr>
+              <w:cnfStyle w:val="000000100000" w:firstRow="0" w:lastRow="0" w:firstColumn="0" w:lastColumn="0" w:oddVBand="0" w:evenVBand="0" w:oddHBand="1" w:evenHBand="0" w:firstRowFirstColumn="0" w:firstRowLastColumn="0" w:lastRowFirstColumn="0" w:lastRowLastColumn="0"/>
+              <w:rPr>
+                <w:rFonts w:asciiTheme="majorHAnsi" w:eastAsia="Times New Roman" w:hAnsiTheme="majorHAnsi" w:cs="Times New Roman"/>
+                <w:sz w:val="24"/>
+                <w:szCs w:val="24"/>
+                <w:lang w:eastAsia="ru-RU"/>
+              </w:rPr>
+            </w:pPr>
+            <w:proofErr w:type="spellStart"/>
+            <w:r>
+              <w:rPr>
+                <w:rFonts w:asciiTheme="majorHAnsi" w:eastAsia="Times New Roman" w:hAnsiTheme="majorHAnsi" w:cs="Times New Roman"/>
+                <w:sz w:val="24"/>
+                <w:szCs w:val="24"/>
+                <w:lang w:eastAsia="ru-RU"/>
+              </w:rPr>
+              <w:t>Shodan</w:t>
+            </w:r>
+            <w:proofErr w:type="spellEnd"/>
+          </w:p>
+        </w:tc>
+      </w:tr>
+      <w:tr>
+        <w:tc>
+          <w:tcPr>
+            <w:cnfStyle w:val="001000000000" w:firstRow="0" w:lastRow="0" w:firstColumn="1" w:lastColumn="0" w:oddVBand="0" w:evenVBand="0" w:oddHBand="0" w:evenHBand="0" w:firstRowFirstColumn="0" w:firstRowLastColumn="0" w:lastRowFirstColumn="0" w:lastRowLastColumn="0"/>
+            <w:tcW w:w="0" w:type="auto"/>
+            <w:hideMark/>
+          </w:tcPr>
+          <w:p>
+            <w:pPr>
+              <w:rPr>
+                <w:rFonts w:asciiTheme="majorHAnsi" w:eastAsia="Times New Roman" w:hAnsiTheme="majorHAnsi" w:cs="Times New Roman"/>
+                <w:sz w:val="24"/>
+                <w:szCs w:val="24"/>
+                <w:lang w:eastAsia="ru-RU"/>
+              </w:rPr>
+            </w:pPr>
+            <w:proofErr w:type="spellStart"/>
+            <w:r>
+              <w:rPr>
+                <w:rFonts w:asciiTheme="majorHAnsi" w:eastAsia="Times New Roman" w:hAnsiTheme="majorHAnsi" w:cs="Courier New"/>
+                <w:sz w:val="20"/>
+                <w:szCs w:val="20"/>
+                <w:lang w:eastAsia="ru-RU"/>
+              </w:rPr>
+              <w:t>Example</w:t>
+            </w:r>
+            <w:proofErr w:type="spellEnd"/>
+            <w:r>
+              <w:rPr>
+                <w:rFonts w:asciiTheme="majorHAnsi" w:eastAsia="Times New Roman" w:hAnsiTheme="majorHAnsi" w:cs="Courier New"/>
+                <w:sz w:val="20"/>
+                <w:szCs w:val="20"/>
+                <w:lang w:eastAsia="ru-RU"/>
+              </w:rPr>
+              <w:t xml:space="preserve"> IP</w:t>
+            </w:r>
+          </w:p>
+        </w:tc>
+        <w:tc>
+          <w:tcPr>
+            <w:tcW w:w="0" w:type="auto"/>
+            <w:hideMark/>
+          </w:tcPr>
+          <w:p>
+            <w:pPr>
+              <w:cnfStyle w:val="000000000000" w:firstRow="0" w:lastRow="0" w:firstColumn="0" w:lastColumn="0" w:oddVBand="0" w:evenVBand="0" w:oddHBand="0" w:evenHBand="0" w:firstRowFirstColumn="0" w:firstRowLastColumn="0" w:lastRowFirstColumn="0" w:lastRowLastColumn="0"/>
+              <w:rPr>
+                <w:rFonts w:asciiTheme="majorHAnsi" w:eastAsia="Times New Roman" w:hAnsiTheme="majorHAnsi" w:cs="Times New Roman"/>
+                <w:sz w:val="24"/>
+                <w:szCs w:val="24"/>
+                <w:lang w:eastAsia="ru-RU"/>
+              </w:rPr>
+            </w:pPr>
+            <w:r>
+              <w:rPr>
+                <w:rFonts w:asciiTheme="majorHAnsi" w:eastAsia="Times New Roman" w:hAnsiTheme="majorHAnsi" w:cs="Times New Roman"/>
+                <w:sz w:val="24"/>
+                <w:szCs w:val="24"/>
+                <w:lang w:eastAsia="ru-RU"/>
+              </w:rPr>
+              <w:t>80</w:t>
+            </w:r>
+          </w:p>
+        </w:tc>
+        <w:tc>
+          <w:tcPr>
+            <w:tcW w:w="0" w:type="auto"/>
+            <w:hideMark/>
+          </w:tcPr>
+          <w:p>
+            <w:pPr>
+              <w:cnfStyle w:val="000000000000" w:firstRow="0" w:lastRow="0" w:firstColumn="0" w:lastColumn="0" w:oddVBand="0" w:evenVBand="0" w:oddHBand="0" w:evenHBand="0" w:firstRowFirstColumn="0" w:firstRowLastColumn="0" w:lastRowFirstColumn="0" w:lastRowLastColumn="0"/>
+              <w:rPr>
+                <w:rFonts w:asciiTheme="majorHAnsi" w:eastAsia="Times New Roman" w:hAnsiTheme="majorHAnsi" w:cs="Times New Roman"/>
+                <w:sz w:val="24"/>
+                <w:szCs w:val="24"/>
+                <w:lang w:eastAsia="ru-RU"/>
+              </w:rPr>
+            </w:pPr>
+            <w:r>
+              <w:rPr>
+                <w:rFonts w:asciiTheme="majorHAnsi" w:eastAsia="Times New Roman" w:hAnsiTheme="majorHAnsi" w:cs="Times New Roman"/>
+                <w:sz w:val="24"/>
+                <w:szCs w:val="24"/>
+                <w:lang w:eastAsia="ru-RU"/>
+              </w:rPr>
+              <w:t>HTTP</w:t>
+            </w:r>
+          </w:p>
+        </w:tc>
+        <w:tc>
+          <w:tcPr>
+            <w:tcW w:w="0" w:type="auto"/>
+            <w:hideMark/>
+          </w:tcPr>
+          <w:p>
+            <w:pPr>
+              <w:cnfStyle w:val="000000000000" w:firstRow="0" w:lastRow="0" w:firstColumn="0" w:lastColumn="0" w:oddVBand="0" w:evenVBand="0" w:oddHBand="0" w:evenHBand="0" w:firstRowFirstColumn="0" w:firstRowLastColumn="0" w:lastRowFirstColumn="0" w:lastRowLastColumn="0"/>
+              <w:rPr>
+                <w:rFonts w:asciiTheme="majorHAnsi" w:eastAsia="Times New Roman" w:hAnsiTheme="majorHAnsi" w:cs="Times New Roman"/>
+                <w:sz w:val="24"/>
+                <w:szCs w:val="24"/>
+                <w:lang w:eastAsia="ru-RU"/>
+              </w:rPr>
+            </w:pPr>
+            <w:r>
+              <w:rPr>
+                <w:rFonts w:asciiTheme="majorHAnsi" w:eastAsia="Times New Roman" w:hAnsiTheme="majorHAnsi" w:cs="Times New Roman"/>
+                <w:sz w:val="24"/>
+                <w:szCs w:val="24"/>
+                <w:lang w:eastAsia="ru-RU"/>
+              </w:rPr>
+              <w:t>ASXXXXX</w:t>
+            </w:r>
+          </w:p>
+        </w:tc>
+        <w:tc>
+          <w:tcPr>
+            <w:tcW w:w="0" w:type="auto"/>
+            <w:hideMark/>
+          </w:tcPr>
+          <w:p>
+            <w:pPr>
+              <w:cnfStyle w:val="000000000000" w:firstRow="0" w:lastRow="0" w:firstColumn="0" w:lastColumn="0" w:oddVBand="0" w:evenVBand="0" w:oddHBand="0" w:evenHBand="0" w:firstRowFirstColumn="0" w:firstRowLastColumn="0" w:lastRowFirstColumn="0" w:lastRowLastColumn="0"/>
+              <w:rPr>
+                <w:rFonts w:asciiTheme="majorHAnsi" w:eastAsia="Times New Roman" w:hAnsiTheme="majorHAnsi" w:cs="Times New Roman"/>
+                <w:sz w:val="24"/>
+                <w:szCs w:val="24"/>
+                <w:lang w:eastAsia="ru-RU"/>
+              </w:rPr>
+            </w:pPr>
+            <w:proofErr w:type="spellStart"/>
+            <w:r>
+              <w:rPr>
+                <w:rFonts w:asciiTheme="majorHAnsi" w:eastAsia="Times New Roman" w:hAnsiTheme="majorHAnsi" w:cs="Times New Roman"/>
+                <w:sz w:val="24"/>
+                <w:szCs w:val="24"/>
+                <w:lang w:eastAsia="ru-RU"/>
+              </w:rPr>
+              <w:t>Example</w:t>
+            </w:r>
+            <w:proofErr w:type="spellEnd"/>
+            <w:r>
+              <w:rPr>
+                <w:rFonts w:asciiTheme="majorHAnsi" w:eastAsia="Times New Roman" w:hAnsiTheme="majorHAnsi" w:cs="Times New Roman"/>
+                <w:sz w:val="24"/>
+                <w:szCs w:val="24"/>
+                <w:lang w:eastAsia="ru-RU"/>
+              </w:rPr>
+              <w:t xml:space="preserve"> ISP</w:t>
+            </w:r>
+          </w:p>
+        </w:tc>
+        <w:tc>
+          <w:tcPr>
+            <w:tcW w:w="0" w:type="auto"/>
+            <w:hideMark/>
+          </w:tcPr>
+          <w:p>
+            <w:pPr>
+              <w:cnfStyle w:val="000000000000" w:firstRow="0" w:lastRow="0" w:firstColumn="0" w:lastColumn="0" w:oddVBand="0" w:evenVBand="0" w:oddHBand="0" w:evenHBand="0" w:firstRowFirstColumn="0" w:firstRowLastColumn="0" w:lastRowFirstColumn="0" w:lastRowLastColumn="0"/>
+              <w:rPr>
+                <w:rFonts w:asciiTheme="majorHAnsi" w:eastAsia="Times New Roman" w:hAnsiTheme="majorHAnsi" w:cs="Times New Roman"/>
+                <w:sz w:val="24"/>
+                <w:szCs w:val="24"/>
+                <w:lang w:eastAsia="ru-RU"/>
+              </w:rPr>
+            </w:pPr>
+            <w:proofErr w:type="spellStart"/>
+            <w:r>
+              <w:rPr>
+                <w:rFonts w:asciiTheme="majorHAnsi" w:eastAsia="Times New Roman" w:hAnsiTheme="majorHAnsi" w:cs="Times New Roman"/>
+                <w:sz w:val="24"/>
+                <w:szCs w:val="24"/>
+                <w:lang w:eastAsia="ru-RU"/>
+              </w:rPr>
+              <w:t>Shodan</w:t>
+            </w:r>
+            <w:proofErr w:type="spellEnd"/>
+          </w:p>
+        </w:tc>
+      </w:tr>
+    </w:tbl>
+    <w:p>
+      <w:pPr>
+        <w:spacing w:before="100" w:beforeAutospacing="1" w:after="100" w:afterAutospacing="1" w:line="240" w:lineRule="auto"/>
+        <w:rPr>
+          <w:rFonts w:asciiTheme="majorHAnsi" w:eastAsia="Times New Roman" w:hAnsiTheme="majorHAnsi" w:cs="Times New Roman"/>
+          <w:sz w:val="24"/>
+          <w:szCs w:val="24"/>
+          <w:lang w:val="en-US" w:eastAsia="ru-RU"/>
+        </w:rPr>
+      </w:pPr>
+      <w:r>
+        <w:rPr>
+          <w:rFonts w:asciiTheme="majorHAnsi" w:eastAsia="Times New Roman" w:hAnsiTheme="majorHAnsi" w:cs="Times New Roman"/>
+          <w:sz w:val="24"/>
+          <w:szCs w:val="24"/>
+          <w:lang w:val="en-US" w:eastAsia="ru-RU"/>
+        </w:rPr>
+        <w:t xml:space="preserve">For the actual report, replace </w:t>
+      </w:r>
+      <w:r>
+        <w:rPr>
+          <w:rFonts w:asciiTheme="majorHAnsi" w:eastAsia="Times New Roman" w:hAnsiTheme="majorHAnsi" w:cs="Courier New"/>
+          <w:sz w:val="20"/>
+          <w:szCs w:val="20"/>
+          <w:lang w:val="en-US" w:eastAsia="ru-RU"/>
+        </w:rPr>
+        <w:t>Example IP</w:t>
+      </w:r>
+      <w:r>
+        <w:rPr>
+          <w:rFonts w:asciiTheme="majorHAnsi" w:eastAsia="Times New Roman" w:hAnsiTheme="majorHAnsi" w:cs="Times New Roman"/>
+          <w:sz w:val="24"/>
+          <w:szCs w:val="24"/>
+          <w:lang w:val="en-US" w:eastAsia="ru-RU"/>
+        </w:rPr>
+        <w:t xml:space="preserve"> with </w:t>
+      </w:r>
+      <w:r>
+        <w:rPr>
+          <w:rFonts w:asciiTheme="majorHAnsi" w:eastAsia="Times New Roman" w:hAnsiTheme="majorHAnsi" w:cs="Times New Roman"/>
+          <w:b/>
+          <w:bCs/>
+          <w:sz w:val="24"/>
+          <w:szCs w:val="24"/>
+          <w:lang w:val="en-US" w:eastAsia="ru-RU"/>
+        </w:rPr>
+        <w:t>real, documented indicators from a public threat-intelligence source</w:t>
+      </w:r>
+      <w:r>
+        <w:rPr>
+          <w:rFonts w:asciiTheme="majorHAnsi" w:eastAsia="Times New Roman" w:hAnsiTheme="majorHAnsi" w:cs="Times New Roman"/>
+          <w:sz w:val="24"/>
+          <w:szCs w:val="24"/>
+          <w:lang w:val="en-US" w:eastAsia="ru-RU"/>
+        </w:rPr>
+        <w:t>, rather than randomly labeling an IP as malicious.</w:t>
+      </w:r>
+    </w:p>
+    <w:p>
+      <w:pPr>
+        <w:spacing w:before="100" w:beforeAutospacing="1" w:after="100" w:afterAutospacing="1" w:line="240" w:lineRule="auto"/>
+        <w:jc w:val="center"/>
+        <w:outlineLvl w:val="0"/>
+        <w:rPr>
+          <w:rFonts w:asciiTheme="majorHAnsi" w:eastAsia="Times New Roman" w:hAnsiTheme="majorHAnsi" w:cs="Times New Roman"/>
+          <w:b/>
+          <w:bCs/>
+          <w:kern w:val="36"/>
+          <w:sz w:val="48"/>
+          <w:szCs w:val="48"/>
+          <w:lang w:val="en-US" w:eastAsia="ru-RU"/>
+        </w:rPr>
+      </w:pPr>
+      <w:r>
+        <w:rPr>
+          <w:rFonts w:asciiTheme="majorHAnsi" w:eastAsia="Times New Roman" w:hAnsiTheme="majorHAnsi" w:cs="Times New Roman"/>
+          <w:b/>
+          <w:bCs/>
+          <w:kern w:val="36"/>
+          <w:sz w:val="48"/>
+          <w:szCs w:val="48"/>
+          <w:lang w:val="en-US" w:eastAsia="ru-RU"/>
+        </w:rPr>
+        <w:t xml:space="preserve">2.5. </w:t>
+      </w:r>
+      <w:proofErr w:type="spellStart"/>
+      <w:r>
+        <w:rPr>
+          <w:rFonts w:asciiTheme="majorHAnsi" w:eastAsia="Times New Roman" w:hAnsiTheme="majorHAnsi" w:cs="Times New Roman"/>
+          <w:b/>
+          <w:bCs/>
+          <w:kern w:val="36"/>
+          <w:sz w:val="48"/>
+          <w:szCs w:val="48"/>
+          <w:lang w:val="en-US" w:eastAsia="ru-RU"/>
+        </w:rPr>
+        <w:t>VirusTotal</w:t>
+      </w:r>
+      <w:proofErr w:type="spellEnd"/>
+      <w:r>
+        <w:rPr>
+          <w:rFonts w:asciiTheme="majorHAnsi" w:eastAsia="Times New Roman" w:hAnsiTheme="majorHAnsi" w:cs="Times New Roman"/>
+          <w:b/>
+          <w:bCs/>
+          <w:kern w:val="36"/>
+          <w:sz w:val="48"/>
+          <w:szCs w:val="48"/>
+          <w:lang w:val="en-US" w:eastAsia="ru-RU"/>
+        </w:rPr>
+        <w:t xml:space="preserve"> Enrichment</w:t>
+      </w:r>
+    </w:p>
+    <w:p>
+      <w:pPr>
+        <w:spacing w:before="100" w:beforeAutospacing="1" w:after="100" w:afterAutospacing="1" w:line="240" w:lineRule="auto"/>
+        <w:rPr>
+          <w:rFonts w:asciiTheme="majorHAnsi" w:eastAsia="Times New Roman" w:hAnsiTheme="majorHAnsi" w:cs="Times New Roman"/>
+          <w:sz w:val="24"/>
+          <w:szCs w:val="24"/>
+          <w:lang w:val="en-US" w:eastAsia="ru-RU"/>
+        </w:rPr>
+      </w:pPr>
+      <w:r>
+        <w:rPr>
+          <w:rFonts w:asciiTheme="majorHAnsi" w:eastAsia="Times New Roman" w:hAnsiTheme="majorHAnsi" w:cs="Times New Roman"/>
+          <w:sz w:val="24"/>
+          <w:szCs w:val="24"/>
+          <w:lang w:val="en-US" w:eastAsia="ru-RU"/>
+        </w:rPr>
+        <w:t xml:space="preserve">The discovered IP addresses can then be checked in </w:t>
+      </w:r>
+      <w:proofErr w:type="spellStart"/>
+      <w:r>
+        <w:rPr>
+          <w:rFonts w:asciiTheme="majorHAnsi" w:eastAsia="Times New Roman" w:hAnsiTheme="majorHAnsi" w:cs="Times New Roman"/>
+          <w:sz w:val="24"/>
+          <w:szCs w:val="24"/>
+          <w:lang w:val="en-US" w:eastAsia="ru-RU"/>
+        </w:rPr>
+        <w:t>VirusTotal</w:t>
+      </w:r>
+      <w:proofErr w:type="spellEnd"/>
+      <w:r>
+        <w:rPr>
+          <w:rFonts w:asciiTheme="majorHAnsi" w:eastAsia="Times New Roman" w:hAnsiTheme="majorHAnsi" w:cs="Times New Roman"/>
+          <w:sz w:val="24"/>
+          <w:szCs w:val="24"/>
+          <w:lang w:val="en-US" w:eastAsia="ru-RU"/>
+        </w:rPr>
+        <w:t>.</w:t>
+      </w:r>
+    </w:p>
+    <w:p>
+      <w:pPr>
+        <w:spacing w:before="100" w:beforeAutospacing="1" w:after="100" w:afterAutospacing="1" w:line="240" w:lineRule="auto"/>
+        <w:rPr>
+          <w:rFonts w:asciiTheme="majorHAnsi" w:eastAsia="Times New Roman" w:hAnsiTheme="majorHAnsi" w:cs="Times New Roman"/>
+          <w:sz w:val="24"/>
+          <w:szCs w:val="24"/>
+          <w:lang w:val="en-US" w:eastAsia="ru-RU"/>
+        </w:rPr>
+      </w:pPr>
+      <w:r>
+        <w:rPr>
+          <w:rFonts w:asciiTheme="majorHAnsi" w:eastAsia="Times New Roman" w:hAnsiTheme="majorHAnsi" w:cs="Times New Roman"/>
+          <w:sz w:val="24"/>
+          <w:szCs w:val="24"/>
+          <w:lang w:val="en-US" w:eastAsia="ru-RU"/>
+        </w:rPr>
+        <w:t>Example:</w:t>
+      </w:r>
+    </w:p>
+    <w:p>
+      <w:pPr>
+        <w:spacing w:before="100" w:beforeAutospacing="1" w:after="100" w:afterAutospacing="1" w:line="240" w:lineRule="auto"/>
+        <w:rPr>
+          <w:rFonts w:asciiTheme="majorHAnsi" w:eastAsia="Times New Roman" w:hAnsiTheme="majorHAnsi" w:cs="Times New Roman"/>
+          <w:sz w:val="24"/>
+          <w:szCs w:val="24"/>
+          <w:lang w:val="en-US" w:eastAsia="ru-RU"/>
+        </w:rPr>
+      </w:pPr>
+      <w:r>
+        <w:rPr>
+          <w:rFonts w:asciiTheme="majorHAnsi" w:eastAsia="Times New Roman" w:hAnsiTheme="majorHAnsi" w:cs="Courier New"/>
+          <w:sz w:val="20"/>
+          <w:szCs w:val="20"/>
+          <w:lang w:val="en-US" w:eastAsia="ru-RU"/>
+        </w:rPr>
+        <w:drawing>
+          <wp:inline distT="0" distB="0" distL="0" distR="0" wp14:anchorId="0B95DFBE" wp14:editId="0FB5253D">
+            <wp:extent cx="3108960" cy="2362200"/>
+            <wp:effectExtent l="0" t="0" r="0" b="0"/>
+            <wp:docPr id="4" name="Рисунок 4"/>
+            <wp:cNvGraphicFramePr>
+              <a:graphicFrameLocks xmlns:a="http://schemas.openxmlformats.org/drawingml/2006/main" noChangeAspect="1"/>
+            </wp:cNvGraphicFramePr>
+            <a:graphic xmlns:a="http://schemas.openxmlformats.org/drawingml/2006/main">
+              <a:graphicData uri="http://schemas.openxmlformats.org/drawingml/2006/picture">
+                <pic:pic xmlns:pic="http://schemas.openxmlformats.org/drawingml/2006/picture">
+                  <pic:nvPicPr>
+                    <pic:cNvPr id="0" name=""/>
+                    <pic:cNvPicPr/>
+                  </pic:nvPicPr>
+                  <pic:blipFill>
+                    <a:blip r:embed="rId9"/>
+                    <a:stretch>
+                      <a:fillRect/>
+                    </a:stretch>
+                  </pic:blipFill>
+                  <pic:spPr>
+                    <a:xfrm>
+                      <a:off x="0" y="0"/>
+                      <a:ext cx="3108960" cy="2362200"/>
+                    </a:xfrm>
+                    <a:prstGeom prst="rect">
+                      <a:avLst/>
+                    </a:prstGeom>
+                  </pic:spPr>
+                </pic:pic>
+              </a:graphicData>
+            </a:graphic>
+          </wp:inline>
+        </w:drawing>
+      </w:r>
+    </w:p>
+    <w:p>
+      <w:pPr>
+        <w:spacing w:before="100" w:beforeAutospacing="1" w:after="100" w:afterAutospacing="1" w:line="240" w:lineRule="auto"/>
+        <w:rPr>
+          <w:rFonts w:asciiTheme="majorHAnsi" w:eastAsia="Times New Roman" w:hAnsiTheme="majorHAnsi" w:cs="Times New Roman"/>
+          <w:sz w:val="24"/>
+          <w:szCs w:val="24"/>
+          <w:lang w:val="en-US" w:eastAsia="ru-RU"/>
+        </w:rPr>
+      </w:pPr>
+      <w:r>
+        <w:rPr>
+          <w:rFonts w:asciiTheme="majorHAnsi" w:eastAsia="Times New Roman" w:hAnsiTheme="majorHAnsi" w:cs="Times New Roman"/>
+          <w:sz w:val="24"/>
+          <w:szCs w:val="24"/>
+          <w:lang w:val="en-US" w:eastAsia="ru-RU"/>
+        </w:rPr>
+        <w:t>The resulting table could look like:</w:t>
+      </w:r>
+    </w:p>
+    <w:tbl>
+      <w:tblPr>
+        <w:tblStyle w:val="a6"/>
+        <w:tblW w:w="0" w:type="auto"/>
+        <w:tblLook w:val="04A0" w:firstRow="1" w:lastRow="0" w:firstColumn="1" w:lastColumn="0" w:noHBand="0" w:noVBand="1"/>
+      </w:tblPr>
+      <w:tblGrid>
+        <w:gridCol w:w="1240"/>
+        <w:gridCol w:w="768"/>
+        <w:gridCol w:w="2746"/>
+        <w:gridCol w:w="1171"/>
+        <w:gridCol w:w="2069"/>
+        <w:gridCol w:w="1296"/>
+      </w:tblGrid>
+      <w:tr>
+        <w:trPr>
+          <w:cnfStyle w:val="100000000000" w:firstRow="1" w:lastRow="0" w:firstColumn="0" w:lastColumn="0" w:oddVBand="0" w:evenVBand="0" w:oddHBand="0" w:evenHBand="0" w:firstRowFirstColumn="0" w:firstRowLastColumn="0" w:lastRowFirstColumn="0" w:lastRowLastColumn="0"/>
+        </w:trPr>
+        <w:tc>
+          <w:tcPr>
+            <w:cnfStyle w:val="001000000000" w:firstRow="0" w:lastRow="0" w:firstColumn="1" w:lastColumn="0" w:oddVBand="0" w:evenVBand="0" w:oddHBand="0" w:evenHBand="0" w:firstRowFirstColumn="0" w:firstRowLastColumn="0" w:lastRowFirstColumn="0" w:lastRowLastColumn="0"/>
+            <w:tcW w:w="0" w:type="auto"/>
+            <w:hideMark/>
+          </w:tcPr>
+          <w:p>
+            <w:pPr>
+              <w:jc w:val="center"/>
+              <w:rPr>
+                <w:rFonts w:asciiTheme="majorHAnsi" w:eastAsia="Times New Roman" w:hAnsiTheme="majorHAnsi" w:cs="Times New Roman"/>
+                <w:sz w:val="24"/>
+                <w:szCs w:val="24"/>
+                <w:lang w:eastAsia="ru-RU"/>
+              </w:rPr>
+            </w:pPr>
+            <w:proofErr w:type="spellStart"/>
+            <w:r>
+              <w:rPr>
+                <w:rFonts w:asciiTheme="majorHAnsi" w:eastAsia="Times New Roman" w:hAnsiTheme="majorHAnsi" w:cs="Times New Roman"/>
+                <w:sz w:val="24"/>
+                <w:szCs w:val="24"/>
+                <w:lang w:eastAsia="ru-RU"/>
+              </w:rPr>
+              <w:t>Indicator</w:t>
+            </w:r>
+            <w:proofErr w:type="spellEnd"/>
+          </w:p>
+        </w:tc>
+        <w:tc>
+          <w:tcPr>
+            <w:tcW w:w="0" w:type="auto"/>
+            <w:hideMark/>
+          </w:tcPr>
+          <w:p>
+            <w:pPr>
+              <w:jc w:val="center"/>
+              <w:cnfStyle w:val="100000000000" w:firstRow="1" w:lastRow="0" w:firstColumn="0" w:lastColumn="0" w:oddVBand="0" w:evenVBand="0" w:oddHBand="0" w:evenHBand="0" w:firstRowFirstColumn="0" w:firstRowLastColumn="0" w:lastRowFirstColumn="0" w:lastRowLastColumn="0"/>
+              <w:rPr>
+                <w:rFonts w:asciiTheme="majorHAnsi" w:eastAsia="Times New Roman" w:hAnsiTheme="majorHAnsi" w:cs="Times New Roman"/>
+                <w:sz w:val="24"/>
+                <w:szCs w:val="24"/>
+                <w:lang w:eastAsia="ru-RU"/>
+              </w:rPr>
+            </w:pPr>
+            <w:proofErr w:type="spellStart"/>
+            <w:r>
+              <w:rPr>
+                <w:rFonts w:asciiTheme="majorHAnsi" w:eastAsia="Times New Roman" w:hAnsiTheme="majorHAnsi" w:cs="Times New Roman"/>
+                <w:sz w:val="24"/>
+                <w:szCs w:val="24"/>
+                <w:lang w:eastAsia="ru-RU"/>
+              </w:rPr>
+              <w:t>Type</w:t>
+            </w:r>
+            <w:proofErr w:type="spellEnd"/>
+          </w:p>
+        </w:tc>
+        <w:tc>
+          <w:tcPr>
+            <w:tcW w:w="0" w:type="auto"/>
+            <w:hideMark/>
+          </w:tcPr>
+          <w:p>
+            <w:pPr>
+              <w:jc w:val="center"/>
+              <w:cnfStyle w:val="100000000000" w:firstRow="1" w:lastRow="0" w:firstColumn="0" w:lastColumn="0" w:oddVBand="0" w:evenVBand="0" w:oddHBand="0" w:evenHBand="0" w:firstRowFirstColumn="0" w:firstRowLastColumn="0" w:lastRowFirstColumn="0" w:lastRowLastColumn="0"/>
+              <w:rPr>
+                <w:rFonts w:asciiTheme="majorHAnsi" w:eastAsia="Times New Roman" w:hAnsiTheme="majorHAnsi" w:cs="Times New Roman"/>
+                <w:sz w:val="24"/>
+                <w:szCs w:val="24"/>
+                <w:lang w:eastAsia="ru-RU"/>
+              </w:rPr>
+            </w:pPr>
+            <w:r>
+              <w:rPr>
+                <w:rFonts w:asciiTheme="majorHAnsi" w:eastAsia="Times New Roman" w:hAnsiTheme="majorHAnsi" w:cs="Times New Roman"/>
+                <w:sz w:val="24"/>
+                <w:szCs w:val="24"/>
+                <w:lang w:eastAsia="ru-RU"/>
+              </w:rPr>
+              <w:t xml:space="preserve">VT </w:t>
+            </w:r>
+            <w:proofErr w:type="spellStart"/>
+            <w:r>
+              <w:rPr>
+                <w:rFonts w:asciiTheme="majorHAnsi" w:eastAsia="Times New Roman" w:hAnsiTheme="majorHAnsi" w:cs="Times New Roman"/>
+                <w:sz w:val="24"/>
+                <w:szCs w:val="24"/>
+                <w:lang w:eastAsia="ru-RU"/>
+              </w:rPr>
+              <w:t>information</w:t>
+            </w:r>
+            <w:proofErr w:type="spellEnd"/>
+          </w:p>
+        </w:tc>
+        <w:tc>
+          <w:tcPr>
+            <w:tcW w:w="0" w:type="auto"/>
+            <w:hideMark/>
+          </w:tcPr>
+          <w:p>
+            <w:pPr>
+              <w:jc w:val="center"/>
+              <w:cnfStyle w:val="100000000000" w:firstRow="1" w:lastRow="0" w:firstColumn="0" w:lastColumn="0" w:oddVBand="0" w:evenVBand="0" w:oddHBand="0" w:evenHBand="0" w:firstRowFirstColumn="0" w:firstRowLastColumn="0" w:lastRowFirstColumn="0" w:lastRowLastColumn="0"/>
+              <w:rPr>
+                <w:rFonts w:asciiTheme="majorHAnsi" w:eastAsia="Times New Roman" w:hAnsiTheme="majorHAnsi" w:cs="Times New Roman"/>
+                <w:sz w:val="24"/>
+                <w:szCs w:val="24"/>
+                <w:lang w:eastAsia="ru-RU"/>
+              </w:rPr>
+            </w:pPr>
+            <w:r>
+              <w:rPr>
+                <w:rFonts w:asciiTheme="majorHAnsi" w:eastAsia="Times New Roman" w:hAnsiTheme="majorHAnsi" w:cs="Times New Roman"/>
+                <w:sz w:val="24"/>
+                <w:szCs w:val="24"/>
+                <w:lang w:eastAsia="ru-RU"/>
+              </w:rPr>
+              <w:t>ASN</w:t>
+            </w:r>
+          </w:p>
+        </w:tc>
+        <w:tc>
+          <w:tcPr>
+            <w:tcW w:w="0" w:type="auto"/>
+            <w:hideMark/>
+          </w:tcPr>
+          <w:p>
+            <w:pPr>
+              <w:jc w:val="center"/>
+              <w:cnfStyle w:val="100000000000" w:firstRow="1" w:lastRow="0" w:firstColumn="0" w:lastColumn="0" w:oddVBand="0" w:evenVBand="0" w:oddHBand="0" w:evenHBand="0" w:firstRowFirstColumn="0" w:firstRowLastColumn="0" w:lastRowFirstColumn="0" w:lastRowLastColumn="0"/>
+              <w:rPr>
+                <w:rFonts w:asciiTheme="majorHAnsi" w:eastAsia="Times New Roman" w:hAnsiTheme="majorHAnsi" w:cs="Times New Roman"/>
+                <w:sz w:val="24"/>
+                <w:szCs w:val="24"/>
+                <w:lang w:eastAsia="ru-RU"/>
+              </w:rPr>
+            </w:pPr>
+            <w:proofErr w:type="spellStart"/>
+            <w:r>
+              <w:rPr>
+                <w:rFonts w:asciiTheme="majorHAnsi" w:eastAsia="Times New Roman" w:hAnsiTheme="majorHAnsi" w:cs="Times New Roman"/>
+                <w:sz w:val="24"/>
+                <w:szCs w:val="24"/>
+                <w:lang w:eastAsia="ru-RU"/>
+              </w:rPr>
+              <w:t>Related</w:t>
+            </w:r>
+            <w:proofErr w:type="spellEnd"/>
+            <w:r>
+              <w:rPr>
+                <w:rFonts w:asciiTheme="majorHAnsi" w:eastAsia="Times New Roman" w:hAnsiTheme="majorHAnsi" w:cs="Times New Roman"/>
+                <w:sz w:val="24"/>
+                <w:szCs w:val="24"/>
+                <w:lang w:eastAsia="ru-RU"/>
+              </w:rPr>
+              <w:t xml:space="preserve"> </w:t>
+            </w:r>
+            <w:proofErr w:type="spellStart"/>
+            <w:r>
+              <w:rPr>
+                <w:rFonts w:asciiTheme="majorHAnsi" w:eastAsia="Times New Roman" w:hAnsiTheme="majorHAnsi" w:cs="Times New Roman"/>
+                <w:sz w:val="24"/>
+                <w:szCs w:val="24"/>
+                <w:lang w:eastAsia="ru-RU"/>
+              </w:rPr>
+              <w:t>domains</w:t>
+            </w:r>
+            <w:proofErr w:type="spellEnd"/>
+          </w:p>
+        </w:tc>
+        <w:tc>
+          <w:tcPr>
+            <w:tcW w:w="0" w:type="auto"/>
+            <w:hideMark/>
+          </w:tcPr>
+          <w:p>
+            <w:pPr>
+              <w:jc w:val="center"/>
+              <w:cnfStyle w:val="100000000000" w:firstRow="1" w:lastRow="0" w:firstColumn="0" w:lastColumn="0" w:oddVBand="0" w:evenVBand="0" w:oddHBand="0" w:evenHBand="0" w:firstRowFirstColumn="0" w:firstRowLastColumn="0" w:lastRowFirstColumn="0" w:lastRowLastColumn="0"/>
+              <w:rPr>
+                <w:rFonts w:asciiTheme="majorHAnsi" w:eastAsia="Times New Roman" w:hAnsiTheme="majorHAnsi" w:cs="Times New Roman"/>
+                <w:sz w:val="24"/>
+                <w:szCs w:val="24"/>
+                <w:lang w:eastAsia="ru-RU"/>
+              </w:rPr>
+            </w:pPr>
+            <w:proofErr w:type="spellStart"/>
+            <w:r>
+              <w:rPr>
+                <w:rFonts w:asciiTheme="majorHAnsi" w:eastAsia="Times New Roman" w:hAnsiTheme="majorHAnsi" w:cs="Times New Roman"/>
+                <w:sz w:val="24"/>
+                <w:szCs w:val="24"/>
+                <w:lang w:eastAsia="ru-RU"/>
+              </w:rPr>
+              <w:t>Source</w:t>
+            </w:r>
+            <w:proofErr w:type="spellEnd"/>
+          </w:p>
+        </w:tc>
+      </w:tr>
+      <w:tr>
+        <w:trPr>
+          <w:cnfStyle w:val="000000100000" w:firstRow="0" w:lastRow="0" w:firstColumn="0" w:lastColumn="0" w:oddVBand="0" w:evenVBand="0" w:oddHBand="1" w:evenHBand="0" w:firstRowFirstColumn="0" w:firstRowLastColumn="0" w:lastRowFirstColumn="0" w:lastRowLastColumn="0"/>
+        </w:trPr>
+        <w:tc>
+          <w:tcPr>
+            <w:cnfStyle w:val="001000000000" w:firstRow="0" w:lastRow="0" w:firstColumn="1" w:lastColumn="0" w:oddVBand="0" w:evenVBand="0" w:oddHBand="0" w:evenHBand="0" w:firstRowFirstColumn="0" w:firstRowLastColumn="0" w:lastRowFirstColumn="0" w:lastRowLastColumn="0"/>
+            <w:tcW w:w="0" w:type="auto"/>
+            <w:hideMark/>
+          </w:tcPr>
+          <w:p>
+            <w:pPr>
+              <w:rPr>
+                <w:rFonts w:asciiTheme="majorHAnsi" w:eastAsia="Times New Roman" w:hAnsiTheme="majorHAnsi" w:cs="Times New Roman"/>
+                <w:sz w:val="24"/>
+                <w:szCs w:val="24"/>
+                <w:lang w:eastAsia="ru-RU"/>
+              </w:rPr>
+            </w:pPr>
+            <w:r>
+              <w:rPr>
+                <w:rFonts w:asciiTheme="majorHAnsi" w:eastAsia="Times New Roman" w:hAnsiTheme="majorHAnsi" w:cs="Courier New"/>
+                <w:sz w:val="20"/>
+                <w:szCs w:val="20"/>
+                <w:lang w:eastAsia="ru-RU"/>
+              </w:rPr>
+              <w:t>X.X.X.X</w:t>
+            </w:r>
+          </w:p>
+        </w:tc>
+        <w:tc>
+          <w:tcPr>
+            <w:tcW w:w="0" w:type="auto"/>
+            <w:hideMark/>
+          </w:tcPr>
+          <w:p>
+            <w:pPr>
+              <w:cnfStyle w:val="000000100000" w:firstRow="0" w:lastRow="0" w:firstColumn="0" w:lastColumn="0" w:oddVBand="0" w:evenVBand="0" w:oddHBand="1" w:evenHBand="0" w:firstRowFirstColumn="0" w:firstRowLastColumn="0" w:lastRowFirstColumn="0" w:lastRowLastColumn="0"/>
+              <w:rPr>
+                <w:rFonts w:asciiTheme="majorHAnsi" w:eastAsia="Times New Roman" w:hAnsiTheme="majorHAnsi" w:cs="Times New Roman"/>
+                <w:sz w:val="24"/>
+                <w:szCs w:val="24"/>
+                <w:lang w:eastAsia="ru-RU"/>
+              </w:rPr>
+            </w:pPr>
+            <w:r>
+              <w:rPr>
+                <w:rFonts w:asciiTheme="majorHAnsi" w:eastAsia="Times New Roman" w:hAnsiTheme="majorHAnsi" w:cs="Times New Roman"/>
+                <w:sz w:val="24"/>
+                <w:szCs w:val="24"/>
+                <w:lang w:eastAsia="ru-RU"/>
+              </w:rPr>
+              <w:t>IPv4</w:t>
+            </w:r>
+          </w:p>
+        </w:tc>
+        <w:tc>
+          <w:tcPr>
+            <w:tcW w:w="0" w:type="auto"/>
+            <w:hideMark/>
+          </w:tcPr>
+          <w:p>
+            <w:pPr>
+              <w:cnfStyle w:val="000000100000" w:firstRow="0" w:lastRow="0" w:firstColumn="0" w:lastColumn="0" w:oddVBand="0" w:evenVBand="0" w:oddHBand="1" w:evenHBand="0" w:firstRowFirstColumn="0" w:firstRowLastColumn="0" w:lastRowFirstColumn="0" w:lastRowLastColumn="0"/>
+              <w:rPr>
+                <w:rFonts w:asciiTheme="majorHAnsi" w:eastAsia="Times New Roman" w:hAnsiTheme="majorHAnsi" w:cs="Times New Roman"/>
+                <w:sz w:val="24"/>
+                <w:szCs w:val="24"/>
+                <w:lang w:eastAsia="ru-RU"/>
+              </w:rPr>
+            </w:pPr>
+            <w:proofErr w:type="spellStart"/>
+            <w:r>
+              <w:rPr>
+                <w:rFonts w:asciiTheme="majorHAnsi" w:eastAsia="Times New Roman" w:hAnsiTheme="majorHAnsi" w:cs="Times New Roman"/>
+                <w:sz w:val="24"/>
+                <w:szCs w:val="24"/>
+                <w:lang w:eastAsia="ru-RU"/>
+              </w:rPr>
+              <w:t>Report</w:t>
+            </w:r>
+            <w:proofErr w:type="spellEnd"/>
+            <w:r>
+              <w:rPr>
+                <w:rFonts w:asciiTheme="majorHAnsi" w:eastAsia="Times New Roman" w:hAnsiTheme="majorHAnsi" w:cs="Times New Roman"/>
+                <w:sz w:val="24"/>
+                <w:szCs w:val="24"/>
+                <w:lang w:eastAsia="ru-RU"/>
+              </w:rPr>
+              <w:t xml:space="preserve"> </w:t>
+            </w:r>
+            <w:proofErr w:type="spellStart"/>
+            <w:r>
+              <w:rPr>
+                <w:rFonts w:asciiTheme="majorHAnsi" w:eastAsia="Times New Roman" w:hAnsiTheme="majorHAnsi" w:cs="Times New Roman"/>
+                <w:sz w:val="24"/>
+                <w:szCs w:val="24"/>
+                <w:lang w:eastAsia="ru-RU"/>
+              </w:rPr>
+              <w:t>available</w:t>
+            </w:r>
+            <w:proofErr w:type="spellEnd"/>
+          </w:p>
+        </w:tc>
+        <w:tc>
+          <w:tcPr>
+            <w:tcW w:w="0" w:type="auto"/>
+            <w:hideMark/>
+          </w:tcPr>
+          <w:p>
+            <w:pPr>
+              <w:cnfStyle w:val="000000100000" w:firstRow="0" w:lastRow="0" w:firstColumn="0" w:lastColumn="0" w:oddVBand="0" w:evenVBand="0" w:oddHBand="1" w:evenHBand="0" w:firstRowFirstColumn="0" w:firstRowLastColumn="0" w:lastRowFirstColumn="0" w:lastRowLastColumn="0"/>
+              <w:rPr>
+                <w:rFonts w:asciiTheme="majorHAnsi" w:eastAsia="Times New Roman" w:hAnsiTheme="majorHAnsi" w:cs="Times New Roman"/>
+                <w:sz w:val="24"/>
+                <w:szCs w:val="24"/>
+                <w:lang w:eastAsia="ru-RU"/>
+              </w:rPr>
+            </w:pPr>
+            <w:r>
+              <w:rPr>
+                <w:rFonts w:asciiTheme="majorHAnsi" w:eastAsia="Times New Roman" w:hAnsiTheme="majorHAnsi" w:cs="Times New Roman"/>
+                <w:sz w:val="24"/>
+                <w:szCs w:val="24"/>
+                <w:lang w:eastAsia="ru-RU"/>
+              </w:rPr>
+              <w:t>ASXXXXX</w:t>
+            </w:r>
+          </w:p>
+        </w:tc>
+        <w:tc>
+          <w:tcPr>
+            <w:tcW w:w="0" w:type="auto"/>
+            <w:hideMark/>
+          </w:tcPr>
+          <w:p>
+            <w:pPr>
+              <w:cnfStyle w:val="000000100000" w:firstRow="0" w:lastRow="0" w:firstColumn="0" w:lastColumn="0" w:oddVBand="0" w:evenVBand="0" w:oddHBand="1" w:evenHBand="0" w:firstRowFirstColumn="0" w:firstRowLastColumn="0" w:lastRowFirstColumn="0" w:lastRowLastColumn="0"/>
+              <w:rPr>
+                <w:rFonts w:asciiTheme="majorHAnsi" w:eastAsia="Times New Roman" w:hAnsiTheme="majorHAnsi" w:cs="Times New Roman"/>
+                <w:sz w:val="24"/>
+                <w:szCs w:val="24"/>
+                <w:lang w:eastAsia="ru-RU"/>
+              </w:rPr>
+            </w:pPr>
+            <w:proofErr w:type="spellStart"/>
+            <w:r>
+              <w:rPr>
+                <w:rFonts w:asciiTheme="majorHAnsi" w:eastAsia="Times New Roman" w:hAnsiTheme="majorHAnsi" w:cs="Times New Roman"/>
+                <w:sz w:val="24"/>
+                <w:szCs w:val="24"/>
+                <w:lang w:eastAsia="ru-RU"/>
+              </w:rPr>
+              <w:t>domain.example</w:t>
+            </w:r>
+            <w:proofErr w:type="spellEnd"/>
+          </w:p>
+        </w:tc>
+        <w:tc>
+          <w:tcPr>
+            <w:tcW w:w="0" w:type="auto"/>
+            <w:hideMark/>
+          </w:tcPr>
+          <w:p>
+            <w:pPr>
+              <w:cnfStyle w:val="000000100000" w:firstRow="0" w:lastRow="0" w:firstColumn="0" w:lastColumn="0" w:oddVBand="0" w:evenVBand="0" w:oddHBand="1" w:evenHBand="0" w:firstRowFirstColumn="0" w:firstRowLastColumn="0" w:lastRowFirstColumn="0" w:lastRowLastColumn="0"/>
+              <w:rPr>
+                <w:rFonts w:asciiTheme="majorHAnsi" w:eastAsia="Times New Roman" w:hAnsiTheme="majorHAnsi" w:cs="Times New Roman"/>
+                <w:sz w:val="24"/>
+                <w:szCs w:val="24"/>
+                <w:lang w:eastAsia="ru-RU"/>
+              </w:rPr>
+            </w:pPr>
+            <w:proofErr w:type="spellStart"/>
+            <w:r>
+              <w:rPr>
+                <w:rFonts w:asciiTheme="majorHAnsi" w:eastAsia="Times New Roman" w:hAnsiTheme="majorHAnsi" w:cs="Times New Roman"/>
+                <w:sz w:val="24"/>
+                <w:szCs w:val="24"/>
+                <w:lang w:eastAsia="ru-RU"/>
+              </w:rPr>
+              <w:t>VirusTotal</w:t>
+            </w:r>
+            <w:proofErr w:type="spellEnd"/>
+          </w:p>
+        </w:tc>
+      </w:tr>
+      <w:tr>
+        <w:tc>
+          <w:tcPr>
+            <w:cnfStyle w:val="001000000000" w:firstRow="0" w:lastRow="0" w:firstColumn="1" w:lastColumn="0" w:oddVBand="0" w:evenVBand="0" w:oddHBand="0" w:evenHBand="0" w:firstRowFirstColumn="0" w:firstRowLastColumn="0" w:lastRowFirstColumn="0" w:lastRowLastColumn="0"/>
+            <w:tcW w:w="0" w:type="auto"/>
+            <w:hideMark/>
+          </w:tcPr>
+          <w:p>
+            <w:pPr>
+              <w:rPr>
+                <w:rFonts w:asciiTheme="majorHAnsi" w:eastAsia="Times New Roman" w:hAnsiTheme="majorHAnsi" w:cs="Times New Roman"/>
+                <w:sz w:val="24"/>
+                <w:szCs w:val="24"/>
+                <w:lang w:eastAsia="ru-RU"/>
+              </w:rPr>
+            </w:pPr>
+            <w:r>
+              <w:rPr>
+                <w:rFonts w:asciiTheme="majorHAnsi" w:eastAsia="Times New Roman" w:hAnsiTheme="majorHAnsi" w:cs="Courier New"/>
+                <w:sz w:val="20"/>
+                <w:szCs w:val="20"/>
+                <w:lang w:eastAsia="ru-RU"/>
+              </w:rPr>
+              <w:t>Y.Y.Y.Y</w:t>
+            </w:r>
+          </w:p>
+        </w:tc>
+        <w:tc>
+          <w:tcPr>
+            <w:tcW w:w="0" w:type="auto"/>
+            <w:hideMark/>
+          </w:tcPr>
+          <w:p>
+            <w:pPr>
+              <w:cnfStyle w:val="000000000000" w:firstRow="0" w:lastRow="0" w:firstColumn="0" w:lastColumn="0" w:oddVBand="0" w:evenVBand="0" w:oddHBand="0" w:evenHBand="0" w:firstRowFirstColumn="0" w:firstRowLastColumn="0" w:lastRowFirstColumn="0" w:lastRowLastColumn="0"/>
+              <w:rPr>
+                <w:rFonts w:asciiTheme="majorHAnsi" w:eastAsia="Times New Roman" w:hAnsiTheme="majorHAnsi" w:cs="Times New Roman"/>
+                <w:sz w:val="24"/>
+                <w:szCs w:val="24"/>
+                <w:lang w:eastAsia="ru-RU"/>
+              </w:rPr>
+            </w:pPr>
+            <w:r>
+              <w:rPr>
+                <w:rFonts w:asciiTheme="majorHAnsi" w:eastAsia="Times New Roman" w:hAnsiTheme="majorHAnsi" w:cs="Times New Roman"/>
+                <w:sz w:val="24"/>
+                <w:szCs w:val="24"/>
+                <w:lang w:eastAsia="ru-RU"/>
+              </w:rPr>
+              <w:t>IPv4</w:t>
+            </w:r>
+          </w:p>
+        </w:tc>
+        <w:tc>
+          <w:tcPr>
+            <w:tcW w:w="0" w:type="auto"/>
+            <w:hideMark/>
+          </w:tcPr>
+          <w:p>
+            <w:pPr>
+              <w:cnfStyle w:val="000000000000" w:firstRow="0" w:lastRow="0" w:firstColumn="0" w:lastColumn="0" w:oddVBand="0" w:evenVBand="0" w:oddHBand="0" w:evenHBand="0" w:firstRowFirstColumn="0" w:firstRowLastColumn="0" w:lastRowFirstColumn="0" w:lastRowLastColumn="0"/>
+              <w:rPr>
+                <w:rFonts w:asciiTheme="majorHAnsi" w:eastAsia="Times New Roman" w:hAnsiTheme="majorHAnsi" w:cs="Times New Roman"/>
+                <w:sz w:val="24"/>
+                <w:szCs w:val="24"/>
+                <w:lang w:eastAsia="ru-RU"/>
+              </w:rPr>
+            </w:pPr>
+            <w:proofErr w:type="spellStart"/>
+            <w:r>
+              <w:rPr>
+                <w:rFonts w:asciiTheme="majorHAnsi" w:eastAsia="Times New Roman" w:hAnsiTheme="majorHAnsi" w:cs="Times New Roman"/>
+                <w:sz w:val="24"/>
+                <w:szCs w:val="24"/>
+                <w:lang w:eastAsia="ru-RU"/>
+              </w:rPr>
+              <w:t>No</w:t>
+            </w:r>
+            <w:proofErr w:type="spellEnd"/>
+            <w:r>
+              <w:rPr>
+                <w:rFonts w:asciiTheme="majorHAnsi" w:eastAsia="Times New Roman" w:hAnsiTheme="majorHAnsi" w:cs="Times New Roman"/>
+                <w:sz w:val="24"/>
+                <w:szCs w:val="24"/>
+                <w:lang w:eastAsia="ru-RU"/>
+              </w:rPr>
+              <w:t xml:space="preserve"> </w:t>
+            </w:r>
+            <w:proofErr w:type="spellStart"/>
+            <w:r>
+              <w:rPr>
+                <w:rFonts w:asciiTheme="majorHAnsi" w:eastAsia="Times New Roman" w:hAnsiTheme="majorHAnsi" w:cs="Times New Roman"/>
+                <w:sz w:val="24"/>
+                <w:szCs w:val="24"/>
+                <w:lang w:eastAsia="ru-RU"/>
+              </w:rPr>
+              <w:t>significant</w:t>
+            </w:r>
+            <w:proofErr w:type="spellEnd"/>
+            <w:r>
+              <w:rPr>
+                <w:rFonts w:asciiTheme="majorHAnsi" w:eastAsia="Times New Roman" w:hAnsiTheme="majorHAnsi" w:cs="Times New Roman"/>
+                <w:sz w:val="24"/>
+                <w:szCs w:val="24"/>
+                <w:lang w:eastAsia="ru-RU"/>
+              </w:rPr>
+              <w:t xml:space="preserve"> </w:t>
+            </w:r>
+            <w:proofErr w:type="spellStart"/>
+            <w:r>
+              <w:rPr>
+                <w:rFonts w:asciiTheme="majorHAnsi" w:eastAsia="Times New Roman" w:hAnsiTheme="majorHAnsi" w:cs="Times New Roman"/>
+                <w:sz w:val="24"/>
+                <w:szCs w:val="24"/>
+                <w:lang w:eastAsia="ru-RU"/>
+              </w:rPr>
+              <w:t>detections</w:t>
+            </w:r>
+            <w:proofErr w:type="spellEnd"/>
+          </w:p>
+        </w:tc>
+        <w:tc>
+          <w:tcPr>
+            <w:tcW w:w="0" w:type="auto"/>
+            <w:hideMark/>
+          </w:tcPr>
+          <w:p>
+            <w:pPr>
+              <w:cnfStyle w:val="000000000000" w:firstRow="0" w:lastRow="0" w:firstColumn="0" w:lastColumn="0" w:oddVBand="0" w:evenVBand="0" w:oddHBand="0" w:evenHBand="0" w:firstRowFirstColumn="0" w:firstRowLastColumn="0" w:lastRowFirstColumn="0" w:lastRowLastColumn="0"/>
+              <w:rPr>
+                <w:rFonts w:asciiTheme="majorHAnsi" w:eastAsia="Times New Roman" w:hAnsiTheme="majorHAnsi" w:cs="Times New Roman"/>
+                <w:sz w:val="24"/>
+                <w:szCs w:val="24"/>
+                <w:lang w:eastAsia="ru-RU"/>
+              </w:rPr>
+            </w:pPr>
+            <w:r>
+              <w:rPr>
+                <w:rFonts w:asciiTheme="majorHAnsi" w:eastAsia="Times New Roman" w:hAnsiTheme="majorHAnsi" w:cs="Times New Roman"/>
+                <w:sz w:val="24"/>
+                <w:szCs w:val="24"/>
+                <w:lang w:eastAsia="ru-RU"/>
+              </w:rPr>
+              <w:t>ASYYYYY</w:t>
+            </w:r>
+          </w:p>
+        </w:tc>
+        <w:tc>
+          <w:tcPr>
+            <w:tcW w:w="0" w:type="auto"/>
+            <w:hideMark/>
+          </w:tcPr>
+          <w:p>
+            <w:pPr>
+              <w:cnfStyle w:val="000000000000" w:firstRow="0" w:lastRow="0" w:firstColumn="0" w:lastColumn="0" w:oddVBand="0" w:evenVBand="0" w:oddHBand="0" w:evenHBand="0" w:firstRowFirstColumn="0" w:firstRowLastColumn="0" w:lastRowFirstColumn="0" w:lastRowLastColumn="0"/>
+              <w:rPr>
+                <w:rFonts w:asciiTheme="majorHAnsi" w:eastAsia="Times New Roman" w:hAnsiTheme="majorHAnsi" w:cs="Times New Roman"/>
+                <w:sz w:val="24"/>
+                <w:szCs w:val="24"/>
+                <w:lang w:eastAsia="ru-RU"/>
+              </w:rPr>
+            </w:pPr>
+            <w:r>
+              <w:rPr>
+                <w:rFonts w:asciiTheme="majorHAnsi" w:eastAsia="Times New Roman" w:hAnsiTheme="majorHAnsi" w:cs="Times New Roman"/>
+                <w:sz w:val="24"/>
+                <w:szCs w:val="24"/>
+                <w:lang w:eastAsia="ru-RU"/>
+              </w:rPr>
+              <w:t>—</w:t>
+            </w:r>
+          </w:p>
+        </w:tc>
+        <w:tc>
+          <w:tcPr>
+            <w:tcW w:w="0" w:type="auto"/>
+            <w:hideMark/>
+          </w:tcPr>
+          <w:p>
+            <w:pPr>
+              <w:cnfStyle w:val="000000000000" w:firstRow="0" w:lastRow="0" w:firstColumn="0" w:lastColumn="0" w:oddVBand="0" w:evenVBand="0" w:oddHBand="0" w:evenHBand="0" w:firstRowFirstColumn="0" w:firstRowLastColumn="0" w:lastRowFirstColumn="0" w:lastRowLastColumn="0"/>
+              <w:rPr>
+                <w:rFonts w:asciiTheme="majorHAnsi" w:eastAsia="Times New Roman" w:hAnsiTheme="majorHAnsi" w:cs="Times New Roman"/>
+                <w:sz w:val="24"/>
+                <w:szCs w:val="24"/>
+                <w:lang w:eastAsia="ru-RU"/>
+              </w:rPr>
+            </w:pPr>
+            <w:proofErr w:type="spellStart"/>
+            <w:r>
+              <w:rPr>
+                <w:rFonts w:asciiTheme="majorHAnsi" w:eastAsia="Times New Roman" w:hAnsiTheme="majorHAnsi" w:cs="Times New Roman"/>
+                <w:sz w:val="24"/>
+                <w:szCs w:val="24"/>
+                <w:lang w:eastAsia="ru-RU"/>
+              </w:rPr>
+              <w:t>VirusTotal</w:t>
+            </w:r>
+            <w:proofErr w:type="spellEnd"/>
+          </w:p>
+        </w:tc>
+      </w:tr>
+    </w:tbl>
+    <w:p>
+      <w:pPr>
+        <w:spacing w:before="100" w:beforeAutospacing="1" w:after="100" w:afterAutospacing="1" w:line="240" w:lineRule="auto"/>
+        <w:rPr>
+          <w:rFonts w:asciiTheme="majorHAnsi" w:eastAsia="Times New Roman" w:hAnsiTheme="majorHAnsi" w:cs="Times New Roman"/>
+          <w:sz w:val="24"/>
+          <w:szCs w:val="24"/>
+          <w:lang w:val="en-US" w:eastAsia="ru-RU"/>
+        </w:rPr>
+      </w:pPr>
+      <w:r>
+        <w:rPr>
+          <w:rFonts w:asciiTheme="majorHAnsi" w:eastAsia="Times New Roman" w:hAnsiTheme="majorHAnsi" w:cs="Times New Roman"/>
+          <w:sz w:val="24"/>
+          <w:szCs w:val="24"/>
+          <w:lang w:val="en-US" w:eastAsia="ru-RU"/>
+        </w:rPr>
+        <w:lastRenderedPageBreak/>
+        <w:t xml:space="preserve">The important point is that </w:t>
+      </w:r>
+      <w:r>
+        <w:rPr>
+          <w:rFonts w:asciiTheme="majorHAnsi" w:eastAsia="Times New Roman" w:hAnsiTheme="majorHAnsi" w:cs="Times New Roman"/>
+          <w:b/>
+          <w:bCs/>
+          <w:sz w:val="24"/>
+          <w:szCs w:val="24"/>
+          <w:lang w:val="en-US" w:eastAsia="ru-RU"/>
+        </w:rPr>
+        <w:t xml:space="preserve">the presence of an IP in </w:t>
+      </w:r>
+      <w:proofErr w:type="spellStart"/>
+      <w:r>
+        <w:rPr>
+          <w:rFonts w:asciiTheme="majorHAnsi" w:eastAsia="Times New Roman" w:hAnsiTheme="majorHAnsi" w:cs="Times New Roman"/>
+          <w:b/>
+          <w:bCs/>
+          <w:sz w:val="24"/>
+          <w:szCs w:val="24"/>
+          <w:lang w:val="en-US" w:eastAsia="ru-RU"/>
+        </w:rPr>
+        <w:t>VirusTotal</w:t>
+      </w:r>
+      <w:proofErr w:type="spellEnd"/>
+      <w:r>
+        <w:rPr>
+          <w:rFonts w:asciiTheme="majorHAnsi" w:eastAsia="Times New Roman" w:hAnsiTheme="majorHAnsi" w:cs="Times New Roman"/>
+          <w:b/>
+          <w:bCs/>
+          <w:sz w:val="24"/>
+          <w:szCs w:val="24"/>
+          <w:lang w:val="en-US" w:eastAsia="ru-RU"/>
+        </w:rPr>
+        <w:t xml:space="preserve"> does not automatically mean that it is a </w:t>
+      </w:r>
+      <w:proofErr w:type="spellStart"/>
+      <w:r>
+        <w:rPr>
+          <w:rFonts w:asciiTheme="majorHAnsi" w:eastAsia="Times New Roman" w:hAnsiTheme="majorHAnsi" w:cs="Times New Roman"/>
+          <w:b/>
+          <w:bCs/>
+          <w:sz w:val="24"/>
+          <w:szCs w:val="24"/>
+          <w:lang w:val="en-US" w:eastAsia="ru-RU"/>
+        </w:rPr>
+        <w:t>DDoS</w:t>
+      </w:r>
+      <w:proofErr w:type="spellEnd"/>
+      <w:r>
+        <w:rPr>
+          <w:rFonts w:asciiTheme="majorHAnsi" w:eastAsia="Times New Roman" w:hAnsiTheme="majorHAnsi" w:cs="Times New Roman"/>
+          <w:b/>
+          <w:bCs/>
+          <w:sz w:val="24"/>
+          <w:szCs w:val="24"/>
+          <w:lang w:val="en-US" w:eastAsia="ru-RU"/>
+        </w:rPr>
+        <w:t xml:space="preserve"> source</w:t>
+      </w:r>
+      <w:r>
+        <w:rPr>
+          <w:rFonts w:asciiTheme="majorHAnsi" w:eastAsia="Times New Roman" w:hAnsiTheme="majorHAnsi" w:cs="Times New Roman"/>
+          <w:sz w:val="24"/>
+          <w:szCs w:val="24"/>
+          <w:lang w:val="en-US" w:eastAsia="ru-RU"/>
+        </w:rPr>
+        <w:t>. It should be treated as one piece of evidence and correlated with other information.</w:t>
       </w:r>
     </w:p>
     <w:p>
@@ -6364,6 +9090,109 @@
       <w:szCs w:val="16"/>
     </w:rPr>
   </w:style>
+  <w:style w:type="table" w:styleId="a6">
+    <w:name w:val="Light Shading"/>
+    <w:basedOn w:val="a1"/>
+    <w:uiPriority w:val="60"/>
+    <w:rsid w:val="00B15FDC"/>
+    <w:pPr>
+      <w:spacing w:after="0" w:line="240" w:lineRule="auto"/>
+    </w:pPr>
+    <w:rPr>
+      <w:color w:val="000000" w:themeColor="text1" w:themeShade="BF"/>
+    </w:rPr>
+    <w:tblPr>
+      <w:tblStyleRowBandSize w:val="1"/>
+      <w:tblStyleColBandSize w:val="1"/>
+      <w:tblInd w:w="0" w:type="dxa"/>
+      <w:tblBorders>
+        <w:top w:val="single" w:sz="8" w:space="0" w:color="000000" w:themeColor="text1"/>
+        <w:bottom w:val="single" w:sz="8" w:space="0" w:color="000000" w:themeColor="text1"/>
+      </w:tblBorders>
+      <w:tblCellMar>
+        <w:top w:w="0" w:type="dxa"/>
+        <w:left w:w="108" w:type="dxa"/>
+        <w:bottom w:w="0" w:type="dxa"/>
+        <w:right w:w="108" w:type="dxa"/>
+      </w:tblCellMar>
+    </w:tblPr>
+    <w:tblStylePr w:type="firstRow">
+      <w:pPr>
+        <w:spacing w:before="0" w:after="0" w:line="240" w:lineRule="auto"/>
+      </w:pPr>
+      <w:rPr>
+        <w:b/>
+        <w:bCs/>
+      </w:rPr>
+      <w:tblPr/>
+      <w:tcPr>
+        <w:tcBorders>
+          <w:top w:val="single" w:sz="8" w:space="0" w:color="000000" w:themeColor="text1"/>
+          <w:left w:val="nil"/>
+          <w:bottom w:val="single" w:sz="8" w:space="0" w:color="000000" w:themeColor="text1"/>
+          <w:right w:val="nil"/>
+          <w:insideH w:val="nil"/>
+          <w:insideV w:val="nil"/>
+        </w:tcBorders>
+      </w:tcPr>
+    </w:tblStylePr>
+    <w:tblStylePr w:type="lastRow">
+      <w:pPr>
+        <w:spacing w:before="0" w:after="0" w:line="240" w:lineRule="auto"/>
+      </w:pPr>
+      <w:rPr>
+        <w:b/>
+        <w:bCs/>
+      </w:rPr>
+      <w:tblPr/>
+      <w:tcPr>
+        <w:tcBorders>
+          <w:top w:val="single" w:sz="8" w:space="0" w:color="000000" w:themeColor="text1"/>
+          <w:left w:val="nil"/>
+          <w:bottom w:val="single" w:sz="8" w:space="0" w:color="000000" w:themeColor="text1"/>
+          <w:right w:val="nil"/>
+          <w:insideH w:val="nil"/>
+          <w:insideV w:val="nil"/>
+        </w:tcBorders>
+      </w:tcPr>
+    </w:tblStylePr>
+    <w:tblStylePr w:type="firstCol">
+      <w:rPr>
+        <w:b/>
+        <w:bCs/>
+      </w:rPr>
+    </w:tblStylePr>
+    <w:tblStylePr w:type="lastCol">
+      <w:rPr>
+        <w:b/>
+        <w:bCs/>
+      </w:rPr>
+    </w:tblStylePr>
+    <w:tblStylePr w:type="band1Vert">
+      <w:tblPr/>
+      <w:tcPr>
+        <w:tcBorders>
+          <w:left w:val="nil"/>
+          <w:right w:val="nil"/>
+          <w:insideH w:val="nil"/>
+          <w:insideV w:val="nil"/>
+        </w:tcBorders>
+        <w:shd w:val="clear" w:color="auto" w:fill="C0C0C0" w:themeFill="text1" w:themeFillTint="3F"/>
+      </w:tcPr>
+    </w:tblStylePr>
+    <w:tblStylePr w:type="band1Horz">
+      <w:tblPr/>
+      <w:tcPr>
+        <w:tcBorders>
+          <w:left w:val="nil"/>
+          <w:right w:val="nil"/>
+          <w:insideH w:val="nil"/>
+          <w:insideV w:val="nil"/>
+        </w:tcBorders>
+        <w:shd w:val="clear" w:color="auto" w:fill="C0C0C0" w:themeFill="text1" w:themeFillTint="3F"/>
+      </w:tcPr>
+    </w:tblStylePr>
+  </w:style>
 </w:styles>
 </file>
 
@@ -6610,6 +9439,109 @@
       <w:sz w:val="16"/>
       <w:szCs w:val="16"/>
     </w:rPr>
+  </w:style>
+  <w:style w:type="table" w:styleId="a6">
+    <w:name w:val="Light Shading"/>
+    <w:basedOn w:val="a1"/>
+    <w:uiPriority w:val="60"/>
+    <w:rsid w:val="00B15FDC"/>
+    <w:pPr>
+      <w:spacing w:after="0" w:line="240" w:lineRule="auto"/>
+    </w:pPr>
+    <w:rPr>
+      <w:color w:val="000000" w:themeColor="text1" w:themeShade="BF"/>
+    </w:rPr>
+    <w:tblPr>
+      <w:tblStyleRowBandSize w:val="1"/>
+      <w:tblStyleColBandSize w:val="1"/>
+      <w:tblInd w:w="0" w:type="dxa"/>
+      <w:tblBorders>
+        <w:top w:val="single" w:sz="8" w:space="0" w:color="000000" w:themeColor="text1"/>
+        <w:bottom w:val="single" w:sz="8" w:space="0" w:color="000000" w:themeColor="text1"/>
+      </w:tblBorders>
+      <w:tblCellMar>
+        <w:top w:w="0" w:type="dxa"/>
+        <w:left w:w="108" w:type="dxa"/>
+        <w:bottom w:w="0" w:type="dxa"/>
+        <w:right w:w="108" w:type="dxa"/>
+      </w:tblCellMar>
+    </w:tblPr>
+    <w:tblStylePr w:type="firstRow">
+      <w:pPr>
+        <w:spacing w:before="0" w:after="0" w:line="240" w:lineRule="auto"/>
+      </w:pPr>
+      <w:rPr>
+        <w:b/>
+        <w:bCs/>
+      </w:rPr>
+      <w:tblPr/>
+      <w:tcPr>
+        <w:tcBorders>
+          <w:top w:val="single" w:sz="8" w:space="0" w:color="000000" w:themeColor="text1"/>
+          <w:left w:val="nil"/>
+          <w:bottom w:val="single" w:sz="8" w:space="0" w:color="000000" w:themeColor="text1"/>
+          <w:right w:val="nil"/>
+          <w:insideH w:val="nil"/>
+          <w:insideV w:val="nil"/>
+        </w:tcBorders>
+      </w:tcPr>
+    </w:tblStylePr>
+    <w:tblStylePr w:type="lastRow">
+      <w:pPr>
+        <w:spacing w:before="0" w:after="0" w:line="240" w:lineRule="auto"/>
+      </w:pPr>
+      <w:rPr>
+        <w:b/>
+        <w:bCs/>
+      </w:rPr>
+      <w:tblPr/>
+      <w:tcPr>
+        <w:tcBorders>
+          <w:top w:val="single" w:sz="8" w:space="0" w:color="000000" w:themeColor="text1"/>
+          <w:left w:val="nil"/>
+          <w:bottom w:val="single" w:sz="8" w:space="0" w:color="000000" w:themeColor="text1"/>
+          <w:right w:val="nil"/>
+          <w:insideH w:val="nil"/>
+          <w:insideV w:val="nil"/>
+        </w:tcBorders>
+      </w:tcPr>
+    </w:tblStylePr>
+    <w:tblStylePr w:type="firstCol">
+      <w:rPr>
+        <w:b/>
+        <w:bCs/>
+      </w:rPr>
+    </w:tblStylePr>
+    <w:tblStylePr w:type="lastCol">
+      <w:rPr>
+        <w:b/>
+        <w:bCs/>
+      </w:rPr>
+    </w:tblStylePr>
+    <w:tblStylePr w:type="band1Vert">
+      <w:tblPr/>
+      <w:tcPr>
+        <w:tcBorders>
+          <w:left w:val="nil"/>
+          <w:right w:val="nil"/>
+          <w:insideH w:val="nil"/>
+          <w:insideV w:val="nil"/>
+        </w:tcBorders>
+        <w:shd w:val="clear" w:color="auto" w:fill="C0C0C0" w:themeFill="text1" w:themeFillTint="3F"/>
+      </w:tcPr>
+    </w:tblStylePr>
+    <w:tblStylePr w:type="band1Horz">
+      <w:tblPr/>
+      <w:tcPr>
+        <w:tcBorders>
+          <w:left w:val="nil"/>
+          <w:right w:val="nil"/>
+          <w:insideH w:val="nil"/>
+          <w:insideV w:val="nil"/>
+        </w:tcBorders>
+        <w:shd w:val="clear" w:color="auto" w:fill="C0C0C0" w:themeFill="text1" w:themeFillTint="3F"/>
+      </w:tcPr>
+    </w:tblStylePr>
   </w:style>
 </w:styles>
 </file>

</xml_diff>